<commit_message>
Procedure: explain the plan summary's origin and how to read it
Co-Authored-By: Claude Fable 5.1 <noreply@anthropic.com>
Claude-Session: https://claude.ai/code/session_016X9U4SzM2dXD3fEs3wV3Mm
</commit_message>
<xml_diff>
--- a/docs/procedures/registration_capture_procedure.docx
+++ b/docs/procedures/registration_capture_procedure.docx
@@ -1313,7 +1313,13 @@
         <w:pStyle w:val="FirstParagraph"/>
       </w:pPr>
       <w:r>
-        <w:t xml:space="preserve">(Use your board’s half-sizes in place of 100 75.) It writes</w:t>
+        <w:t xml:space="preserve">(Use your board’s half-sizes in place of 100 75.) It writes three files: the pose</w:t>
+      </w:r>
+      <w:r>
+        <w:t xml:space="preserve"> </w:t>
+      </w:r>
+      <w:r>
+        <w:t xml:space="preserve">list</w:t>
       </w:r>
       <w:r>
         <w:t xml:space="preserve"> </w:t>
@@ -1325,7 +1331,10 @@
         <w:t xml:space="preserve">plan/poses.csv</w:t>
       </w:r>
       <w:r>
-        <w:t xml:space="preserve">,</w:t>
+        <w:t xml:space="preserve"> </w:t>
+      </w:r>
+      <w:r>
+        <w:t xml:space="preserve">for the robot program, a report</w:t>
       </w:r>
       <w:r>
         <w:t xml:space="preserve"> </w:t>
@@ -1340,7 +1349,7 @@
         <w:t xml:space="preserve"> </w:t>
       </w:r>
       <w:r>
-        <w:t xml:space="preserve">and a picture</w:t>
+        <w:t xml:space="preserve">(explained below), and a picture</w:t>
       </w:r>
       <w:r>
         <w:t xml:space="preserve"> </w:t>
@@ -1355,13 +1364,13 @@
         <w:t xml:space="preserve"> </w:t>
       </w:r>
       <w:r>
-        <w:t xml:space="preserve">(figure 2 shows the picture for</w:t>
-      </w:r>
-      <w:r>
-        <w:t xml:space="preserve"> </w:t>
-      </w:r>
-      <w:r>
-        <w:t xml:space="preserve">the default settings). The plan with the default settings is:</w:t>
+        <w:t xml:space="preserve">(figure 2 shows the picture for the</w:t>
+      </w:r>
+      <w:r>
+        <w:t xml:space="preserve"> </w:t>
+      </w:r>
+      <w:r>
+        <w:t xml:space="preserve">default settings). The plan with the default settings is:</w:t>
       </w:r>
     </w:p>
     <w:p>
@@ -1413,7 +1422,204 @@
         <w:pStyle w:val="BodyText"/>
       </w:pPr>
       <w:r>
-        <w:t xml:space="preserve">The plan summary for these settings (reproduced from</w:t>
+        <w:t xml:space="preserve">What the plan tool prints. Besides the three files, the tool prints a plain-text</w:t>
+      </w:r>
+      <w:r>
+        <w:t xml:space="preserve"> </w:t>
+      </w:r>
+      <w:r>
+        <w:t xml:space="preserve">summary to the screen and saves the same text as</w:t>
+      </w:r>
+      <w:r>
+        <w:t xml:space="preserve"> </w:t>
+      </w:r>
+      <w:r>
+        <w:rPr>
+          <w:rStyle w:val="VerbatimChar"/>
+        </w:rPr>
+        <w:t xml:space="preserve">plan/plan_summary.txt</w:t>
+      </w:r>
+      <w:r>
+        <w:t xml:space="preserve">. It is not</w:t>
+      </w:r>
+      <w:r>
+        <w:t xml:space="preserve"> </w:t>
+      </w:r>
+      <w:r>
+        <w:t xml:space="preserve">something you fill in; it is the tool’s report on the plan it just made. The block</w:t>
+      </w:r>
+      <w:r>
+        <w:t xml:space="preserve"> </w:t>
+      </w:r>
+      <w:r>
+        <w:t xml:space="preserve">below is that report for the default settings, a 640 x 480 sensor and a nominal</w:t>
+      </w:r>
+      <w:r>
+        <w:t xml:space="preserve"> </w:t>
+      </w:r>
+      <w:r>
+        <w:t xml:space="preserve">sensor position (your own run shows the same layout with your numbers). Read it</w:t>
+      </w:r>
+      <w:r>
+        <w:t xml:space="preserve"> </w:t>
+      </w:r>
+      <w:r>
+        <w:t xml:space="preserve">before handing the plan to the robot programmer:</w:t>
+      </w:r>
+    </w:p>
+    <w:p>
+      <w:pPr>
+        <w:pStyle w:val="Compact"/>
+        <w:numPr>
+          <w:ilvl w:val="0"/>
+          <w:numId w:val="1003"/>
+        </w:numPr>
+      </w:pPr>
+      <w:r>
+        <w:t xml:space="preserve">The table gives, for every standoff and tilt, how many poses were planned, how</w:t>
+      </w:r>
+      <w:r>
+        <w:t xml:space="preserve"> </w:t>
+      </w:r>
+      <w:r>
+        <w:t xml:space="preserve">many were dropped because a board corner would fall too near the image edge, how</w:t>
+      </w:r>
+      <w:r>
+        <w:t xml:space="preserve"> </w:t>
+      </w:r>
+      <w:r>
+        <w:t xml:space="preserve">many are kept, and how many of those are tagged held out. A few dropped poses are</w:t>
+      </w:r>
+      <w:r>
+        <w:t xml:space="preserve"> </w:t>
+      </w:r>
+      <w:r>
+        <w:t xml:space="preserve">normal; if a whole row is dropped, the board is too large for that standoff in</w:t>
+      </w:r>
+      <w:r>
+        <w:t xml:space="preserve"> </w:t>
+      </w:r>
+      <w:r>
+        <w:t xml:space="preserve">this sensor’s field, and the line after the table says which option to change.</w:t>
+      </w:r>
+    </w:p>
+    <w:p>
+      <w:pPr>
+        <w:pStyle w:val="Compact"/>
+        <w:numPr>
+          <w:ilvl w:val="0"/>
+          <w:numId w:val="1003"/>
+        </w:numPr>
+      </w:pPr>
+      <w:r>
+        <w:rPr>
+          <w:rStyle w:val="VerbatimChar"/>
+        </w:rPr>
+        <w:t xml:space="preserve">normal spread</w:t>
+      </w:r>
+      <w:r>
+        <w:t xml:space="preserve"> </w:t>
+      </w:r>
+      <w:r>
+        <w:t xml:space="preserve">says how well the tilts cover all directions; the registration</w:t>
+      </w:r>
+      <w:r>
+        <w:t xml:space="preserve"> </w:t>
+      </w:r>
+      <w:r>
+        <w:t xml:space="preserve">refuses a set below 0.05. The default plan gives about 0.28.</w:t>
+      </w:r>
+      <w:r>
+        <w:t xml:space="preserve"> </w:t>
+      </w:r>
+      <w:r>
+        <w:rPr>
+          <w:rStyle w:val="VerbatimChar"/>
+        </w:rPr>
+        <w:t xml:space="preserve">similarity spread</w:t>
+      </w:r>
+      <w:r>
+        <w:t xml:space="preserve"> </w:t>
+      </w:r>
+      <w:r>
+        <w:t xml:space="preserve">matters only for the optional scale analysis and must exceed 0.01.</w:t>
+      </w:r>
+    </w:p>
+    <w:p>
+      <w:pPr>
+        <w:pStyle w:val="Compact"/>
+        <w:numPr>
+          <w:ilvl w:val="0"/>
+          <w:numId w:val="1003"/>
+        </w:numPr>
+      </w:pPr>
+      <w:r>
+        <w:t xml:space="preserve">The</w:t>
+      </w:r>
+      <w:r>
+        <w:t xml:space="preserve"> </w:t>
+      </w:r>
+      <w:r>
+        <w:rPr>
+          <w:rStyle w:val="VerbatimChar"/>
+        </w:rPr>
+        <w:t xml:space="preserve">predicted ... RMS error</w:t>
+      </w:r>
+      <w:r>
+        <w:t xml:space="preserve"> </w:t>
+      </w:r>
+      <w:r>
+        <w:t xml:space="preserve">lines are the registration error to expect if the</w:t>
+      </w:r>
+      <w:r>
+        <w:t xml:space="preserve"> </w:t>
+      </w:r>
+      <w:r>
+        <w:t xml:space="preserve">sensor’s planes are good to 0.2 degrees and 0.2 mm; they are an order of</w:t>
+      </w:r>
+      <w:r>
+        <w:t xml:space="preserve"> </w:t>
+      </w:r>
+      <w:r>
+        <w:t xml:space="preserve">magnitude, not a promise. The second quality block repeats the numbers for the</w:t>
+      </w:r>
+      <w:r>
+        <w:t xml:space="preserve"> </w:t>
+      </w:r>
+      <w:r>
+        <w:t xml:space="preserve">poses that are not held out, which is the set the engineer fits.</w:t>
+      </w:r>
+    </w:p>
+    <w:p>
+      <w:pPr>
+        <w:pStyle w:val="Compact"/>
+        <w:numPr>
+          <w:ilvl w:val="0"/>
+          <w:numId w:val="1003"/>
+        </w:numPr>
+      </w:pPr>
+      <w:r>
+        <w:t xml:space="preserve">The last two lines are the size of the job: the number of poses, and the number of</w:t>
+      </w:r>
+      <w:r>
+        <w:t xml:space="preserve"> </w:t>
+      </w:r>
+      <w:r>
+        <w:t xml:space="preserve">pose visits and capture files once both sub-procedures (section 6) have been run.</w:t>
+      </w:r>
+      <w:r>
+        <w:t xml:space="preserve"> </w:t>
+      </w:r>
+      <w:r>
+        <w:t xml:space="preserve">Check them against the time and disk space available before starting.</w:t>
+      </w:r>
+    </w:p>
+    <w:p>
+      <w:pPr>
+        <w:pStyle w:val="FirstParagraph"/>
+      </w:pPr>
+      <w:r>
+        <w:t xml:space="preserve">Send</w:t>
       </w:r>
       <w:r>
         <w:t xml:space="preserve"> </w:t>
@@ -1425,7 +1631,16 @@
         <w:t xml:space="preserve">plan_summary.txt</w:t>
       </w:r>
       <w:r>
-        <w:t xml:space="preserve">, and kept in</w:t>
+        <w:t xml:space="preserve"> </w:t>
+      </w:r>
+      <w:r>
+        <w:t xml:space="preserve">to the engineer with the other deliverables (section 9). The</w:t>
+      </w:r>
+      <w:r>
+        <w:t xml:space="preserve"> </w:t>
+      </w:r>
+      <w:r>
+        <w:t xml:space="preserve">example below is also kept as</w:t>
       </w:r>
       <w:r>
         <w:t xml:space="preserve"> </w:t>
@@ -1437,7 +1652,7 @@
         <w:t xml:space="preserve">figures/plan_example_summary.txt</w:t>
       </w:r>
       <w:r>
-        <w:t xml:space="preserve">):</w:t>
+        <w:t xml:space="preserve">.</w:t>
       </w:r>
     </w:p>
     <w:p>
@@ -1457,7 +1672,7 @@
         <w:rPr>
           <w:rStyle w:val="VerbatimChar"/>
         </w:rPr>
-        <w:t xml:space="preserve">Sensor-to-base transform: matrix from /tmp/tmpo8ktdcjp/sensor.json</w:t>
+        <w:t xml:space="preserve">Sensor-to-base transform: matrix from boot.json</w:t>
       </w:r>
       <w:r>
         <w:br/>
@@ -2217,212 +2432,11 @@
         <w:pStyle w:val="Compact"/>
         <w:numPr>
           <w:ilvl w:val="0"/>
-          <w:numId w:val="1003"/>
+          <w:numId w:val="1004"/>
         </w:numPr>
       </w:pPr>
       <w:r>
         <w:t xml:space="preserve">Move to the target pose with one joint move, from wherever the robot is.</w:t>
-      </w:r>
-    </w:p>
-    <w:p>
-      <w:pPr>
-        <w:pStyle w:val="Compact"/>
-        <w:numPr>
-          <w:ilvl w:val="0"/>
-          <w:numId w:val="1003"/>
-        </w:numPr>
-      </w:pPr>
-      <w:r>
-        <w:t xml:space="preserve">Wait 1.5 seconds for vibration to settle.</w:t>
-      </w:r>
-    </w:p>
-    <w:p>
-      <w:pPr>
-        <w:pStyle w:val="Compact"/>
-        <w:numPr>
-          <w:ilvl w:val="0"/>
-          <w:numId w:val="1003"/>
-        </w:numPr>
-      </w:pPr>
-      <w:r>
-        <w:t xml:space="preserve">Trigger the capture of 5 frames; file names</w:t>
-      </w:r>
-      <w:r>
-        <w:t xml:space="preserve"> </w:t>
-      </w:r>
-      <w:r>
-        <w:rPr>
-          <w:rStyle w:val="VerbatimChar"/>
-        </w:rPr>
-        <w:t xml:space="preserve">&lt;pose_id&gt;_Index00.mc</w:t>
-      </w:r>
-      <w:r>
-        <w:t xml:space="preserve"> </w:t>
-      </w:r>
-      <w:r>
-        <w:t xml:space="preserve">to</w:t>
-      </w:r>
-      <w:r>
-        <w:t xml:space="preserve"> </w:t>
-      </w:r>
-      <w:r>
-        <w:rPr>
-          <w:rStyle w:val="VerbatimChar"/>
-        </w:rPr>
-        <w:t xml:space="preserve">&lt;pose_id&gt;_Index04.mc</w:t>
-      </w:r>
-      <w:r>
-        <w:t xml:space="preserve">, in the folder</w:t>
-      </w:r>
-      <w:r>
-        <w:t xml:space="preserve"> </w:t>
-      </w:r>
-      <w:r>
-        <w:rPr>
-          <w:rStyle w:val="VerbatimChar"/>
-        </w:rPr>
-        <w:t xml:space="preserve">captures_A/</w:t>
-      </w:r>
-      <w:r>
-        <w:t xml:space="preserve">.</w:t>
-      </w:r>
-    </w:p>
-    <w:p>
-      <w:pPr>
-        <w:pStyle w:val="Compact"/>
-        <w:numPr>
-          <w:ilvl w:val="0"/>
-          <w:numId w:val="1003"/>
-        </w:numPr>
-      </w:pPr>
-      <w:r>
-        <w:t xml:space="preserve">Read the robot’s actual reported tool pose (not the commanded one, the reported</w:t>
-      </w:r>
-      <w:r>
-        <w:t xml:space="preserve"> </w:t>
-      </w:r>
-      <w:r>
-        <w:t xml:space="preserve">one) and, if the controller gives them, the six joint angles; append them to the</w:t>
-      </w:r>
-      <w:r>
-        <w:t xml:space="preserve"> </w:t>
-      </w:r>
-      <w:r>
-        <w:t xml:space="preserve">pose log</w:t>
-      </w:r>
-      <w:r>
-        <w:t xml:space="preserve"> </w:t>
-      </w:r>
-      <w:r>
-        <w:rPr>
-          <w:rStyle w:val="VerbatimChar"/>
-        </w:rPr>
-        <w:t xml:space="preserve">pose_log_A.csv</w:t>
-      </w:r>
-      <w:r>
-        <w:t xml:space="preserve"> </w:t>
-      </w:r>
-      <w:r>
-        <w:t xml:space="preserve">(section 7).</w:t>
-      </w:r>
-    </w:p>
-    <w:p>
-      <w:pPr>
-        <w:pStyle w:val="Compact"/>
-        <w:numPr>
-          <w:ilvl w:val="0"/>
-          <w:numId w:val="1003"/>
-        </w:numPr>
-      </w:pPr>
-      <w:r>
-        <w:t xml:space="preserve">Move on.</w:t>
-      </w:r>
-    </w:p>
-    <w:p>
-      <w:pPr>
-        <w:pStyle w:val="FirstParagraph"/>
-      </w:pPr>
-      <w:r>
-        <w:rPr>
-          <w:b/>
-          <w:bCs/>
-        </w:rPr>
-        <w:t xml:space="preserve">Sub-procedure B,</w:t>
-      </w:r>
-      <w:r>
-        <w:rPr>
-          <w:b/>
-          <w:bCs/>
-        </w:rPr>
-        <w:t xml:space="preserve"> </w:t>
-      </w:r>
-      <w:r>
-        <w:rPr>
-          <w:b/>
-          <w:bCs/>
-        </w:rPr>
-        <w:t xml:space="preserve">“minimizing backlash”</w:t>
-      </w:r>
-      <w:r>
-        <w:rPr>
-          <w:b/>
-          <w:bCs/>
-        </w:rPr>
-        <w:t xml:space="preserve">.</w:t>
-      </w:r>
-      <w:r>
-        <w:t xml:space="preserve"> </w:t>
-      </w:r>
-      <w:r>
-        <w:t xml:space="preserve">The idea: gear backlash means the flange</w:t>
-      </w:r>
-      <w:r>
-        <w:t xml:space="preserve"> </w:t>
-      </w:r>
-      <w:r>
-        <w:t xml:space="preserve">can sit on either side of a small dead band after a move, depending on which way each</w:t>
-      </w:r>
-      <w:r>
-        <w:t xml:space="preserve"> </w:t>
-      </w:r>
-      <w:r>
-        <w:t xml:space="preserve">joint last moved. Approaching every target pose with the same final move makes the</w:t>
-      </w:r>
-      <w:r>
-        <w:t xml:space="preserve"> </w:t>
-      </w:r>
-      <w:r>
-        <w:t xml:space="preserve">last motion of each joint the same at every pose, as far as the geometry allows, so</w:t>
-      </w:r>
-      <w:r>
-        <w:t xml:space="preserve"> </w:t>
-      </w:r>
-      <w:r>
-        <w:t xml:space="preserve">the dead band is taken up the same way each time and its effect is constant instead</w:t>
-      </w:r>
-      <w:r>
-        <w:t xml:space="preserve"> </w:t>
-      </w:r>
-      <w:r>
-        <w:t xml:space="preserve">of random. The approach pose in the plan is the target pose moved back 40 mm along</w:t>
-      </w:r>
-      <w:r>
-        <w:t xml:space="preserve"> </w:t>
-      </w:r>
-      <w:r>
-        <w:t xml:space="preserve">the board’s own normal (away from the sensor) and turned 3 degrees about the board’s</w:t>
-      </w:r>
-      <w:r>
-        <w:t xml:space="preserve"> </w:t>
-      </w:r>
-      <w:r>
-        <w:t xml:space="preserve">long edge; the final move is therefore the same 40 mm advance and 3 degree turn at</w:t>
-      </w:r>
-      <w:r>
-        <w:t xml:space="preserve"> </w:t>
-      </w:r>
-      <w:r>
-        <w:t xml:space="preserve">every pose. Robot program outline, for each row:</w:t>
       </w:r>
     </w:p>
     <w:p>
@@ -2434,7 +2448,7 @@
         </w:numPr>
       </w:pPr>
       <w:r>
-        <w:t xml:space="preserve">Move to the approach pose with a joint move, from wherever the robot is.</w:t>
+        <w:t xml:space="preserve">Wait 1.5 seconds for vibration to settle.</w:t>
       </w:r>
     </w:p>
     <w:p>
@@ -2446,7 +2460,46 @@
         </w:numPr>
       </w:pPr>
       <w:r>
-        <w:t xml:space="preserve">Wait 0.5 seconds.</w:t>
+        <w:t xml:space="preserve">Trigger the capture of 5 frames; file names</w:t>
+      </w:r>
+      <w:r>
+        <w:t xml:space="preserve"> </w:t>
+      </w:r>
+      <w:r>
+        <w:rPr>
+          <w:rStyle w:val="VerbatimChar"/>
+        </w:rPr>
+        <w:t xml:space="preserve">&lt;pose_id&gt;_Index00.mc</w:t>
+      </w:r>
+      <w:r>
+        <w:t xml:space="preserve"> </w:t>
+      </w:r>
+      <w:r>
+        <w:t xml:space="preserve">to</w:t>
+      </w:r>
+      <w:r>
+        <w:t xml:space="preserve"> </w:t>
+      </w:r>
+      <w:r>
+        <w:rPr>
+          <w:rStyle w:val="VerbatimChar"/>
+        </w:rPr>
+        <w:t xml:space="preserve">&lt;pose_id&gt;_Index04.mc</w:t>
+      </w:r>
+      <w:r>
+        <w:t xml:space="preserve">, in the folder</w:t>
+      </w:r>
+      <w:r>
+        <w:t xml:space="preserve"> </w:t>
+      </w:r>
+      <w:r>
+        <w:rPr>
+          <w:rStyle w:val="VerbatimChar"/>
+        </w:rPr>
+        <w:t xml:space="preserve">captures_A/</w:t>
+      </w:r>
+      <w:r>
+        <w:t xml:space="preserve">.</w:t>
       </w:r>
     </w:p>
     <w:p>
@@ -2458,49 +2511,34 @@
         </w:numPr>
       </w:pPr>
       <w:r>
-        <w:t xml:space="preserve">Make a linear move onto the target pose, at the same speed for every pose, without</w:t>
-      </w:r>
-      <w:r>
-        <w:t xml:space="preserve"> </w:t>
-      </w:r>
-      <w:r>
-        <w:t xml:space="preserve">stopping or reversing on the way. If the controller offers a</w:t>
-      </w:r>
-      <w:r>
-        <w:t xml:space="preserve"> </w:t>
-      </w:r>
-      <w:r>
-        <w:t xml:space="preserve">“fine”</w:t>
-      </w:r>
-      <w:r>
-        <w:t xml:space="preserve"> </w:t>
-      </w:r>
-      <w:r>
-        <w:t xml:space="preserve">or</w:t>
-      </w:r>
-      <w:r>
-        <w:t xml:space="preserve"> </w:t>
-      </w:r>
-      <w:r>
-        <w:t xml:space="preserve">“exact</w:t>
-      </w:r>
-      <w:r>
-        <w:t xml:space="preserve"> </w:t>
-      </w:r>
-      <w:r>
-        <w:t xml:space="preserve">stop”</w:t>
-      </w:r>
-      <w:r>
-        <w:t xml:space="preserve"> </w:t>
-      </w:r>
-      <w:r>
-        <w:t xml:space="preserve">positioning mode for the end of a move, use it here and in sub-procedure A</w:t>
-      </w:r>
-      <w:r>
-        <w:t xml:space="preserve"> </w:t>
-      </w:r>
-      <w:r>
-        <w:t xml:space="preserve">alike.</w:t>
+        <w:t xml:space="preserve">Read the robot’s actual reported tool pose (not the commanded one, the reported</w:t>
+      </w:r>
+      <w:r>
+        <w:t xml:space="preserve"> </w:t>
+      </w:r>
+      <w:r>
+        <w:t xml:space="preserve">one) and, if the controller gives them, the six joint angles; append them to the</w:t>
+      </w:r>
+      <w:r>
+        <w:t xml:space="preserve"> </w:t>
+      </w:r>
+      <w:r>
+        <w:t xml:space="preserve">pose log</w:t>
+      </w:r>
+      <w:r>
+        <w:t xml:space="preserve"> </w:t>
+      </w:r>
+      <w:r>
+        <w:rPr>
+          <w:rStyle w:val="VerbatimChar"/>
+        </w:rPr>
+        <w:t xml:space="preserve">pose_log_A.csv</w:t>
+      </w:r>
+      <w:r>
+        <w:t xml:space="preserve"> </w:t>
+      </w:r>
+      <w:r>
+        <w:t xml:space="preserve">(section 7).</w:t>
       </w:r>
     </w:p>
     <w:p>
@@ -2512,234 +2550,94 @@
         </w:numPr>
       </w:pPr>
       <w:r>
-        <w:t xml:space="preserve">Wait 1.5 seconds for vibration to settle.</w:t>
-      </w:r>
-    </w:p>
-    <w:p>
-      <w:pPr>
-        <w:pStyle w:val="Compact"/>
-        <w:numPr>
-          <w:ilvl w:val="0"/>
-          <w:numId w:val="1004"/>
-        </w:numPr>
-      </w:pPr>
-      <w:r>
-        <w:t xml:space="preserve">Trigger the capture of 5 frames; file names as above, in the folder</w:t>
-      </w:r>
-      <w:r>
-        <w:t xml:space="preserve"> </w:t>
-      </w:r>
-      <w:r>
-        <w:rPr>
-          <w:rStyle w:val="VerbatimChar"/>
-        </w:rPr>
-        <w:t xml:space="preserve">captures_B/</w:t>
-      </w:r>
-      <w:r>
+        <w:t xml:space="preserve">Move on.</w:t>
+      </w:r>
+    </w:p>
+    <w:p>
+      <w:pPr>
+        <w:pStyle w:val="FirstParagraph"/>
+      </w:pPr>
+      <w:r>
+        <w:rPr>
+          <w:b/>
+          <w:bCs/>
+        </w:rPr>
+        <w:t xml:space="preserve">Sub-procedure B,</w:t>
+      </w:r>
+      <w:r>
+        <w:rPr>
+          <w:b/>
+          <w:bCs/>
+        </w:rPr>
+        <w:t xml:space="preserve"> </w:t>
+      </w:r>
+      <w:r>
+        <w:rPr>
+          <w:b/>
+          <w:bCs/>
+        </w:rPr>
+        <w:t xml:space="preserve">“minimizing backlash”</w:t>
+      </w:r>
+      <w:r>
+        <w:rPr>
+          <w:b/>
+          <w:bCs/>
+        </w:rPr>
         <w:t xml:space="preserve">.</w:t>
       </w:r>
-    </w:p>
-    <w:p>
-      <w:pPr>
-        <w:pStyle w:val="Compact"/>
-        <w:numPr>
-          <w:ilvl w:val="0"/>
-          <w:numId w:val="1004"/>
-        </w:numPr>
-      </w:pPr>
-      <w:r>
-        <w:t xml:space="preserve">Read the reported tool pose and, if available, the joint angles at the target,</w:t>
-      </w:r>
-      <w:r>
-        <w:t xml:space="preserve"> </w:t>
-      </w:r>
-      <w:r>
-        <w:t xml:space="preserve">and append them to</w:t>
-      </w:r>
-      <w:r>
-        <w:t xml:space="preserve"> </w:t>
-      </w:r>
-      <w:r>
-        <w:rPr>
-          <w:rStyle w:val="VerbatimChar"/>
-        </w:rPr>
-        <w:t xml:space="preserve">pose_log_B.csv</w:t>
-      </w:r>
-      <w:r>
-        <w:t xml:space="preserve">; if the controller can also report the joint</w:t>
-      </w:r>
-      <w:r>
-        <w:t xml:space="preserve"> </w:t>
-      </w:r>
-      <w:r>
-        <w:t xml:space="preserve">angles at the approach pose, log those in the</w:t>
-      </w:r>
-      <w:r>
-        <w:t xml:space="preserve"> </w:t>
-      </w:r>
-      <w:r>
-        <w:rPr>
-          <w:rStyle w:val="VerbatimChar"/>
-        </w:rPr>
-        <w:t xml:space="preserve">approach_j1..approach_j6</w:t>
-      </w:r>
-      <w:r>
-        <w:t xml:space="preserve"> </w:t>
-      </w:r>
-      <w:r>
-        <w:t xml:space="preserve">columns.</w:t>
-      </w:r>
-      <w:r>
-        <w:t xml:space="preserve"> </w:t>
-      </w:r>
-      <w:r>
-        <w:t xml:space="preserve">The check tool uses them to confirm that each joint’s final motion had the same</w:t>
-      </w:r>
-      <w:r>
-        <w:t xml:space="preserve"> </w:t>
-      </w:r>
-      <w:r>
-        <w:t xml:space="preserve">direction at every pose.</w:t>
-      </w:r>
-    </w:p>
-    <w:p>
-      <w:pPr>
-        <w:pStyle w:val="Compact"/>
-        <w:numPr>
-          <w:ilvl w:val="0"/>
-          <w:numId w:val="1004"/>
-        </w:numPr>
-      </w:pPr>
-      <w:r>
-        <w:t xml:space="preserve">Move on.</w:t>
-      </w:r>
-    </w:p>
-    <w:p>
-      <w:pPr>
-        <w:pStyle w:val="FirstParagraph"/>
-      </w:pPr>
-      <w:r>
-        <w:t xml:space="preserve">Use the same speed and acceleration settings in both sub-procedures. Do all of A,</w:t>
-      </w:r>
-      <w:r>
-        <w:t xml:space="preserve"> </w:t>
-      </w:r>
-      <w:r>
-        <w:t xml:space="preserve">then all of B (or the other way round); do not interleave, and do not move the</w:t>
-      </w:r>
-      <w:r>
-        <w:t xml:space="preserve"> </w:t>
-      </w:r>
-      <w:r>
-        <w:t xml:space="preserve">sensor or remount the board between them. At about 8 seconds per pose in A and 12 in</w:t>
-      </w:r>
-      <w:r>
-        <w:t xml:space="preserve"> </w:t>
-      </w:r>
-      <w:r>
-        <w:t xml:space="preserve">B, the robot time for the default plan of about 240 poses is about 80 minutes in</w:t>
-      </w:r>
-      <w:r>
-        <w:t xml:space="preserve"> </w:t>
-      </w:r>
-      <w:r>
-        <w:t xml:space="preserve">all; plan on about three hours including the setup and the checks.</w:t>
-      </w:r>
-    </w:p>
-    <w:bookmarkEnd w:id="20"/>
-    <w:bookmarkStart w:id="21" w:name="Xc279066e6a46f3b5efa771585a0fe6c1009c89c"/>
-    <w:p>
-      <w:pPr>
-        <w:pStyle w:val="Heading2"/>
-      </w:pPr>
-      <w:r>
-        <w:t xml:space="preserve">7. Recording the poses: the pose log and the manifest</w:t>
-      </w:r>
-    </w:p>
-    <w:p>
-      <w:pPr>
-        <w:pStyle w:val="FirstParagraph"/>
-      </w:pPr>
-      <w:r>
-        <w:t xml:space="preserve">The capture software writes the sensor data. The pose must be recorded separately,</w:t>
-      </w:r>
-      <w:r>
-        <w:t xml:space="preserve"> </w:t>
-      </w:r>
-      <w:r>
-        <w:t xml:space="preserve">in one of two ways. Both are supported; use the first if the capture software can do it.</w:t>
-      </w:r>
-    </w:p>
-    <w:p>
-      <w:pPr>
-        <w:pStyle w:val="BodyText"/>
-      </w:pPr>
-      <w:r>
-        <w:t xml:space="preserve">Option A, pose in the file header. If the capture software can be given the robot’s</w:t>
-      </w:r>
-      <w:r>
-        <w:t xml:space="preserve"> </w:t>
-      </w:r>
-      <w:r>
-        <w:t xml:space="preserve">pose at capture time, it writes it into the file’s header under the key</w:t>
-      </w:r>
-      <w:r>
-        <w:t xml:space="preserve"> </w:t>
-      </w:r>
-      <w:r>
-        <w:rPr>
-          <w:rStyle w:val="VerbatimChar"/>
-        </w:rPr>
-        <w:t xml:space="preserve">robotPose</w:t>
-      </w:r>
-      <w:r>
-        <w:t xml:space="preserve"> </w:t>
-      </w:r>
-      <w:r>
-        <w:t xml:space="preserve">as a 4 x 4 matrix (16 numbers, row by row: rotation in the top-left 3 x 3, position</w:t>
-      </w:r>
-      <w:r>
-        <w:t xml:space="preserve"> </w:t>
-      </w:r>
-      <w:r>
-        <w:t xml:space="preserve">in the right column, last row 0 0 0 1), tool frame to base frame. Then the pose log</w:t>
-      </w:r>
-      <w:r>
-        <w:t xml:space="preserve"> </w:t>
-      </w:r>
-      <w:r>
-        <w:t xml:space="preserve">is only needed for the joint angles.</w:t>
-      </w:r>
-    </w:p>
-    <w:p>
-      <w:pPr>
-        <w:pStyle w:val="BodyText"/>
-      </w:pPr>
-      <w:r>
-        <w:t xml:space="preserve">Option B, pose log plus manifest (preferred when option A is not available, and</w:t>
-      </w:r>
-      <w:r>
-        <w:t xml:space="preserve"> </w:t>
-      </w:r>
-      <w:r>
-        <w:t xml:space="preserve">recommended anyway as a backup). The robot program appends one line per pose to a</w:t>
-      </w:r>
-      <w:r>
-        <w:t xml:space="preserve"> </w:t>
-      </w:r>
-      <w:r>
-        <w:t xml:space="preserve">CSV file, the pose log, with these columns:</w:t>
-      </w:r>
-    </w:p>
-    <w:p>
-      <w:pPr>
-        <w:pStyle w:val="SourceCode"/>
-      </w:pPr>
-      <w:r>
-        <w:rPr>
-          <w:rStyle w:val="VerbatimChar"/>
-        </w:rPr>
-        <w:t xml:space="preserve">pose_id, kind, radius_mm, half_width_mm, half_height_mm, x_mm, y_mm, z_mm, rotation_type, r1, r2, r3, r4, j1, j2, j3, j4, j5, j6, approach_j1, ..., approach_j6</w:t>
+      <w:r>
+        <w:t xml:space="preserve"> </w:t>
+      </w:r>
+      <w:r>
+        <w:t xml:space="preserve">The idea: gear backlash means the flange</w:t>
+      </w:r>
+      <w:r>
+        <w:t xml:space="preserve"> </w:t>
+      </w:r>
+      <w:r>
+        <w:t xml:space="preserve">can sit on either side of a small dead band after a move, depending on which way each</w:t>
+      </w:r>
+      <w:r>
+        <w:t xml:space="preserve"> </w:t>
+      </w:r>
+      <w:r>
+        <w:t xml:space="preserve">joint last moved. Approaching every target pose with the same final move makes the</w:t>
+      </w:r>
+      <w:r>
+        <w:t xml:space="preserve"> </w:t>
+      </w:r>
+      <w:r>
+        <w:t xml:space="preserve">last motion of each joint the same at every pose, as far as the geometry allows, so</w:t>
+      </w:r>
+      <w:r>
+        <w:t xml:space="preserve"> </w:t>
+      </w:r>
+      <w:r>
+        <w:t xml:space="preserve">the dead band is taken up the same way each time and its effect is constant instead</w:t>
+      </w:r>
+      <w:r>
+        <w:t xml:space="preserve"> </w:t>
+      </w:r>
+      <w:r>
+        <w:t xml:space="preserve">of random. The approach pose in the plan is the target pose moved back 40 mm along</w:t>
+      </w:r>
+      <w:r>
+        <w:t xml:space="preserve"> </w:t>
+      </w:r>
+      <w:r>
+        <w:t xml:space="preserve">the board’s own normal (away from the sensor) and turned 3 degrees about the board’s</w:t>
+      </w:r>
+      <w:r>
+        <w:t xml:space="preserve"> </w:t>
+      </w:r>
+      <w:r>
+        <w:t xml:space="preserve">long edge; the final move is therefore the same 40 mm advance and 3 degree turn at</w:t>
+      </w:r>
+      <w:r>
+        <w:t xml:space="preserve"> </w:t>
+      </w:r>
+      <w:r>
+        <w:t xml:space="preserve">every pose. Robot program outline, for each row:</w:t>
       </w:r>
     </w:p>
     <w:p>
@@ -2751,25 +2649,7 @@
         </w:numPr>
       </w:pPr>
       <w:r>
-        <w:rPr>
-          <w:rStyle w:val="VerbatimChar"/>
-        </w:rPr>
-        <w:t xml:space="preserve">pose_id</w:t>
-      </w:r>
-      <w:r>
-        <w:t xml:space="preserve">: exactly the id from</w:t>
-      </w:r>
-      <w:r>
-        <w:t xml:space="preserve"> </w:t>
-      </w:r>
-      <w:r>
-        <w:rPr>
-          <w:rStyle w:val="VerbatimChar"/>
-        </w:rPr>
-        <w:t xml:space="preserve">poses.csv</w:t>
-      </w:r>
-      <w:r>
-        <w:t xml:space="preserve">, which is also the start of the file names.</w:t>
+        <w:t xml:space="preserve">Move to the approach pose with a joint move, from wherever the robot is.</w:t>
       </w:r>
     </w:p>
     <w:p>
@@ -2781,37 +2661,7 @@
         </w:numPr>
       </w:pPr>
       <w:r>
-        <w:rPr>
-          <w:rStyle w:val="VerbatimChar"/>
-        </w:rPr>
-        <w:t xml:space="preserve">kind</w:t>
-      </w:r>
-      <w:r>
-        <w:t xml:space="preserve">:</w:t>
-      </w:r>
-      <w:r>
-        <w:t xml:space="preserve"> </w:t>
-      </w:r>
-      <w:r>
-        <w:rPr>
-          <w:rStyle w:val="VerbatimChar"/>
-        </w:rPr>
-        <w:t xml:space="preserve">board</w:t>
-      </w:r>
-      <w:r>
-        <w:t xml:space="preserve">.</w:t>
-      </w:r>
-      <w:r>
-        <w:t xml:space="preserve"> </w:t>
-      </w:r>
-      <w:r>
-        <w:rPr>
-          <w:rStyle w:val="VerbatimChar"/>
-        </w:rPr>
-        <w:t xml:space="preserve">radius_mm</w:t>
-      </w:r>
-      <w:r>
-        <w:t xml:space="preserve">: empty.</w:t>
+        <w:t xml:space="preserve">Wait 0.5 seconds.</w:t>
       </w:r>
     </w:p>
     <w:p>
@@ -2823,25 +2673,49 @@
         </w:numPr>
       </w:pPr>
       <w:r>
-        <w:rPr>
-          <w:rStyle w:val="VerbatimChar"/>
-        </w:rPr>
-        <w:t xml:space="preserve">half_width_mm</w:t>
-      </w:r>
-      <w:r>
-        <w:t xml:space="preserve">,</w:t>
-      </w:r>
-      <w:r>
-        <w:t xml:space="preserve"> </w:t>
-      </w:r>
-      <w:r>
-        <w:rPr>
-          <w:rStyle w:val="VerbatimChar"/>
-        </w:rPr>
-        <w:t xml:space="preserve">half_height_mm</w:t>
-      </w:r>
-      <w:r>
-        <w:t xml:space="preserve">: half the measured board size.</w:t>
+        <w:t xml:space="preserve">Make a linear move onto the target pose, at the same speed for every pose, without</w:t>
+      </w:r>
+      <w:r>
+        <w:t xml:space="preserve"> </w:t>
+      </w:r>
+      <w:r>
+        <w:t xml:space="preserve">stopping or reversing on the way. If the controller offers a</w:t>
+      </w:r>
+      <w:r>
+        <w:t xml:space="preserve"> </w:t>
+      </w:r>
+      <w:r>
+        <w:t xml:space="preserve">“fine”</w:t>
+      </w:r>
+      <w:r>
+        <w:t xml:space="preserve"> </w:t>
+      </w:r>
+      <w:r>
+        <w:t xml:space="preserve">or</w:t>
+      </w:r>
+      <w:r>
+        <w:t xml:space="preserve"> </w:t>
+      </w:r>
+      <w:r>
+        <w:t xml:space="preserve">“exact</w:t>
+      </w:r>
+      <w:r>
+        <w:t xml:space="preserve"> </w:t>
+      </w:r>
+      <w:r>
+        <w:t xml:space="preserve">stop”</w:t>
+      </w:r>
+      <w:r>
+        <w:t xml:space="preserve"> </w:t>
+      </w:r>
+      <w:r>
+        <w:t xml:space="preserve">positioning mode for the end of a move, use it here and in sub-procedure A</w:t>
+      </w:r>
+      <w:r>
+        <w:t xml:space="preserve"> </w:t>
+      </w:r>
+      <w:r>
+        <w:t xml:space="preserve">alike.</w:t>
       </w:r>
     </w:p>
     <w:p>
@@ -2853,37 +2727,7 @@
         </w:numPr>
       </w:pPr>
       <w:r>
-        <w:rPr>
-          <w:rStyle w:val="VerbatimChar"/>
-        </w:rPr>
-        <w:t xml:space="preserve">x_mm</w:t>
-      </w:r>
-      <w:r>
-        <w:t xml:space="preserve">,</w:t>
-      </w:r>
-      <w:r>
-        <w:t xml:space="preserve"> </w:t>
-      </w:r>
-      <w:r>
-        <w:rPr>
-          <w:rStyle w:val="VerbatimChar"/>
-        </w:rPr>
-        <w:t xml:space="preserve">y_mm</w:t>
-      </w:r>
-      <w:r>
-        <w:t xml:space="preserve">,</w:t>
-      </w:r>
-      <w:r>
-        <w:t xml:space="preserve"> </w:t>
-      </w:r>
-      <w:r>
-        <w:rPr>
-          <w:rStyle w:val="VerbatimChar"/>
-        </w:rPr>
-        <w:t xml:space="preserve">z_mm</w:t>
-      </w:r>
-      <w:r>
-        <w:t xml:space="preserve">: the reported tool position in the base frame.</w:t>
+        <w:t xml:space="preserve">Wait 1.5 seconds for vibration to settle.</w:t>
       </w:r>
     </w:p>
     <w:p>
@@ -2895,112 +2739,19 @@
         </w:numPr>
       </w:pPr>
       <w:r>
-        <w:rPr>
-          <w:rStyle w:val="VerbatimChar"/>
-        </w:rPr>
-        <w:t xml:space="preserve">rotation_type</w:t>
-      </w:r>
-      <w:r>
-        <w:t xml:space="preserve"> </w:t>
-      </w:r>
-      <w:r>
-        <w:t xml:space="preserve">and</w:t>
-      </w:r>
-      <w:r>
-        <w:t xml:space="preserve"> </w:t>
-      </w:r>
-      <w:r>
-        <w:rPr>
-          <w:rStyle w:val="VerbatimChar"/>
-        </w:rPr>
-        <w:t xml:space="preserve">r1..r4</w:t>
-      </w:r>
-      <w:r>
-        <w:t xml:space="preserve">: the reported tool orientation, in whatever form the</w:t>
-      </w:r>
-      <w:r>
-        <w:t xml:space="preserve"> </w:t>
-      </w:r>
-      <w:r>
-        <w:t xml:space="preserve">controller gives, named by one of:</w:t>
-      </w:r>
-      <w:r>
-        <w:t xml:space="preserve"> </w:t>
-      </w:r>
-      <w:r>
-        <w:rPr>
-          <w:rStyle w:val="VerbatimChar"/>
-        </w:rPr>
-        <w:t xml:space="preserve">quaternion_wxyz</w:t>
-      </w:r>
-      <w:r>
-        <w:t xml:space="preserve">,</w:t>
-      </w:r>
-      <w:r>
-        <w:t xml:space="preserve"> </w:t>
-      </w:r>
-      <w:r>
-        <w:rPr>
-          <w:rStyle w:val="VerbatimChar"/>
-        </w:rPr>
-        <w:t xml:space="preserve">quaternion_xyzw</w:t>
-      </w:r>
-      <w:r>
-        <w:t xml:space="preserve">,</w:t>
-      </w:r>
-      <w:r>
-        <w:t xml:space="preserve"> </w:t>
-      </w:r>
-      <w:r>
-        <w:rPr>
-          <w:rStyle w:val="VerbatimChar"/>
-        </w:rPr>
-        <w:t xml:space="preserve">euler_zyx_deg</w:t>
-      </w:r>
-      <w:r>
-        <w:t xml:space="preserve"> </w:t>
-      </w:r>
-      <w:r>
-        <w:t xml:space="preserve">(KUKA A, B, C),</w:t>
-      </w:r>
-      <w:r>
-        <w:t xml:space="preserve"> </w:t>
-      </w:r>
-      <w:r>
-        <w:rPr>
-          <w:rStyle w:val="VerbatimChar"/>
-        </w:rPr>
-        <w:t xml:space="preserve">fixed_xyz_deg</w:t>
-      </w:r>
-      <w:r>
-        <w:t xml:space="preserve"> </w:t>
-      </w:r>
-      <w:r>
-        <w:t xml:space="preserve">(FANUC W, P, R),</w:t>
-      </w:r>
-      <w:r>
-        <w:t xml:space="preserve"> </w:t>
-      </w:r>
-      <w:r>
-        <w:rPr>
-          <w:rStyle w:val="VerbatimChar"/>
-        </w:rPr>
-        <w:t xml:space="preserve">euler_xyz_deg</w:t>
-      </w:r>
-      <w:r>
-        <w:t xml:space="preserve">,</w:t>
-      </w:r>
-      <w:r>
-        <w:t xml:space="preserve"> </w:t>
-      </w:r>
-      <w:r>
-        <w:rPr>
-          <w:rStyle w:val="VerbatimChar"/>
-        </w:rPr>
-        <w:t xml:space="preserve">rotvec_deg</w:t>
-      </w:r>
-      <w:r>
-        <w:t xml:space="preserve">. Fill unused r columns with nothing.</w:t>
+        <w:t xml:space="preserve">Trigger the capture of 5 frames; file names as above, in the folder</w:t>
+      </w:r>
+      <w:r>
+        <w:t xml:space="preserve"> </w:t>
+      </w:r>
+      <w:r>
+        <w:rPr>
+          <w:rStyle w:val="VerbatimChar"/>
+        </w:rPr>
+        <w:t xml:space="preserve">captures_B/</w:t>
+      </w:r>
+      <w:r>
+        <w:t xml:space="preserve">.</w:t>
       </w:r>
     </w:p>
     <w:p>
@@ -3012,16 +2763,31 @@
         </w:numPr>
       </w:pPr>
       <w:r>
-        <w:rPr>
-          <w:rStyle w:val="VerbatimChar"/>
-        </w:rPr>
-        <w:t xml:space="preserve">j1..j6</w:t>
-      </w:r>
-      <w:r>
-        <w:t xml:space="preserve"> </w:t>
-      </w:r>
-      <w:r>
-        <w:t xml:space="preserve">and</w:t>
+        <w:t xml:space="preserve">Read the reported tool pose and, if available, the joint angles at the target,</w:t>
+      </w:r>
+      <w:r>
+        <w:t xml:space="preserve"> </w:t>
+      </w:r>
+      <w:r>
+        <w:t xml:space="preserve">and append them to</w:t>
+      </w:r>
+      <w:r>
+        <w:t xml:space="preserve"> </w:t>
+      </w:r>
+      <w:r>
+        <w:rPr>
+          <w:rStyle w:val="VerbatimChar"/>
+        </w:rPr>
+        <w:t xml:space="preserve">pose_log_B.csv</w:t>
+      </w:r>
+      <w:r>
+        <w:t xml:space="preserve">; if the controller can also report the joint</w:t>
+      </w:r>
+      <w:r>
+        <w:t xml:space="preserve"> </w:t>
+      </w:r>
+      <w:r>
+        <w:t xml:space="preserve">angles at the approach pose, log those in the</w:t>
       </w:r>
       <w:r>
         <w:t xml:space="preserve"> </w:t>
@@ -3033,13 +2799,34 @@
         <w:t xml:space="preserve">approach_j1..approach_j6</w:t>
       </w:r>
       <w:r>
-        <w:t xml:space="preserve">: the joint angles in degrees, if the</w:t>
-      </w:r>
-      <w:r>
-        <w:t xml:space="preserve"> </w:t>
-      </w:r>
-      <w:r>
-        <w:t xml:space="preserve">controller reports them; otherwise leave the columns out entirely.</w:t>
+        <w:t xml:space="preserve"> </w:t>
+      </w:r>
+      <w:r>
+        <w:t xml:space="preserve">columns.</w:t>
+      </w:r>
+      <w:r>
+        <w:t xml:space="preserve"> </w:t>
+      </w:r>
+      <w:r>
+        <w:t xml:space="preserve">The check tool uses them to confirm that each joint’s final motion had the same</w:t>
+      </w:r>
+      <w:r>
+        <w:t xml:space="preserve"> </w:t>
+      </w:r>
+      <w:r>
+        <w:t xml:space="preserve">direction at every pose.</w:t>
+      </w:r>
+    </w:p>
+    <w:p>
+      <w:pPr>
+        <w:pStyle w:val="Compact"/>
+        <w:numPr>
+          <w:ilvl w:val="0"/>
+          <w:numId w:val="1005"/>
+        </w:numPr>
+      </w:pPr>
+      <w:r>
+        <w:t xml:space="preserve">Move on.</w:t>
       </w:r>
     </w:p>
     <w:p>
@@ -3047,7 +2834,116 @@
         <w:pStyle w:val="FirstParagraph"/>
       </w:pPr>
       <w:r>
-        <w:t xml:space="preserve">Example line:</w:t>
+        <w:t xml:space="preserve">Use the same speed and acceleration settings in both sub-procedures. Do all of A,</w:t>
+      </w:r>
+      <w:r>
+        <w:t xml:space="preserve"> </w:t>
+      </w:r>
+      <w:r>
+        <w:t xml:space="preserve">then all of B (or the other way round); do not interleave, and do not move the</w:t>
+      </w:r>
+      <w:r>
+        <w:t xml:space="preserve"> </w:t>
+      </w:r>
+      <w:r>
+        <w:t xml:space="preserve">sensor or remount the board between them. At about 8 seconds per pose in A and 12 in</w:t>
+      </w:r>
+      <w:r>
+        <w:t xml:space="preserve"> </w:t>
+      </w:r>
+      <w:r>
+        <w:t xml:space="preserve">B, the robot time for the default plan of about 240 poses is about 80 minutes in</w:t>
+      </w:r>
+      <w:r>
+        <w:t xml:space="preserve"> </w:t>
+      </w:r>
+      <w:r>
+        <w:t xml:space="preserve">all; plan on about three hours including the setup and the checks.</w:t>
+      </w:r>
+    </w:p>
+    <w:bookmarkEnd w:id="20"/>
+    <w:bookmarkStart w:id="21" w:name="Xc279066e6a46f3b5efa771585a0fe6c1009c89c"/>
+    <w:p>
+      <w:pPr>
+        <w:pStyle w:val="Heading2"/>
+      </w:pPr>
+      <w:r>
+        <w:t xml:space="preserve">7. Recording the poses: the pose log and the manifest</w:t>
+      </w:r>
+    </w:p>
+    <w:p>
+      <w:pPr>
+        <w:pStyle w:val="FirstParagraph"/>
+      </w:pPr>
+      <w:r>
+        <w:t xml:space="preserve">The capture software writes the sensor data. The pose must be recorded separately,</w:t>
+      </w:r>
+      <w:r>
+        <w:t xml:space="preserve"> </w:t>
+      </w:r>
+      <w:r>
+        <w:t xml:space="preserve">in one of two ways. Both are supported; use the first if the capture software can do it.</w:t>
+      </w:r>
+    </w:p>
+    <w:p>
+      <w:pPr>
+        <w:pStyle w:val="BodyText"/>
+      </w:pPr>
+      <w:r>
+        <w:t xml:space="preserve">Option A, pose in the file header. If the capture software can be given the robot’s</w:t>
+      </w:r>
+      <w:r>
+        <w:t xml:space="preserve"> </w:t>
+      </w:r>
+      <w:r>
+        <w:t xml:space="preserve">pose at capture time, it writes it into the file’s header under the key</w:t>
+      </w:r>
+      <w:r>
+        <w:t xml:space="preserve"> </w:t>
+      </w:r>
+      <w:r>
+        <w:rPr>
+          <w:rStyle w:val="VerbatimChar"/>
+        </w:rPr>
+        <w:t xml:space="preserve">robotPose</w:t>
+      </w:r>
+      <w:r>
+        <w:t xml:space="preserve"> </w:t>
+      </w:r>
+      <w:r>
+        <w:t xml:space="preserve">as a 4 x 4 matrix (16 numbers, row by row: rotation in the top-left 3 x 3, position</w:t>
+      </w:r>
+      <w:r>
+        <w:t xml:space="preserve"> </w:t>
+      </w:r>
+      <w:r>
+        <w:t xml:space="preserve">in the right column, last row 0 0 0 1), tool frame to base frame. Then the pose log</w:t>
+      </w:r>
+      <w:r>
+        <w:t xml:space="preserve"> </w:t>
+      </w:r>
+      <w:r>
+        <w:t xml:space="preserve">is only needed for the joint angles.</w:t>
+      </w:r>
+    </w:p>
+    <w:p>
+      <w:pPr>
+        <w:pStyle w:val="BodyText"/>
+      </w:pPr>
+      <w:r>
+        <w:t xml:space="preserve">Option B, pose log plus manifest (preferred when option A is not available, and</w:t>
+      </w:r>
+      <w:r>
+        <w:t xml:space="preserve"> </w:t>
+      </w:r>
+      <w:r>
+        <w:t xml:space="preserve">recommended anyway as a backup). The robot program appends one line per pose to a</w:t>
+      </w:r>
+      <w:r>
+        <w:t xml:space="preserve"> </w:t>
+      </w:r>
+      <w:r>
+        <w:t xml:space="preserve">CSV file, the pose log, with these columns:</w:t>
       </w:r>
     </w:p>
     <w:p>
@@ -3058,146 +2954,7 @@
         <w:rPr>
           <w:rStyle w:val="VerbatimChar"/>
         </w:rPr>
-        <w:t xml:space="preserve">b_z0650_t24_a090_05,board,,100.0,75.0,850.11,-12.70,470.55,euler_zyx_deg,-91.3,19.8,0.4,,12.1,-35.6,88.2,3.4,41.0,-8.7,11.9,-36.0,88.9,3.1,40.5,-8.4</w:t>
-      </w:r>
-    </w:p>
-    <w:p>
-      <w:pPr>
-        <w:pStyle w:val="FirstParagraph"/>
-      </w:pPr>
-      <w:r>
-        <w:t xml:space="preserve">After each sub-procedure, the manifest is built from its pose log and its capture folder:</w:t>
-      </w:r>
-    </w:p>
-    <w:p>
-      <w:pPr>
-        <w:pStyle w:val="SourceCode"/>
-      </w:pPr>
-      <w:r>
-        <w:rPr>
-          <w:rStyle w:val="VerbatimChar"/>
-        </w:rPr>
-        <w:t xml:space="preserve">python3 -m sphcal.cli.make_manifest --pose-log pose_log_A.csv --captures captures_A/ --format csv --out captures_A/manifest.csv</w:t>
-      </w:r>
-      <w:r>
-        <w:br/>
-      </w:r>
-      <w:r>
-        <w:rPr>
-          <w:rStyle w:val="VerbatimChar"/>
-        </w:rPr>
-        <w:t xml:space="preserve">python3 -m sphcal.cli.make_manifest --pose-log pose_log_B.csv --captures captures_B/ --format csv --out captures_B/manifest.csv</w:t>
-      </w:r>
-    </w:p>
-    <w:p>
-      <w:pPr>
-        <w:pStyle w:val="FirstParagraph"/>
-      </w:pPr>
-      <w:r>
-        <w:t xml:space="preserve">The tool matches every file to its pose id, converts the orientation to the standard</w:t>
-      </w:r>
-      <w:r>
-        <w:t xml:space="preserve"> </w:t>
-      </w:r>
-      <w:r>
-        <w:t xml:space="preserve">matrix form, and complains, by name, about any pose without files, any file without</w:t>
-      </w:r>
-      <w:r>
-        <w:t xml:space="preserve"> </w:t>
-      </w:r>
-      <w:r>
-        <w:t xml:space="preserve">a pose, and any missing size. A</w:t>
-      </w:r>
-      <w:r>
-        <w:t xml:space="preserve"> </w:t>
-      </w:r>
-      <w:r>
-        <w:rPr>
-          <w:rStyle w:val="VerbatimChar"/>
-        </w:rPr>
-        <w:t xml:space="preserve">poses.csv</w:t>
-      </w:r>
-      <w:r>
-        <w:t xml:space="preserve"> </w:t>
-      </w:r>
-      <w:r>
-        <w:t xml:space="preserve">from the plan tool is also accepted</w:t>
-      </w:r>
-      <w:r>
-        <w:t xml:space="preserve"> </w:t>
-      </w:r>
-      <w:r>
-        <w:t xml:space="preserve">directly as the pose log if your robot program cannot write one; then the commanded</w:t>
-      </w:r>
-      <w:r>
-        <w:t xml:space="preserve"> </w:t>
-      </w:r>
-      <w:r>
-        <w:t xml:space="preserve">poses stand in for the reported ones, which is acceptable only for a robot with</w:t>
-      </w:r>
-      <w:r>
-        <w:t xml:space="preserve"> </w:t>
-      </w:r>
-      <w:r>
-        <w:t xml:space="preserve">absolute accuracy better than 0.1 mm, and it defeats the purpose of sub-procedure B.</w:t>
-      </w:r>
-      <w:r>
-        <w:t xml:space="preserve"> </w:t>
-      </w:r>
-      <w:r>
-        <w:t xml:space="preserve">Extra columns such as the joint angles are carried along unchanged.</w:t>
-      </w:r>
-    </w:p>
-    <w:bookmarkEnd w:id="21"/>
-    <w:bookmarkStart w:id="22" w:name="X5519462675585d0256a3c46cb1261738cf187b2"/>
-    <w:p>
-      <w:pPr>
-        <w:pStyle w:val="Heading2"/>
-      </w:pPr>
-      <w:r>
-        <w:t xml:space="preserve">8. Checking the captures before the analysis</w:t>
-      </w:r>
-    </w:p>
-    <w:p>
-      <w:pPr>
-        <w:pStyle w:val="FirstParagraph"/>
-      </w:pPr>
-      <w:r>
-        <w:t xml:space="preserve">Run the quick check on each folder as soon as its captures are complete, while the</w:t>
-      </w:r>
-      <w:r>
-        <w:t xml:space="preserve"> </w:t>
-      </w:r>
-      <w:r>
-        <w:t xml:space="preserve">robot and the board are still set up:</w:t>
-      </w:r>
-    </w:p>
-    <w:p>
-      <w:pPr>
-        <w:pStyle w:val="SourceCode"/>
-      </w:pPr>
-      <w:r>
-        <w:rPr>
-          <w:rStyle w:val="VerbatimChar"/>
-        </w:rPr>
-        <w:t xml:space="preserve">python3 -m planereg.capture.check_captures --manifest captures_A/manifest.csv --sensor-in-base boot.json --pose-log pose_log_A.csv --out captures_A/check.json</w:t>
-      </w:r>
-      <w:r>
-        <w:br/>
-      </w:r>
-      <w:r>
-        <w:rPr>
-          <w:rStyle w:val="VerbatimChar"/>
-        </w:rPr>
-        <w:t xml:space="preserve">python3 -m planereg.capture.check_captures --manifest captures_B/manifest.csv --sensor-in-base boot.json --pose-log pose_log_B.csv --out captures_B/check.json</w:t>
-      </w:r>
-    </w:p>
-    <w:p>
-      <w:pPr>
-        <w:pStyle w:val="FirstParagraph"/>
-      </w:pPr>
-      <w:r>
-        <w:t xml:space="preserve">It prints one line per pose and a verdict. Things it flags, and what they mean:</w:t>
+        <w:t xml:space="preserve">pose_id, kind, radius_mm, half_width_mm, half_height_mm, x_mm, y_mm, z_mm, rotation_type, r1, r2, r3, r4, j1, j2, j3, j4, j5, j6, approach_j1, ..., approach_j6</w:t>
       </w:r>
     </w:p>
     <w:p>
@@ -3209,13 +2966,25 @@
         </w:numPr>
       </w:pPr>
       <w:r>
-        <w:t xml:space="preserve">Low valid fraction (below 50 percent of frames): the board was not read; check</w:t>
-      </w:r>
-      <w:r>
-        <w:t xml:space="preserve"> </w:t>
-      </w:r>
-      <w:r>
-        <w:t xml:space="preserve">exposure, or the board was outside the field.</w:t>
+        <w:rPr>
+          <w:rStyle w:val="VerbatimChar"/>
+        </w:rPr>
+        <w:t xml:space="preserve">pose_id</w:t>
+      </w:r>
+      <w:r>
+        <w:t xml:space="preserve">: exactly the id from</w:t>
+      </w:r>
+      <w:r>
+        <w:t xml:space="preserve"> </w:t>
+      </w:r>
+      <w:r>
+        <w:rPr>
+          <w:rStyle w:val="VerbatimChar"/>
+        </w:rPr>
+        <w:t xml:space="preserve">poses.csv</w:t>
+      </w:r>
+      <w:r>
+        <w:t xml:space="preserve">, which is also the start of the file names.</w:t>
       </w:r>
     </w:p>
     <w:p>
@@ -3227,13 +2996,37 @@
         </w:numPr>
       </w:pPr>
       <w:r>
-        <w:t xml:space="preserve">Board touching the image border: the board is partly out of view; the pose is</w:t>
-      </w:r>
-      <w:r>
-        <w:t xml:space="preserve"> </w:t>
-      </w:r>
-      <w:r>
-        <w:t xml:space="preserve">unusable, re-plan it slightly inward.</w:t>
+        <w:rPr>
+          <w:rStyle w:val="VerbatimChar"/>
+        </w:rPr>
+        <w:t xml:space="preserve">kind</w:t>
+      </w:r>
+      <w:r>
+        <w:t xml:space="preserve">:</w:t>
+      </w:r>
+      <w:r>
+        <w:t xml:space="preserve"> </w:t>
+      </w:r>
+      <w:r>
+        <w:rPr>
+          <w:rStyle w:val="VerbatimChar"/>
+        </w:rPr>
+        <w:t xml:space="preserve">board</w:t>
+      </w:r>
+      <w:r>
+        <w:t xml:space="preserve">.</w:t>
+      </w:r>
+      <w:r>
+        <w:t xml:space="preserve"> </w:t>
+      </w:r>
+      <w:r>
+        <w:rPr>
+          <w:rStyle w:val="VerbatimChar"/>
+        </w:rPr>
+        <w:t xml:space="preserve">radius_mm</w:t>
+      </w:r>
+      <w:r>
+        <w:t xml:space="preserve">: empty.</w:t>
       </w:r>
     </w:p>
     <w:p>
@@ -3245,25 +3038,25 @@
         </w:numPr>
       </w:pPr>
       <w:r>
-        <w:t xml:space="preserve">Segmentation failed: the software could not find a flat surface of the board’s</w:t>
-      </w:r>
-      <w:r>
-        <w:t xml:space="preserve"> </w:t>
-      </w:r>
-      <w:r>
-        <w:t xml:space="preserve">size facing the sensor where the pose says it should be; the pose was copied</w:t>
-      </w:r>
-      <w:r>
-        <w:t xml:space="preserve"> </w:t>
-      </w:r>
-      <w:r>
-        <w:t xml:space="preserve">wrongly, or something flat is closer to the sensor than the board (a cable, a</w:t>
-      </w:r>
-      <w:r>
-        <w:t xml:space="preserve"> </w:t>
-      </w:r>
-      <w:r>
-        <w:t xml:space="preserve">hand, the table), or the board is outside the field.</w:t>
+        <w:rPr>
+          <w:rStyle w:val="VerbatimChar"/>
+        </w:rPr>
+        <w:t xml:space="preserve">half_width_mm</w:t>
+      </w:r>
+      <w:r>
+        <w:t xml:space="preserve">,</w:t>
+      </w:r>
+      <w:r>
+        <w:t xml:space="preserve"> </w:t>
+      </w:r>
+      <w:r>
+        <w:rPr>
+          <w:rStyle w:val="VerbatimChar"/>
+        </w:rPr>
+        <w:t xml:space="preserve">half_height_mm</w:t>
+      </w:r>
+      <w:r>
+        <w:t xml:space="preserve">: half the measured board size.</w:t>
       </w:r>
     </w:p>
     <w:p>
@@ -3275,13 +3068,37 @@
         </w:numPr>
       </w:pPr>
       <w:r>
-        <w:t xml:space="preserve">Plane residual above 1 mm: the board surface read by the sensor is not flat to</w:t>
-      </w:r>
-      <w:r>
-        <w:t xml:space="preserve"> </w:t>
-      </w:r>
-      <w:r>
-        <w:t xml:space="preserve">the sensor; a shiny spot or a dirty board, or an exposure problem.</w:t>
+        <w:rPr>
+          <w:rStyle w:val="VerbatimChar"/>
+        </w:rPr>
+        <w:t xml:space="preserve">x_mm</w:t>
+      </w:r>
+      <w:r>
+        <w:t xml:space="preserve">,</w:t>
+      </w:r>
+      <w:r>
+        <w:t xml:space="preserve"> </w:t>
+      </w:r>
+      <w:r>
+        <w:rPr>
+          <w:rStyle w:val="VerbatimChar"/>
+        </w:rPr>
+        <w:t xml:space="preserve">y_mm</w:t>
+      </w:r>
+      <w:r>
+        <w:t xml:space="preserve">,</w:t>
+      </w:r>
+      <w:r>
+        <w:t xml:space="preserve"> </w:t>
+      </w:r>
+      <w:r>
+        <w:rPr>
+          <w:rStyle w:val="VerbatimChar"/>
+        </w:rPr>
+        <w:t xml:space="preserve">z_mm</w:t>
+      </w:r>
+      <w:r>
+        <w:t xml:space="preserve">: the reported tool position in the base frame.</w:t>
       </w:r>
     </w:p>
     <w:p>
@@ -3293,37 +3110,112 @@
         </w:numPr>
       </w:pPr>
       <w:r>
-        <w:t xml:space="preserve">Normal residual above 1 degree or offset residual above 1 mm against the solved</w:t>
-      </w:r>
-      <w:r>
-        <w:t xml:space="preserve"> </w:t>
-      </w:r>
-      <w:r>
-        <w:t xml:space="preserve">registration: either the robot pose was copied wrongly for that pose, or, if it</w:t>
-      </w:r>
-      <w:r>
-        <w:t xml:space="preserve"> </w:t>
-      </w:r>
-      <w:r>
-        <w:t xml:space="preserve">affects every pose with one tilt direction, the board tool frame’s orientation is</w:t>
-      </w:r>
-      <w:r>
-        <w:t xml:space="preserve"> </w:t>
-      </w:r>
-      <w:r>
-        <w:t xml:space="preserve">wrong (section 3, step 5), or the rotation type in the pose log is misnamed; or,</w:t>
-      </w:r>
-      <w:r>
-        <w:t xml:space="preserve"> </w:t>
-      </w:r>
-      <w:r>
-        <w:t xml:space="preserve">if it grows steadily across the volume, the robot’s base frame or its absolute</w:t>
-      </w:r>
-      <w:r>
-        <w:t xml:space="preserve"> </w:t>
-      </w:r>
-      <w:r>
-        <w:t xml:space="preserve">accuracy is off.</w:t>
+        <w:rPr>
+          <w:rStyle w:val="VerbatimChar"/>
+        </w:rPr>
+        <w:t xml:space="preserve">rotation_type</w:t>
+      </w:r>
+      <w:r>
+        <w:t xml:space="preserve"> </w:t>
+      </w:r>
+      <w:r>
+        <w:t xml:space="preserve">and</w:t>
+      </w:r>
+      <w:r>
+        <w:t xml:space="preserve"> </w:t>
+      </w:r>
+      <w:r>
+        <w:rPr>
+          <w:rStyle w:val="VerbatimChar"/>
+        </w:rPr>
+        <w:t xml:space="preserve">r1..r4</w:t>
+      </w:r>
+      <w:r>
+        <w:t xml:space="preserve">: the reported tool orientation, in whatever form the</w:t>
+      </w:r>
+      <w:r>
+        <w:t xml:space="preserve"> </w:t>
+      </w:r>
+      <w:r>
+        <w:t xml:space="preserve">controller gives, named by one of:</w:t>
+      </w:r>
+      <w:r>
+        <w:t xml:space="preserve"> </w:t>
+      </w:r>
+      <w:r>
+        <w:rPr>
+          <w:rStyle w:val="VerbatimChar"/>
+        </w:rPr>
+        <w:t xml:space="preserve">quaternion_wxyz</w:t>
+      </w:r>
+      <w:r>
+        <w:t xml:space="preserve">,</w:t>
+      </w:r>
+      <w:r>
+        <w:t xml:space="preserve"> </w:t>
+      </w:r>
+      <w:r>
+        <w:rPr>
+          <w:rStyle w:val="VerbatimChar"/>
+        </w:rPr>
+        <w:t xml:space="preserve">quaternion_xyzw</w:t>
+      </w:r>
+      <w:r>
+        <w:t xml:space="preserve">,</w:t>
+      </w:r>
+      <w:r>
+        <w:t xml:space="preserve"> </w:t>
+      </w:r>
+      <w:r>
+        <w:rPr>
+          <w:rStyle w:val="VerbatimChar"/>
+        </w:rPr>
+        <w:t xml:space="preserve">euler_zyx_deg</w:t>
+      </w:r>
+      <w:r>
+        <w:t xml:space="preserve"> </w:t>
+      </w:r>
+      <w:r>
+        <w:t xml:space="preserve">(KUKA A, B, C),</w:t>
+      </w:r>
+      <w:r>
+        <w:t xml:space="preserve"> </w:t>
+      </w:r>
+      <w:r>
+        <w:rPr>
+          <w:rStyle w:val="VerbatimChar"/>
+        </w:rPr>
+        <w:t xml:space="preserve">fixed_xyz_deg</w:t>
+      </w:r>
+      <w:r>
+        <w:t xml:space="preserve"> </w:t>
+      </w:r>
+      <w:r>
+        <w:t xml:space="preserve">(FANUC W, P, R),</w:t>
+      </w:r>
+      <w:r>
+        <w:t xml:space="preserve"> </w:t>
+      </w:r>
+      <w:r>
+        <w:rPr>
+          <w:rStyle w:val="VerbatimChar"/>
+        </w:rPr>
+        <w:t xml:space="preserve">euler_xyz_deg</w:t>
+      </w:r>
+      <w:r>
+        <w:t xml:space="preserve">,</w:t>
+      </w:r>
+      <w:r>
+        <w:t xml:space="preserve"> </w:t>
+      </w:r>
+      <w:r>
+        <w:rPr>
+          <w:rStyle w:val="VerbatimChar"/>
+        </w:rPr>
+        <w:t xml:space="preserve">rotvec_deg</w:t>
+      </w:r>
+      <w:r>
+        <w:t xml:space="preserve">. Fill unused r columns with nothing.</w:t>
       </w:r>
     </w:p>
     <w:p>
@@ -3335,49 +3227,34 @@
         </w:numPr>
       </w:pPr>
       <w:r>
-        <w:t xml:space="preserve">Normal spread below 0.05: the tilts were not varied enough (should not happen with</w:t>
-      </w:r>
-      <w:r>
-        <w:t xml:space="preserve"> </w:t>
-      </w:r>
-      <w:r>
-        <w:t xml:space="preserve">the plan’s defaults).</w:t>
-      </w:r>
-    </w:p>
-    <w:p>
-      <w:pPr>
-        <w:pStyle w:val="Compact"/>
-        <w:numPr>
-          <w:ilvl w:val="0"/>
-          <w:numId w:val="1006"/>
-        </w:numPr>
-      </w:pPr>
-      <w:r>
-        <w:t xml:space="preserve">Joint sign consistency (sub-procedure B, when joint angles were logged): for each</w:t>
-      </w:r>
-      <w:r>
-        <w:t xml:space="preserve"> </w:t>
-      </w:r>
-      <w:r>
-        <w:t xml:space="preserve">joint, the fraction of poses whose final motion had the majority direction. A joint</w:t>
-      </w:r>
-      <w:r>
-        <w:t xml:space="preserve"> </w:t>
-      </w:r>
-      <w:r>
-        <w:t xml:space="preserve">far below 100 percent means the approach move did not standardize that joint’s</w:t>
-      </w:r>
-      <w:r>
-        <w:t xml:space="preserve"> </w:t>
-      </w:r>
-      <w:r>
-        <w:t xml:space="preserve">backlash over part of the workspace; tell the engineer, it affects how the two</w:t>
-      </w:r>
-      <w:r>
-        <w:t xml:space="preserve"> </w:t>
-      </w:r>
-      <w:r>
-        <w:t xml:space="preserve">folders are compared.</w:t>
+        <w:rPr>
+          <w:rStyle w:val="VerbatimChar"/>
+        </w:rPr>
+        <w:t xml:space="preserve">j1..j6</w:t>
+      </w:r>
+      <w:r>
+        <w:t xml:space="preserve"> </w:t>
+      </w:r>
+      <w:r>
+        <w:t xml:space="preserve">and</w:t>
+      </w:r>
+      <w:r>
+        <w:t xml:space="preserve"> </w:t>
+      </w:r>
+      <w:r>
+        <w:rPr>
+          <w:rStyle w:val="VerbatimChar"/>
+        </w:rPr>
+        <w:t xml:space="preserve">approach_j1..approach_j6</w:t>
+      </w:r>
+      <w:r>
+        <w:t xml:space="preserve">: the joint angles in degrees, if the</w:t>
+      </w:r>
+      <w:r>
+        <w:t xml:space="preserve"> </w:t>
+      </w:r>
+      <w:r>
+        <w:t xml:space="preserve">controller reports them; otherwise leave the columns out entirely.</w:t>
       </w:r>
     </w:p>
     <w:p>
@@ -3385,47 +3262,157 @@
         <w:pStyle w:val="FirstParagraph"/>
       </w:pPr>
       <w:r>
-        <w:t xml:space="preserve">Re-capture flagged poses after fixing the cause; do not delete the lines from the</w:t>
-      </w:r>
-      <w:r>
-        <w:t xml:space="preserve"> </w:t>
-      </w:r>
-      <w:r>
-        <w:t xml:space="preserve">log, add corrected lines with a new pose id (for example</w:t>
-      </w:r>
-      <w:r>
-        <w:t xml:space="preserve"> </w:t>
-      </w:r>
-      <w:r>
-        <w:rPr>
-          <w:rStyle w:val="VerbatimChar"/>
-        </w:rPr>
-        <w:t xml:space="preserve">b_z0650_t24_a090_05r</w:t>
-      </w:r>
-      <w:r>
-        <w:t xml:space="preserve">). The</w:t>
-      </w:r>
-      <w:r>
-        <w:t xml:space="preserve"> </w:t>
-      </w:r>
-      <w:r>
-        <w:t xml:space="preserve">check tool’s exit code is 0 when nothing is flagged, 1 when something is, and 2 when</w:t>
-      </w:r>
-      <w:r>
-        <w:t xml:space="preserve"> </w:t>
-      </w:r>
-      <w:r>
-        <w:t xml:space="preserve">it cannot read the manifest.</w:t>
-      </w:r>
-    </w:p>
-    <w:bookmarkEnd w:id="22"/>
-    <w:bookmarkStart w:id="23" w:name="deliverables-checklist"/>
+        <w:t xml:space="preserve">Example line:</w:t>
+      </w:r>
+    </w:p>
+    <w:p>
+      <w:pPr>
+        <w:pStyle w:val="SourceCode"/>
+      </w:pPr>
+      <w:r>
+        <w:rPr>
+          <w:rStyle w:val="VerbatimChar"/>
+        </w:rPr>
+        <w:t xml:space="preserve">b_z0650_t24_a090_05,board,,100.0,75.0,850.11,-12.70,470.55,euler_zyx_deg,-91.3,19.8,0.4,,12.1,-35.6,88.2,3.4,41.0,-8.7,11.9,-36.0,88.9,3.1,40.5,-8.4</w:t>
+      </w:r>
+    </w:p>
+    <w:p>
+      <w:pPr>
+        <w:pStyle w:val="FirstParagraph"/>
+      </w:pPr>
+      <w:r>
+        <w:t xml:space="preserve">After each sub-procedure, the manifest is built from its pose log and its capture folder:</w:t>
+      </w:r>
+    </w:p>
+    <w:p>
+      <w:pPr>
+        <w:pStyle w:val="SourceCode"/>
+      </w:pPr>
+      <w:r>
+        <w:rPr>
+          <w:rStyle w:val="VerbatimChar"/>
+        </w:rPr>
+        <w:t xml:space="preserve">python3 -m sphcal.cli.make_manifest --pose-log pose_log_A.csv --captures captures_A/ --format csv --out captures_A/manifest.csv</w:t>
+      </w:r>
+      <w:r>
+        <w:br/>
+      </w:r>
+      <w:r>
+        <w:rPr>
+          <w:rStyle w:val="VerbatimChar"/>
+        </w:rPr>
+        <w:t xml:space="preserve">python3 -m sphcal.cli.make_manifest --pose-log pose_log_B.csv --captures captures_B/ --format csv --out captures_B/manifest.csv</w:t>
+      </w:r>
+    </w:p>
+    <w:p>
+      <w:pPr>
+        <w:pStyle w:val="FirstParagraph"/>
+      </w:pPr>
+      <w:r>
+        <w:t xml:space="preserve">The tool matches every file to its pose id, converts the orientation to the standard</w:t>
+      </w:r>
+      <w:r>
+        <w:t xml:space="preserve"> </w:t>
+      </w:r>
+      <w:r>
+        <w:t xml:space="preserve">matrix form, and complains, by name, about any pose without files, any file without</w:t>
+      </w:r>
+      <w:r>
+        <w:t xml:space="preserve"> </w:t>
+      </w:r>
+      <w:r>
+        <w:t xml:space="preserve">a pose, and any missing size. A</w:t>
+      </w:r>
+      <w:r>
+        <w:t xml:space="preserve"> </w:t>
+      </w:r>
+      <w:r>
+        <w:rPr>
+          <w:rStyle w:val="VerbatimChar"/>
+        </w:rPr>
+        <w:t xml:space="preserve">poses.csv</w:t>
+      </w:r>
+      <w:r>
+        <w:t xml:space="preserve"> </w:t>
+      </w:r>
+      <w:r>
+        <w:t xml:space="preserve">from the plan tool is also accepted</w:t>
+      </w:r>
+      <w:r>
+        <w:t xml:space="preserve"> </w:t>
+      </w:r>
+      <w:r>
+        <w:t xml:space="preserve">directly as the pose log if your robot program cannot write one; then the commanded</w:t>
+      </w:r>
+      <w:r>
+        <w:t xml:space="preserve"> </w:t>
+      </w:r>
+      <w:r>
+        <w:t xml:space="preserve">poses stand in for the reported ones, which is acceptable only for a robot with</w:t>
+      </w:r>
+      <w:r>
+        <w:t xml:space="preserve"> </w:t>
+      </w:r>
+      <w:r>
+        <w:t xml:space="preserve">absolute accuracy better than 0.1 mm, and it defeats the purpose of sub-procedure B.</w:t>
+      </w:r>
+      <w:r>
+        <w:t xml:space="preserve"> </w:t>
+      </w:r>
+      <w:r>
+        <w:t xml:space="preserve">Extra columns such as the joint angles are carried along unchanged.</w:t>
+      </w:r>
+    </w:p>
+    <w:bookmarkEnd w:id="21"/>
+    <w:bookmarkStart w:id="22" w:name="X5519462675585d0256a3c46cb1261738cf187b2"/>
     <w:p>
       <w:pPr>
         <w:pStyle w:val="Heading2"/>
       </w:pPr>
       <w:r>
-        <w:t xml:space="preserve">9. Deliverables checklist</w:t>
+        <w:t xml:space="preserve">8. Checking the captures before the analysis</w:t>
+      </w:r>
+    </w:p>
+    <w:p>
+      <w:pPr>
+        <w:pStyle w:val="FirstParagraph"/>
+      </w:pPr>
+      <w:r>
+        <w:t xml:space="preserve">Run the quick check on each folder as soon as its captures are complete, while the</w:t>
+      </w:r>
+      <w:r>
+        <w:t xml:space="preserve"> </w:t>
+      </w:r>
+      <w:r>
+        <w:t xml:space="preserve">robot and the board are still set up:</w:t>
+      </w:r>
+    </w:p>
+    <w:p>
+      <w:pPr>
+        <w:pStyle w:val="SourceCode"/>
+      </w:pPr>
+      <w:r>
+        <w:rPr>
+          <w:rStyle w:val="VerbatimChar"/>
+        </w:rPr>
+        <w:t xml:space="preserve">python3 -m planereg.capture.check_captures --manifest captures_A/manifest.csv --sensor-in-base boot.json --pose-log pose_log_A.csv --out captures_A/check.json</w:t>
+      </w:r>
+      <w:r>
+        <w:br/>
+      </w:r>
+      <w:r>
+        <w:rPr>
+          <w:rStyle w:val="VerbatimChar"/>
+        </w:rPr>
+        <w:t xml:space="preserve">python3 -m planereg.capture.check_captures --manifest captures_B/manifest.csv --sensor-in-base boot.json --pose-log pose_log_B.csv --out captures_B/check.json</w:t>
+      </w:r>
+    </w:p>
+    <w:p>
+      <w:pPr>
+        <w:pStyle w:val="FirstParagraph"/>
+      </w:pPr>
+      <w:r>
+        <w:t xml:space="preserve">It prints one line per pose and a verdict. Things it flags, and what they mean:</w:t>
       </w:r>
     </w:p>
     <w:p>
@@ -3437,55 +3424,13 @@
         </w:numPr>
       </w:pPr>
       <w:r>
-        <w:rPr>
-          <w:rStyle w:val="VerbatimChar"/>
-        </w:rPr>
-        <w:t xml:space="preserve">captures_A/</w:t>
-      </w:r>
-      <w:r>
-        <w:t xml:space="preserve"> </w:t>
-      </w:r>
-      <w:r>
-        <w:t xml:space="preserve">and</w:t>
-      </w:r>
-      <w:r>
-        <w:t xml:space="preserve"> </w:t>
-      </w:r>
-      <w:r>
-        <w:rPr>
-          <w:rStyle w:val="VerbatimChar"/>
-        </w:rPr>
-        <w:t xml:space="preserve">captures_B/</w:t>
-      </w:r>
-      <w:r>
-        <w:t xml:space="preserve"> </w:t>
-      </w:r>
-      <w:r>
-        <w:t xml:space="preserve">with all</w:t>
-      </w:r>
-      <w:r>
-        <w:t xml:space="preserve"> </w:t>
-      </w:r>
-      <w:r>
-        <w:rPr>
-          <w:rStyle w:val="VerbatimChar"/>
-        </w:rPr>
-        <w:t xml:space="preserve">.mc</w:t>
-      </w:r>
-      <w:r>
-        <w:t xml:space="preserve"> </w:t>
-      </w:r>
-      <w:r>
-        <w:t xml:space="preserve">files, named</w:t>
-      </w:r>
-      <w:r>
-        <w:t xml:space="preserve"> </w:t>
-      </w:r>
-      <w:r>
-        <w:rPr>
-          <w:rStyle w:val="VerbatimChar"/>
-        </w:rPr>
-        <w:t xml:space="preserve">&lt;pose_id&gt;_Index&lt;nn&gt;.mc</w:t>
+        <w:t xml:space="preserve">Low valid fraction (below 50 percent of frames): the board was not read; check</w:t>
+      </w:r>
+      <w:r>
+        <w:t xml:space="preserve"> </w:t>
+      </w:r>
+      <w:r>
+        <w:t xml:space="preserve">exposure, or the board was outside the field.</w:t>
       </w:r>
     </w:p>
     <w:p>
@@ -3497,46 +3442,13 @@
         </w:numPr>
       </w:pPr>
       <w:r>
-        <w:rPr>
-          <w:rStyle w:val="VerbatimChar"/>
-        </w:rPr>
-        <w:t xml:space="preserve">pose_log_A.csv</w:t>
-      </w:r>
-      <w:r>
-        <w:t xml:space="preserve"> </w:t>
-      </w:r>
-      <w:r>
-        <w:t xml:space="preserve">and</w:t>
-      </w:r>
-      <w:r>
-        <w:t xml:space="preserve"> </w:t>
-      </w:r>
-      <w:r>
-        <w:rPr>
-          <w:rStyle w:val="VerbatimChar"/>
-        </w:rPr>
-        <w:t xml:space="preserve">pose_log_B.csv</w:t>
-      </w:r>
-      <w:r>
-        <w:t xml:space="preserve"> </w:t>
-      </w:r>
-      <w:r>
-        <w:t xml:space="preserve">(option B), or confirmation that headers carry</w:t>
-      </w:r>
-      <w:r>
-        <w:t xml:space="preserve"> </w:t>
-      </w:r>
-      <w:r>
-        <w:rPr>
-          <w:rStyle w:val="VerbatimChar"/>
-        </w:rPr>
-        <w:t xml:space="preserve">robotPose</w:t>
-      </w:r>
-      <w:r>
-        <w:t xml:space="preserve"> </w:t>
-      </w:r>
-      <w:r>
-        <w:t xml:space="preserve">(option A) plus the joint-angle logs</w:t>
+        <w:t xml:space="preserve">Board touching the image border: the board is partly out of view; the pose is</w:t>
+      </w:r>
+      <w:r>
+        <w:t xml:space="preserve"> </w:t>
+      </w:r>
+      <w:r>
+        <w:t xml:space="preserve">unusable, re-plan it slightly inward.</w:t>
       </w:r>
     </w:p>
     <w:p>
@@ -3548,46 +3460,25 @@
         </w:numPr>
       </w:pPr>
       <w:r>
-        <w:rPr>
-          <w:rStyle w:val="VerbatimChar"/>
-        </w:rPr>
-        <w:t xml:space="preserve">captures_A/manifest.csv</w:t>
-      </w:r>
-      <w:r>
-        <w:t xml:space="preserve"> </w:t>
-      </w:r>
-      <w:r>
-        <w:t xml:space="preserve">and</w:t>
-      </w:r>
-      <w:r>
-        <w:t xml:space="preserve"> </w:t>
-      </w:r>
-      <w:r>
-        <w:rPr>
-          <w:rStyle w:val="VerbatimChar"/>
-        </w:rPr>
-        <w:t xml:space="preserve">captures_B/manifest.csv</w:t>
-      </w:r>
-      <w:r>
-        <w:t xml:space="preserve"> </w:t>
-      </w:r>
-      <w:r>
-        <w:t xml:space="preserve">produced by</w:t>
-      </w:r>
-      <w:r>
-        <w:t xml:space="preserve"> </w:t>
-      </w:r>
-      <w:r>
-        <w:rPr>
-          <w:rStyle w:val="VerbatimChar"/>
-        </w:rPr>
-        <w:t xml:space="preserve">make_manifest</w:t>
-      </w:r>
-      <w:r>
-        <w:t xml:space="preserve"> </w:t>
-      </w:r>
-      <w:r>
-        <w:t xml:space="preserve">without errors</w:t>
+        <w:t xml:space="preserve">Segmentation failed: the software could not find a flat surface of the board’s</w:t>
+      </w:r>
+      <w:r>
+        <w:t xml:space="preserve"> </w:t>
+      </w:r>
+      <w:r>
+        <w:t xml:space="preserve">size facing the sensor where the pose says it should be; the pose was copied</w:t>
+      </w:r>
+      <w:r>
+        <w:t xml:space="preserve"> </w:t>
+      </w:r>
+      <w:r>
+        <w:t xml:space="preserve">wrongly, or something flat is closer to the sensor than the board (a cable, a</w:t>
+      </w:r>
+      <w:r>
+        <w:t xml:space="preserve"> </w:t>
+      </w:r>
+      <w:r>
+        <w:t xml:space="preserve">hand, the table), or the board is outside the field.</w:t>
       </w:r>
     </w:p>
     <w:p>
@@ -3599,37 +3490,13 @@
         </w:numPr>
       </w:pPr>
       <w:r>
-        <w:rPr>
-          <w:rStyle w:val="VerbatimChar"/>
-        </w:rPr>
-        <w:t xml:space="preserve">captures_A/check.json</w:t>
-      </w:r>
-      <w:r>
-        <w:t xml:space="preserve"> </w:t>
-      </w:r>
-      <w:r>
-        <w:t xml:space="preserve">and</w:t>
-      </w:r>
-      <w:r>
-        <w:t xml:space="preserve"> </w:t>
-      </w:r>
-      <w:r>
-        <w:rPr>
-          <w:rStyle w:val="VerbatimChar"/>
-        </w:rPr>
-        <w:t xml:space="preserve">captures_B/check.json</w:t>
-      </w:r>
-      <w:r>
-        <w:t xml:space="preserve"> </w:t>
-      </w:r>
-      <w:r>
-        <w:t xml:space="preserve">with no flags, or a note</w:t>
-      </w:r>
-      <w:r>
-        <w:t xml:space="preserve"> </w:t>
-      </w:r>
-      <w:r>
-        <w:t xml:space="preserve">explaining each remaining flag</w:t>
+        <w:t xml:space="preserve">Plane residual above 1 mm: the board surface read by the sensor is not flat to</w:t>
+      </w:r>
+      <w:r>
+        <w:t xml:space="preserve"> </w:t>
+      </w:r>
+      <w:r>
+        <w:t xml:space="preserve">the sensor; a shiny spot or a dirty board, or an exposure problem.</w:t>
       </w:r>
     </w:p>
     <w:p>
@@ -3641,40 +3508,37 @@
         </w:numPr>
       </w:pPr>
       <w:r>
-        <w:rPr>
-          <w:rStyle w:val="VerbatimChar"/>
-        </w:rPr>
-        <w:t xml:space="preserve">plan/poses.csv</w:t>
-      </w:r>
-      <w:r>
-        <w:t xml:space="preserve">,</w:t>
-      </w:r>
-      <w:r>
-        <w:t xml:space="preserve"> </w:t>
-      </w:r>
-      <w:r>
-        <w:rPr>
-          <w:rStyle w:val="VerbatimChar"/>
-        </w:rPr>
-        <w:t xml:space="preserve">plan/plan_summary.txt</w:t>
-      </w:r>
-      <w:r>
-        <w:t xml:space="preserve">,</w:t>
-      </w:r>
-      <w:r>
-        <w:t xml:space="preserve"> </w:t>
-      </w:r>
-      <w:r>
-        <w:rPr>
-          <w:rStyle w:val="VerbatimChar"/>
-        </w:rPr>
-        <w:t xml:space="preserve">plan/plan.png</w:t>
-      </w:r>
-      <w:r>
-        <w:t xml:space="preserve"> </w:t>
-      </w:r>
-      <w:r>
-        <w:t xml:space="preserve">as used</w:t>
+        <w:t xml:space="preserve">Normal residual above 1 degree or offset residual above 1 mm against the solved</w:t>
+      </w:r>
+      <w:r>
+        <w:t xml:space="preserve"> </w:t>
+      </w:r>
+      <w:r>
+        <w:t xml:space="preserve">registration: either the robot pose was copied wrongly for that pose, or, if it</w:t>
+      </w:r>
+      <w:r>
+        <w:t xml:space="preserve"> </w:t>
+      </w:r>
+      <w:r>
+        <w:t xml:space="preserve">affects every pose with one tilt direction, the board tool frame’s orientation is</w:t>
+      </w:r>
+      <w:r>
+        <w:t xml:space="preserve"> </w:t>
+      </w:r>
+      <w:r>
+        <w:t xml:space="preserve">wrong (section 3, step 5), or the rotation type in the pose log is misnamed; or,</w:t>
+      </w:r>
+      <w:r>
+        <w:t xml:space="preserve"> </w:t>
+      </w:r>
+      <w:r>
+        <w:t xml:space="preserve">if it grows steadily across the volume, the robot’s base frame or its absolute</w:t>
+      </w:r>
+      <w:r>
+        <w:t xml:space="preserve"> </w:t>
+      </w:r>
+      <w:r>
+        <w:t xml:space="preserve">accuracy is off.</w:t>
       </w:r>
     </w:p>
     <w:p>
@@ -3686,37 +3550,13 @@
         </w:numPr>
       </w:pPr>
       <w:r>
-        <w:rPr>
-          <w:rStyle w:val="VerbatimChar"/>
-        </w:rPr>
-        <w:t xml:space="preserve">boot.json</w:t>
-      </w:r>
-      <w:r>
-        <w:t xml:space="preserve">,</w:t>
-      </w:r>
-      <w:r>
-        <w:t xml:space="preserve"> </w:t>
-      </w:r>
-      <w:r>
-        <w:rPr>
-          <w:rStyle w:val="VerbatimChar"/>
-        </w:rPr>
-        <w:t xml:space="preserve">boot_pose_log.csv</w:t>
-      </w:r>
-      <w:r>
-        <w:t xml:space="preserve"> </w:t>
-      </w:r>
-      <w:r>
-        <w:t xml:space="preserve">and the bootstrap captures in</w:t>
-      </w:r>
-      <w:r>
-        <w:t xml:space="preserve"> </w:t>
-      </w:r>
-      <w:r>
-        <w:rPr>
-          <w:rStyle w:val="VerbatimChar"/>
-        </w:rPr>
-        <w:t xml:space="preserve">boot/</w:t>
+        <w:t xml:space="preserve">Normal spread below 0.05: the tilts were not varied enough (should not happen with</w:t>
+      </w:r>
+      <w:r>
+        <w:t xml:space="preserve"> </w:t>
+      </w:r>
+      <w:r>
+        <w:t xml:space="preserve">the plan’s defaults).</w:t>
       </w:r>
     </w:p>
     <w:p>
@@ -3728,62 +3568,79 @@
         </w:numPr>
       </w:pPr>
       <w:r>
-        <w:rPr>
-          <w:rStyle w:val="VerbatimChar"/>
-        </w:rPr>
-        <w:t xml:space="preserve">session_notes.txt</w:t>
-      </w:r>
-      <w:r>
-        <w:t xml:space="preserve"> </w:t>
-      </w:r>
-      <w:r>
-        <w:t xml:space="preserve">with: sensor serial, warm-up time, exposure and gain, base</w:t>
-      </w:r>
-      <w:r>
-        <w:t xml:space="preserve"> </w:t>
-      </w:r>
-      <w:r>
-        <w:t xml:space="preserve">frame name, backlash compensation setting, board D and runout reading, board</w:t>
-      </w:r>
-      <w:r>
-        <w:t xml:space="preserve"> </w:t>
-      </w:r>
-      <w:r>
-        <w:t xml:space="preserve">dimensions and certificate, TOOL_BOARD values, temperature, robot speed and</w:t>
-      </w:r>
-      <w:r>
-        <w:t xml:space="preserve"> </w:t>
-      </w:r>
-      <w:r>
-        <w:t xml:space="preserve">acceleration settings, the order the sub-procedures were run in and their times</w:t>
-      </w:r>
-    </w:p>
-    <w:p>
-      <w:pPr>
-        <w:pStyle w:val="Compact"/>
-        <w:numPr>
-          <w:ilvl w:val="0"/>
-          <w:numId w:val="1007"/>
-        </w:numPr>
-      </w:pPr>
-      <w:r>
-        <w:t xml:space="preserve">Photos of the setup: sensor mount, the board on the flange, the workspace behind</w:t>
-      </w:r>
-      <w:r>
-        <w:t xml:space="preserve"> </w:t>
-      </w:r>
-      <w:r>
-        <w:t xml:space="preserve">the board as the sensor sees it</w:t>
-      </w:r>
-    </w:p>
-    <w:bookmarkEnd w:id="23"/>
-    <w:bookmarkStart w:id="24" w:name="things-that-spoil-a-session"/>
+        <w:t xml:space="preserve">Joint sign consistency (sub-procedure B, when joint angles were logged): for each</w:t>
+      </w:r>
+      <w:r>
+        <w:t xml:space="preserve"> </w:t>
+      </w:r>
+      <w:r>
+        <w:t xml:space="preserve">joint, the fraction of poses whose final motion had the majority direction. A joint</w:t>
+      </w:r>
+      <w:r>
+        <w:t xml:space="preserve"> </w:t>
+      </w:r>
+      <w:r>
+        <w:t xml:space="preserve">far below 100 percent means the approach move did not standardize that joint’s</w:t>
+      </w:r>
+      <w:r>
+        <w:t xml:space="preserve"> </w:t>
+      </w:r>
+      <w:r>
+        <w:t xml:space="preserve">backlash over part of the workspace; tell the engineer, it affects how the two</w:t>
+      </w:r>
+      <w:r>
+        <w:t xml:space="preserve"> </w:t>
+      </w:r>
+      <w:r>
+        <w:t xml:space="preserve">folders are compared.</w:t>
+      </w:r>
+    </w:p>
+    <w:p>
+      <w:pPr>
+        <w:pStyle w:val="FirstParagraph"/>
+      </w:pPr>
+      <w:r>
+        <w:t xml:space="preserve">Re-capture flagged poses after fixing the cause; do not delete the lines from the</w:t>
+      </w:r>
+      <w:r>
+        <w:t xml:space="preserve"> </w:t>
+      </w:r>
+      <w:r>
+        <w:t xml:space="preserve">log, add corrected lines with a new pose id (for example</w:t>
+      </w:r>
+      <w:r>
+        <w:t xml:space="preserve"> </w:t>
+      </w:r>
+      <w:r>
+        <w:rPr>
+          <w:rStyle w:val="VerbatimChar"/>
+        </w:rPr>
+        <w:t xml:space="preserve">b_z0650_t24_a090_05r</w:t>
+      </w:r>
+      <w:r>
+        <w:t xml:space="preserve">). The</w:t>
+      </w:r>
+      <w:r>
+        <w:t xml:space="preserve"> </w:t>
+      </w:r>
+      <w:r>
+        <w:t xml:space="preserve">check tool’s exit code is 0 when nothing is flagged, 1 when something is, and 2 when</w:t>
+      </w:r>
+      <w:r>
+        <w:t xml:space="preserve"> </w:t>
+      </w:r>
+      <w:r>
+        <w:t xml:space="preserve">it cannot read the manifest.</w:t>
+      </w:r>
+    </w:p>
+    <w:bookmarkEnd w:id="22"/>
+    <w:bookmarkStart w:id="23" w:name="deliverables-checklist"/>
     <w:p>
       <w:pPr>
         <w:pStyle w:val="Heading2"/>
       </w:pPr>
       <w:r>
-        <w:t xml:space="preserve">10. Things that spoil a session</w:t>
+        <w:t xml:space="preserve">9. Deliverables checklist</w:t>
       </w:r>
     </w:p>
     <w:p>
@@ -3795,13 +3652,55 @@
         </w:numPr>
       </w:pPr>
       <w:r>
-        <w:t xml:space="preserve">Moving or bumping the sensor. If it happens, everything after it is a new session,</w:t>
-      </w:r>
-      <w:r>
-        <w:t xml:space="preserve"> </w:t>
-      </w:r>
-      <w:r>
-        <w:t xml:space="preserve">and both sub-procedures must be repeated.</w:t>
+        <w:rPr>
+          <w:rStyle w:val="VerbatimChar"/>
+        </w:rPr>
+        <w:t xml:space="preserve">captures_A/</w:t>
+      </w:r>
+      <w:r>
+        <w:t xml:space="preserve"> </w:t>
+      </w:r>
+      <w:r>
+        <w:t xml:space="preserve">and</w:t>
+      </w:r>
+      <w:r>
+        <w:t xml:space="preserve"> </w:t>
+      </w:r>
+      <w:r>
+        <w:rPr>
+          <w:rStyle w:val="VerbatimChar"/>
+        </w:rPr>
+        <w:t xml:space="preserve">captures_B/</w:t>
+      </w:r>
+      <w:r>
+        <w:t xml:space="preserve"> </w:t>
+      </w:r>
+      <w:r>
+        <w:t xml:space="preserve">with all</w:t>
+      </w:r>
+      <w:r>
+        <w:t xml:space="preserve"> </w:t>
+      </w:r>
+      <w:r>
+        <w:rPr>
+          <w:rStyle w:val="VerbatimChar"/>
+        </w:rPr>
+        <w:t xml:space="preserve">.mc</w:t>
+      </w:r>
+      <w:r>
+        <w:t xml:space="preserve"> </w:t>
+      </w:r>
+      <w:r>
+        <w:t xml:space="preserve">files, named</w:t>
+      </w:r>
+      <w:r>
+        <w:t xml:space="preserve"> </w:t>
+      </w:r>
+      <w:r>
+        <w:rPr>
+          <w:rStyle w:val="VerbatimChar"/>
+        </w:rPr>
+        <w:t xml:space="preserve">&lt;pose_id&gt;_Index&lt;nn&gt;.mc</w:t>
       </w:r>
     </w:p>
     <w:p>
@@ -3813,13 +3712,46 @@
         </w:numPr>
       </w:pPr>
       <w:r>
-        <w:t xml:space="preserve">Changing exposure, gain, the base frame, the speed settings, or the backlash</w:t>
-      </w:r>
-      <w:r>
-        <w:t xml:space="preserve"> </w:t>
-      </w:r>
-      <w:r>
-        <w:t xml:space="preserve">compensation mid-session or between the sub-procedures.</w:t>
+        <w:rPr>
+          <w:rStyle w:val="VerbatimChar"/>
+        </w:rPr>
+        <w:t xml:space="preserve">pose_log_A.csv</w:t>
+      </w:r>
+      <w:r>
+        <w:t xml:space="preserve"> </w:t>
+      </w:r>
+      <w:r>
+        <w:t xml:space="preserve">and</w:t>
+      </w:r>
+      <w:r>
+        <w:t xml:space="preserve"> </w:t>
+      </w:r>
+      <w:r>
+        <w:rPr>
+          <w:rStyle w:val="VerbatimChar"/>
+        </w:rPr>
+        <w:t xml:space="preserve">pose_log_B.csv</w:t>
+      </w:r>
+      <w:r>
+        <w:t xml:space="preserve"> </w:t>
+      </w:r>
+      <w:r>
+        <w:t xml:space="preserve">(option B), or confirmation that headers carry</w:t>
+      </w:r>
+      <w:r>
+        <w:t xml:space="preserve"> </w:t>
+      </w:r>
+      <w:r>
+        <w:rPr>
+          <w:rStyle w:val="VerbatimChar"/>
+        </w:rPr>
+        <w:t xml:space="preserve">robotPose</w:t>
+      </w:r>
+      <w:r>
+        <w:t xml:space="preserve"> </w:t>
+      </w:r>
+      <w:r>
+        <w:t xml:space="preserve">(option A) plus the joint-angle logs</w:t>
       </w:r>
     </w:p>
     <w:p>
@@ -3831,7 +3763,46 @@
         </w:numPr>
       </w:pPr>
       <w:r>
-        <w:t xml:space="preserve">Using the commanded pose instead of the reported pose in the log.</w:t>
+        <w:rPr>
+          <w:rStyle w:val="VerbatimChar"/>
+        </w:rPr>
+        <w:t xml:space="preserve">captures_A/manifest.csv</w:t>
+      </w:r>
+      <w:r>
+        <w:t xml:space="preserve"> </w:t>
+      </w:r>
+      <w:r>
+        <w:t xml:space="preserve">and</w:t>
+      </w:r>
+      <w:r>
+        <w:t xml:space="preserve"> </w:t>
+      </w:r>
+      <w:r>
+        <w:rPr>
+          <w:rStyle w:val="VerbatimChar"/>
+        </w:rPr>
+        <w:t xml:space="preserve">captures_B/manifest.csv</w:t>
+      </w:r>
+      <w:r>
+        <w:t xml:space="preserve"> </w:t>
+      </w:r>
+      <w:r>
+        <w:t xml:space="preserve">produced by</w:t>
+      </w:r>
+      <w:r>
+        <w:t xml:space="preserve"> </w:t>
+      </w:r>
+      <w:r>
+        <w:rPr>
+          <w:rStyle w:val="VerbatimChar"/>
+        </w:rPr>
+        <w:t xml:space="preserve">make_manifest</w:t>
+      </w:r>
+      <w:r>
+        <w:t xml:space="preserve"> </w:t>
+      </w:r>
+      <w:r>
+        <w:t xml:space="preserve">without errors</w:t>
       </w:r>
     </w:p>
     <w:p>
@@ -3843,13 +3814,37 @@
         </w:numPr>
       </w:pPr>
       <w:r>
-        <w:t xml:space="preserve">A loose adapter: check the dowels are seated and the runout (section 3, step 2)</w:t>
-      </w:r>
-      <w:r>
-        <w:t xml:space="preserve"> </w:t>
-      </w:r>
-      <w:r>
-        <w:t xml:space="preserve">before each sub-procedure.</w:t>
+        <w:rPr>
+          <w:rStyle w:val="VerbatimChar"/>
+        </w:rPr>
+        <w:t xml:space="preserve">captures_A/check.json</w:t>
+      </w:r>
+      <w:r>
+        <w:t xml:space="preserve"> </w:t>
+      </w:r>
+      <w:r>
+        <w:t xml:space="preserve">and</w:t>
+      </w:r>
+      <w:r>
+        <w:t xml:space="preserve"> </w:t>
+      </w:r>
+      <w:r>
+        <w:rPr>
+          <w:rStyle w:val="VerbatimChar"/>
+        </w:rPr>
+        <w:t xml:space="preserve">captures_B/check.json</w:t>
+      </w:r>
+      <w:r>
+        <w:t xml:space="preserve"> </w:t>
+      </w:r>
+      <w:r>
+        <w:t xml:space="preserve">with no flags, or a note</w:t>
+      </w:r>
+      <w:r>
+        <w:t xml:space="preserve"> </w:t>
+      </w:r>
+      <w:r>
+        <w:t xml:space="preserve">explaining each remaining flag</w:t>
       </w:r>
     </w:p>
     <w:p>
@@ -3861,13 +3856,40 @@
         </w:numPr>
       </w:pPr>
       <w:r>
-        <w:t xml:space="preserve">Fingerprints or gloss on the board: wipe with isopropyl alcohol; a shiny spot</w:t>
-      </w:r>
-      <w:r>
-        <w:t xml:space="preserve"> </w:t>
-      </w:r>
-      <w:r>
-        <w:t xml:space="preserve">returns a bright highlight and a bad read.</w:t>
+        <w:rPr>
+          <w:rStyle w:val="VerbatimChar"/>
+        </w:rPr>
+        <w:t xml:space="preserve">plan/poses.csv</w:t>
+      </w:r>
+      <w:r>
+        <w:t xml:space="preserve">,</w:t>
+      </w:r>
+      <w:r>
+        <w:t xml:space="preserve"> </w:t>
+      </w:r>
+      <w:r>
+        <w:rPr>
+          <w:rStyle w:val="VerbatimChar"/>
+        </w:rPr>
+        <w:t xml:space="preserve">plan/plan_summary.txt</w:t>
+      </w:r>
+      <w:r>
+        <w:t xml:space="preserve">,</w:t>
+      </w:r>
+      <w:r>
+        <w:t xml:space="preserve"> </w:t>
+      </w:r>
+      <w:r>
+        <w:rPr>
+          <w:rStyle w:val="VerbatimChar"/>
+        </w:rPr>
+        <w:t xml:space="preserve">plan/plan.png</w:t>
+      </w:r>
+      <w:r>
+        <w:t xml:space="preserve"> </w:t>
+      </w:r>
+      <w:r>
+        <w:t xml:space="preserve">as used</w:t>
       </w:r>
     </w:p>
     <w:p>
@@ -3879,19 +3901,37 @@
         </w:numPr>
       </w:pPr>
       <w:r>
-        <w:t xml:space="preserve">Something flat and large closer to the sensor than the board, in the picture. The</w:t>
-      </w:r>
-      <w:r>
-        <w:t xml:space="preserve"> </w:t>
-      </w:r>
-      <w:r>
-        <w:t xml:space="preserve">software looks for the closest large flat surface when it has no better</w:t>
-      </w:r>
-      <w:r>
-        <w:t xml:space="preserve"> </w:t>
-      </w:r>
-      <w:r>
-        <w:t xml:space="preserve">information; keep the foreground clear.</w:t>
+        <w:rPr>
+          <w:rStyle w:val="VerbatimChar"/>
+        </w:rPr>
+        <w:t xml:space="preserve">boot.json</w:t>
+      </w:r>
+      <w:r>
+        <w:t xml:space="preserve">,</w:t>
+      </w:r>
+      <w:r>
+        <w:t xml:space="preserve"> </w:t>
+      </w:r>
+      <w:r>
+        <w:rPr>
+          <w:rStyle w:val="VerbatimChar"/>
+        </w:rPr>
+        <w:t xml:space="preserve">boot_pose_log.csv</w:t>
+      </w:r>
+      <w:r>
+        <w:t xml:space="preserve"> </w:t>
+      </w:r>
+      <w:r>
+        <w:t xml:space="preserve">and the bootstrap captures in</w:t>
+      </w:r>
+      <w:r>
+        <w:t xml:space="preserve"> </w:t>
+      </w:r>
+      <w:r>
+        <w:rPr>
+          <w:rStyle w:val="VerbatimChar"/>
+        </w:rPr>
+        <w:t xml:space="preserve">boot/</w:t>
       </w:r>
     </w:p>
     <w:p>
@@ -3903,19 +3943,34 @@
         </w:numPr>
       </w:pPr>
       <w:r>
-        <w:t xml:space="preserve">In sub-procedure B, stopping, reversing, or slowing on the final move, or</w:t>
-      </w:r>
-      <w:r>
-        <w:t xml:space="preserve"> </w:t>
-      </w:r>
-      <w:r>
-        <w:t xml:space="preserve">approaching some poses without the approach pose. Every pose must get the same</w:t>
-      </w:r>
-      <w:r>
-        <w:t xml:space="preserve"> </w:t>
-      </w:r>
-      <w:r>
-        <w:t xml:space="preserve">final move.</w:t>
+        <w:rPr>
+          <w:rStyle w:val="VerbatimChar"/>
+        </w:rPr>
+        <w:t xml:space="preserve">session_notes.txt</w:t>
+      </w:r>
+      <w:r>
+        <w:t xml:space="preserve"> </w:t>
+      </w:r>
+      <w:r>
+        <w:t xml:space="preserve">with: sensor serial, warm-up time, exposure and gain, base</w:t>
+      </w:r>
+      <w:r>
+        <w:t xml:space="preserve"> </w:t>
+      </w:r>
+      <w:r>
+        <w:t xml:space="preserve">frame name, backlash compensation setting, board D and runout reading, board</w:t>
+      </w:r>
+      <w:r>
+        <w:t xml:space="preserve"> </w:t>
+      </w:r>
+      <w:r>
+        <w:t xml:space="preserve">dimensions and certificate, TOOL_BOARD values, temperature, robot speed and</w:t>
+      </w:r>
+      <w:r>
+        <w:t xml:space="preserve"> </w:t>
+      </w:r>
+      <w:r>
+        <w:t xml:space="preserve">acceleration settings, the order the sub-procedures were run in and their times</w:t>
       </w:r>
     </w:p>
     <w:p>
@@ -3924,6 +3979,166 @@
         <w:numPr>
           <w:ilvl w:val="0"/>
           <w:numId w:val="1008"/>
+        </w:numPr>
+      </w:pPr>
+      <w:r>
+        <w:t xml:space="preserve">Photos of the setup: sensor mount, the board on the flange, the workspace behind</w:t>
+      </w:r>
+      <w:r>
+        <w:t xml:space="preserve"> </w:t>
+      </w:r>
+      <w:r>
+        <w:t xml:space="preserve">the board as the sensor sees it</w:t>
+      </w:r>
+    </w:p>
+    <w:bookmarkEnd w:id="23"/>
+    <w:bookmarkStart w:id="24" w:name="things-that-spoil-a-session"/>
+    <w:p>
+      <w:pPr>
+        <w:pStyle w:val="Heading2"/>
+      </w:pPr>
+      <w:r>
+        <w:t xml:space="preserve">10. Things that spoil a session</w:t>
+      </w:r>
+    </w:p>
+    <w:p>
+      <w:pPr>
+        <w:pStyle w:val="Compact"/>
+        <w:numPr>
+          <w:ilvl w:val="0"/>
+          <w:numId w:val="1009"/>
+        </w:numPr>
+      </w:pPr>
+      <w:r>
+        <w:t xml:space="preserve">Moving or bumping the sensor. If it happens, everything after it is a new session,</w:t>
+      </w:r>
+      <w:r>
+        <w:t xml:space="preserve"> </w:t>
+      </w:r>
+      <w:r>
+        <w:t xml:space="preserve">and both sub-procedures must be repeated.</w:t>
+      </w:r>
+    </w:p>
+    <w:p>
+      <w:pPr>
+        <w:pStyle w:val="Compact"/>
+        <w:numPr>
+          <w:ilvl w:val="0"/>
+          <w:numId w:val="1009"/>
+        </w:numPr>
+      </w:pPr>
+      <w:r>
+        <w:t xml:space="preserve">Changing exposure, gain, the base frame, the speed settings, or the backlash</w:t>
+      </w:r>
+      <w:r>
+        <w:t xml:space="preserve"> </w:t>
+      </w:r>
+      <w:r>
+        <w:t xml:space="preserve">compensation mid-session or between the sub-procedures.</w:t>
+      </w:r>
+    </w:p>
+    <w:p>
+      <w:pPr>
+        <w:pStyle w:val="Compact"/>
+        <w:numPr>
+          <w:ilvl w:val="0"/>
+          <w:numId w:val="1009"/>
+        </w:numPr>
+      </w:pPr>
+      <w:r>
+        <w:t xml:space="preserve">Using the commanded pose instead of the reported pose in the log.</w:t>
+      </w:r>
+    </w:p>
+    <w:p>
+      <w:pPr>
+        <w:pStyle w:val="Compact"/>
+        <w:numPr>
+          <w:ilvl w:val="0"/>
+          <w:numId w:val="1009"/>
+        </w:numPr>
+      </w:pPr>
+      <w:r>
+        <w:t xml:space="preserve">A loose adapter: check the dowels are seated and the runout (section 3, step 2)</w:t>
+      </w:r>
+      <w:r>
+        <w:t xml:space="preserve"> </w:t>
+      </w:r>
+      <w:r>
+        <w:t xml:space="preserve">before each sub-procedure.</w:t>
+      </w:r>
+    </w:p>
+    <w:p>
+      <w:pPr>
+        <w:pStyle w:val="Compact"/>
+        <w:numPr>
+          <w:ilvl w:val="0"/>
+          <w:numId w:val="1009"/>
+        </w:numPr>
+      </w:pPr>
+      <w:r>
+        <w:t xml:space="preserve">Fingerprints or gloss on the board: wipe with isopropyl alcohol; a shiny spot</w:t>
+      </w:r>
+      <w:r>
+        <w:t xml:space="preserve"> </w:t>
+      </w:r>
+      <w:r>
+        <w:t xml:space="preserve">returns a bright highlight and a bad read.</w:t>
+      </w:r>
+    </w:p>
+    <w:p>
+      <w:pPr>
+        <w:pStyle w:val="Compact"/>
+        <w:numPr>
+          <w:ilvl w:val="0"/>
+          <w:numId w:val="1009"/>
+        </w:numPr>
+      </w:pPr>
+      <w:r>
+        <w:t xml:space="preserve">Something flat and large closer to the sensor than the board, in the picture. The</w:t>
+      </w:r>
+      <w:r>
+        <w:t xml:space="preserve"> </w:t>
+      </w:r>
+      <w:r>
+        <w:t xml:space="preserve">software looks for the closest large flat surface when it has no better</w:t>
+      </w:r>
+      <w:r>
+        <w:t xml:space="preserve"> </w:t>
+      </w:r>
+      <w:r>
+        <w:t xml:space="preserve">information; keep the foreground clear.</w:t>
+      </w:r>
+    </w:p>
+    <w:p>
+      <w:pPr>
+        <w:pStyle w:val="Compact"/>
+        <w:numPr>
+          <w:ilvl w:val="0"/>
+          <w:numId w:val="1009"/>
+        </w:numPr>
+      </w:pPr>
+      <w:r>
+        <w:t xml:space="preserve">In sub-procedure B, stopping, reversing, or slowing on the final move, or</w:t>
+      </w:r>
+      <w:r>
+        <w:t xml:space="preserve"> </w:t>
+      </w:r>
+      <w:r>
+        <w:t xml:space="preserve">approaching some poses without the approach pose. Every pose must get the same</w:t>
+      </w:r>
+      <w:r>
+        <w:t xml:space="preserve"> </w:t>
+      </w:r>
+      <w:r>
+        <w:t xml:space="preserve">final move.</w:t>
+      </w:r>
+    </w:p>
+    <w:p>
+      <w:pPr>
+        <w:pStyle w:val="Compact"/>
+        <w:numPr>
+          <w:ilvl w:val="0"/>
+          <w:numId w:val="1009"/>
         </w:numPr>
       </w:pPr>
       <w:r>
@@ -6508,34 +6723,7 @@
     </w:lvlOverride>
   </w:num>
   <w:num w:numId="1003">
-    <w:abstractNumId w:val="99411"/>
-    <w:lvlOverride w:ilvl="0">
-      <w:startOverride w:val="1"/>
-    </w:lvlOverride>
-    <w:lvlOverride w:ilvl="1">
-      <w:startOverride w:val="1"/>
-    </w:lvlOverride>
-    <w:lvlOverride w:ilvl="2">
-      <w:startOverride w:val="1"/>
-    </w:lvlOverride>
-    <w:lvlOverride w:ilvl="3">
-      <w:startOverride w:val="1"/>
-    </w:lvlOverride>
-    <w:lvlOverride w:ilvl="4">
-      <w:startOverride w:val="1"/>
-    </w:lvlOverride>
-    <w:lvlOverride w:ilvl="5">
-      <w:startOverride w:val="1"/>
-    </w:lvlOverride>
-    <w:lvlOverride w:ilvl="6">
-      <w:startOverride w:val="1"/>
-    </w:lvlOverride>
-    <w:lvlOverride w:ilvl="7">
-      <w:startOverride w:val="1"/>
-    </w:lvlOverride>
-    <w:lvlOverride w:ilvl="8">
-      <w:startOverride w:val="1"/>
-    </w:lvlOverride>
+    <w:abstractNumId w:val="991"/>
   </w:num>
   <w:num w:numId="1004">
     <w:abstractNumId w:val="99411"/>
@@ -6568,7 +6756,34 @@
     </w:lvlOverride>
   </w:num>
   <w:num w:numId="1005">
-    <w:abstractNumId w:val="991"/>
+    <w:abstractNumId w:val="99411"/>
+    <w:lvlOverride w:ilvl="0">
+      <w:startOverride w:val="1"/>
+    </w:lvlOverride>
+    <w:lvlOverride w:ilvl="1">
+      <w:startOverride w:val="1"/>
+    </w:lvlOverride>
+    <w:lvlOverride w:ilvl="2">
+      <w:startOverride w:val="1"/>
+    </w:lvlOverride>
+    <w:lvlOverride w:ilvl="3">
+      <w:startOverride w:val="1"/>
+    </w:lvlOverride>
+    <w:lvlOverride w:ilvl="4">
+      <w:startOverride w:val="1"/>
+    </w:lvlOverride>
+    <w:lvlOverride w:ilvl="5">
+      <w:startOverride w:val="1"/>
+    </w:lvlOverride>
+    <w:lvlOverride w:ilvl="6">
+      <w:startOverride w:val="1"/>
+    </w:lvlOverride>
+    <w:lvlOverride w:ilvl="7">
+      <w:startOverride w:val="1"/>
+    </w:lvlOverride>
+    <w:lvlOverride w:ilvl="8">
+      <w:startOverride w:val="1"/>
+    </w:lvlOverride>
   </w:num>
   <w:num w:numId="1006">
     <w:abstractNumId w:val="991"/>
@@ -6577,6 +6792,9 @@
     <w:abstractNumId w:val="991"/>
   </w:num>
   <w:num w:numId="1008">
+    <w:abstractNumId w:val="991"/>
+  </w:num>
+  <w:num w:numId="1009">
     <w:abstractNumId w:val="991"/>
   </w:num>
 </w:numbering>

</xml_diff>

<commit_message>
Procedure: keep code blocks inside the page margins
pandoc's default code font (Consolas 11 pt) fits 77 columns of the
6.5 in text width while the quoted help text is 78 wide, so the last
character of many lines wrapped alone to the next line. A reference
document (build/make_reference_docx.py) sets the code font to 9 pt,
the help text is captured at 76 columns, long plan-summary sentences
are wrapped, and the long shell commands, the pose-log column list and
the example log line are broken across lines in the template.

Co-Authored-By: Claude Fable 5.1 <noreply@anthropic.com>
Claude-Session: https://claude.ai/code/session_016X9U4SzM2dXD3fEs3wV3Mm
</commit_message>
<xml_diff>
--- a/docs/procedures/registration_capture_procedure.docx
+++ b/docs/procedures/registration_capture_procedure.docx
@@ -1175,16 +1175,34 @@
         <w:rPr>
           <w:rStyle w:val="VerbatimChar"/>
         </w:rPr>
-        <w:t xml:space="preserve">python3 -m sphcal.cli.make_manifest --pose-log boot_pose_log.csv --captures boot/ --format csv --out boot/manifest.csv</w:t>
-      </w:r>
-      <w:r>
-        <w:br/>
-      </w:r>
-      <w:r>
-        <w:rPr>
-          <w:rStyle w:val="VerbatimChar"/>
-        </w:rPr>
-        <w:t xml:space="preserve">python3 -m planereg.capture.bootstrap --manifest boot/manifest.csv --out boot.json</w:t>
+        <w:t xml:space="preserve">python3 -m sphcal.cli.make_manifest --pose-log boot_pose_log.csv \</w:t>
+      </w:r>
+      <w:r>
+        <w:br/>
+      </w:r>
+      <w:r>
+        <w:rPr>
+          <w:rStyle w:val="VerbatimChar"/>
+        </w:rPr>
+        <w:t xml:space="preserve">    --captures boot/ --format csv --out boot/manifest.csv</w:t>
+      </w:r>
+      <w:r>
+        <w:br/>
+      </w:r>
+      <w:r>
+        <w:rPr>
+          <w:rStyle w:val="VerbatimChar"/>
+        </w:rPr>
+        <w:t xml:space="preserve">python3 -m planereg.capture.bootstrap --manifest boot/manifest.csv \</w:t>
+      </w:r>
+      <w:r>
+        <w:br/>
+      </w:r>
+      <w:r>
+        <w:rPr>
+          <w:rStyle w:val="VerbatimChar"/>
+        </w:rPr>
+        <w:t xml:space="preserve">    --out boot.json</w:t>
       </w:r>
     </w:p>
     <w:p>
@@ -1296,16 +1314,16 @@
         <w:rPr>
           <w:rStyle w:val="VerbatimChar"/>
         </w:rPr>
-        <w:t xml:space="preserve">python3 -m planereg.capture.plan_poses --sensor-in-base boot.json --camera boot/boot01_Index00.mc \</w:t>
-      </w:r>
-      <w:r>
-        <w:br/>
-      </w:r>
-      <w:r>
-        <w:rPr>
-          <w:rStyle w:val="VerbatimChar"/>
-        </w:rPr>
-        <w:t xml:space="preserve">    --board-half-size-mm 100 75 --out plan/</w:t>
+        <w:t xml:space="preserve">python3 -m planereg.capture.plan_poses --sensor-in-base boot.json \</w:t>
+      </w:r>
+      <w:r>
+        <w:br/>
+      </w:r>
+      <w:r>
+        <w:rPr>
+          <w:rStyle w:val="VerbatimChar"/>
+        </w:rPr>
+        <w:t xml:space="preserve">    --camera boot/boot01_Index00.mc --board-half-size-mm 100 75 --out plan/</w:t>
       </w:r>
     </w:p>
     <w:p>
@@ -1699,7 +1717,16 @@
         <w:rPr>
           <w:rStyle w:val="VerbatimChar"/>
         </w:rPr>
-        <w:t xml:space="preserve">Approach pose: retreat 40 mm along the board's -z, rotation 3 deg about the board's x axis</w:t>
+        <w:t xml:space="preserve">Approach pose: retreat 40 mm along the board's -z, rotation 3 deg about the board's</w:t>
+      </w:r>
+      <w:r>
+        <w:br/>
+      </w:r>
+      <w:r>
+        <w:rPr>
+          <w:rStyle w:val="VerbatimChar"/>
+        </w:rPr>
+        <w:t xml:space="preserve">  x axis</w:t>
       </w:r>
       <w:r>
         <w:br/>
@@ -1810,7 +1837,25 @@
         <w:rPr>
           <w:rStyle w:val="VerbatimChar"/>
         </w:rPr>
-        <w:t xml:space="preserve">  8 poses were dropped because a board corner would come within 10 px of the image edge; use a smaller --lateral-fill, smaller tilts, a smaller board or larger standoffs to keep more of them.</w:t>
+        <w:t xml:space="preserve">    8 poses were dropped because a board corner would come within 10 px of the image</w:t>
+      </w:r>
+      <w:r>
+        <w:br/>
+      </w:r>
+      <w:r>
+        <w:rPr>
+          <w:rStyle w:val="VerbatimChar"/>
+        </w:rPr>
+        <w:t xml:space="preserve">    edge; use a smaller --lateral-fill, smaller tilts, a smaller board or larger</w:t>
+      </w:r>
+      <w:r>
+        <w:br/>
+      </w:r>
+      <w:r>
+        <w:rPr>
+          <w:rStyle w:val="VerbatimChar"/>
+        </w:rPr>
+        <w:t xml:space="preserve">    standoffs to keep more of them.</w:t>
       </w:r>
       <w:r>
         <w:br/>
@@ -1867,7 +1912,16 @@
         <w:rPr>
           <w:rStyle w:val="VerbatimChar"/>
         </w:rPr>
-        <w:t xml:space="preserve">  (assumed noise: normals 0.2 deg, offsets 0.2 mm; an order of magnitude, good to a factor of about two)</w:t>
+        <w:t xml:space="preserve">    (assumed noise: normals 0.2 deg, offsets 0.2 mm; an order of magnitude, good to</w:t>
+      </w:r>
+      <w:r>
+        <w:br/>
+      </w:r>
+      <w:r>
+        <w:rPr>
+          <w:rStyle w:val="VerbatimChar"/>
+        </w:rPr>
+        <w:t xml:space="preserve">    a factor of about two)</w:t>
       </w:r>
       <w:r>
         <w:br/>
@@ -1924,7 +1978,16 @@
         <w:rPr>
           <w:rStyle w:val="VerbatimChar"/>
         </w:rPr>
-        <w:t xml:space="preserve">  (assumed noise: normals 0.2 deg, offsets 0.2 mm; an order of magnitude, good to a factor of about two)</w:t>
+        <w:t xml:space="preserve">    (assumed noise: normals 0.2 deg, offsets 0.2 mm; an order of magnitude, good to</w:t>
+      </w:r>
+      <w:r>
+        <w:br/>
+      </w:r>
+      <w:r>
+        <w:rPr>
+          <w:rStyle w:val="VerbatimChar"/>
+        </w:rPr>
+        <w:t xml:space="preserve">    a factor of about two)</w:t>
       </w:r>
       <w:r>
         <w:br/>
@@ -1954,7 +2017,16 @@
         <w:rPr>
           <w:rStyle w:val="VerbatimChar"/>
         </w:rPr>
-        <w:t xml:space="preserve">Both sub-procedures together: 2 x 235 poses = 470 pose visits; x 5 frames = 2350 capture files.</w:t>
+        <w:t xml:space="preserve">Both sub-procedures together: 2 x 235 poses = 470 pose visits; x 5 frames = 2350</w:t>
+      </w:r>
+      <w:r>
+        <w:br/>
+      </w:r>
+      <w:r>
+        <w:rPr>
+          <w:rStyle w:val="VerbatimChar"/>
+        </w:rPr>
+        <w:t xml:space="preserve">  capture files.</w:t>
       </w:r>
     </w:p>
     <w:p>
@@ -2954,7 +3026,33 @@
         <w:rPr>
           <w:rStyle w:val="VerbatimChar"/>
         </w:rPr>
-        <w:t xml:space="preserve">pose_id, kind, radius_mm, half_width_mm, half_height_mm, x_mm, y_mm, z_mm, rotation_type, r1, r2, r3, r4, j1, j2, j3, j4, j5, j6, approach_j1, ..., approach_j6</w:t>
+        <w:t xml:space="preserve">pose_id, kind, radius_mm, half_width_mm, half_height_mm,</w:t>
+      </w:r>
+      <w:r>
+        <w:br/>
+      </w:r>
+      <w:r>
+        <w:rPr>
+          <w:rStyle w:val="VerbatimChar"/>
+        </w:rPr>
+        <w:t xml:space="preserve">x_mm, y_mm, z_mm, rotation_type, r1, r2, r3, r4,</w:t>
+      </w:r>
+      <w:r>
+        <w:br/>
+      </w:r>
+      <w:r>
+        <w:rPr>
+          <w:rStyle w:val="VerbatimChar"/>
+        </w:rPr>
+        <w:t xml:space="preserve">j1, j2, j3, j4, j5, j6, approach_j1, ..., approach_j6</w:t>
+      </w:r>
+    </w:p>
+    <w:p>
+      <w:pPr>
+        <w:pStyle w:val="FirstParagraph"/>
+      </w:pPr>
+      <w:r>
+        <w:t xml:space="preserve">(one header line in the file; it is broken here only to fit the page)</w:t>
       </w:r>
     </w:p>
     <w:p>
@@ -3262,7 +3360,19 @@
         <w:pStyle w:val="FirstParagraph"/>
       </w:pPr>
       <w:r>
-        <w:t xml:space="preserve">Example line:</w:t>
+        <w:t xml:space="preserve">Example line, one line in the file, broken here only to fit the page (the first</w:t>
+      </w:r>
+      <w:r>
+        <w:t xml:space="preserve"> </w:t>
+      </w:r>
+      <w:r>
+        <w:t xml:space="preserve">part is the pose, the second the six joint angles at the target and the six at the</w:t>
+      </w:r>
+      <w:r>
+        <w:t xml:space="preserve"> </w:t>
+      </w:r>
+      <w:r>
+        <w:t xml:space="preserve">approach pose):</w:t>
       </w:r>
     </w:p>
     <w:p>
@@ -3273,7 +3383,16 @@
         <w:rPr>
           <w:rStyle w:val="VerbatimChar"/>
         </w:rPr>
-        <w:t xml:space="preserve">b_z0650_t24_a090_05,board,,100.0,75.0,850.11,-12.70,470.55,euler_zyx_deg,-91.3,19.8,0.4,,12.1,-35.6,88.2,3.4,41.0,-8.7,11.9,-36.0,88.9,3.1,40.5,-8.4</w:t>
+        <w:t xml:space="preserve">b_z0650_t24_a090_05,board,,100.0,75.0,850.11,-12.70,470.55,euler_zyx_deg,-91.3,19.8,0.4,,</w:t>
+      </w:r>
+      <w:r>
+        <w:br/>
+      </w:r>
+      <w:r>
+        <w:rPr>
+          <w:rStyle w:val="VerbatimChar"/>
+        </w:rPr>
+        <w:t xml:space="preserve">12.1,-35.6,88.2,3.4,41.0,-8.7,11.9,-36.0,88.9,3.1,40.5,-8.4</w:t>
       </w:r>
     </w:p>
     <w:p>
@@ -3292,16 +3411,34 @@
         <w:rPr>
           <w:rStyle w:val="VerbatimChar"/>
         </w:rPr>
-        <w:t xml:space="preserve">python3 -m sphcal.cli.make_manifest --pose-log pose_log_A.csv --captures captures_A/ --format csv --out captures_A/manifest.csv</w:t>
-      </w:r>
-      <w:r>
-        <w:br/>
-      </w:r>
-      <w:r>
-        <w:rPr>
-          <w:rStyle w:val="VerbatimChar"/>
-        </w:rPr>
-        <w:t xml:space="preserve">python3 -m sphcal.cli.make_manifest --pose-log pose_log_B.csv --captures captures_B/ --format csv --out captures_B/manifest.csv</w:t>
+        <w:t xml:space="preserve">python3 -m sphcal.cli.make_manifest --pose-log pose_log_A.csv \</w:t>
+      </w:r>
+      <w:r>
+        <w:br/>
+      </w:r>
+      <w:r>
+        <w:rPr>
+          <w:rStyle w:val="VerbatimChar"/>
+        </w:rPr>
+        <w:t xml:space="preserve">    --captures captures_A/ --format csv --out captures_A/manifest.csv</w:t>
+      </w:r>
+      <w:r>
+        <w:br/>
+      </w:r>
+      <w:r>
+        <w:rPr>
+          <w:rStyle w:val="VerbatimChar"/>
+        </w:rPr>
+        <w:t xml:space="preserve">python3 -m sphcal.cli.make_manifest --pose-log pose_log_B.csv \</w:t>
+      </w:r>
+      <w:r>
+        <w:br/>
+      </w:r>
+      <w:r>
+        <w:rPr>
+          <w:rStyle w:val="VerbatimChar"/>
+        </w:rPr>
+        <w:t xml:space="preserve">    --captures captures_B/ --format csv --out captures_B/manifest.csv</w:t>
       </w:r>
     </w:p>
     <w:p>
@@ -3395,16 +3532,34 @@
         <w:rPr>
           <w:rStyle w:val="VerbatimChar"/>
         </w:rPr>
-        <w:t xml:space="preserve">python3 -m planereg.capture.check_captures --manifest captures_A/manifest.csv --sensor-in-base boot.json --pose-log pose_log_A.csv --out captures_A/check.json</w:t>
-      </w:r>
-      <w:r>
-        <w:br/>
-      </w:r>
-      <w:r>
-        <w:rPr>
-          <w:rStyle w:val="VerbatimChar"/>
-        </w:rPr>
-        <w:t xml:space="preserve">python3 -m planereg.capture.check_captures --manifest captures_B/manifest.csv --sensor-in-base boot.json --pose-log pose_log_B.csv --out captures_B/check.json</w:t>
+        <w:t xml:space="preserve">python3 -m planereg.capture.check_captures --manifest captures_A/manifest.csv \</w:t>
+      </w:r>
+      <w:r>
+        <w:br/>
+      </w:r>
+      <w:r>
+        <w:rPr>
+          <w:rStyle w:val="VerbatimChar"/>
+        </w:rPr>
+        <w:t xml:space="preserve">    --sensor-in-base boot.json --pose-log pose_log_A.csv --out captures_A/check.json</w:t>
+      </w:r>
+      <w:r>
+        <w:br/>
+      </w:r>
+      <w:r>
+        <w:rPr>
+          <w:rStyle w:val="VerbatimChar"/>
+        </w:rPr>
+        <w:t xml:space="preserve">python3 -m planereg.capture.check_captures --manifest captures_B/manifest.csv \</w:t>
+      </w:r>
+      <w:r>
+        <w:br/>
+      </w:r>
+      <w:r>
+        <w:rPr>
+          <w:rStyle w:val="VerbatimChar"/>
+        </w:rPr>
+        <w:t xml:space="preserve">    --sensor-in-base boot.json --pose-log pose_log_B.csv --out captures_B/check.json</w:t>
       </w:r>
     </w:p>
     <w:p>
@@ -4329,7 +4484,16 @@
         <w:rPr>
           <w:rStyle w:val="VerbatimChar"/>
         </w:rPr>
-        <w:t xml:space="preserve">                     [--lateral-fill LATERAL_FILL] [--lateral-positions NX NY]</w:t>
+        <w:t xml:space="preserve">                     [--lateral-fill LATERAL_FILL]</w:t>
+      </w:r>
+      <w:r>
+        <w:br/>
+      </w:r>
+      <w:r>
+        <w:rPr>
+          <w:rStyle w:val="VerbatimChar"/>
+        </w:rPr>
+        <w:t xml:space="preserve">                     [--lateral-positions NX NY]</w:t>
       </w:r>
       <w:r>
         <w:br/>
@@ -4422,25 +4586,25 @@
         <w:rPr>
           <w:rStyle w:val="VerbatimChar"/>
         </w:rPr>
-        <w:t xml:space="preserve">standoffs, lateral positions, tilts and azimuths, each with an approach pose</w:t>
-      </w:r>
-      <w:r>
-        <w:br/>
-      </w:r>
-      <w:r>
-        <w:rPr>
-          <w:rStyle w:val="VerbatimChar"/>
-        </w:rPr>
-        <w:t xml:space="preserve">for the minimizing-backlash sub-procedure. Writes poses.csv, plan_summary.txt</w:t>
-      </w:r>
-      <w:r>
-        <w:br/>
-      </w:r>
-      <w:r>
-        <w:rPr>
-          <w:rStyle w:val="VerbatimChar"/>
-        </w:rPr>
-        <w:t xml:space="preserve">and plan.png.</w:t>
+        <w:t xml:space="preserve">standoffs, lateral positions, tilts and azimuths, each with an approach</w:t>
+      </w:r>
+      <w:r>
+        <w:br/>
+      </w:r>
+      <w:r>
+        <w:rPr>
+          <w:rStyle w:val="VerbatimChar"/>
+        </w:rPr>
+        <w:t xml:space="preserve">pose for the minimizing-backlash sub-procedure. Writes poses.csv,</w:t>
+      </w:r>
+      <w:r>
+        <w:br/>
+      </w:r>
+      <w:r>
+        <w:rPr>
+          <w:rStyle w:val="VerbatimChar"/>
+        </w:rPr>
+        <w:t xml:space="preserve">plan_summary.txt and plan.png.</w:t>
       </w:r>
       <w:r>
         <w:br/>
@@ -4479,70 +4643,70 @@
         <w:rPr>
           <w:rStyle w:val="VerbatimChar"/>
         </w:rPr>
-        <w:t xml:space="preserve">                        JSON with {"matrix": [16 floats, row-major 4x4 sensor-</w:t>
-      </w:r>
-      <w:r>
-        <w:br/>
-      </w:r>
-      <w:r>
-        <w:rPr>
-          <w:rStyle w:val="VerbatimChar"/>
-        </w:rPr>
-        <w:t xml:space="preserve">                        to-base]} (the bootstrap tool writes this) or sphcal's</w:t>
-      </w:r>
-      <w:r>
-        <w:br/>
-      </w:r>
-      <w:r>
-        <w:rPr>
-          <w:rStyle w:val="VerbatimChar"/>
-        </w:rPr>
-        <w:t xml:space="preserve">                        {"bootstrap": [{"pose_id", "base_xyz", "sensor_xyz"},</w:t>
-      </w:r>
-      <w:r>
-        <w:br/>
-      </w:r>
-      <w:r>
-        <w:rPr>
-          <w:rStyle w:val="VerbatimChar"/>
-        </w:rPr>
-        <w:t xml:space="preserve">                        ...]}</w:t>
-      </w:r>
-      <w:r>
-        <w:br/>
-      </w:r>
-      <w:r>
-        <w:rPr>
-          <w:rStyle w:val="VerbatimChar"/>
-        </w:rPr>
-        <w:t xml:space="preserve">  --camera PATH         .mc capture file whose header gives fx, fy, cx, cy and</w:t>
-      </w:r>
-      <w:r>
-        <w:br/>
-      </w:r>
-      <w:r>
-        <w:rPr>
-          <w:rStyle w:val="VerbatimChar"/>
-        </w:rPr>
-        <w:t xml:space="preserve">                        whose array gives the image size</w:t>
-      </w:r>
-      <w:r>
-        <w:br/>
-      </w:r>
-      <w:r>
-        <w:rPr>
-          <w:rStyle w:val="VerbatimChar"/>
-        </w:rPr>
-        <w:t xml:space="preserve">  --fov-deg H V         full horizontal and vertical field of view in degrees</w:t>
-      </w:r>
-      <w:r>
-        <w:br/>
-      </w:r>
-      <w:r>
-        <w:rPr>
-          <w:rStyle w:val="VerbatimChar"/>
-        </w:rPr>
-        <w:t xml:space="preserve">                        (with --image-size)</w:t>
+        <w:t xml:space="preserve">                        JSON with {"matrix": [16 floats, row-major 4x4</w:t>
+      </w:r>
+      <w:r>
+        <w:br/>
+      </w:r>
+      <w:r>
+        <w:rPr>
+          <w:rStyle w:val="VerbatimChar"/>
+        </w:rPr>
+        <w:t xml:space="preserve">                        sensor-to-base]} (the bootstrap tool writes this)</w:t>
+      </w:r>
+      <w:r>
+        <w:br/>
+      </w:r>
+      <w:r>
+        <w:rPr>
+          <w:rStyle w:val="VerbatimChar"/>
+        </w:rPr>
+        <w:t xml:space="preserve">                        or sphcal's {"bootstrap": [{"pose_id", "base_xyz",</w:t>
+      </w:r>
+      <w:r>
+        <w:br/>
+      </w:r>
+      <w:r>
+        <w:rPr>
+          <w:rStyle w:val="VerbatimChar"/>
+        </w:rPr>
+        <w:t xml:space="preserve">                        "sensor_xyz"}, ...]}</w:t>
+      </w:r>
+      <w:r>
+        <w:br/>
+      </w:r>
+      <w:r>
+        <w:rPr>
+          <w:rStyle w:val="VerbatimChar"/>
+        </w:rPr>
+        <w:t xml:space="preserve">  --camera PATH         .mc capture file whose header gives fx, fy, cx, cy</w:t>
+      </w:r>
+      <w:r>
+        <w:br/>
+      </w:r>
+      <w:r>
+        <w:rPr>
+          <w:rStyle w:val="VerbatimChar"/>
+        </w:rPr>
+        <w:t xml:space="preserve">                        and whose array gives the image size</w:t>
+      </w:r>
+      <w:r>
+        <w:br/>
+      </w:r>
+      <w:r>
+        <w:rPr>
+          <w:rStyle w:val="VerbatimChar"/>
+        </w:rPr>
+        <w:t xml:space="preserve">  --fov-deg H V         full horizontal and vertical field of view in</w:t>
+      </w:r>
+      <w:r>
+        <w:br/>
+      </w:r>
+      <w:r>
+        <w:rPr>
+          <w:rStyle w:val="VerbatimChar"/>
+        </w:rPr>
+        <w:t xml:space="preserve">                        degrees (with --image-size)</w:t>
       </w:r>
       <w:r>
         <w:br/>
@@ -4569,16 +4733,16 @@
         <w:rPr>
           <w:rStyle w:val="VerbatimChar"/>
         </w:rPr>
-        <w:t xml:space="preserve">                        half the long edge and half the short edge (default</w:t>
-      </w:r>
-      <w:r>
-        <w:br/>
-      </w:r>
-      <w:r>
-        <w:rPr>
-          <w:rStyle w:val="VerbatimChar"/>
-        </w:rPr>
-        <w:t xml:space="preserve">                        (100.0, 75.0))</w:t>
+        <w:t xml:space="preserve">                        half the long edge and half the short edge</w:t>
+      </w:r>
+      <w:r>
+        <w:br/>
+      </w:r>
+      <w:r>
+        <w:rPr>
+          <w:rStyle w:val="VerbatimChar"/>
+        </w:rPr>
+        <w:t xml:space="preserve">                        (default (100.0, 75.0))</w:t>
       </w:r>
       <w:r>
         <w:br/>
@@ -4596,16 +4760,16 @@
         <w:rPr>
           <w:rStyle w:val="VerbatimChar"/>
         </w:rPr>
-        <w:t xml:space="preserve">                        sensor-z depths of the board centers (default (550.0,</w:t>
-      </w:r>
-      <w:r>
-        <w:br/>
-      </w:r>
-      <w:r>
-        <w:rPr>
-          <w:rStyle w:val="VerbatimChar"/>
-        </w:rPr>
-        <w:t xml:space="preserve">                        750.0, 950.0))</w:t>
+        <w:t xml:space="preserve">                        sensor-z depths of the board centers (default</w:t>
+      </w:r>
+      <w:r>
+        <w:br/>
+      </w:r>
+      <w:r>
+        <w:rPr>
+          <w:rStyle w:val="VerbatimChar"/>
+        </w:rPr>
+        <w:t xml:space="preserve">                        (550.0, 750.0, 950.0))</w:t>
       </w:r>
       <w:r>
         <w:br/>
@@ -4623,16 +4787,25 @@
         <w:rPr>
           <w:rStyle w:val="VerbatimChar"/>
         </w:rPr>
-        <w:t xml:space="preserve">                        board tilts away from facing the sensor; 0 is planned</w:t>
-      </w:r>
-      <w:r>
-        <w:br/>
-      </w:r>
-      <w:r>
-        <w:rPr>
-          <w:rStyle w:val="VerbatimChar"/>
-        </w:rPr>
-        <w:t xml:space="preserve">                        once per position (default (0.0, 15.0, 30.0))</w:t>
+        <w:t xml:space="preserve">                        board tilts away from facing the sensor; 0 is</w:t>
+      </w:r>
+      <w:r>
+        <w:br/>
+      </w:r>
+      <w:r>
+        <w:rPr>
+          <w:rStyle w:val="VerbatimChar"/>
+        </w:rPr>
+        <w:t xml:space="preserve">                        planned once per position (default (0.0, 15.0,</w:t>
+      </w:r>
+      <w:r>
+        <w:br/>
+      </w:r>
+      <w:r>
+        <w:rPr>
+          <w:rStyle w:val="VerbatimChar"/>
+        </w:rPr>
+        <w:t xml:space="preserve">                        30.0))</w:t>
       </w:r>
       <w:r>
         <w:br/>
@@ -4677,16 +4850,16 @@
         <w:rPr>
           <w:rStyle w:val="VerbatimChar"/>
         </w:rPr>
-        <w:t xml:space="preserve">                        fraction of the half field covered by board centers at</w:t>
-      </w:r>
-      <w:r>
-        <w:br/>
-      </w:r>
-      <w:r>
-        <w:rPr>
-          <w:rStyle w:val="VerbatimChar"/>
-        </w:rPr>
-        <w:t xml:space="preserve">                        each standoff (default 0.5)</w:t>
+        <w:t xml:space="preserve">                        fraction of the half field covered by board</w:t>
+      </w:r>
+      <w:r>
+        <w:br/>
+      </w:r>
+      <w:r>
+        <w:rPr>
+          <w:rStyle w:val="VerbatimChar"/>
+        </w:rPr>
+        <w:t xml:space="preserve">                        centers at each standoff (default 0.5)</w:t>
       </w:r>
       <w:r>
         <w:br/>
@@ -4731,7 +4904,593 @@
         <w:rPr>
           <w:rStyle w:val="VerbatimChar"/>
         </w:rPr>
-        <w:t xml:space="preserve">                        board corners must project this far inside the image</w:t>
+        <w:t xml:space="preserve">                        board corners must project this far inside the</w:t>
+      </w:r>
+      <w:r>
+        <w:br/>
+      </w:r>
+      <w:r>
+        <w:rPr>
+          <w:rStyle w:val="VerbatimChar"/>
+        </w:rPr>
+        <w:t xml:space="preserve">                        image (default 10.0)</w:t>
+      </w:r>
+      <w:r>
+        <w:br/>
+      </w:r>
+      <w:r>
+        <w:rPr>
+          <w:rStyle w:val="VerbatimChar"/>
+        </w:rPr>
+        <w:t xml:space="preserve">  --approach-retreat-mm APPROACH_RETREAT_MM</w:t>
+      </w:r>
+      <w:r>
+        <w:br/>
+      </w:r>
+      <w:r>
+        <w:rPr>
+          <w:rStyle w:val="VerbatimChar"/>
+        </w:rPr>
+        <w:t xml:space="preserve">                        retreat of the approach pose along the board's own</w:t>
+      </w:r>
+      <w:r>
+        <w:br/>
+      </w:r>
+      <w:r>
+        <w:rPr>
+          <w:rStyle w:val="VerbatimChar"/>
+        </w:rPr>
+        <w:t xml:space="preserve">                        -z (default 40.0)</w:t>
+      </w:r>
+      <w:r>
+        <w:br/>
+      </w:r>
+      <w:r>
+        <w:rPr>
+          <w:rStyle w:val="VerbatimChar"/>
+        </w:rPr>
+        <w:t xml:space="preserve">  --approach-rotation-deg APPROACH_ROTATION_DEG</w:t>
+      </w:r>
+      <w:r>
+        <w:br/>
+      </w:r>
+      <w:r>
+        <w:rPr>
+          <w:rStyle w:val="VerbatimChar"/>
+        </w:rPr>
+        <w:t xml:space="preserve">                        rotation of the approach pose about the board's</w:t>
+      </w:r>
+      <w:r>
+        <w:br/>
+      </w:r>
+      <w:r>
+        <w:rPr>
+          <w:rStyle w:val="VerbatimChar"/>
+        </w:rPr>
+        <w:t xml:space="preserve">                        own x axis (default 3.0)</w:t>
+      </w:r>
+      <w:r>
+        <w:br/>
+      </w:r>
+      <w:r>
+        <w:rPr>
+          <w:rStyle w:val="VerbatimChar"/>
+        </w:rPr>
+        <w:t xml:space="preserve">  --holdout-fraction HOLDOUT_FRACTION</w:t>
+      </w:r>
+      <w:r>
+        <w:br/>
+      </w:r>
+      <w:r>
+        <w:rPr>
+          <w:rStyle w:val="VerbatimChar"/>
+        </w:rPr>
+        <w:t xml:space="preserve">                        fraction of the poses tagged as held out (default</w:t>
+      </w:r>
+      <w:r>
+        <w:br/>
+      </w:r>
+      <w:r>
+        <w:rPr>
+          <w:rStyle w:val="VerbatimChar"/>
+        </w:rPr>
+        <w:t xml:space="preserve">                        0.2)</w:t>
+      </w:r>
+      <w:r>
+        <w:br/>
+      </w:r>
+      <w:r>
+        <w:rPr>
+          <w:rStyle w:val="VerbatimChar"/>
+        </w:rPr>
+        <w:t xml:space="preserve">  --seed SEED           seed of the random held-out subset</w:t>
+      </w:r>
+      <w:r>
+        <w:br/>
+      </w:r>
+      <w:r>
+        <w:rPr>
+          <w:rStyle w:val="VerbatimChar"/>
+        </w:rPr>
+        <w:t xml:space="preserve">  --target-pose-count N</w:t>
+      </w:r>
+      <w:r>
+        <w:br/>
+      </w:r>
+      <w:r>
+        <w:rPr>
+          <w:rStyle w:val="VerbatimChar"/>
+        </w:rPr>
+        <w:t xml:space="preserve">                        choose the lateral grid so that the plan has about</w:t>
+      </w:r>
+      <w:r>
+        <w:br/>
+      </w:r>
+      <w:r>
+        <w:rPr>
+          <w:rStyle w:val="VerbatimChar"/>
+        </w:rPr>
+        <w:t xml:space="preserve">                        N poses (overrides --lateral-positions)</w:t>
+      </w:r>
+      <w:r>
+        <w:br/>
+      </w:r>
+      <w:r>
+        <w:rPr>
+          <w:rStyle w:val="VerbatimChar"/>
+        </w:rPr>
+        <w:t xml:space="preserve">  --noise-normal-deg NOISE_NORMAL_DEG</w:t>
+      </w:r>
+      <w:r>
+        <w:br/>
+      </w:r>
+      <w:r>
+        <w:rPr>
+          <w:rStyle w:val="VerbatimChar"/>
+        </w:rPr>
+        <w:t xml:space="preserve">                        assumed normal noise for the error prediction</w:t>
+      </w:r>
+      <w:r>
+        <w:br/>
+      </w:r>
+      <w:r>
+        <w:rPr>
+          <w:rStyle w:val="VerbatimChar"/>
+        </w:rPr>
+        <w:t xml:space="preserve">                        (default 0.2)</w:t>
+      </w:r>
+      <w:r>
+        <w:br/>
+      </w:r>
+      <w:r>
+        <w:rPr>
+          <w:rStyle w:val="VerbatimChar"/>
+        </w:rPr>
+        <w:t xml:space="preserve">  --noise-offset-mm NOISE_OFFSET_MM</w:t>
+      </w:r>
+      <w:r>
+        <w:br/>
+      </w:r>
+      <w:r>
+        <w:rPr>
+          <w:rStyle w:val="VerbatimChar"/>
+        </w:rPr>
+        <w:t xml:space="preserve">                        assumed offset noise for the error prediction</w:t>
+      </w:r>
+      <w:r>
+        <w:br/>
+      </w:r>
+      <w:r>
+        <w:rPr>
+          <w:rStyle w:val="VerbatimChar"/>
+        </w:rPr>
+        <w:t xml:space="preserve">                        (default 0.2)</w:t>
+      </w:r>
+      <w:r>
+        <w:br/>
+      </w:r>
+      <w:r>
+        <w:rPr>
+          <w:rStyle w:val="VerbatimChar"/>
+        </w:rPr>
+        <w:t xml:space="preserve">  --frames-per-pose FRAMES_PER_POSE</w:t>
+      </w:r>
+      <w:r>
+        <w:br/>
+      </w:r>
+      <w:r>
+        <w:rPr>
+          <w:rStyle w:val="VerbatimChar"/>
+        </w:rPr>
+        <w:t xml:space="preserve">                        frames captured per pose, for the capture counts</w:t>
+      </w:r>
+      <w:r>
+        <w:br/>
+      </w:r>
+      <w:r>
+        <w:rPr>
+          <w:rStyle w:val="VerbatimChar"/>
+        </w:rPr>
+        <w:t xml:space="preserve">                        (default 5)</w:t>
+      </w:r>
+      <w:r>
+        <w:br/>
+      </w:r>
+      <w:r>
+        <w:rPr>
+          <w:rStyle w:val="VerbatimChar"/>
+        </w:rPr>
+        <w:t xml:space="preserve">  --out DIR             output directory</w:t>
+      </w:r>
+    </w:p>
+    <w:p>
+      <w:pPr>
+        <w:pStyle w:val="FirstParagraph"/>
+      </w:pPr>
+      <w:r>
+        <w:t xml:space="preserve">Output of</w:t>
+      </w:r>
+      <w:r>
+        <w:t xml:space="preserve"> </w:t>
+      </w:r>
+      <w:r>
+        <w:rPr>
+          <w:rStyle w:val="VerbatimChar"/>
+        </w:rPr>
+        <w:t xml:space="preserve">python3 -m planereg.capture.bootstrap --help</w:t>
+      </w:r>
+      <w:r>
+        <w:t xml:space="preserve">:</w:t>
+      </w:r>
+    </w:p>
+    <w:p>
+      <w:pPr>
+        <w:pStyle w:val="SourceCode"/>
+      </w:pPr>
+      <w:r>
+        <w:rPr>
+          <w:rStyle w:val="VerbatimChar"/>
+        </w:rPr>
+        <w:t xml:space="preserve">usage: bootstrap.py [-h] --manifest PATH --out PATH</w:t>
+      </w:r>
+      <w:r>
+        <w:br/>
+      </w:r>
+      <w:r>
+        <w:rPr>
+          <w:rStyle w:val="VerbatimChar"/>
+        </w:rPr>
+        <w:t xml:space="preserve">                    [--min-valid-fraction MIN_VALID_FRACTION]</w:t>
+      </w:r>
+      <w:r>
+        <w:br/>
+      </w:r>
+      <w:r>
+        <w:rPr>
+          <w:rStyle w:val="VerbatimChar"/>
+        </w:rPr>
+        <w:t xml:space="preserve">                    [--border-margin-px BORDER_MARGIN_PX]</w:t>
+      </w:r>
+      <w:r>
+        <w:br/>
+      </w:r>
+      <w:r>
+        <w:rPr>
+          <w:rStyle w:val="VerbatimChar"/>
+        </w:rPr>
+        <w:t xml:space="preserve">                    [--min-pose-count MIN_POSE_COUNT]</w:t>
+      </w:r>
+      <w:r>
+        <w:br/>
+      </w:r>
+      <w:r>
+        <w:rPr>
+          <w:rStyle w:val="VerbatimChar"/>
+        </w:rPr>
+        <w:t xml:space="preserve">                    [--min-normal-spread MIN_NORMAL_SPREAD]</w:t>
+      </w:r>
+      <w:r>
+        <w:br/>
+      </w:r>
+      <w:r>
+        <w:rPr>
+          <w:rStyle w:val="VerbatimChar"/>
+        </w:rPr>
+        <w:t xml:space="preserve">                    [--max-rms-normal-deg MAX_RMS_NORMAL_DEG]</w:t>
+      </w:r>
+      <w:r>
+        <w:br/>
+      </w:r>
+      <w:r>
+        <w:rPr>
+          <w:rStyle w:val="VerbatimChar"/>
+        </w:rPr>
+        <w:t xml:space="preserve">                    [--max-rms-offset-mm MAX_RMS_OFFSET_MM]</w:t>
+      </w:r>
+      <w:r>
+        <w:br/>
+      </w:r>
+      <w:r>
+        <w:rPr>
+          <w:rStyle w:val="VerbatimChar"/>
+        </w:rPr>
+        <w:t xml:space="preserve">                    [--max-normal-deg MAX_NORMAL_DEG]</w:t>
+      </w:r>
+      <w:r>
+        <w:br/>
+      </w:r>
+      <w:r>
+        <w:rPr>
+          <w:rStyle w:val="VerbatimChar"/>
+        </w:rPr>
+        <w:t xml:space="preserve">                    [--max-offset-mm MAX_OFFSET_MM]</w:t>
+      </w:r>
+      <w:r>
+        <w:br/>
+      </w:r>
+      <w:r>
+        <w:br/>
+      </w:r>
+      <w:r>
+        <w:rPr>
+          <w:rStyle w:val="VerbatimChar"/>
+        </w:rPr>
+        <w:t xml:space="preserve">Find the sensor roughly in the robot base frame from four or more hand-</w:t>
+      </w:r>
+      <w:r>
+        <w:br/>
+      </w:r>
+      <w:r>
+        <w:rPr>
+          <w:rStyle w:val="VerbatimChar"/>
+        </w:rPr>
+        <w:t xml:space="preserve">jogged board captures (manifest made by sphcal's make_manifest): segment</w:t>
+      </w:r>
+      <w:r>
+        <w:br/>
+      </w:r>
+      <w:r>
+        <w:rPr>
+          <w:rStyle w:val="VerbatimChar"/>
+        </w:rPr>
+        <w:t xml:space="preserve">the board in each, register, print the table and the transform, and write</w:t>
+      </w:r>
+      <w:r>
+        <w:br/>
+      </w:r>
+      <w:r>
+        <w:rPr>
+          <w:rStyle w:val="VerbatimChar"/>
+        </w:rPr>
+        <w:t xml:space="preserve">the JSON that the plan tool reads.</w:t>
+      </w:r>
+      <w:r>
+        <w:br/>
+      </w:r>
+      <w:r>
+        <w:br/>
+      </w:r>
+      <w:r>
+        <w:rPr>
+          <w:rStyle w:val="VerbatimChar"/>
+        </w:rPr>
+        <w:t xml:space="preserve">options:</w:t>
+      </w:r>
+      <w:r>
+        <w:br/>
+      </w:r>
+      <w:r>
+        <w:rPr>
+          <w:rStyle w:val="VerbatimChar"/>
+        </w:rPr>
+        <w:t xml:space="preserve">  -h, --help            show this help message and exit</w:t>
+      </w:r>
+      <w:r>
+        <w:br/>
+      </w:r>
+      <w:r>
+        <w:rPr>
+          <w:rStyle w:val="VerbatimChar"/>
+        </w:rPr>
+        <w:t xml:space="preserve">  --manifest PATH       manifest CSV or JSON</w:t>
+      </w:r>
+      <w:r>
+        <w:br/>
+      </w:r>
+      <w:r>
+        <w:rPr>
+          <w:rStyle w:val="VerbatimChar"/>
+        </w:rPr>
+        <w:t xml:space="preserve">  --out PATH            JSON file to write</w:t>
+      </w:r>
+      <w:r>
+        <w:br/>
+      </w:r>
+      <w:r>
+        <w:rPr>
+          <w:rStyle w:val="VerbatimChar"/>
+        </w:rPr>
+        <w:t xml:space="preserve">  --min-valid-fraction MIN_VALID_FRACTION</w:t>
+      </w:r>
+      <w:r>
+        <w:br/>
+      </w:r>
+      <w:r>
+        <w:rPr>
+          <w:rStyle w:val="VerbatimChar"/>
+        </w:rPr>
+        <w:t xml:space="preserve">                        a pixel must be valid in this fraction of a pose's</w:t>
+      </w:r>
+      <w:r>
+        <w:br/>
+      </w:r>
+      <w:r>
+        <w:rPr>
+          <w:rStyle w:val="VerbatimChar"/>
+        </w:rPr>
+        <w:t xml:space="preserve">                        frames (default 0.5)</w:t>
+      </w:r>
+      <w:r>
+        <w:br/>
+      </w:r>
+      <w:r>
+        <w:rPr>
+          <w:rStyle w:val="VerbatimChar"/>
+        </w:rPr>
+        <w:t xml:space="preserve">  --border-margin-px BORDER_MARGIN_PX</w:t>
+      </w:r>
+      <w:r>
+        <w:br/>
+      </w:r>
+      <w:r>
+        <w:rPr>
+          <w:rStyle w:val="VerbatimChar"/>
+        </w:rPr>
+        <w:t xml:space="preserve">                        warn when the board mask comes this close to the</w:t>
+      </w:r>
+      <w:r>
+        <w:br/>
+      </w:r>
+      <w:r>
+        <w:rPr>
+          <w:rStyle w:val="VerbatimChar"/>
+        </w:rPr>
+        <w:t xml:space="preserve">                        image border (default 4)</w:t>
+      </w:r>
+      <w:r>
+        <w:br/>
+      </w:r>
+      <w:r>
+        <w:rPr>
+          <w:rStyle w:val="VerbatimChar"/>
+        </w:rPr>
+        <w:t xml:space="preserve">  --min-pose-count MIN_POSE_COUNT</w:t>
+      </w:r>
+      <w:r>
+        <w:br/>
+      </w:r>
+      <w:r>
+        <w:rPr>
+          <w:rStyle w:val="VerbatimChar"/>
+        </w:rPr>
+        <w:t xml:space="preserve">                        fewest segmented poses the registration may use</w:t>
+      </w:r>
+      <w:r>
+        <w:br/>
+      </w:r>
+      <w:r>
+        <w:rPr>
+          <w:rStyle w:val="VerbatimChar"/>
+        </w:rPr>
+        <w:t xml:space="preserve">                        (default 4)</w:t>
+      </w:r>
+      <w:r>
+        <w:br/>
+      </w:r>
+      <w:r>
+        <w:rPr>
+          <w:rStyle w:val="VerbatimChar"/>
+        </w:rPr>
+        <w:t xml:space="preserve">  --min-normal-spread MIN_NORMAL_SPREAD</w:t>
+      </w:r>
+      <w:r>
+        <w:br/>
+      </w:r>
+      <w:r>
+        <w:rPr>
+          <w:rStyle w:val="VerbatimChar"/>
+        </w:rPr>
+        <w:t xml:space="preserve">                        smallest accepted spread of the board normals</w:t>
+      </w:r>
+      <w:r>
+        <w:br/>
+      </w:r>
+      <w:r>
+        <w:rPr>
+          <w:rStyle w:val="VerbatimChar"/>
+        </w:rPr>
+        <w:t xml:space="preserve">                        (default 0.05)</w:t>
+      </w:r>
+      <w:r>
+        <w:br/>
+      </w:r>
+      <w:r>
+        <w:rPr>
+          <w:rStyle w:val="VerbatimChar"/>
+        </w:rPr>
+        <w:t xml:space="preserve">  --max-rms-normal-deg MAX_RMS_NORMAL_DEG</w:t>
+      </w:r>
+      <w:r>
+        <w:br/>
+      </w:r>
+      <w:r>
+        <w:rPr>
+          <w:rStyle w:val="VerbatimChar"/>
+        </w:rPr>
+        <w:t xml:space="preserve">                        largest accepted RMS normal residual (default 1.0)</w:t>
+      </w:r>
+      <w:r>
+        <w:br/>
+      </w:r>
+      <w:r>
+        <w:rPr>
+          <w:rStyle w:val="VerbatimChar"/>
+        </w:rPr>
+        <w:t xml:space="preserve">  --max-rms-offset-mm MAX_RMS_OFFSET_MM</w:t>
+      </w:r>
+      <w:r>
+        <w:br/>
+      </w:r>
+      <w:r>
+        <w:rPr>
+          <w:rStyle w:val="VerbatimChar"/>
+        </w:rPr>
+        <w:t xml:space="preserve">                        largest accepted RMS offset residual (default 5.0)</w:t>
+      </w:r>
+      <w:r>
+        <w:br/>
+      </w:r>
+      <w:r>
+        <w:rPr>
+          <w:rStyle w:val="VerbatimChar"/>
+        </w:rPr>
+        <w:t xml:space="preserve">  --max-normal-deg MAX_NORMAL_DEG</w:t>
+      </w:r>
+      <w:r>
+        <w:br/>
+      </w:r>
+      <w:r>
+        <w:rPr>
+          <w:rStyle w:val="VerbatimChar"/>
+        </w:rPr>
+        <w:t xml:space="preserve">                        largest accepted normal residual of a single pose</w:t>
+      </w:r>
+      <w:r>
+        <w:br/>
+      </w:r>
+      <w:r>
+        <w:rPr>
+          <w:rStyle w:val="VerbatimChar"/>
+        </w:rPr>
+        <w:t xml:space="preserve">                        (default 2.0)</w:t>
+      </w:r>
+      <w:r>
+        <w:br/>
+      </w:r>
+      <w:r>
+        <w:rPr>
+          <w:rStyle w:val="VerbatimChar"/>
+        </w:rPr>
+        <w:t xml:space="preserve">  --max-offset-mm MAX_OFFSET_MM</w:t>
+      </w:r>
+      <w:r>
+        <w:br/>
+      </w:r>
+      <w:r>
+        <w:rPr>
+          <w:rStyle w:val="VerbatimChar"/>
+        </w:rPr>
+        <w:t xml:space="preserve">                        largest accepted offset residual of a single pose</w:t>
       </w:r>
       <w:r>
         <w:br/>
@@ -4742,204 +5501,6 @@
         </w:rPr>
         <w:t xml:space="preserve">                        (default 10.0)</w:t>
       </w:r>
-      <w:r>
-        <w:br/>
-      </w:r>
-      <w:r>
-        <w:rPr>
-          <w:rStyle w:val="VerbatimChar"/>
-        </w:rPr>
-        <w:t xml:space="preserve">  --approach-retreat-mm APPROACH_RETREAT_MM</w:t>
-      </w:r>
-      <w:r>
-        <w:br/>
-      </w:r>
-      <w:r>
-        <w:rPr>
-          <w:rStyle w:val="VerbatimChar"/>
-        </w:rPr>
-        <w:t xml:space="preserve">                        retreat of the approach pose along the board's own -z</w:t>
-      </w:r>
-      <w:r>
-        <w:br/>
-      </w:r>
-      <w:r>
-        <w:rPr>
-          <w:rStyle w:val="VerbatimChar"/>
-        </w:rPr>
-        <w:t xml:space="preserve">                        (default 40.0)</w:t>
-      </w:r>
-      <w:r>
-        <w:br/>
-      </w:r>
-      <w:r>
-        <w:rPr>
-          <w:rStyle w:val="VerbatimChar"/>
-        </w:rPr>
-        <w:t xml:space="preserve">  --approach-rotation-deg APPROACH_ROTATION_DEG</w:t>
-      </w:r>
-      <w:r>
-        <w:br/>
-      </w:r>
-      <w:r>
-        <w:rPr>
-          <w:rStyle w:val="VerbatimChar"/>
-        </w:rPr>
-        <w:t xml:space="preserve">                        rotation of the approach pose about the board's own x</w:t>
-      </w:r>
-      <w:r>
-        <w:br/>
-      </w:r>
-      <w:r>
-        <w:rPr>
-          <w:rStyle w:val="VerbatimChar"/>
-        </w:rPr>
-        <w:t xml:space="preserve">                        axis (default 3.0)</w:t>
-      </w:r>
-      <w:r>
-        <w:br/>
-      </w:r>
-      <w:r>
-        <w:rPr>
-          <w:rStyle w:val="VerbatimChar"/>
-        </w:rPr>
-        <w:t xml:space="preserve">  --holdout-fraction HOLDOUT_FRACTION</w:t>
-      </w:r>
-      <w:r>
-        <w:br/>
-      </w:r>
-      <w:r>
-        <w:rPr>
-          <w:rStyle w:val="VerbatimChar"/>
-        </w:rPr>
-        <w:t xml:space="preserve">                        fraction of the poses tagged as held out (default 0.2)</w:t>
-      </w:r>
-      <w:r>
-        <w:br/>
-      </w:r>
-      <w:r>
-        <w:rPr>
-          <w:rStyle w:val="VerbatimChar"/>
-        </w:rPr>
-        <w:t xml:space="preserve">  --seed SEED           seed of the random held-out subset</w:t>
-      </w:r>
-      <w:r>
-        <w:br/>
-      </w:r>
-      <w:r>
-        <w:rPr>
-          <w:rStyle w:val="VerbatimChar"/>
-        </w:rPr>
-        <w:t xml:space="preserve">  --target-pose-count N</w:t>
-      </w:r>
-      <w:r>
-        <w:br/>
-      </w:r>
-      <w:r>
-        <w:rPr>
-          <w:rStyle w:val="VerbatimChar"/>
-        </w:rPr>
-        <w:t xml:space="preserve">                        choose the lateral grid so that the plan has about N</w:t>
-      </w:r>
-      <w:r>
-        <w:br/>
-      </w:r>
-      <w:r>
-        <w:rPr>
-          <w:rStyle w:val="VerbatimChar"/>
-        </w:rPr>
-        <w:t xml:space="preserve">                        poses (overrides --lateral-positions)</w:t>
-      </w:r>
-      <w:r>
-        <w:br/>
-      </w:r>
-      <w:r>
-        <w:rPr>
-          <w:rStyle w:val="VerbatimChar"/>
-        </w:rPr>
-        <w:t xml:space="preserve">  --noise-normal-deg NOISE_NORMAL_DEG</w:t>
-      </w:r>
-      <w:r>
-        <w:br/>
-      </w:r>
-      <w:r>
-        <w:rPr>
-          <w:rStyle w:val="VerbatimChar"/>
-        </w:rPr>
-        <w:t xml:space="preserve">                        assumed normal noise for the error prediction (default</w:t>
-      </w:r>
-      <w:r>
-        <w:br/>
-      </w:r>
-      <w:r>
-        <w:rPr>
-          <w:rStyle w:val="VerbatimChar"/>
-        </w:rPr>
-        <w:t xml:space="preserve">                        0.2)</w:t>
-      </w:r>
-      <w:r>
-        <w:br/>
-      </w:r>
-      <w:r>
-        <w:rPr>
-          <w:rStyle w:val="VerbatimChar"/>
-        </w:rPr>
-        <w:t xml:space="preserve">  --noise-offset-mm NOISE_OFFSET_MM</w:t>
-      </w:r>
-      <w:r>
-        <w:br/>
-      </w:r>
-      <w:r>
-        <w:rPr>
-          <w:rStyle w:val="VerbatimChar"/>
-        </w:rPr>
-        <w:t xml:space="preserve">                        assumed offset noise for the error prediction (default</w:t>
-      </w:r>
-      <w:r>
-        <w:br/>
-      </w:r>
-      <w:r>
-        <w:rPr>
-          <w:rStyle w:val="VerbatimChar"/>
-        </w:rPr>
-        <w:t xml:space="preserve">                        0.2)</w:t>
-      </w:r>
-      <w:r>
-        <w:br/>
-      </w:r>
-      <w:r>
-        <w:rPr>
-          <w:rStyle w:val="VerbatimChar"/>
-        </w:rPr>
-        <w:t xml:space="preserve">  --frames-per-pose FRAMES_PER_POSE</w:t>
-      </w:r>
-      <w:r>
-        <w:br/>
-      </w:r>
-      <w:r>
-        <w:rPr>
-          <w:rStyle w:val="VerbatimChar"/>
-        </w:rPr>
-        <w:t xml:space="preserve">                        frames captured per pose, for the capture counts</w:t>
-      </w:r>
-      <w:r>
-        <w:br/>
-      </w:r>
-      <w:r>
-        <w:rPr>
-          <w:rStyle w:val="VerbatimChar"/>
-        </w:rPr>
-        <w:t xml:space="preserve">                        (default 5)</w:t>
-      </w:r>
-      <w:r>
-        <w:br/>
-      </w:r>
-      <w:r>
-        <w:rPr>
-          <w:rStyle w:val="VerbatimChar"/>
-        </w:rPr>
-        <w:t xml:space="preserve">  --out DIR             output directory</w:t>
-      </w:r>
     </w:p>
     <w:p>
       <w:pPr>
@@ -4955,7 +5516,7 @@
         <w:rPr>
           <w:rStyle w:val="VerbatimChar"/>
         </w:rPr>
-        <w:t xml:space="preserve">python3 -m planereg.capture.bootstrap --help</w:t>
+        <w:t xml:space="preserve">python3 -m planereg.capture.check_captures --help</w:t>
       </w:r>
       <w:r>
         <w:t xml:space="preserve">:</w:t>
@@ -4969,118 +5530,127 @@
         <w:rPr>
           <w:rStyle w:val="VerbatimChar"/>
         </w:rPr>
-        <w:t xml:space="preserve">usage: bootstrap.py [-h] --manifest PATH --out PATH</w:t>
-      </w:r>
-      <w:r>
-        <w:br/>
-      </w:r>
-      <w:r>
-        <w:rPr>
-          <w:rStyle w:val="VerbatimChar"/>
-        </w:rPr>
-        <w:t xml:space="preserve">                    [--min-valid-fraction MIN_VALID_FRACTION]</w:t>
-      </w:r>
-      <w:r>
-        <w:br/>
-      </w:r>
-      <w:r>
-        <w:rPr>
-          <w:rStyle w:val="VerbatimChar"/>
-        </w:rPr>
-        <w:t xml:space="preserve">                    [--border-margin-px BORDER_MARGIN_PX]</w:t>
-      </w:r>
-      <w:r>
-        <w:br/>
-      </w:r>
-      <w:r>
-        <w:rPr>
-          <w:rStyle w:val="VerbatimChar"/>
-        </w:rPr>
-        <w:t xml:space="preserve">                    [--min-pose-count MIN_POSE_COUNT]</w:t>
-      </w:r>
-      <w:r>
-        <w:br/>
-      </w:r>
-      <w:r>
-        <w:rPr>
-          <w:rStyle w:val="VerbatimChar"/>
-        </w:rPr>
-        <w:t xml:space="preserve">                    [--min-normal-spread MIN_NORMAL_SPREAD]</w:t>
-      </w:r>
-      <w:r>
-        <w:br/>
-      </w:r>
-      <w:r>
-        <w:rPr>
-          <w:rStyle w:val="VerbatimChar"/>
-        </w:rPr>
-        <w:t xml:space="preserve">                    [--max-rms-normal-deg MAX_RMS_NORMAL_DEG]</w:t>
-      </w:r>
-      <w:r>
-        <w:br/>
-      </w:r>
-      <w:r>
-        <w:rPr>
-          <w:rStyle w:val="VerbatimChar"/>
-        </w:rPr>
-        <w:t xml:space="preserve">                    [--max-rms-offset-mm MAX_RMS_OFFSET_MM]</w:t>
-      </w:r>
-      <w:r>
-        <w:br/>
-      </w:r>
-      <w:r>
-        <w:rPr>
-          <w:rStyle w:val="VerbatimChar"/>
-        </w:rPr>
-        <w:t xml:space="preserve">                    [--max-normal-deg MAX_NORMAL_DEG]</w:t>
-      </w:r>
-      <w:r>
-        <w:br/>
-      </w:r>
-      <w:r>
-        <w:rPr>
-          <w:rStyle w:val="VerbatimChar"/>
-        </w:rPr>
-        <w:t xml:space="preserve">                    [--max-offset-mm MAX_OFFSET_MM]</w:t>
-      </w:r>
-      <w:r>
-        <w:br/>
-      </w:r>
-      <w:r>
-        <w:br/>
-      </w:r>
-      <w:r>
-        <w:rPr>
-          <w:rStyle w:val="VerbatimChar"/>
-        </w:rPr>
-        <w:t xml:space="preserve">Find the sensor roughly in the robot base frame from four or more hand-jogged</w:t>
-      </w:r>
-      <w:r>
-        <w:br/>
-      </w:r>
-      <w:r>
-        <w:rPr>
-          <w:rStyle w:val="VerbatimChar"/>
-        </w:rPr>
-        <w:t xml:space="preserve">board captures (manifest made by sphcal's make_manifest): segment the board in</w:t>
-      </w:r>
-      <w:r>
-        <w:br/>
-      </w:r>
-      <w:r>
-        <w:rPr>
-          <w:rStyle w:val="VerbatimChar"/>
-        </w:rPr>
-        <w:t xml:space="preserve">each, register, print the table and the transform, and write the JSON that the</w:t>
-      </w:r>
-      <w:r>
-        <w:br/>
-      </w:r>
-      <w:r>
-        <w:rPr>
-          <w:rStyle w:val="VerbatimChar"/>
-        </w:rPr>
-        <w:t xml:space="preserve">plan tool reads.</w:t>
+        <w:t xml:space="preserve">usage: check_captures.py [-h] --manifest PATH [--sensor-in-base PATH]</w:t>
+      </w:r>
+      <w:r>
+        <w:br/>
+      </w:r>
+      <w:r>
+        <w:rPr>
+          <w:rStyle w:val="VerbatimChar"/>
+        </w:rPr>
+        <w:t xml:space="preserve">                         [--pose-log PATH]</w:t>
+      </w:r>
+      <w:r>
+        <w:br/>
+      </w:r>
+      <w:r>
+        <w:rPr>
+          <w:rStyle w:val="VerbatimChar"/>
+        </w:rPr>
+        <w:t xml:space="preserve">                         [--plane-rms-warn-mm PLANE_RMS_WARN_MM]</w:t>
+      </w:r>
+      <w:r>
+        <w:br/>
+      </w:r>
+      <w:r>
+        <w:rPr>
+          <w:rStyle w:val="VerbatimChar"/>
+        </w:rPr>
+        <w:t xml:space="preserve">                         [--min-valid-fraction MIN_VALID_FRACTION]</w:t>
+      </w:r>
+      <w:r>
+        <w:br/>
+      </w:r>
+      <w:r>
+        <w:rPr>
+          <w:rStyle w:val="VerbatimChar"/>
+        </w:rPr>
+        <w:t xml:space="preserve">                         [--border-margin-px BORDER_MARGIN_PX]</w:t>
+      </w:r>
+      <w:r>
+        <w:br/>
+      </w:r>
+      <w:r>
+        <w:rPr>
+          <w:rStyle w:val="VerbatimChar"/>
+        </w:rPr>
+        <w:t xml:space="preserve">                         [--normal-residual-warn-deg NORMAL_RESIDUAL_WARN_DEG]</w:t>
+      </w:r>
+      <w:r>
+        <w:br/>
+      </w:r>
+      <w:r>
+        <w:rPr>
+          <w:rStyle w:val="VerbatimChar"/>
+        </w:rPr>
+        <w:t xml:space="preserve">                         [--offset-residual-warn-mm OFFSET_RESIDUAL_WARN_MM]</w:t>
+      </w:r>
+      <w:r>
+        <w:br/>
+      </w:r>
+      <w:r>
+        <w:rPr>
+          <w:rStyle w:val="VerbatimChar"/>
+        </w:rPr>
+        <w:t xml:space="preserve">                         [--outlier-rounds OUTLIER_ROUNDS]</w:t>
+      </w:r>
+      <w:r>
+        <w:br/>
+      </w:r>
+      <w:r>
+        <w:rPr>
+          <w:rStyle w:val="VerbatimChar"/>
+        </w:rPr>
+        <w:t xml:space="preserve">                         [--joint-sign-warn-fraction JOINT_SIGN_WARN_FRACTION]</w:t>
+      </w:r>
+      <w:r>
+        <w:br/>
+      </w:r>
+      <w:r>
+        <w:rPr>
+          <w:rStyle w:val="VerbatimChar"/>
+        </w:rPr>
+        <w:t xml:space="preserve">                         [--out PATH]</w:t>
+      </w:r>
+      <w:r>
+        <w:br/>
+      </w:r>
+      <w:r>
+        <w:br/>
+      </w:r>
+      <w:r>
+        <w:rPr>
+          <w:rStyle w:val="VerbatimChar"/>
+        </w:rPr>
+        <w:t xml:space="preserve">Quick check of a capture set before the long registration: valid pixels,</w:t>
+      </w:r>
+      <w:r>
+        <w:br/>
+      </w:r>
+      <w:r>
+        <w:rPr>
+          <w:rStyle w:val="VerbatimChar"/>
+        </w:rPr>
+        <w:t xml:space="preserve">border contact of the board mask, plane fit residuals, agreement of each</w:t>
+      </w:r>
+      <w:r>
+        <w:br/>
+      </w:r>
+      <w:r>
+        <w:rPr>
+          <w:rStyle w:val="VerbatimChar"/>
+        </w:rPr>
+        <w:t xml:space="preserve">pose with the registration of the set, conditioning of the set, and (with</w:t>
+      </w:r>
+      <w:r>
+        <w:br/>
+      </w:r>
+      <w:r>
+        <w:rPr>
+          <w:rStyle w:val="VerbatimChar"/>
+        </w:rPr>
+        <w:t xml:space="preserve">a pose log) the joint motion signs.</w:t>
       </w:r>
       <w:r>
         <w:br/>
@@ -5119,7 +5689,70 @@
         <w:rPr>
           <w:rStyle w:val="VerbatimChar"/>
         </w:rPr>
-        <w:t xml:space="preserve">  --out PATH            JSON file to write</w:t>
+        <w:t xml:space="preserve">  --sensor-in-base PATH</w:t>
+      </w:r>
+      <w:r>
+        <w:br/>
+      </w:r>
+      <w:r>
+        <w:rPr>
+          <w:rStyle w:val="VerbatimChar"/>
+        </w:rPr>
+        <w:t xml:space="preserve">                        rough sensor-to-base JSON (the bootstrap tool's</w:t>
+      </w:r>
+      <w:r>
+        <w:br/>
+      </w:r>
+      <w:r>
+        <w:rPr>
+          <w:rStyle w:val="VerbatimChar"/>
+        </w:rPr>
+        <w:t xml:space="preserve">                        output); enables the predicted region</w:t>
+      </w:r>
+      <w:r>
+        <w:br/>
+      </w:r>
+      <w:r>
+        <w:rPr>
+          <w:rStyle w:val="VerbatimChar"/>
+        </w:rPr>
+        <w:t xml:space="preserve">  --pose-log PATH       pose log CSV with the joint columns j1..j6 and</w:t>
+      </w:r>
+      <w:r>
+        <w:br/>
+      </w:r>
+      <w:r>
+        <w:rPr>
+          <w:rStyle w:val="VerbatimChar"/>
+        </w:rPr>
+        <w:t xml:space="preserve">                        approach_j1..approach_j6 (optional)</w:t>
+      </w:r>
+      <w:r>
+        <w:br/>
+      </w:r>
+      <w:r>
+        <w:rPr>
+          <w:rStyle w:val="VerbatimChar"/>
+        </w:rPr>
+        <w:t xml:space="preserve">  --plane-rms-warn-mm PLANE_RMS_WARN_MM</w:t>
+      </w:r>
+      <w:r>
+        <w:br/>
+      </w:r>
+      <w:r>
+        <w:rPr>
+          <w:rStyle w:val="VerbatimChar"/>
+        </w:rPr>
+        <w:t xml:space="preserve">                        flag a pose whose plane fit RMS exceeds this</w:t>
+      </w:r>
+      <w:r>
+        <w:br/>
+      </w:r>
+      <w:r>
+        <w:rPr>
+          <w:rStyle w:val="VerbatimChar"/>
+        </w:rPr>
+        <w:t xml:space="preserve">                        (default 1.0)</w:t>
       </w:r>
       <w:r>
         <w:br/>
@@ -5137,7 +5770,7 @@
         <w:rPr>
           <w:rStyle w:val="VerbatimChar"/>
         </w:rPr>
-        <w:t xml:space="preserve">                        a pixel must be valid in this fraction of a pose's</w:t>
+        <w:t xml:space="preserve">                        flag a pose valid in a smaller fraction of its</w:t>
       </w:r>
       <w:r>
         <w:br/>
@@ -5164,7 +5797,7 @@
         <w:rPr>
           <w:rStyle w:val="VerbatimChar"/>
         </w:rPr>
-        <w:t xml:space="preserve">                        warn when the board mask comes this close to the image</w:t>
+        <w:t xml:space="preserve">                        flag a board mask within this many pixels of the</w:t>
       </w:r>
       <w:r>
         <w:br/>
@@ -5182,457 +5815,6 @@
         <w:rPr>
           <w:rStyle w:val="VerbatimChar"/>
         </w:rPr>
-        <w:t xml:space="preserve">  --min-pose-count MIN_POSE_COUNT</w:t>
-      </w:r>
-      <w:r>
-        <w:br/>
-      </w:r>
-      <w:r>
-        <w:rPr>
-          <w:rStyle w:val="VerbatimChar"/>
-        </w:rPr>
-        <w:t xml:space="preserve">                        fewest segmented poses the registration may use</w:t>
-      </w:r>
-      <w:r>
-        <w:br/>
-      </w:r>
-      <w:r>
-        <w:rPr>
-          <w:rStyle w:val="VerbatimChar"/>
-        </w:rPr>
-        <w:t xml:space="preserve">                        (default 4)</w:t>
-      </w:r>
-      <w:r>
-        <w:br/>
-      </w:r>
-      <w:r>
-        <w:rPr>
-          <w:rStyle w:val="VerbatimChar"/>
-        </w:rPr>
-        <w:t xml:space="preserve">  --min-normal-spread MIN_NORMAL_SPREAD</w:t>
-      </w:r>
-      <w:r>
-        <w:br/>
-      </w:r>
-      <w:r>
-        <w:rPr>
-          <w:rStyle w:val="VerbatimChar"/>
-        </w:rPr>
-        <w:t xml:space="preserve">                        smallest accepted spread of the board normals (default</w:t>
-      </w:r>
-      <w:r>
-        <w:br/>
-      </w:r>
-      <w:r>
-        <w:rPr>
-          <w:rStyle w:val="VerbatimChar"/>
-        </w:rPr>
-        <w:t xml:space="preserve">                        0.05)</w:t>
-      </w:r>
-      <w:r>
-        <w:br/>
-      </w:r>
-      <w:r>
-        <w:rPr>
-          <w:rStyle w:val="VerbatimChar"/>
-        </w:rPr>
-        <w:t xml:space="preserve">  --max-rms-normal-deg MAX_RMS_NORMAL_DEG</w:t>
-      </w:r>
-      <w:r>
-        <w:br/>
-      </w:r>
-      <w:r>
-        <w:rPr>
-          <w:rStyle w:val="VerbatimChar"/>
-        </w:rPr>
-        <w:t xml:space="preserve">                        largest accepted RMS normal residual (default 1.0)</w:t>
-      </w:r>
-      <w:r>
-        <w:br/>
-      </w:r>
-      <w:r>
-        <w:rPr>
-          <w:rStyle w:val="VerbatimChar"/>
-        </w:rPr>
-        <w:t xml:space="preserve">  --max-rms-offset-mm MAX_RMS_OFFSET_MM</w:t>
-      </w:r>
-      <w:r>
-        <w:br/>
-      </w:r>
-      <w:r>
-        <w:rPr>
-          <w:rStyle w:val="VerbatimChar"/>
-        </w:rPr>
-        <w:t xml:space="preserve">                        largest accepted RMS offset residual (default 5.0)</w:t>
-      </w:r>
-      <w:r>
-        <w:br/>
-      </w:r>
-      <w:r>
-        <w:rPr>
-          <w:rStyle w:val="VerbatimChar"/>
-        </w:rPr>
-        <w:t xml:space="preserve">  --max-normal-deg MAX_NORMAL_DEG</w:t>
-      </w:r>
-      <w:r>
-        <w:br/>
-      </w:r>
-      <w:r>
-        <w:rPr>
-          <w:rStyle w:val="VerbatimChar"/>
-        </w:rPr>
-        <w:t xml:space="preserve">                        largest accepted normal residual of a single pose</w:t>
-      </w:r>
-      <w:r>
-        <w:br/>
-      </w:r>
-      <w:r>
-        <w:rPr>
-          <w:rStyle w:val="VerbatimChar"/>
-        </w:rPr>
-        <w:t xml:space="preserve">                        (default 2.0)</w:t>
-      </w:r>
-      <w:r>
-        <w:br/>
-      </w:r>
-      <w:r>
-        <w:rPr>
-          <w:rStyle w:val="VerbatimChar"/>
-        </w:rPr>
-        <w:t xml:space="preserve">  --max-offset-mm MAX_OFFSET_MM</w:t>
-      </w:r>
-      <w:r>
-        <w:br/>
-      </w:r>
-      <w:r>
-        <w:rPr>
-          <w:rStyle w:val="VerbatimChar"/>
-        </w:rPr>
-        <w:t xml:space="preserve">                        largest accepted offset residual of a single pose</w:t>
-      </w:r>
-      <w:r>
-        <w:br/>
-      </w:r>
-      <w:r>
-        <w:rPr>
-          <w:rStyle w:val="VerbatimChar"/>
-        </w:rPr>
-        <w:t xml:space="preserve">                        (default 10.0)</w:t>
-      </w:r>
-    </w:p>
-    <w:p>
-      <w:pPr>
-        <w:pStyle w:val="FirstParagraph"/>
-      </w:pPr>
-      <w:r>
-        <w:t xml:space="preserve">Output of</w:t>
-      </w:r>
-      <w:r>
-        <w:t xml:space="preserve"> </w:t>
-      </w:r>
-      <w:r>
-        <w:rPr>
-          <w:rStyle w:val="VerbatimChar"/>
-        </w:rPr>
-        <w:t xml:space="preserve">python3 -m planereg.capture.check_captures --help</w:t>
-      </w:r>
-      <w:r>
-        <w:t xml:space="preserve">:</w:t>
-      </w:r>
-    </w:p>
-    <w:p>
-      <w:pPr>
-        <w:pStyle w:val="SourceCode"/>
-      </w:pPr>
-      <w:r>
-        <w:rPr>
-          <w:rStyle w:val="VerbatimChar"/>
-        </w:rPr>
-        <w:t xml:space="preserve">usage: check_captures.py [-h] --manifest PATH [--sensor-in-base PATH]</w:t>
-      </w:r>
-      <w:r>
-        <w:br/>
-      </w:r>
-      <w:r>
-        <w:rPr>
-          <w:rStyle w:val="VerbatimChar"/>
-        </w:rPr>
-        <w:t xml:space="preserve">                         [--pose-log PATH]</w:t>
-      </w:r>
-      <w:r>
-        <w:br/>
-      </w:r>
-      <w:r>
-        <w:rPr>
-          <w:rStyle w:val="VerbatimChar"/>
-        </w:rPr>
-        <w:t xml:space="preserve">                         [--plane-rms-warn-mm PLANE_RMS_WARN_MM]</w:t>
-      </w:r>
-      <w:r>
-        <w:br/>
-      </w:r>
-      <w:r>
-        <w:rPr>
-          <w:rStyle w:val="VerbatimChar"/>
-        </w:rPr>
-        <w:t xml:space="preserve">                         [--min-valid-fraction MIN_VALID_FRACTION]</w:t>
-      </w:r>
-      <w:r>
-        <w:br/>
-      </w:r>
-      <w:r>
-        <w:rPr>
-          <w:rStyle w:val="VerbatimChar"/>
-        </w:rPr>
-        <w:t xml:space="preserve">                         [--border-margin-px BORDER_MARGIN_PX]</w:t>
-      </w:r>
-      <w:r>
-        <w:br/>
-      </w:r>
-      <w:r>
-        <w:rPr>
-          <w:rStyle w:val="VerbatimChar"/>
-        </w:rPr>
-        <w:t xml:space="preserve">                         [--normal-residual-warn-deg NORMAL_RESIDUAL_WARN_DEG]</w:t>
-      </w:r>
-      <w:r>
-        <w:br/>
-      </w:r>
-      <w:r>
-        <w:rPr>
-          <w:rStyle w:val="VerbatimChar"/>
-        </w:rPr>
-        <w:t xml:space="preserve">                         [--offset-residual-warn-mm OFFSET_RESIDUAL_WARN_MM]</w:t>
-      </w:r>
-      <w:r>
-        <w:br/>
-      </w:r>
-      <w:r>
-        <w:rPr>
-          <w:rStyle w:val="VerbatimChar"/>
-        </w:rPr>
-        <w:t xml:space="preserve">                         [--outlier-rounds OUTLIER_ROUNDS]</w:t>
-      </w:r>
-      <w:r>
-        <w:br/>
-      </w:r>
-      <w:r>
-        <w:rPr>
-          <w:rStyle w:val="VerbatimChar"/>
-        </w:rPr>
-        <w:t xml:space="preserve">                         [--joint-sign-warn-fraction JOINT_SIGN_WARN_FRACTION]</w:t>
-      </w:r>
-      <w:r>
-        <w:br/>
-      </w:r>
-      <w:r>
-        <w:rPr>
-          <w:rStyle w:val="VerbatimChar"/>
-        </w:rPr>
-        <w:t xml:space="preserve">                         [--out PATH]</w:t>
-      </w:r>
-      <w:r>
-        <w:br/>
-      </w:r>
-      <w:r>
-        <w:br/>
-      </w:r>
-      <w:r>
-        <w:rPr>
-          <w:rStyle w:val="VerbatimChar"/>
-        </w:rPr>
-        <w:t xml:space="preserve">Quick check of a capture set before the long registration: valid pixels,</w:t>
-      </w:r>
-      <w:r>
-        <w:br/>
-      </w:r>
-      <w:r>
-        <w:rPr>
-          <w:rStyle w:val="VerbatimChar"/>
-        </w:rPr>
-        <w:t xml:space="preserve">border contact of the board mask, plane fit residuals, agreement of each pose</w:t>
-      </w:r>
-      <w:r>
-        <w:br/>
-      </w:r>
-      <w:r>
-        <w:rPr>
-          <w:rStyle w:val="VerbatimChar"/>
-        </w:rPr>
-        <w:t xml:space="preserve">with the registration of the set, conditioning of the set, and (with a pose</w:t>
-      </w:r>
-      <w:r>
-        <w:br/>
-      </w:r>
-      <w:r>
-        <w:rPr>
-          <w:rStyle w:val="VerbatimChar"/>
-        </w:rPr>
-        <w:t xml:space="preserve">log) the joint motion signs.</w:t>
-      </w:r>
-      <w:r>
-        <w:br/>
-      </w:r>
-      <w:r>
-        <w:br/>
-      </w:r>
-      <w:r>
-        <w:rPr>
-          <w:rStyle w:val="VerbatimChar"/>
-        </w:rPr>
-        <w:t xml:space="preserve">options:</w:t>
-      </w:r>
-      <w:r>
-        <w:br/>
-      </w:r>
-      <w:r>
-        <w:rPr>
-          <w:rStyle w:val="VerbatimChar"/>
-        </w:rPr>
-        <w:t xml:space="preserve">  -h, --help            show this help message and exit</w:t>
-      </w:r>
-      <w:r>
-        <w:br/>
-      </w:r>
-      <w:r>
-        <w:rPr>
-          <w:rStyle w:val="VerbatimChar"/>
-        </w:rPr>
-        <w:t xml:space="preserve">  --manifest PATH       manifest CSV or JSON</w:t>
-      </w:r>
-      <w:r>
-        <w:br/>
-      </w:r>
-      <w:r>
-        <w:rPr>
-          <w:rStyle w:val="VerbatimChar"/>
-        </w:rPr>
-        <w:t xml:space="preserve">  --sensor-in-base PATH</w:t>
-      </w:r>
-      <w:r>
-        <w:br/>
-      </w:r>
-      <w:r>
-        <w:rPr>
-          <w:rStyle w:val="VerbatimChar"/>
-        </w:rPr>
-        <w:t xml:space="preserve">                        rough sensor-to-base JSON (the bootstrap tool's</w:t>
-      </w:r>
-      <w:r>
-        <w:br/>
-      </w:r>
-      <w:r>
-        <w:rPr>
-          <w:rStyle w:val="VerbatimChar"/>
-        </w:rPr>
-        <w:t xml:space="preserve">                        output); enables the predicted region</w:t>
-      </w:r>
-      <w:r>
-        <w:br/>
-      </w:r>
-      <w:r>
-        <w:rPr>
-          <w:rStyle w:val="VerbatimChar"/>
-        </w:rPr>
-        <w:t xml:space="preserve">  --pose-log PATH       pose log CSV with the joint columns j1..j6 and</w:t>
-      </w:r>
-      <w:r>
-        <w:br/>
-      </w:r>
-      <w:r>
-        <w:rPr>
-          <w:rStyle w:val="VerbatimChar"/>
-        </w:rPr>
-        <w:t xml:space="preserve">                        approach_j1..approach_j6 (optional)</w:t>
-      </w:r>
-      <w:r>
-        <w:br/>
-      </w:r>
-      <w:r>
-        <w:rPr>
-          <w:rStyle w:val="VerbatimChar"/>
-        </w:rPr>
-        <w:t xml:space="preserve">  --plane-rms-warn-mm PLANE_RMS_WARN_MM</w:t>
-      </w:r>
-      <w:r>
-        <w:br/>
-      </w:r>
-      <w:r>
-        <w:rPr>
-          <w:rStyle w:val="VerbatimChar"/>
-        </w:rPr>
-        <w:t xml:space="preserve">                        flag a pose whose plane fit RMS exceeds this (default</w:t>
-      </w:r>
-      <w:r>
-        <w:br/>
-      </w:r>
-      <w:r>
-        <w:rPr>
-          <w:rStyle w:val="VerbatimChar"/>
-        </w:rPr>
-        <w:t xml:space="preserve">                        1.0)</w:t>
-      </w:r>
-      <w:r>
-        <w:br/>
-      </w:r>
-      <w:r>
-        <w:rPr>
-          <w:rStyle w:val="VerbatimChar"/>
-        </w:rPr>
-        <w:t xml:space="preserve">  --min-valid-fraction MIN_VALID_FRACTION</w:t>
-      </w:r>
-      <w:r>
-        <w:br/>
-      </w:r>
-      <w:r>
-        <w:rPr>
-          <w:rStyle w:val="VerbatimChar"/>
-        </w:rPr>
-        <w:t xml:space="preserve">                        flag a pose valid in a smaller fraction of its frames</w:t>
-      </w:r>
-      <w:r>
-        <w:br/>
-      </w:r>
-      <w:r>
-        <w:rPr>
-          <w:rStyle w:val="VerbatimChar"/>
-        </w:rPr>
-        <w:t xml:space="preserve">                        (default 0.5)</w:t>
-      </w:r>
-      <w:r>
-        <w:br/>
-      </w:r>
-      <w:r>
-        <w:rPr>
-          <w:rStyle w:val="VerbatimChar"/>
-        </w:rPr>
-        <w:t xml:space="preserve">  --border-margin-px BORDER_MARGIN_PX</w:t>
-      </w:r>
-      <w:r>
-        <w:br/>
-      </w:r>
-      <w:r>
-        <w:rPr>
-          <w:rStyle w:val="VerbatimChar"/>
-        </w:rPr>
-        <w:t xml:space="preserve">                        flag a board mask within this many pixels of the</w:t>
-      </w:r>
-      <w:r>
-        <w:br/>
-      </w:r>
-      <w:r>
-        <w:rPr>
-          <w:rStyle w:val="VerbatimChar"/>
-        </w:rPr>
-        <w:t xml:space="preserve">                        border (default 4)</w:t>
-      </w:r>
-      <w:r>
-        <w:br/>
-      </w:r>
-      <w:r>
-        <w:rPr>
-          <w:rStyle w:val="VerbatimChar"/>
-        </w:rPr>
         <w:t xml:space="preserve">  --normal-residual-warn-deg NORMAL_RESIDUAL_WARN_DEG</w:t>
       </w:r>
       <w:r>
@@ -5696,25 +5878,34 @@
         <w:rPr>
           <w:rStyle w:val="VerbatimChar"/>
         </w:rPr>
-        <w:t xml:space="preserve">                        leave out up to this many poses (the worst per round)</w:t>
-      </w:r>
-      <w:r>
-        <w:br/>
-      </w:r>
-      <w:r>
-        <w:rPr>
-          <w:rStyle w:val="VerbatimChar"/>
-        </w:rPr>
-        <w:t xml:space="preserve">                        from the registration, so that one wrong pose does not</w:t>
-      </w:r>
-      <w:r>
-        <w:br/>
-      </w:r>
-      <w:r>
-        <w:rPr>
-          <w:rStyle w:val="VerbatimChar"/>
-        </w:rPr>
-        <w:t xml:space="preserve">                        flag the others (default 3; 0 keeps every pose)</w:t>
+        <w:t xml:space="preserve">                        leave out up to this many poses (the worst per</w:t>
+      </w:r>
+      <w:r>
+        <w:br/>
+      </w:r>
+      <w:r>
+        <w:rPr>
+          <w:rStyle w:val="VerbatimChar"/>
+        </w:rPr>
+        <w:t xml:space="preserve">                        round) from the registration, so that one wrong</w:t>
+      </w:r>
+      <w:r>
+        <w:br/>
+      </w:r>
+      <w:r>
+        <w:rPr>
+          <w:rStyle w:val="VerbatimChar"/>
+        </w:rPr>
+        <w:t xml:space="preserve">                        pose does not flag the others (default 3; 0 keeps</w:t>
+      </w:r>
+      <w:r>
+        <w:br/>
+      </w:r>
+      <w:r>
+        <w:rPr>
+          <w:rStyle w:val="VerbatimChar"/>
+        </w:rPr>
+        <w:t xml:space="preserve">                        every pose)</w:t>
       </w:r>
       <w:r>
         <w:br/>
@@ -6041,7 +6232,7 @@
         <w:rPr>
           <w:rStyle w:val="VerbatimChar"/>
         </w:rPr>
-        <w:t xml:space="preserve">python3 -m pip install -e ../../depth_calibration   (the sphcal repository, by its path)</w:t>
+        <w:t xml:space="preserve">python3 -m pip install -e ../../depth_calibration    (sphcal, by its path)</w:t>
       </w:r>
       <w:r>
         <w:br/>
@@ -7417,7 +7608,7 @@
     <w:basedOn w:val="BodyTextChar"/>
     <w:rPr>
       <w:rFonts w:ascii="Consolas" w:hAnsi="Consolas"/>
-      <w:sz w:val="22"/>
+      <w:sz w:val="18"/>
     </w:rPr>
   </w:style>
   <w:style w:customStyle="1" w:styleId="SectionNumber" w:type="character">

</xml_diff>

<commit_message>
Procedure: the board is the stage-1 board, 6 mm in both procedures
The introduction still contrasted a 6 mm board with a 15 mm stage-1 board; the stage-1
procedure was relaxed to 6 mm at the same time, so the two specifications are identical.

Co-Authored-By: Claude Fable 5.1 <noreply@anthropic.com>
Claude-Session: https://claude.ai/code/session_016X9U4SzM2dXD3fEs3wV3Mm
</commit_message>
<xml_diff>
--- a/docs/procedures/registration_capture_procedure.docx
+++ b/docs/procedures/registration_capture_procedure.docx
@@ -210,25 +210,19 @@
         <w:t xml:space="preserve"> </w:t>
       </w:r>
       <w:r>
-        <w:t xml:space="preserve">its layout and its tools; the board, its adapter and its tool frame are the same,</w:t>
-      </w:r>
-      <w:r>
-        <w:t xml:space="preserve"> </w:t>
-      </w:r>
-      <w:r>
-        <w:t xml:space="preserve">except that the board may be thinner (6 mm instead of 15 mm; section 1 says why). A</w:t>
-      </w:r>
-      <w:r>
-        <w:t xml:space="preserve"> </w:t>
-      </w:r>
-      <w:r>
-        <w:t xml:space="preserve">stage-1 board can be used as it is. The spheres and the three-ball nest are not</w:t>
-      </w:r>
-      <w:r>
-        <w:t xml:space="preserve"> </w:t>
-      </w:r>
-      <w:r>
-        <w:t xml:space="preserve">needed here. You do not need to have read the stage-1 procedure; where this</w:t>
+        <w:t xml:space="preserve">its layout and its tools; the board, its adapter and its tool frame are the same</w:t>
+      </w:r>
+      <w:r>
+        <w:t xml:space="preserve"> </w:t>
+      </w:r>
+      <w:r>
+        <w:t xml:space="preserve">(section 1 repeats the board specification). A stage-1 board can be used as it is.</w:t>
+      </w:r>
+      <w:r>
+        <w:t xml:space="preserve"> </w:t>
+      </w:r>
+      <w:r>
+        <w:t xml:space="preserve">The spheres and the three-ball nest are not needed here. You do not need to have read the stage-1 procedure; where this</w:t>
       </w:r>
       <w:r>
         <w:t xml:space="preserve"> </w:t>

</xml_diff>

<commit_message>
Procedure: mounting figure for section 3; figures numbered in order of appearance
New figure 1 (figures/make_fig_mounting.py): the flange, adapter and board in
section with D, the tool frame and the runout check, and the front face with the
axes, the indicator path, the four D places and the three-point mounting. The other
figures are renumbered 2 (residuals), 3 (plan), 4 (approach).

Co-Authored-By: Claude Fable 5.1 <noreply@anthropic.com>
Claude-Session: https://claude.ai/code/session_016X9U4SzM2dXD3fEs3wV3Mm
</commit_message>
<xml_diff>
--- a/docs/procedures/registration_capture_procedure.docx
+++ b/docs/procedures/registration_capture_procedure.docx
@@ -36,7 +36,7 @@
         </w:p>
       </w:sdtContent>
     </w:sdt>
-    <w:bookmarkStart w:id="30" w:name="X3598e64a88c823a5f341feeb99141bc42344d3c"/>
+    <w:bookmarkStart w:id="33" w:name="X3598e64a88c823a5f341feeb99141bc42344d3c"/>
     <w:p>
       <w:pPr>
         <w:pStyle w:val="Heading1"/>
@@ -280,19 +280,25 @@
         <w:pStyle w:val="BodyText"/>
       </w:pPr>
       <w:r>
-        <w:t xml:space="preserve">Figures: figure 1 (section 6) shows the two ways of driving to a pose; figure 2</w:t>
-      </w:r>
-      <w:r>
-        <w:t xml:space="preserve"> </w:t>
-      </w:r>
-      <w:r>
-        <w:t xml:space="preserve">(section 5) shows an example pose plan; figure 3 (section 4) shows the two numbers</w:t>
-      </w:r>
-      <w:r>
-        <w:t xml:space="preserve"> </w:t>
-      </w:r>
-      <w:r>
-        <w:t xml:space="preserve">the software reports for every pose.</w:t>
+        <w:t xml:space="preserve">Figures: figure 1 (section 3) shows the board on the flange and its tool frame;</w:t>
+      </w:r>
+      <w:r>
+        <w:t xml:space="preserve"> </w:t>
+      </w:r>
+      <w:r>
+        <w:t xml:space="preserve">figure 2 (section 4) shows the two numbers the software reports for every pose;</w:t>
+      </w:r>
+      <w:r>
+        <w:t xml:space="preserve"> </w:t>
+      </w:r>
+      <w:r>
+        <w:t xml:space="preserve">figure 3 (section 5) shows an example pose plan; figure 4 (section 6) shows the two</w:t>
+      </w:r>
+      <w:r>
+        <w:t xml:space="preserve"> </w:t>
+      </w:r>
+      <w:r>
+        <w:t xml:space="preserve">ways of driving to a pose.</w:t>
       </w:r>
     </w:p>
     <w:p>
@@ -1340,7 +1346,7 @@
       </w:r>
     </w:p>
     <w:bookmarkEnd w:id="10"/>
-    <w:bookmarkStart w:id="11" w:name="mounting-the-board-and-its-tool-frame"/>
+    <w:bookmarkStart w:id="14" w:name="mounting-the-board-and-its-tool-frame"/>
     <w:p>
       <w:pPr>
         <w:pStyle w:val="Heading2"/>
@@ -1396,7 +1402,106 @@
         <w:t xml:space="preserve"> </w:t>
       </w:r>
       <w:r>
-        <w:t xml:space="preserve">this board and adapter, check it (steps 2 and 3) and reuse it.</w:t>
+        <w:t xml:space="preserve">this board and adapter, check it (steps 2 and 3) and reuse it. Figure 1 shows the</w:t>
+      </w:r>
+      <w:r>
+        <w:t xml:space="preserve"> </w:t>
+      </w:r>
+      <w:r>
+        <w:t xml:space="preserve">parts, the measurements of steps 2 and 3, and the tool frame.</w:t>
+      </w:r>
+    </w:p>
+    <w:p>
+      <w:pPr>
+        <w:pStyle w:val="CaptionedFigure"/>
+      </w:pPr>
+      <w:r>
+        <w:drawing>
+          <wp:inline>
+            <wp:extent cx="5334000" cy="1555750"/>
+            <wp:effectExtent b="0" l="0" r="0" t="0"/>
+            <wp:docPr descr="mounting" title="" id="12" name="Picture"/>
+            <a:graphic>
+              <a:graphicData uri="http://schemas.openxmlformats.org/drawingml/2006/picture">
+                <pic:pic>
+                  <pic:nvPicPr>
+                    <pic:cNvPr descr="figures/fig_mounting.png" id="13" name="Picture"/>
+                    <pic:cNvPicPr>
+                      <a:picLocks noChangeArrowheads="1" noChangeAspect="1"/>
+                    </pic:cNvPicPr>
+                  </pic:nvPicPr>
+                  <pic:blipFill>
+                    <a:blip r:embed="rId11"/>
+                    <a:stretch>
+                      <a:fillRect/>
+                    </a:stretch>
+                  </pic:blipFill>
+                  <pic:spPr bwMode="auto">
+                    <a:xfrm>
+                      <a:off x="0" y="0"/>
+                      <a:ext cx="5334000" cy="1555750"/>
+                    </a:xfrm>
+                    <a:prstGeom prst="rect">
+                      <a:avLst/>
+                    </a:prstGeom>
+                    <a:noFill/>
+                    <a:ln w="9525">
+                      <a:noFill/>
+                      <a:headEnd/>
+                      <a:tailEnd/>
+                    </a:ln>
+                  </pic:spPr>
+                </pic:pic>
+              </a:graphicData>
+            </a:graphic>
+          </wp:inline>
+        </w:drawing>
+      </w:r>
+    </w:p>
+    <w:p>
+      <w:pPr>
+        <w:pStyle w:val="ImageCaption"/>
+      </w:pPr>
+      <w:r>
+        <w:t xml:space="preserve">mounting</w:t>
+      </w:r>
+    </w:p>
+    <w:p>
+      <w:pPr>
+        <w:pStyle w:val="BodyText"/>
+      </w:pPr>
+      <w:r>
+        <w:t xml:space="preserve">Figure 1. (a) The flange, the doweled adapter plate and the board in section, with</w:t>
+      </w:r>
+      <w:r>
+        <w:t xml:space="preserve"> </w:t>
+      </w:r>
+      <w:r>
+        <w:t xml:space="preserve">the distance D from the flange face to the board’s front face, the tool frame at the</w:t>
+      </w:r>
+      <w:r>
+        <w:t xml:space="preserve"> </w:t>
+      </w:r>
+      <w:r>
+        <w:t xml:space="preserve">center of the front face (z out of the face toward the sensor, x along the long edge)</w:t>
+      </w:r>
+      <w:r>
+        <w:t xml:space="preserve"> </w:t>
+      </w:r>
+      <w:r>
+        <w:t xml:space="preserve">and the dial indicator of the runout check. (b) The front face as the sensor sees it:</w:t>
+      </w:r>
+      <w:r>
+        <w:t xml:space="preserve"> </w:t>
+      </w:r>
+      <w:r>
+        <w:t xml:space="preserve">the tool frame axes, the path of the indicator tip while joint 6 turns, the four</w:t>
+      </w:r>
+      <w:r>
+        <w:t xml:space="preserve"> </w:t>
+      </w:r>
+      <w:r>
+        <w:t xml:space="preserve">places where D is measured, and the three-point mounting hidden behind the board.</w:t>
       </w:r>
     </w:p>
     <w:p>
@@ -1420,7 +1525,7 @@
         </w:numPr>
       </w:pPr>
       <w:r>
-        <w:t xml:space="preserve">Runout check: fix the dial indicator to the table with its tip on the board’s</w:t>
+        <w:t xml:space="preserve">Runout check (figure 1a): fix the dial indicator to the table with its tip on the board’s</w:t>
       </w:r>
       <w:r>
         <w:t xml:space="preserve"> </w:t>
@@ -1462,13 +1567,13 @@
         <w:t xml:space="preserve"> </w:t>
       </w:r>
       <w:r>
-        <w:t xml:space="preserve">gauge or calipers at four places around the board; they should agree within</w:t>
-      </w:r>
-      <w:r>
-        <w:t xml:space="preserve"> </w:t>
-      </w:r>
-      <w:r>
-        <w:t xml:space="preserve">0.05 mm. Record the average as D.</w:t>
+        <w:t xml:space="preserve">gauge or calipers at four places around the board (figure 1b); they should agree</w:t>
+      </w:r>
+      <w:r>
+        <w:t xml:space="preserve"> </w:t>
+      </w:r>
+      <w:r>
+        <w:t xml:space="preserve">within 0.05 mm. Record the average as D.</w:t>
       </w:r>
     </w:p>
     <w:p>
@@ -1498,19 +1603,19 @@
         </w:numPr>
       </w:pPr>
       <w:r>
-        <w:t xml:space="preserve">Define the tool frame in the robot: position (0, 0, D) from the flange,</w:t>
-      </w:r>
-      <w:r>
-        <w:t xml:space="preserve"> </w:t>
-      </w:r>
-      <w:r>
-        <w:t xml:space="preserve">orientation: z along the flange axis pointing out of the board, x along the board’s</w:t>
-      </w:r>
-      <w:r>
-        <w:t xml:space="preserve"> </w:t>
-      </w:r>
-      <w:r>
-        <w:t xml:space="preserve">long edge. How to set x: with the robot’s</w:t>
+        <w:t xml:space="preserve">Define the tool frame in the robot (figure 1): position (0, 0, D) from the</w:t>
+      </w:r>
+      <w:r>
+        <w:t xml:space="preserve"> </w:t>
+      </w:r>
+      <w:r>
+        <w:t xml:space="preserve">flange, orientation: z along the flange axis pointing out of the board, x along</w:t>
+      </w:r>
+      <w:r>
+        <w:t xml:space="preserve"> </w:t>
+      </w:r>
+      <w:r>
+        <w:t xml:space="preserve">the board’s long edge. How to set x: with the robot’s</w:t>
       </w:r>
       <w:r>
         <w:t xml:space="preserve"> </w:t>
@@ -1626,8 +1731,8 @@
         <w:t xml:space="preserve">mix the two kinds of pose in one session.</w:t>
       </w:r>
     </w:p>
-    <w:bookmarkEnd w:id="11"/>
-    <w:bookmarkStart w:id="15" w:name="finding-where-the-sensor-is-rough"/>
+    <w:bookmarkEnd w:id="14"/>
+    <w:bookmarkStart w:id="18" w:name="finding-where-the-sensor-is-rough"/>
     <w:p>
       <w:pPr>
         <w:pStyle w:val="Heading2"/>
@@ -1761,7 +1866,7 @@
         <w:t xml:space="preserve"> </w:t>
       </w:r>
       <w:r>
-        <w:t xml:space="preserve">reported as two numbers (figure 3): the</w:t>
+        <w:t xml:space="preserve">reported as two numbers (figure 2): the</w:t>
       </w:r>
       <w:r>
         <w:t xml:space="preserve"> </w:t>
@@ -1851,18 +1956,18 @@
           <wp:inline>
             <wp:extent cx="5334000" cy="3692769"/>
             <wp:effectExtent b="0" l="0" r="0" t="0"/>
-            <wp:docPr descr="residuals" title="" id="13" name="Picture"/>
+            <wp:docPr descr="residuals" title="" id="16" name="Picture"/>
             <a:graphic>
               <a:graphicData uri="http://schemas.openxmlformats.org/drawingml/2006/picture">
                 <pic:pic>
                   <pic:nvPicPr>
-                    <pic:cNvPr descr="figures/fig_residuals.png" id="14" name="Picture"/>
+                    <pic:cNvPr descr="figures/fig_residuals.png" id="17" name="Picture"/>
                     <pic:cNvPicPr>
                       <a:picLocks noChangeArrowheads="1" noChangeAspect="1"/>
                     </pic:cNvPicPr>
                   </pic:nvPicPr>
                   <pic:blipFill>
-                    <a:blip r:embed="rId12"/>
+                    <a:blip r:embed="rId15"/>
                     <a:stretch>
                       <a:fillRect/>
                     </a:stretch>
@@ -1902,7 +2007,7 @@
         <w:pStyle w:val="BodyText"/>
       </w:pPr>
       <w:r>
-        <w:t xml:space="preserve">Figure 3. The two residuals reported for every pose: the angle between the board as</w:t>
+        <w:t xml:space="preserve">Figure 2. The two residuals reported for every pose: the angle between the board as</w:t>
       </w:r>
       <w:r>
         <w:t xml:space="preserve"> </w:t>
@@ -2352,8 +2457,8 @@
         <w:t xml:space="preserve">is the rough sensor position; the next steps read it.</w:t>
       </w:r>
     </w:p>
-    <w:bookmarkEnd w:id="15"/>
-    <w:bookmarkStart w:id="19" w:name="the-pose-plan"/>
+    <w:bookmarkEnd w:id="18"/>
+    <w:bookmarkStart w:id="22" w:name="the-pose-plan"/>
     <w:p>
       <w:pPr>
         <w:pStyle w:val="Heading2"/>
@@ -2598,7 +2703,7 @@
         <w:t xml:space="preserve"> </w:t>
       </w:r>
       <w:r>
-        <w:t xml:space="preserve">(figure 2 shows the picture for the</w:t>
+        <w:t xml:space="preserve">(figure 3 shows the picture for the</w:t>
       </w:r>
       <w:r>
         <w:t xml:space="preserve"> </w:t>
@@ -3341,18 +3446,18 @@
           <wp:inline>
             <wp:extent cx="5334000" cy="2667000"/>
             <wp:effectExtent b="0" l="0" r="0" t="0"/>
-            <wp:docPr descr="plan" title="" id="17" name="Picture"/>
+            <wp:docPr descr="plan" title="" id="20" name="Picture"/>
             <a:graphic>
               <a:graphicData uri="http://schemas.openxmlformats.org/drawingml/2006/picture">
                 <pic:pic>
                   <pic:nvPicPr>
-                    <pic:cNvPr descr="figures/fig_plan_example.png" id="18" name="Picture"/>
+                    <pic:cNvPr descr="figures/fig_plan_example.png" id="21" name="Picture"/>
                     <pic:cNvPicPr>
                       <a:picLocks noChangeArrowheads="1" noChangeAspect="1"/>
                     </pic:cNvPicPr>
                   </pic:nvPicPr>
                   <pic:blipFill>
-                    <a:blip r:embed="rId16"/>
+                    <a:blip r:embed="rId19"/>
                     <a:stretch>
                       <a:fillRect/>
                     </a:stretch>
@@ -3392,7 +3497,7 @@
         <w:pStyle w:val="BodyText"/>
       </w:pPr>
       <w:r>
-        <w:t xml:space="preserve">Figure 2. The planned board centers for the default settings, in the sensor’s frame:</w:t>
+        <w:t xml:space="preserve">Figure 3. The planned board centers for the default settings, in the sensor’s frame:</w:t>
       </w:r>
       <w:r>
         <w:t xml:space="preserve"> </w:t>
@@ -4161,8 +4266,8 @@
         <w:t xml:space="preserve">program, or import it directly if the controller can read CSV.</w:t>
       </w:r>
     </w:p>
-    <w:bookmarkEnd w:id="19"/>
-    <w:bookmarkStart w:id="23" w:name="the-two-sub-procedures"/>
+    <w:bookmarkEnd w:id="22"/>
+    <w:bookmarkStart w:id="26" w:name="the-two-sub-procedures"/>
     <w:p>
       <w:pPr>
         <w:pStyle w:val="Heading2"/>
@@ -4182,7 +4287,7 @@
         <w:t xml:space="preserve"> </w:t>
       </w:r>
       <w:r>
-        <w:t xml:space="preserve">sensor and the board untouched between them. Figure 1 shows the difference. Read</w:t>
+        <w:t xml:space="preserve">sensor and the board untouched between them. Figure 4 shows the difference. Read</w:t>
       </w:r>
       <w:r>
         <w:t xml:space="preserve"> </w:t>
@@ -4275,18 +4380,18 @@
           <wp:inline>
             <wp:extent cx="5334000" cy="2370666"/>
             <wp:effectExtent b="0" l="0" r="0" t="0"/>
-            <wp:docPr descr="approach" title="" id="21" name="Picture"/>
+            <wp:docPr descr="approach" title="" id="24" name="Picture"/>
             <a:graphic>
               <a:graphicData uri="http://schemas.openxmlformats.org/drawingml/2006/picture">
                 <pic:pic>
                   <pic:nvPicPr>
-                    <pic:cNvPr descr="figures/fig_approach.png" id="22" name="Picture"/>
+                    <pic:cNvPr descr="figures/fig_approach.png" id="25" name="Picture"/>
                     <pic:cNvPicPr>
                       <a:picLocks noChangeArrowheads="1" noChangeAspect="1"/>
                     </pic:cNvPicPr>
                   </pic:nvPicPr>
                   <pic:blipFill>
-                    <a:blip r:embed="rId20"/>
+                    <a:blip r:embed="rId23"/>
                     <a:stretch>
                       <a:fillRect/>
                     </a:stretch>
@@ -4326,7 +4431,7 @@
         <w:pStyle w:val="BodyText"/>
       </w:pPr>
       <w:r>
-        <w:t xml:space="preserve">Figure 1. Left: sub-procedure A drives straight onto each target pose. Right:</w:t>
+        <w:t xml:space="preserve">Figure 4. Left: sub-procedure A drives straight onto each target pose. Right:</w:t>
       </w:r>
       <w:r>
         <w:t xml:space="preserve"> </w:t>
@@ -4832,8 +4937,8 @@
         <w:t xml:space="preserve">checks.</w:t>
       </w:r>
     </w:p>
-    <w:bookmarkEnd w:id="23"/>
-    <w:bookmarkStart w:id="24" w:name="recording-the-poses-the-pose-log"/>
+    <w:bookmarkEnd w:id="26"/>
+    <w:bookmarkStart w:id="27" w:name="recording-the-poses-the-pose-log"/>
     <w:p>
       <w:pPr>
         <w:pStyle w:val="Heading2"/>
@@ -5806,8 +5911,8 @@
         <w:t xml:space="preserve">replace the pose log: the tools above read the log.</w:t>
       </w:r>
     </w:p>
-    <w:bookmarkEnd w:id="24"/>
-    <w:bookmarkStart w:id="25" w:name="X5519462675585d0256a3c46cb1261738cf187b2"/>
+    <w:bookmarkEnd w:id="27"/>
+    <w:bookmarkStart w:id="28" w:name="X5519462675585d0256a3c46cb1261738cf187b2"/>
     <w:p>
       <w:pPr>
         <w:pStyle w:val="Heading2"/>
@@ -6100,8 +6205,8 @@
         <w:t xml:space="preserve">it cannot read the manifest.</w:t>
       </w:r>
     </w:p>
-    <w:bookmarkEnd w:id="25"/>
-    <w:bookmarkStart w:id="26" w:name="deliverables-checklist"/>
+    <w:bookmarkEnd w:id="28"/>
+    <w:bookmarkStart w:id="29" w:name="deliverables-checklist"/>
     <w:p>
       <w:pPr>
         <w:pStyle w:val="Heading2"/>
@@ -6452,8 +6557,8 @@
         <w:t xml:space="preserve">the board as the sensor sees it</w:t>
       </w:r>
     </w:p>
-    <w:bookmarkEnd w:id="26"/>
-    <w:bookmarkStart w:id="27" w:name="things-that-spoil-a-session"/>
+    <w:bookmarkEnd w:id="29"/>
+    <w:bookmarkStart w:id="30" w:name="things-that-spoil-a-session"/>
     <w:p>
       <w:pPr>
         <w:pStyle w:val="Heading2"/>
@@ -6606,8 +6711,8 @@
         <w:t xml:space="preserve">Mixing up the two pose logs, or capturing B into the A folder.</w:t>
       </w:r>
     </w:p>
-    <w:bookmarkEnd w:id="27"/>
-    <w:bookmarkStart w:id="28" w:name="appendix-a.-software-reference"/>
+    <w:bookmarkEnd w:id="30"/>
+    <w:bookmarkStart w:id="31" w:name="appendix-a.-software-reference"/>
     <w:p>
       <w:pPr>
         <w:pStyle w:val="Heading2"/>
@@ -8566,8 +8671,8 @@
         <w:t xml:space="preserve">                       unit quaternions) as errors</w:t>
       </w:r>
     </w:p>
-    <w:bookmarkEnd w:id="28"/>
-    <w:bookmarkStart w:id="29" w:name="X3b77f225bf0e3dd8541e4ee02fd4c1c557d291a"/>
+    <w:bookmarkEnd w:id="31"/>
+    <w:bookmarkStart w:id="32" w:name="X3b77f225bf0e3dd8541e4ee02fd4c1c557d291a"/>
     <w:p>
       <w:pPr>
         <w:pStyle w:val="Heading2"/>
@@ -9098,8 +9203,8 @@
         <w:t xml:space="preserve">active or the install step was skipped).</w:t>
       </w:r>
     </w:p>
-    <w:bookmarkEnd w:id="29"/>
-    <w:bookmarkEnd w:id="30"/>
+    <w:bookmarkEnd w:id="32"/>
+    <w:bookmarkEnd w:id="33"/>
     <w:sectPr>
       <w:footnotePr>
         <w:numRestart w:val="eachSect"/>

</xml_diff>

<commit_message>
Procedure: the software steps at a glance, and when to run them
Section 2 gains a table of every command in order (when, command, reads, writes,
section) and says to do appendix B once before section 4 and to run everything from
the session folder with the environment active. Section 6 says to build the manifest
and run the check after each sub-procedure, before starting the other.

Co-Authored-By: Claude Fable 5.1 <noreply@anthropic.com>
Claude-Session: https://claude.ai/code/session_016X9U4SzM2dXD3fEs3wV3Mm
</commit_message>
<xml_diff>
--- a/docs/procedures/registration_capture_procedure.docx
+++ b/docs/procedures/registration_capture_procedure.docx
@@ -1343,6 +1343,641 @@
       </w:r>
       <w:r>
         <w:t xml:space="preserve">room temperature, and anything unusual.</w:t>
+      </w:r>
+    </w:p>
+    <w:p>
+      <w:pPr>
+        <w:pStyle w:val="BodyText"/>
+      </w:pPr>
+      <w:r>
+        <w:rPr>
+          <w:b/>
+          <w:bCs/>
+        </w:rPr>
+        <w:t xml:space="preserve">Software.</w:t>
+      </w:r>
+      <w:r>
+        <w:t xml:space="preserve"> </w:t>
+      </w:r>
+      <w:r>
+        <w:t xml:space="preserve">Before the first command of section 4, do appendix B once on the</w:t>
+      </w:r>
+      <w:r>
+        <w:t xml:space="preserve"> </w:t>
+      </w:r>
+      <w:r>
+        <w:t xml:space="preserve">computer that will run the tools: install the two packages and run the self-test.</w:t>
+      </w:r>
+      <w:r>
+        <w:t xml:space="preserve"> </w:t>
+      </w:r>
+      <w:r>
+        <w:t xml:space="preserve">Every command in this document is then typed in a terminal opened in the session</w:t>
+      </w:r>
+      <w:r>
+        <w:t xml:space="preserve"> </w:t>
+      </w:r>
+      <w:r>
+        <w:t xml:space="preserve">folder, with the environment of appendix B.4 active (the prompt starts with</w:t>
+      </w:r>
+      <w:r>
+        <w:t xml:space="preserve"> </w:t>
+      </w:r>
+      <w:r>
+        <w:rPr>
+          <w:rStyle w:val="VerbatimChar"/>
+        </w:rPr>
+        <w:t xml:space="preserve">(.venv)</w:t>
+      </w:r>
+      <w:r>
+        <w:t xml:space="preserve">). The table below is the whole of what gets run, in order; each row points</w:t>
+      </w:r>
+      <w:r>
+        <w:t xml:space="preserve"> </w:t>
+      </w:r>
+      <w:r>
+        <w:t xml:space="preserve">to the section that gives the full command and explains its output. Any row can be</w:t>
+      </w:r>
+      <w:r>
+        <w:t xml:space="preserve"> </w:t>
+      </w:r>
+      <w:r>
+        <w:t xml:space="preserve">run by the engineer instead, if you send the files it reads.</w:t>
+      </w:r>
+    </w:p>
+    <w:tbl>
+      <w:tblPr>
+        <w:tblStyle w:val="Table"/>
+        <w:tblW w:type="pct" w:w="5000"/>
+        <w:tblLayout w:type="fixed"/>
+        <w:tblLook w:firstRow="1" w:lastRow="0" w:firstColumn="0" w:lastColumn="0" w:noHBand="0" w:noVBand="0" w:val="0020"/>
+      </w:tblPr>
+      <w:tblGrid>
+        <w:gridCol w:w="1584"/>
+        <w:gridCol w:w="1584"/>
+        <w:gridCol w:w="1584"/>
+        <w:gridCol w:w="1584"/>
+        <w:gridCol w:w="1584"/>
+      </w:tblGrid>
+      <w:tr>
+        <w:trPr>
+          <w:tblHeader w:val="on"/>
+        </w:trPr>
+        <w:tc>
+          <w:tcPr/>
+          <w:p>
+            <w:pPr>
+              <w:pStyle w:val="Compact"/>
+            </w:pPr>
+            <w:r>
+              <w:t xml:space="preserve">When</w:t>
+            </w:r>
+          </w:p>
+        </w:tc>
+        <w:tc>
+          <w:tcPr/>
+          <w:p>
+            <w:pPr>
+              <w:pStyle w:val="Compact"/>
+            </w:pPr>
+            <w:r>
+              <w:t xml:space="preserve">Command</w:t>
+            </w:r>
+          </w:p>
+        </w:tc>
+        <w:tc>
+          <w:tcPr/>
+          <w:p>
+            <w:pPr>
+              <w:pStyle w:val="Compact"/>
+            </w:pPr>
+            <w:r>
+              <w:t xml:space="preserve">Reads</w:t>
+            </w:r>
+          </w:p>
+        </w:tc>
+        <w:tc>
+          <w:tcPr/>
+          <w:p>
+            <w:pPr>
+              <w:pStyle w:val="Compact"/>
+            </w:pPr>
+            <w:r>
+              <w:t xml:space="preserve">Writes</w:t>
+            </w:r>
+          </w:p>
+        </w:tc>
+        <w:tc>
+          <w:tcPr/>
+          <w:p>
+            <w:pPr>
+              <w:pStyle w:val="Compact"/>
+            </w:pPr>
+            <w:r>
+              <w:t xml:space="preserve">Section</w:t>
+            </w:r>
+          </w:p>
+        </w:tc>
+      </w:tr>
+      <w:tr>
+        <w:tc>
+          <w:tcPr/>
+          <w:p>
+            <w:pPr>
+              <w:pStyle w:val="Compact"/>
+            </w:pPr>
+            <w:r>
+              <w:t xml:space="preserve">Once, before section 4</w:t>
+            </w:r>
+          </w:p>
+        </w:tc>
+        <w:tc>
+          <w:tcPr/>
+          <w:p>
+            <w:pPr>
+              <w:pStyle w:val="Compact"/>
+            </w:pPr>
+            <w:r>
+              <w:t xml:space="preserve">install and self-test</w:t>
+            </w:r>
+          </w:p>
+        </w:tc>
+        <w:tc>
+          <w:tcPr/>
+          <w:p>
+            <w:pPr>
+              <w:pStyle w:val="Compact"/>
+            </w:pPr>
+            <w:r>
+              <w:t xml:space="preserve">the two repositories</w:t>
+            </w:r>
+          </w:p>
+        </w:tc>
+        <w:tc>
+          <w:tcPr/>
+          <w:p>
+            <w:pPr>
+              <w:pStyle w:val="Compact"/>
+            </w:pPr>
+            <w:r>
+              <w:t xml:space="preserve">the environment</w:t>
+            </w:r>
+            <w:r>
+              <w:t xml:space="preserve"> </w:t>
+            </w:r>
+            <w:r>
+              <w:rPr>
+                <w:rStyle w:val="VerbatimChar"/>
+              </w:rPr>
+              <w:t xml:space="preserve">.venv</w:t>
+            </w:r>
+          </w:p>
+        </w:tc>
+        <w:tc>
+          <w:tcPr/>
+          <w:p>
+            <w:pPr>
+              <w:pStyle w:val="Compact"/>
+            </w:pPr>
+            <w:r>
+              <w:t xml:space="preserve">appendix B</w:t>
+            </w:r>
+          </w:p>
+        </w:tc>
+      </w:tr>
+      <w:tr>
+        <w:tc>
+          <w:tcPr/>
+          <w:p>
+            <w:pPr>
+              <w:pStyle w:val="Compact"/>
+            </w:pPr>
+            <w:r>
+              <w:t xml:space="preserve">After the six boot captures</w:t>
+            </w:r>
+          </w:p>
+        </w:tc>
+        <w:tc>
+          <w:tcPr/>
+          <w:p>
+            <w:pPr>
+              <w:pStyle w:val="Compact"/>
+            </w:pPr>
+            <w:r>
+              <w:rPr>
+                <w:rStyle w:val="VerbatimChar"/>
+              </w:rPr>
+              <w:t xml:space="preserve">sphcal.cli.make_manifest</w:t>
+            </w:r>
+          </w:p>
+        </w:tc>
+        <w:tc>
+          <w:tcPr/>
+          <w:p>
+            <w:pPr>
+              <w:pStyle w:val="Compact"/>
+            </w:pPr>
+            <w:r>
+              <w:rPr>
+                <w:rStyle w:val="VerbatimChar"/>
+              </w:rPr>
+              <w:t xml:space="preserve">boot_pose_log.csv</w:t>
+            </w:r>
+            <w:r>
+              <w:t xml:space="preserve">,</w:t>
+            </w:r>
+            <w:r>
+              <w:t xml:space="preserve"> </w:t>
+            </w:r>
+            <w:r>
+              <w:rPr>
+                <w:rStyle w:val="VerbatimChar"/>
+              </w:rPr>
+              <w:t xml:space="preserve">boot/</w:t>
+            </w:r>
+          </w:p>
+        </w:tc>
+        <w:tc>
+          <w:tcPr/>
+          <w:p>
+            <w:pPr>
+              <w:pStyle w:val="Compact"/>
+            </w:pPr>
+            <w:r>
+              <w:rPr>
+                <w:rStyle w:val="VerbatimChar"/>
+              </w:rPr>
+              <w:t xml:space="preserve">boot/manifest.csv</w:t>
+            </w:r>
+          </w:p>
+        </w:tc>
+        <w:tc>
+          <w:tcPr/>
+          <w:p>
+            <w:pPr>
+              <w:pStyle w:val="Compact"/>
+            </w:pPr>
+            <w:r>
+              <w:t xml:space="preserve">4, step 4</w:t>
+            </w:r>
+          </w:p>
+        </w:tc>
+      </w:tr>
+      <w:tr>
+        <w:tc>
+          <w:tcPr/>
+          <w:p>
+            <w:pPr>
+              <w:pStyle w:val="Compact"/>
+            </w:pPr>
+            <w:r>
+              <w:t xml:space="preserve">Right after that</w:t>
+            </w:r>
+          </w:p>
+        </w:tc>
+        <w:tc>
+          <w:tcPr/>
+          <w:p>
+            <w:pPr>
+              <w:pStyle w:val="Compact"/>
+            </w:pPr>
+            <w:r>
+              <w:rPr>
+                <w:rStyle w:val="VerbatimChar"/>
+              </w:rPr>
+              <w:t xml:space="preserve">planereg.capture.bootstrap</w:t>
+            </w:r>
+          </w:p>
+        </w:tc>
+        <w:tc>
+          <w:tcPr/>
+          <w:p>
+            <w:pPr>
+              <w:pStyle w:val="Compact"/>
+            </w:pPr>
+            <w:r>
+              <w:rPr>
+                <w:rStyle w:val="VerbatimChar"/>
+              </w:rPr>
+              <w:t xml:space="preserve">boot/manifest.csv</w:t>
+            </w:r>
+          </w:p>
+        </w:tc>
+        <w:tc>
+          <w:tcPr/>
+          <w:p>
+            <w:pPr>
+              <w:pStyle w:val="Compact"/>
+            </w:pPr>
+            <w:r>
+              <w:rPr>
+                <w:rStyle w:val="VerbatimChar"/>
+              </w:rPr>
+              <w:t xml:space="preserve">boot.json</w:t>
+            </w:r>
+            <w:r>
+              <w:t xml:space="preserve"> </w:t>
+            </w:r>
+            <w:r>
+              <w:t xml:space="preserve">(rough sensor position)</w:t>
+            </w:r>
+          </w:p>
+        </w:tc>
+        <w:tc>
+          <w:tcPr/>
+          <w:p>
+            <w:pPr>
+              <w:pStyle w:val="Compact"/>
+            </w:pPr>
+            <w:r>
+              <w:t xml:space="preserve">4, step 4</w:t>
+            </w:r>
+          </w:p>
+        </w:tc>
+      </w:tr>
+      <w:tr>
+        <w:tc>
+          <w:tcPr/>
+          <w:p>
+            <w:pPr>
+              <w:pStyle w:val="Compact"/>
+            </w:pPr>
+            <w:r>
+              <w:t xml:space="preserve">Before programming the robot</w:t>
+            </w:r>
+          </w:p>
+        </w:tc>
+        <w:tc>
+          <w:tcPr/>
+          <w:p>
+            <w:pPr>
+              <w:pStyle w:val="Compact"/>
+            </w:pPr>
+            <w:r>
+              <w:rPr>
+                <w:rStyle w:val="VerbatimChar"/>
+              </w:rPr>
+              <w:t xml:space="preserve">planereg.capture.plan_poses</w:t>
+            </w:r>
+          </w:p>
+        </w:tc>
+        <w:tc>
+          <w:tcPr/>
+          <w:p>
+            <w:pPr>
+              <w:pStyle w:val="Compact"/>
+            </w:pPr>
+            <w:r>
+              <w:rPr>
+                <w:rStyle w:val="VerbatimChar"/>
+              </w:rPr>
+              <w:t xml:space="preserve">boot.json</w:t>
+            </w:r>
+            <w:r>
+              <w:t xml:space="preserve">, one boot capture</w:t>
+            </w:r>
+          </w:p>
+        </w:tc>
+        <w:tc>
+          <w:tcPr/>
+          <w:p>
+            <w:pPr>
+              <w:pStyle w:val="Compact"/>
+            </w:pPr>
+            <w:r>
+              <w:rPr>
+                <w:rStyle w:val="VerbatimChar"/>
+              </w:rPr>
+              <w:t xml:space="preserve">plan/poses.csv</w:t>
+            </w:r>
+            <w:r>
+              <w:t xml:space="preserve">,</w:t>
+            </w:r>
+            <w:r>
+              <w:t xml:space="preserve"> </w:t>
+            </w:r>
+            <w:r>
+              <w:rPr>
+                <w:rStyle w:val="VerbatimChar"/>
+              </w:rPr>
+              <w:t xml:space="preserve">plan_summary.txt</w:t>
+            </w:r>
+            <w:r>
+              <w:t xml:space="preserve">,</w:t>
+            </w:r>
+            <w:r>
+              <w:t xml:space="preserve"> </w:t>
+            </w:r>
+            <w:r>
+              <w:rPr>
+                <w:rStyle w:val="VerbatimChar"/>
+              </w:rPr>
+              <w:t xml:space="preserve">plan.png</w:t>
+            </w:r>
+          </w:p>
+        </w:tc>
+        <w:tc>
+          <w:tcPr/>
+          <w:p>
+            <w:pPr>
+              <w:pStyle w:val="Compact"/>
+            </w:pPr>
+            <w:r>
+              <w:t xml:space="preserve">5</w:t>
+            </w:r>
+          </w:p>
+        </w:tc>
+      </w:tr>
+      <w:tr>
+        <w:tc>
+          <w:tcPr/>
+          <w:p>
+            <w:pPr>
+              <w:pStyle w:val="Compact"/>
+            </w:pPr>
+            <w:r>
+              <w:t xml:space="preserve">After each sub-procedure (A, then B)</w:t>
+            </w:r>
+          </w:p>
+        </w:tc>
+        <w:tc>
+          <w:tcPr/>
+          <w:p>
+            <w:pPr>
+              <w:pStyle w:val="Compact"/>
+            </w:pPr>
+            <w:r>
+              <w:rPr>
+                <w:rStyle w:val="VerbatimChar"/>
+              </w:rPr>
+              <w:t xml:space="preserve">sphcal.cli.make_manifest</w:t>
+            </w:r>
+          </w:p>
+        </w:tc>
+        <w:tc>
+          <w:tcPr/>
+          <w:p>
+            <w:pPr>
+              <w:pStyle w:val="Compact"/>
+            </w:pPr>
+            <w:r>
+              <w:rPr>
+                <w:rStyle w:val="VerbatimChar"/>
+              </w:rPr>
+              <w:t xml:space="preserve">pose_log_A.csv</w:t>
+            </w:r>
+            <w:r>
+              <w:t xml:space="preserve">,</w:t>
+            </w:r>
+            <w:r>
+              <w:t xml:space="preserve"> </w:t>
+            </w:r>
+            <w:r>
+              <w:rPr>
+                <w:rStyle w:val="VerbatimChar"/>
+              </w:rPr>
+              <w:t xml:space="preserve">captures_A/</w:t>
+            </w:r>
+            <w:r>
+              <w:t xml:space="preserve"> </w:t>
+            </w:r>
+            <w:r>
+              <w:t xml:space="preserve">(same for B)</w:t>
+            </w:r>
+          </w:p>
+        </w:tc>
+        <w:tc>
+          <w:tcPr/>
+          <w:p>
+            <w:pPr>
+              <w:pStyle w:val="Compact"/>
+            </w:pPr>
+            <w:r>
+              <w:rPr>
+                <w:rStyle w:val="VerbatimChar"/>
+              </w:rPr>
+              <w:t xml:space="preserve">captures_A/manifest.csv</w:t>
+            </w:r>
+          </w:p>
+        </w:tc>
+        <w:tc>
+          <w:tcPr/>
+          <w:p>
+            <w:pPr>
+              <w:pStyle w:val="Compact"/>
+            </w:pPr>
+            <w:r>
+              <w:t xml:space="preserve">7</w:t>
+            </w:r>
+          </w:p>
+        </w:tc>
+      </w:tr>
+      <w:tr>
+        <w:tc>
+          <w:tcPr/>
+          <w:p>
+            <w:pPr>
+              <w:pStyle w:val="Compact"/>
+            </w:pPr>
+            <w:r>
+              <w:t xml:space="preserve">Right after that, board still mounted</w:t>
+            </w:r>
+          </w:p>
+        </w:tc>
+        <w:tc>
+          <w:tcPr/>
+          <w:p>
+            <w:pPr>
+              <w:pStyle w:val="Compact"/>
+            </w:pPr>
+            <w:r>
+              <w:rPr>
+                <w:rStyle w:val="VerbatimChar"/>
+              </w:rPr>
+              <w:t xml:space="preserve">planereg.capture.check_captures</w:t>
+            </w:r>
+          </w:p>
+        </w:tc>
+        <w:tc>
+          <w:tcPr/>
+          <w:p>
+            <w:pPr>
+              <w:pStyle w:val="Compact"/>
+            </w:pPr>
+            <w:r>
+              <w:t xml:space="preserve">the manifest,</w:t>
+            </w:r>
+            <w:r>
+              <w:t xml:space="preserve"> </w:t>
+            </w:r>
+            <w:r>
+              <w:rPr>
+                <w:rStyle w:val="VerbatimChar"/>
+              </w:rPr>
+              <w:t xml:space="preserve">boot.json</w:t>
+            </w:r>
+            <w:r>
+              <w:t xml:space="preserve">, the pose log</w:t>
+            </w:r>
+          </w:p>
+        </w:tc>
+        <w:tc>
+          <w:tcPr/>
+          <w:p>
+            <w:pPr>
+              <w:pStyle w:val="Compact"/>
+            </w:pPr>
+            <w:r>
+              <w:rPr>
+                <w:rStyle w:val="VerbatimChar"/>
+              </w:rPr>
+              <w:t xml:space="preserve">captures_A/check.json</w:t>
+            </w:r>
+            <w:r>
+              <w:t xml:space="preserve"> </w:t>
+            </w:r>
+            <w:r>
+              <w:t xml:space="preserve">and a verdict</w:t>
+            </w:r>
+          </w:p>
+        </w:tc>
+        <w:tc>
+          <w:tcPr/>
+          <w:p>
+            <w:pPr>
+              <w:pStyle w:val="Compact"/>
+            </w:pPr>
+            <w:r>
+              <w:t xml:space="preserve">8</w:t>
+            </w:r>
+          </w:p>
+        </w:tc>
+      </w:tr>
+    </w:tbl>
+    <w:p>
+      <w:pPr>
+        <w:pStyle w:val="BodyText"/>
+      </w:pPr>
+      <w:r>
+        <w:t xml:space="preserve">Each command is run as</w:t>
+      </w:r>
+      <w:r>
+        <w:t xml:space="preserve"> </w:t>
+      </w:r>
+      <w:r>
+        <w:rPr>
+          <w:rStyle w:val="VerbatimChar"/>
+        </w:rPr>
+        <w:t xml:space="preserve">python3 -m &lt;command&gt; &lt;options&gt;</w:t>
+      </w:r>
+      <w:r>
+        <w:t xml:space="preserve">; the sections give the</w:t>
+      </w:r>
+      <w:r>
+        <w:t xml:space="preserve"> </w:t>
+      </w:r>
+      <w:r>
+        <w:t xml:space="preserve">options.</w:t>
       </w:r>
     </w:p>
     <w:bookmarkEnd w:id="10"/>
@@ -2333,7 +2968,7 @@
         </w:numPr>
       </w:pPr>
       <w:r>
-        <w:t xml:space="preserve">Build the manifest and run the bootstrap (the engineer can do this):</w:t>
+        <w:t xml:space="preserve">Build the manifest and run the bootstrap (section 2 says where to type this):</w:t>
       </w:r>
     </w:p>
     <w:p>
@@ -4628,6 +5263,35 @@
         <w:pStyle w:val="FirstParagraph"/>
       </w:pPr>
       <w:r>
+        <w:t xml:space="preserve">When the last pose of A is done, and before starting B, build the manifest of</w:t>
+      </w:r>
+      <w:r>
+        <w:t xml:space="preserve"> </w:t>
+      </w:r>
+      <w:r>
+        <w:rPr>
+          <w:rStyle w:val="VerbatimChar"/>
+        </w:rPr>
+        <w:t xml:space="preserve">captures_A/</w:t>
+      </w:r>
+      <w:r>
+        <w:t xml:space="preserve"> </w:t>
+      </w:r>
+      <w:r>
+        <w:t xml:space="preserve">(section 7) and run the check on it (section 8), while the board is</w:t>
+      </w:r>
+      <w:r>
+        <w:t xml:space="preserve"> </w:t>
+      </w:r>
+      <w:r>
+        <w:t xml:space="preserve">still mounted and flagged poses can be re-captured cheaply.</w:t>
+      </w:r>
+    </w:p>
+    <w:p>
+      <w:pPr>
+        <w:pStyle w:val="BodyText"/>
+      </w:pPr>
+      <w:r>
         <w:rPr>
           <w:b/>
           <w:bCs/>
@@ -4902,6 +5566,35 @@
     <w:p>
       <w:pPr>
         <w:pStyle w:val="FirstParagraph"/>
+      </w:pPr>
+      <w:r>
+        <w:t xml:space="preserve">When the last pose of B is done, build the manifest of</w:t>
+      </w:r>
+      <w:r>
+        <w:t xml:space="preserve"> </w:t>
+      </w:r>
+      <w:r>
+        <w:rPr>
+          <w:rStyle w:val="VerbatimChar"/>
+        </w:rPr>
+        <w:t xml:space="preserve">captures_B/</w:t>
+      </w:r>
+      <w:r>
+        <w:t xml:space="preserve"> </w:t>
+      </w:r>
+      <w:r>
+        <w:t xml:space="preserve">and run the</w:t>
+      </w:r>
+      <w:r>
+        <w:t xml:space="preserve"> </w:t>
+      </w:r>
+      <w:r>
+        <w:t xml:space="preserve">check on it, as after A.</w:t>
+      </w:r>
+    </w:p>
+    <w:p>
+      <w:pPr>
+        <w:pStyle w:val="BodyText"/>
       </w:pPr>
       <w:r>
         <w:t xml:space="preserve">Use the same speed and acceleration settings in both sub-procedures. Do all of A,</w:t>

</xml_diff>

<commit_message>
Procedure: scope of work (section 1a-1f), suppliers and drawing appendices, cost script
Section 1 now lists what is in hand from stage 1 (board, board adapter, run-out
fixture, sensor mount), what must be built or bought with costs from one script
(build/costs.py), the plate purchase specification, the run-out fixture and the
preparation before the first session. Captures are triggered through the capture
computer's communication software; the sensor's SGM settings are recorded as in
stage 1. Appendices re-lettered: A suppliers, B software reference, C installation,
D the stage-1 board-adapter drawing SC1-05 (PNG copied from that repository).
Decisions 11 to 16 recorded in the review's decision log. Previous version archived
under docs/procedures/archive/2026-10-07_before_scope_of_work.

Co-Authored-By: Claude Fable 5.1 <noreply@anthropic.com>
Claude-Session: https://claude.ai/code/session_016X9U4SzM2dXD3fEs3wV3Mm
</commit_message>
<xml_diff>
--- a/docs/procedures/registration_capture_procedure.docx
+++ b/docs/procedures/registration_capture_procedure.docx
@@ -36,7 +36,7 @@
         </w:p>
       </w:sdtContent>
     </w:sdt>
-    <w:bookmarkStart w:id="33" w:name="X3598e64a88c823a5f341feeb99141bc42344d3c"/>
+    <w:bookmarkStart w:id="44" w:name="X3598e64a88c823a5f341feeb99141bc42344d3c"/>
     <w:p>
       <w:pPr>
         <w:pStyle w:val="Heading1"/>
@@ -89,7 +89,7 @@
         <w:t xml:space="preserve"> </w:t>
       </w:r>
       <w:r>
-        <w:t xml:space="preserve">repository is needed (appendix B says how to set it up); the engineer can run those</w:t>
+        <w:t xml:space="preserve">repository is needed (appendix C says how to set it up); the engineer can run those</w:t>
       </w:r>
       <w:r>
         <w:t xml:space="preserve"> </w:t>
@@ -210,25 +210,37 @@
         <w:t xml:space="preserve"> </w:t>
       </w:r>
       <w:r>
-        <w:t xml:space="preserve">its layout and its tools; the board, its adapter and its tool frame are the same</w:t>
-      </w:r>
-      <w:r>
-        <w:t xml:space="preserve"> </w:t>
-      </w:r>
-      <w:r>
-        <w:t xml:space="preserve">(section 1 repeats the board specification). A stage-1 board can be used as it is.</w:t>
-      </w:r>
-      <w:r>
-        <w:t xml:space="preserve"> </w:t>
-      </w:r>
-      <w:r>
-        <w:t xml:space="preserve">The spheres and the three-ball nest are not needed here. You do not need to have read the stage-1 procedure; where this</w:t>
-      </w:r>
-      <w:r>
-        <w:t xml:space="preserve"> </w:t>
-      </w:r>
-      <w:r>
-        <w:t xml:space="preserve">document points to it, it is for extra detail only.</w:t>
+        <w:t xml:space="preserve">its layout and its tools. The board, its adapter, its tool frame and the run-out</w:t>
+      </w:r>
+      <w:r>
+        <w:t xml:space="preserve"> </w:t>
+      </w:r>
+      <w:r>
+        <w:t xml:space="preserve">fixture are the stage-1 ones, reused; section 1 lists them, and carries their</w:t>
+      </w:r>
+      <w:r>
+        <w:t xml:space="preserve"> </w:t>
+      </w:r>
+      <w:r>
+        <w:t xml:space="preserve">specification, drawing and suppliers so that they can be made if the stage-1 session</w:t>
+      </w:r>
+      <w:r>
+        <w:t xml:space="preserve"> </w:t>
+      </w:r>
+      <w:r>
+        <w:t xml:space="preserve">has not been run. The spheres and the three-ball nest are not needed here. You do</w:t>
+      </w:r>
+      <w:r>
+        <w:t xml:space="preserve"> </w:t>
+      </w:r>
+      <w:r>
+        <w:t xml:space="preserve">not need to have read the stage-1 procedure; where this document points to it, it is</w:t>
+      </w:r>
+      <w:r>
+        <w:t xml:space="preserve"> </w:t>
+      </w:r>
+      <w:r>
+        <w:t xml:space="preserve">for extra detail only.</w:t>
       </w:r>
     </w:p>
     <w:p>
@@ -308,13 +320,60 @@
         </w:pict>
       </w:r>
     </w:p>
-    <w:bookmarkStart w:id="9" w:name="equipment"/>
+    <w:bookmarkStart w:id="15" w:name="scope-of-work-and-equipment"/>
     <w:p>
       <w:pPr>
         <w:pStyle w:val="Heading2"/>
       </w:pPr>
       <w:r>
-        <w:t xml:space="preserve">1. Equipment</w:t>
+        <w:t xml:space="preserve">1. Scope of work and equipment</w:t>
+      </w:r>
+    </w:p>
+    <w:p>
+      <w:pPr>
+        <w:pStyle w:val="FirstParagraph"/>
+      </w:pPr>
+      <w:r>
+        <w:t xml:space="preserve">This section is the complete list of what must exist before the first session: what</w:t>
+      </w:r>
+      <w:r>
+        <w:t xml:space="preserve"> </w:t>
+      </w:r>
+      <w:r>
+        <w:t xml:space="preserve">is already in hand, what must be built, what must be bought, and what must be</w:t>
+      </w:r>
+      <w:r>
+        <w:t xml:space="preserve"> </w:t>
+      </w:r>
+      <w:r>
+        <w:t xml:space="preserve">prepared. Nothing outside this list is needed. The board, its adapter and the run-out</w:t>
+      </w:r>
+      <w:r>
+        <w:t xml:space="preserve"> </w:t>
+      </w:r>
+      <w:r>
+        <w:t xml:space="preserve">fixture come from the stage-1 session; 1b to 1e say what they are, so that they can</w:t>
+      </w:r>
+      <w:r>
+        <w:t xml:space="preserve"> </w:t>
+      </w:r>
+      <w:r>
+        <w:t xml:space="preserve">be made for this procedure alone if stage 1 has not been run. Appendix D holds the</w:t>
+      </w:r>
+      <w:r>
+        <w:t xml:space="preserve"> </w:t>
+      </w:r>
+      <w:r>
+        <w:t xml:space="preserve">shop drawing; appendix A lists suppliers.</w:t>
+      </w:r>
+    </w:p>
+    <w:bookmarkStart w:id="9" w:name="a.-already-in-hand"/>
+    <w:p>
+      <w:pPr>
+        <w:pStyle w:val="Heading3"/>
+      </w:pPr>
+      <w:r>
+        <w:t xml:space="preserve">1a. Already in hand</w:t>
       </w:r>
     </w:p>
     <w:tbl>
@@ -325,9 +384,8 @@
         <w:tblLook w:firstRow="1" w:lastRow="0" w:firstColumn="0" w:lastColumn="0" w:noHBand="0" w:noVBand="0" w:val="0020"/>
       </w:tblPr>
       <w:tblGrid>
-        <w:gridCol w:w="2640"/>
-        <w:gridCol w:w="2640"/>
-        <w:gridCol w:w="2640"/>
+        <w:gridCol w:w="3960"/>
+        <w:gridCol w:w="3960"/>
       </w:tblGrid>
       <w:tr>
         <w:trPr>
@@ -355,17 +413,6 @@
             </w:r>
           </w:p>
         </w:tc>
-        <w:tc>
-          <w:tcPr/>
-          <w:p>
-            <w:pPr>
-              <w:pStyle w:val="Compact"/>
-            </w:pPr>
-            <w:r>
-              <w:t xml:space="preserve">Notes</w:t>
-            </w:r>
-          </w:p>
-        </w:tc>
       </w:tr>
       <w:tr>
         <w:tc>
@@ -386,18 +433,7 @@
               <w:pStyle w:val="Compact"/>
             </w:pPr>
             <w:r>
-              <w:t xml:space="preserve">The 3D sensor to be registered, rigidly mounted; it must not move during the whole session</w:t>
-            </w:r>
-          </w:p>
-        </w:tc>
-        <w:tc>
-          <w:tcPr/>
-          <w:p>
-            <w:pPr>
-              <w:pStyle w:val="Compact"/>
-            </w:pPr>
-            <w:r>
-              <w:t xml:space="preserve">Mount on a stiff bracket, not a tripod; mark its position so a bump is noticed</w:t>
+              <w:t xml:space="preserve">The 3D sensor to be registered: the same depth sensor as in stage 1, with the same processing settings (1f)</w:t>
             </w:r>
           </w:p>
         </w:tc>
@@ -421,27 +457,7 @@
               <w:pStyle w:val="Compact"/>
             </w:pPr>
             <w:r>
-              <w:t xml:space="preserve">Six-axis industrial robot, absolute positioning accuracy 0.1 mm or better over the working volume, with a 50 mm or larger ISO flange</w:t>
-            </w:r>
-          </w:p>
-        </w:tc>
-        <w:tc>
-          <w:tcPr/>
-          <w:p>
-            <w:pPr>
-              <w:pStyle w:val="Compact"/>
-            </w:pPr>
-            <w:r>
-              <w:t xml:space="preserve">A robot calibrated by its maker (</w:t>
-            </w:r>
-            <w:r>
-              <w:t xml:space="preserve">“absolute accuracy”</w:t>
-            </w:r>
-            <w:r>
-              <w:t xml:space="preserve"> </w:t>
-            </w:r>
-            <w:r>
-              <w:t xml:space="preserve">option) is needed; repeatability alone is not enough</w:t>
+              <w:t xml:space="preserve">Six-axis industrial robot with an ISO 9409-1-50-4-M6 tool flange; its documented absolute positioning accuracy must be 0.1 mm or better over the working volume (check the maker’s specification sheet; repeatability alone is not enough)</w:t>
             </w:r>
           </w:p>
         </w:tc>
@@ -454,158 +470,18 @@
               <w:pStyle w:val="Compact"/>
             </w:pPr>
             <w:r>
-              <w:t xml:space="preserve">Board</w:t>
-            </w:r>
-          </w:p>
-        </w:tc>
-        <w:tc>
-          <w:tcPr/>
-          <w:p>
-            <w:pPr>
-              <w:pStyle w:val="Compact"/>
-            </w:pPr>
-            <w:r>
-              <w:t xml:space="preserve">Flat plate 200 mm x 150 mm, at least 6 mm thick, front face matte and light gray, flat to 0.05 mm after finishing</w:t>
-            </w:r>
-          </w:p>
-        </w:tc>
-        <w:tc>
-          <w:tcPr/>
-          <w:p>
-            <w:pPr>
-              <w:pStyle w:val="Compact"/>
-            </w:pPr>
-            <w:r>
-              <w:t xml:space="preserve">Ground aluminum tooling plate or float glass, matte-painted; ask the supplier for a flatness report (stage-1 procedure, appendix A, lists suppliers). Thickness is not a stiffness matter (a 6 mm plate sags about 0.002 mm under its own weight); it only has to survive the finish and the mounting flat. Do not bead-blast a plate thinner than about 10 mm: peening one face bows it. Paint over the ground or glass surface instead, and check the flatness after painting and mounting, not before</w:t>
-            </w:r>
-          </w:p>
-        </w:tc>
-      </w:tr>
-      <w:tr>
-        <w:tc>
-          <w:tcPr/>
-          <w:p>
-            <w:pPr>
-              <w:pStyle w:val="Compact"/>
-            </w:pPr>
-            <w:r>
-              <w:t xml:space="preserve">Board adapter</w:t>
-            </w:r>
-          </w:p>
-        </w:tc>
-        <w:tc>
-          <w:tcPr/>
-          <w:p>
-            <w:pPr>
-              <w:pStyle w:val="Compact"/>
-            </w:pPr>
-            <w:r>
-              <w:t xml:space="preserve">Plate that bolts to the flange with the dowel pins and holds the board with its front face perpendicular to the flange axis and its center on the flange axis</w:t>
-            </w:r>
-          </w:p>
-        </w:tc>
-        <w:tc>
-          <w:tcPr/>
-          <w:p>
-            <w:pPr>
-              <w:pStyle w:val="Compact"/>
-            </w:pPr>
-            <w:r>
-              <w:t xml:space="preserve">Three-point mounting (two dowels and a clamp) so the board goes back in the same place</w:t>
-            </w:r>
-          </w:p>
-        </w:tc>
-      </w:tr>
-      <w:tr>
-        <w:tc>
-          <w:tcPr/>
-          <w:p>
-            <w:pPr>
-              <w:pStyle w:val="Compact"/>
-            </w:pPr>
-            <w:r>
-              <w:t xml:space="preserve">Dial indicator with magnetic base</w:t>
-            </w:r>
-          </w:p>
-        </w:tc>
-        <w:tc>
-          <w:tcPr/>
-          <w:p>
-            <w:pPr>
-              <w:pStyle w:val="Compact"/>
-            </w:pPr>
-            <w:r>
-              <w:t xml:space="preserve">0.01 mm resolution</w:t>
-            </w:r>
-          </w:p>
-        </w:tc>
-        <w:tc>
-          <w:tcPr/>
-          <w:p>
-            <w:pPr>
-              <w:pStyle w:val="Compact"/>
-            </w:pPr>
-            <w:r>
-              <w:t xml:space="preserve">Board runout check</w:t>
-            </w:r>
-          </w:p>
-        </w:tc>
-      </w:tr>
-      <w:tr>
-        <w:tc>
-          <w:tcPr/>
-          <w:p>
-            <w:pPr>
-              <w:pStyle w:val="Compact"/>
-            </w:pPr>
-            <w:r>
-              <w:t xml:space="preserve">Depth gauge or calipers</w:t>
-            </w:r>
-          </w:p>
-        </w:tc>
-        <w:tc>
-          <w:tcPr/>
-          <w:p>
-            <w:pPr>
-              <w:pStyle w:val="Compact"/>
-            </w:pPr>
-            <w:r>
-              <w:t xml:space="preserve">0.02 mm resolution</w:t>
-            </w:r>
-          </w:p>
-        </w:tc>
-        <w:tc>
-          <w:tcPr/>
-          <w:p>
-            <w:pPr>
-              <w:pStyle w:val="Compact"/>
-            </w:pPr>
-            <w:r>
-              <w:t xml:space="preserve">Board offset D</w:t>
-            </w:r>
-          </w:p>
-        </w:tc>
-      </w:tr>
-      <w:tr>
-        <w:tc>
-          <w:tcPr/>
-          <w:p>
-            <w:pPr>
-              <w:pStyle w:val="Compact"/>
-            </w:pPr>
-            <w:r>
-              <w:t xml:space="preserve">Capture computer</w:t>
-            </w:r>
-          </w:p>
-        </w:tc>
-        <w:tc>
-          <w:tcPr/>
-          <w:p>
-            <w:pPr>
-              <w:pStyle w:val="Compact"/>
-            </w:pPr>
-            <w:r>
-              <w:t xml:space="preserve">Runs the sensor’s capture software and writes one</w:t>
+              <w:t xml:space="preserve">Capture computer and software</w:t>
+            </w:r>
+          </w:p>
+        </w:tc>
+        <w:tc>
+          <w:tcPr/>
+          <w:p>
+            <w:pPr>
+              <w:pStyle w:val="Compact"/>
+            </w:pPr>
+            <w:r>
+              <w:t xml:space="preserve">Runs the sensor’s capture and communication software, which accepts the capture trigger from the robot program and writes one</w:t>
             </w:r>
             <w:r>
               <w:t xml:space="preserve"> </w:t>
@@ -620,45 +496,1019 @@
               <w:t xml:space="preserve"> </w:t>
             </w:r>
             <w:r>
-              <w:t xml:space="preserve">file per capture; the files must be named by pose id (section 2 says how)</w:t>
-            </w:r>
-          </w:p>
-        </w:tc>
-        <w:tc>
-          <w:tcPr/>
-          <w:p>
-            <w:pPr>
-              <w:pStyle w:val="Compact"/>
-            </w:pPr>
-            <w:r>
-              <w:t xml:space="preserve">At least 10 GB free per 1,000 frames</w:t>
+              <w:t xml:space="preserve">file per capture, named by pose id (section 2); at least 10 GB free per 1,000 frames, about 25 GB for the default plan</w:t>
+            </w:r>
+          </w:p>
+        </w:tc>
+      </w:tr>
+      <w:tr>
+        <w:tc>
+          <w:tcPr/>
+          <w:p>
+            <w:pPr>
+              <w:pStyle w:val="Compact"/>
+            </w:pPr>
+            <w:r>
+              <w:t xml:space="preserve">Analysis computer</w:t>
+            </w:r>
+          </w:p>
+        </w:tc>
+        <w:tc>
+          <w:tcPr/>
+          <w:p>
+            <w:pPr>
+              <w:pStyle w:val="Compact"/>
+            </w:pPr>
+            <w:r>
+              <w:t xml:space="preserve">Any computer with Python 3.10 or later and the two software packages installed, their self-test passed (appendix C)</w:t>
+            </w:r>
+          </w:p>
+        </w:tc>
+      </w:tr>
+      <w:tr>
+        <w:tc>
+          <w:tcPr/>
+          <w:p>
+            <w:pPr>
+              <w:pStyle w:val="Compact"/>
+            </w:pPr>
+            <w:r>
+              <w:t xml:space="preserve">Flat target (board)</w:t>
+            </w:r>
+          </w:p>
+        </w:tc>
+        <w:tc>
+          <w:tcPr/>
+          <w:p>
+            <w:pPr>
+              <w:pStyle w:val="Compact"/>
+            </w:pPr>
+            <w:r>
+              <w:t xml:space="preserve">From stage 1: 200 x 150 mm plate, at least 6 mm thick, matte light-gray front face flat to 0.05 mm; specification in 1d</w:t>
+            </w:r>
+          </w:p>
+        </w:tc>
+      </w:tr>
+      <w:tr>
+        <w:tc>
+          <w:tcPr/>
+          <w:p>
+            <w:pPr>
+              <w:pStyle w:val="Compact"/>
+            </w:pPr>
+            <w:r>
+              <w:t xml:space="preserve">Board adapter</w:t>
+            </w:r>
+          </w:p>
+        </w:tc>
+        <w:tc>
+          <w:tcPr/>
+          <w:p>
+            <w:pPr>
+              <w:pStyle w:val="Compact"/>
+            </w:pPr>
+            <w:r>
+              <w:t xml:space="preserve">From stage 1: plate on the ISO flange with three support pads, three edge pins and three clamp fingers, holding the board square to the flange axis and centered on it; drawing SC1-05 (appendix D)</w:t>
+            </w:r>
+          </w:p>
+        </w:tc>
+      </w:tr>
+      <w:tr>
+        <w:tc>
+          <w:tcPr/>
+          <w:p>
+            <w:pPr>
+              <w:pStyle w:val="Compact"/>
+            </w:pPr>
+            <w:r>
+              <w:t xml:space="preserve">Run-out fixture</w:t>
+            </w:r>
+          </w:p>
+        </w:tc>
+        <w:tc>
+          <w:tcPr/>
+          <w:p>
+            <w:pPr>
+              <w:pStyle w:val="Compact"/>
+            </w:pPr>
+            <w:r>
+              <w:t xml:space="preserve">From stage 1: dial indicator on a magnetic base on a steel plate bolted to the cell table; section 1e</w:t>
+            </w:r>
+          </w:p>
+        </w:tc>
+      </w:tr>
+      <w:tr>
+        <w:tc>
+          <w:tcPr/>
+          <w:p>
+            <w:pPr>
+              <w:pStyle w:val="Compact"/>
+            </w:pPr>
+            <w:r>
+              <w:t xml:space="preserve">Rigid sensor mount</w:t>
+            </w:r>
+          </w:p>
+        </w:tc>
+        <w:tc>
+          <w:tcPr/>
+          <w:p>
+            <w:pPr>
+              <w:pStyle w:val="Compact"/>
+            </w:pPr>
+            <w:r>
+              <w:t xml:space="preserve">From stage 1, built from the existing drawing from previous work: a stiff bracket, not a tripod, with the sensor’s position marked so a bump is noticed</w:t>
             </w:r>
           </w:p>
         </w:tc>
       </w:tr>
     </w:tbl>
+    <w:bookmarkEnd w:id="9"/>
+    <w:bookmarkStart w:id="10" w:name="b.-what-must-be-built"/>
+    <w:p>
+      <w:pPr>
+        <w:pStyle w:val="Heading3"/>
+      </w:pPr>
+      <w:r>
+        <w:t xml:space="preserve">1b. What must be built</w:t>
+      </w:r>
+    </w:p>
+    <w:p>
+      <w:pPr>
+        <w:pStyle w:val="FirstParagraph"/>
+      </w:pPr>
+      <w:r>
+        <w:t xml:space="preserve">Nothing, if the stage-1 session has been run: the three items below exist. Otherwise</w:t>
+      </w:r>
+      <w:r>
+        <w:t xml:space="preserve"> </w:t>
+      </w:r>
+      <w:r>
+        <w:t xml:space="preserve">they are built as in the stage-1 procedure, to the same drawing and specification.</w:t>
+      </w:r>
+    </w:p>
+    <w:tbl>
+      <w:tblPr>
+        <w:tblStyle w:val="Table"/>
+        <w:tblW w:type="pct" w:w="5000"/>
+        <w:tblLayout w:type="fixed"/>
+        <w:tblLook w:firstRow="1" w:lastRow="0" w:firstColumn="0" w:lastColumn="0" w:noHBand="0" w:noVBand="0" w:val="0020"/>
+      </w:tblPr>
+      <w:tblGrid>
+        <w:gridCol w:w="1320"/>
+        <w:gridCol w:w="1320"/>
+        <w:gridCol w:w="1320"/>
+        <w:gridCol w:w="1320"/>
+        <w:gridCol w:w="1320"/>
+        <w:gridCol w:w="1320"/>
+      </w:tblGrid>
+      <w:tr>
+        <w:trPr>
+          <w:tblHeader w:val="on"/>
+        </w:trPr>
+        <w:tc>
+          <w:tcPr/>
+          <w:p>
+            <w:pPr>
+              <w:pStyle w:val="Compact"/>
+            </w:pPr>
+            <w:r>
+              <w:t xml:space="preserve">Item</w:t>
+            </w:r>
+          </w:p>
+        </w:tc>
+        <w:tc>
+          <w:tcPr/>
+          <w:p>
+            <w:pPr>
+              <w:pStyle w:val="Compact"/>
+            </w:pPr>
+            <w:r>
+              <w:t xml:space="preserve">Quantity</w:t>
+            </w:r>
+          </w:p>
+        </w:tc>
+        <w:tc>
+          <w:tcPr/>
+          <w:p>
+            <w:pPr>
+              <w:pStyle w:val="Compact"/>
+            </w:pPr>
+            <w:r>
+              <w:t xml:space="preserve">Description</w:t>
+            </w:r>
+          </w:p>
+        </w:tc>
+        <w:tc>
+          <w:tcPr/>
+          <w:p>
+            <w:pPr>
+              <w:pStyle w:val="Compact"/>
+            </w:pPr>
+            <w:r>
+              <w:t xml:space="preserve">Drawing</w:t>
+            </w:r>
+          </w:p>
+        </w:tc>
+        <w:tc>
+          <w:tcPr/>
+          <w:p>
+            <w:pPr>
+              <w:pStyle w:val="Compact"/>
+            </w:pPr>
+            <w:r>
+              <w:t xml:space="preserve">Estimated cost (USD)</w:t>
+            </w:r>
+          </w:p>
+        </w:tc>
+        <w:tc>
+          <w:tcPr/>
+          <w:p>
+            <w:pPr>
+              <w:pStyle w:val="Compact"/>
+            </w:pPr>
+            <w:r>
+              <w:t xml:space="preserve">From stage 1</w:t>
+            </w:r>
+          </w:p>
+        </w:tc>
+      </w:tr>
+      <w:tr>
+        <w:tc>
+          <w:tcPr/>
+          <w:p>
+            <w:pPr>
+              <w:pStyle w:val="Compact"/>
+            </w:pPr>
+            <w:r>
+              <w:t xml:space="preserve">Flat target (board)</w:t>
+            </w:r>
+          </w:p>
+        </w:tc>
+        <w:tc>
+          <w:tcPr/>
+          <w:p>
+            <w:pPr>
+              <w:pStyle w:val="Compact"/>
+            </w:pPr>
+            <w:r>
+              <w:t xml:space="preserve">1</w:t>
+            </w:r>
+          </w:p>
+        </w:tc>
+        <w:tc>
+          <w:tcPr/>
+          <w:p>
+            <w:pPr>
+              <w:pStyle w:val="Compact"/>
+            </w:pPr>
+            <w:r>
+              <w:t xml:space="preserve">200 x 150 mm plate, specification in 1d</w:t>
+            </w:r>
+          </w:p>
+        </w:tc>
+        <w:tc>
+          <w:tcPr/>
+          <w:p>
+            <w:pPr>
+              <w:pStyle w:val="Compact"/>
+            </w:pPr>
+            <w:r>
+              <w:t xml:space="preserve">SC1-05 (outline)</w:t>
+            </w:r>
+          </w:p>
+        </w:tc>
+        <w:tc>
+          <w:tcPr/>
+          <w:p>
+            <w:pPr>
+              <w:pStyle w:val="Compact"/>
+            </w:pPr>
+            <w:r>
+              <w:t xml:space="preserve">$50 to $400</w:t>
+            </w:r>
+          </w:p>
+        </w:tc>
+        <w:tc>
+          <w:tcPr/>
+          <w:p>
+            <w:pPr>
+              <w:pStyle w:val="Compact"/>
+            </w:pPr>
+            <w:r>
+              <w:t xml:space="preserve">yes</w:t>
+            </w:r>
+          </w:p>
+        </w:tc>
+      </w:tr>
+      <w:tr>
+        <w:tc>
+          <w:tcPr/>
+          <w:p>
+            <w:pPr>
+              <w:pStyle w:val="Compact"/>
+            </w:pPr>
+            <w:r>
+              <w:t xml:space="preserve">Board adapter</w:t>
+            </w:r>
+          </w:p>
+        </w:tc>
+        <w:tc>
+          <w:tcPr/>
+          <w:p>
+            <w:pPr>
+              <w:pStyle w:val="Compact"/>
+            </w:pPr>
+            <w:r>
+              <w:t xml:space="preserve">1</w:t>
+            </w:r>
+          </w:p>
+        </w:tc>
+        <w:tc>
+          <w:tcPr/>
+          <w:p>
+            <w:pPr>
+              <w:pStyle w:val="Compact"/>
+            </w:pPr>
+            <w:r>
+              <w:t xml:space="preserve">Flange plate with pads, edge pins and clamp fingers, drawing SC1-05</w:t>
+            </w:r>
+          </w:p>
+        </w:tc>
+        <w:tc>
+          <w:tcPr/>
+          <w:p>
+            <w:pPr>
+              <w:pStyle w:val="Compact"/>
+            </w:pPr>
+            <w:r>
+              <w:t xml:space="preserve">SC1-05</w:t>
+            </w:r>
+          </w:p>
+        </w:tc>
+        <w:tc>
+          <w:tcPr/>
+          <w:p>
+            <w:pPr>
+              <w:pStyle w:val="Compact"/>
+            </w:pPr>
+            <w:r>
+              <w:t xml:space="preserve">$250 to $600</w:t>
+            </w:r>
+          </w:p>
+        </w:tc>
+        <w:tc>
+          <w:tcPr/>
+          <w:p>
+            <w:pPr>
+              <w:pStyle w:val="Compact"/>
+            </w:pPr>
+            <w:r>
+              <w:t xml:space="preserve">yes</w:t>
+            </w:r>
+          </w:p>
+        </w:tc>
+      </w:tr>
+      <w:tr>
+        <w:tc>
+          <w:tcPr/>
+          <w:p>
+            <w:pPr>
+              <w:pStyle w:val="Compact"/>
+            </w:pPr>
+            <w:r>
+              <w:t xml:space="preserve">Run-out fixture</w:t>
+            </w:r>
+          </w:p>
+        </w:tc>
+        <w:tc>
+          <w:tcPr/>
+          <w:p>
+            <w:pPr>
+              <w:pStyle w:val="Compact"/>
+            </w:pPr>
+            <w:r>
+              <w:t xml:space="preserve">1</w:t>
+            </w:r>
+          </w:p>
+        </w:tc>
+        <w:tc>
+          <w:tcPr/>
+          <w:p>
+            <w:pPr>
+              <w:pStyle w:val="Compact"/>
+            </w:pPr>
+            <w:r>
+              <w:t xml:space="preserve">Dial indicator on a magnetic base on a bolted steel plate, section 1e</w:t>
+            </w:r>
+          </w:p>
+        </w:tc>
+        <w:tc>
+          <w:tcPr/>
+          <w:p>
+            <w:pPr>
+              <w:pStyle w:val="Compact"/>
+            </w:pPr>
+            <w:r>
+              <w:t xml:space="preserve">none needed</w:t>
+            </w:r>
+          </w:p>
+        </w:tc>
+        <w:tc>
+          <w:tcPr/>
+          <w:p>
+            <w:pPr>
+              <w:pStyle w:val="Compact"/>
+            </w:pPr>
+            <w:r>
+              <w:t xml:space="preserve">$240 to $570</w:t>
+            </w:r>
+          </w:p>
+        </w:tc>
+        <w:tc>
+          <w:tcPr/>
+          <w:p>
+            <w:pPr>
+              <w:pStyle w:val="Compact"/>
+            </w:pPr>
+            <w:r>
+              <w:t xml:space="preserve">yes</w:t>
+            </w:r>
+          </w:p>
+        </w:tc>
+      </w:tr>
+    </w:tbl>
     <w:p>
       <w:pPr>
         <w:pStyle w:val="BodyText"/>
       </w:pPr>
       <w:r>
-        <w:t xml:space="preserve">Appendix A lists the software tools used in sections 4 to 8 and their options;</w:t>
-      </w:r>
-      <w:r>
-        <w:t xml:space="preserve"> </w:t>
-      </w:r>
-      <w:r>
-        <w:t xml:space="preserve">appendix B says how to install them.</w:t>
-      </w:r>
-    </w:p>
-    <w:bookmarkEnd w:id="9"/>
-    <w:bookmarkStart w:id="10" w:name="before-anything-else"/>
-    <w:p>
-      <w:pPr>
-        <w:pStyle w:val="Heading2"/>
-      </w:pPr>
-      <w:r>
-        <w:t xml:space="preserve">2. Before anything else</w:t>
+        <w:t xml:space="preserve">The rigid sensor mount is built from the existing drawing from previous work and is</w:t>
+      </w:r>
+      <w:r>
+        <w:t xml:space="preserve"> </w:t>
+      </w:r>
+      <w:r>
+        <w:t xml:space="preserve">not estimated here.</w:t>
+      </w:r>
+    </w:p>
+    <w:bookmarkEnd w:id="10"/>
+    <w:bookmarkStart w:id="11" w:name="c.-what-must-be-bought"/>
+    <w:p>
+      <w:pPr>
+        <w:pStyle w:val="Heading3"/>
+      </w:pPr>
+      <w:r>
+        <w:t xml:space="preserve">1c. What must be bought</w:t>
+      </w:r>
+    </w:p>
+    <w:tbl>
+      <w:tblPr>
+        <w:tblStyle w:val="Table"/>
+        <w:tblW w:type="pct" w:w="5000"/>
+        <w:tblLayout w:type="fixed"/>
+        <w:tblLook w:firstRow="1" w:lastRow="0" w:firstColumn="0" w:lastColumn="0" w:noHBand="0" w:noVBand="0" w:val="0020"/>
+      </w:tblPr>
+      <w:tblGrid>
+        <w:gridCol w:w="1980"/>
+        <w:gridCol w:w="1980"/>
+        <w:gridCol w:w="1980"/>
+        <w:gridCol w:w="1980"/>
+      </w:tblGrid>
+      <w:tr>
+        <w:trPr>
+          <w:tblHeader w:val="on"/>
+        </w:trPr>
+        <w:tc>
+          <w:tcPr/>
+          <w:p>
+            <w:pPr>
+              <w:pStyle w:val="Compact"/>
+            </w:pPr>
+            <w:r>
+              <w:t xml:space="preserve">Item</w:t>
+            </w:r>
+          </w:p>
+        </w:tc>
+        <w:tc>
+          <w:tcPr/>
+          <w:p>
+            <w:pPr>
+              <w:pStyle w:val="Compact"/>
+            </w:pPr>
+            <w:r>
+              <w:t xml:space="preserve">Purpose</w:t>
+            </w:r>
+          </w:p>
+        </w:tc>
+        <w:tc>
+          <w:tcPr/>
+          <w:p>
+            <w:pPr>
+              <w:pStyle w:val="Compact"/>
+            </w:pPr>
+            <w:r>
+              <w:t xml:space="preserve">Estimated cost (USD)</w:t>
+            </w:r>
+          </w:p>
+        </w:tc>
+        <w:tc>
+          <w:tcPr/>
+          <w:p>
+            <w:pPr>
+              <w:pStyle w:val="Compact"/>
+            </w:pPr>
+            <w:r>
+              <w:t xml:space="preserve">From stage 1</w:t>
+            </w:r>
+          </w:p>
+        </w:tc>
+      </w:tr>
+      <w:tr>
+        <w:tc>
+          <w:tcPr/>
+          <w:p>
+            <w:pPr>
+              <w:pStyle w:val="Compact"/>
+            </w:pPr>
+            <w:r>
+              <w:t xml:space="preserve">Calipers with depth rod, 150 mm</w:t>
+            </w:r>
+          </w:p>
+        </w:tc>
+        <w:tc>
+          <w:tcPr/>
+          <w:p>
+            <w:pPr>
+              <w:pStyle w:val="Compact"/>
+            </w:pPr>
+            <w:r>
+              <w:t xml:space="preserve">Board distance D; board size</w:t>
+            </w:r>
+          </w:p>
+        </w:tc>
+        <w:tc>
+          <w:tcPr/>
+          <w:p>
+            <w:pPr>
+              <w:pStyle w:val="Compact"/>
+            </w:pPr>
+            <w:r>
+              <w:t xml:space="preserve">$30 to $150</w:t>
+            </w:r>
+          </w:p>
+        </w:tc>
+        <w:tc>
+          <w:tcPr/>
+          <w:p>
+            <w:pPr>
+              <w:pStyle w:val="Compact"/>
+            </w:pPr>
+            <w:r>
+              <w:t xml:space="preserve">yes</w:t>
+            </w:r>
+          </w:p>
+        </w:tc>
+      </w:tr>
+      <w:tr>
+        <w:tc>
+          <w:tcPr/>
+          <w:p>
+            <w:pPr>
+              <w:pStyle w:val="Compact"/>
+            </w:pPr>
+            <w:r>
+              <w:t xml:space="preserve">Precision straightedge, 300 mm, and feeler gauges</w:t>
+            </w:r>
+          </w:p>
+        </w:tc>
+        <w:tc>
+          <w:tcPr/>
+          <w:p>
+            <w:pPr>
+              <w:pStyle w:val="Compact"/>
+            </w:pPr>
+            <w:r>
+              <w:t xml:space="preserve">Board flatness after painting and mounting</w:t>
+            </w:r>
+          </w:p>
+        </w:tc>
+        <w:tc>
+          <w:tcPr/>
+          <w:p>
+            <w:pPr>
+              <w:pStyle w:val="Compact"/>
+            </w:pPr>
+            <w:r>
+              <w:t xml:space="preserve">$75 to $240</w:t>
+            </w:r>
+          </w:p>
+        </w:tc>
+        <w:tc>
+          <w:tcPr/>
+          <w:p>
+            <w:pPr>
+              <w:pStyle w:val="Compact"/>
+            </w:pPr>
+            <w:r>
+              <w:t xml:space="preserve">yes</w:t>
+            </w:r>
+          </w:p>
+        </w:tc>
+      </w:tr>
+      <w:tr>
+        <w:tc>
+          <w:tcPr/>
+          <w:p>
+            <w:pPr>
+              <w:pStyle w:val="Compact"/>
+            </w:pPr>
+            <w:r>
+              <w:t xml:space="preserve">Thermometer</w:t>
+            </w:r>
+          </w:p>
+        </w:tc>
+        <w:tc>
+          <w:tcPr/>
+          <w:p>
+            <w:pPr>
+              <w:pStyle w:val="Compact"/>
+            </w:pPr>
+            <w:r>
+              <w:t xml:space="preserve">Room temperature in the session notes</w:t>
+            </w:r>
+          </w:p>
+        </w:tc>
+        <w:tc>
+          <w:tcPr/>
+          <w:p>
+            <w:pPr>
+              <w:pStyle w:val="Compact"/>
+            </w:pPr>
+            <w:r>
+              <w:t xml:space="preserve">$15 to $40</w:t>
+            </w:r>
+          </w:p>
+        </w:tc>
+        <w:tc>
+          <w:tcPr/>
+          <w:p>
+            <w:pPr>
+              <w:pStyle w:val="Compact"/>
+            </w:pPr>
+            <w:r>
+              <w:t xml:space="preserve">yes</w:t>
+            </w:r>
+          </w:p>
+        </w:tc>
+      </w:tr>
+      <w:tr>
+        <w:tc>
+          <w:tcPr/>
+          <w:p>
+            <w:pPr>
+              <w:pStyle w:val="Compact"/>
+            </w:pPr>
+            <w:r>
+              <w:t xml:space="preserve">Machinist’s square</w:t>
+            </w:r>
+          </w:p>
+        </w:tc>
+        <w:tc>
+          <w:tcPr/>
+          <w:p>
+            <w:pPr>
+              <w:pStyle w:val="Compact"/>
+            </w:pPr>
+            <w:r>
+              <w:t xml:space="preserve">Board x axis against the adapter when the tool frame is set</w:t>
+            </w:r>
+          </w:p>
+        </w:tc>
+        <w:tc>
+          <w:tcPr/>
+          <w:p>
+            <w:pPr>
+              <w:pStyle w:val="Compact"/>
+            </w:pPr>
+            <w:r>
+              <w:t xml:space="preserve">$30 to $80</w:t>
+            </w:r>
+          </w:p>
+        </w:tc>
+        <w:tc>
+          <w:tcPr/>
+          <w:p>
+            <w:pPr>
+              <w:pStyle w:val="Compact"/>
+            </w:pPr>
+            <w:r>
+              <w:t xml:space="preserve">yes</w:t>
+            </w:r>
+          </w:p>
+        </w:tc>
+      </w:tr>
+      <w:tr>
+        <w:tc>
+          <w:tcPr/>
+          <w:p>
+            <w:pPr>
+              <w:pStyle w:val="Compact"/>
+            </w:pPr>
+            <w:r>
+              <w:t xml:space="preserve">Consumables</w:t>
+            </w:r>
+          </w:p>
+        </w:tc>
+        <w:tc>
+          <w:tcPr/>
+          <w:p>
+            <w:pPr>
+              <w:pStyle w:val="Compact"/>
+            </w:pPr>
+            <w:r>
+              <w:t xml:space="preserve">Isopropyl alcohol and wipes, shim stock for the adapter</w:t>
+            </w:r>
+          </w:p>
+        </w:tc>
+        <w:tc>
+          <w:tcPr/>
+          <w:p>
+            <w:pPr>
+              <w:pStyle w:val="Compact"/>
+            </w:pPr>
+            <w:r>
+              <w:t xml:space="preserve">$20 to $60</w:t>
+            </w:r>
+          </w:p>
+        </w:tc>
+        <w:tc>
+          <w:tcPr/>
+          <w:p>
+            <w:pPr>
+              <w:pStyle w:val="Compact"/>
+            </w:pPr>
+            <w:r>
+              <w:t xml:space="preserve">no</w:t>
+            </w:r>
+          </w:p>
+        </w:tc>
+      </w:tr>
+      <w:tr>
+        <w:tc>
+          <w:tcPr/>
+          <w:p>
+            <w:pPr>
+              <w:pStyle w:val="Compact"/>
+            </w:pPr>
+            <w:r>
+              <w:t xml:space="preserve">Phone camera</w:t>
+            </w:r>
+          </w:p>
+        </w:tc>
+        <w:tc>
+          <w:tcPr/>
+          <w:p>
+            <w:pPr>
+              <w:pStyle w:val="Compact"/>
+            </w:pPr>
+            <w:r>
+              <w:t xml:space="preserve">Setup photos for the deliverables (section 9)</w:t>
+            </w:r>
+          </w:p>
+        </w:tc>
+        <w:tc>
+          <w:tcPr/>
+          <w:p>
+            <w:pPr>
+              <w:pStyle w:val="Compact"/>
+            </w:pPr>
+            <w:r>
+              <w:t xml:space="preserve">in hand</w:t>
+            </w:r>
+          </w:p>
+        </w:tc>
+        <w:tc>
+          <w:tcPr/>
+          <w:p>
+            <w:pPr>
+              <w:pStyle w:val="Compact"/>
+            </w:pPr>
+            <w:r>
+              <w:t xml:space="preserve">yes</w:t>
+            </w:r>
+          </w:p>
+        </w:tc>
+      </w:tr>
+    </w:tbl>
+    <w:p>
+      <w:pPr>
+        <w:pStyle w:val="BodyText"/>
+      </w:pPr>
+      <w:r>
+        <w:t xml:space="preserve">Cost estimates (October 2026): if the stage-1 session has been run, everything above is in hand and the new spending is $20 to $60 for consumables. Built from nothing, the items come to $540 to $1,570 to build and $170 to $570 to buy, $710 to $2,140 in all. The figures are the stage-1 procedure’s, from suppliers’ list prices where these exist (appendix A) and otherwise from typical United States job-shop rates of about $80 to $150 per hour. Treat them as plus or minus 50 percent and get quotes; the board adapter is the least certain figure.</w:t>
+      </w:r>
+    </w:p>
+    <w:bookmarkEnd w:id="11"/>
+    <w:bookmarkStart w:id="12" w:name="X019e8fbd185fb056ebd01e57421e0fb1812dcb4"/>
+    <w:p>
+      <w:pPr>
+        <w:pStyle w:val="Heading3"/>
+      </w:pPr>
+      <w:r>
+        <w:t xml:space="preserve">1d. Purchase specification for the flat plate</w:t>
+      </w:r>
+    </w:p>
+    <w:tbl>
+      <w:tblPr>
+        <w:tblStyle w:val="Table"/>
+        <w:tblW w:type="pct" w:w="5000"/>
+        <w:tblLayout w:type="fixed"/>
+        <w:tblLook w:firstRow="1" w:lastRow="0" w:firstColumn="0" w:lastColumn="0" w:noHBand="0" w:noVBand="0" w:val="0020"/>
+      </w:tblPr>
+      <w:tblGrid>
+        <w:gridCol w:w="3960"/>
+        <w:gridCol w:w="3960"/>
+      </w:tblGrid>
+      <w:tr>
+        <w:trPr>
+          <w:tblHeader w:val="on"/>
+        </w:trPr>
+        <w:tc>
+          <w:tcPr/>
+          <w:p>
+            <w:pPr>
+              <w:pStyle w:val="Compact"/>
+            </w:pPr>
+            <w:r>
+              <w:t xml:space="preserve">Requirement</w:t>
+            </w:r>
+          </w:p>
+        </w:tc>
+        <w:tc>
+          <w:tcPr/>
+          <w:p>
+            <w:pPr>
+              <w:pStyle w:val="Compact"/>
+            </w:pPr>
+            <w:r>
+              <w:t xml:space="preserve">Flat plate (board)</w:t>
+            </w:r>
+          </w:p>
+        </w:tc>
+      </w:tr>
+      <w:tr>
+        <w:tc>
+          <w:tcPr/>
+          <w:p>
+            <w:pPr>
+              <w:pStyle w:val="Compact"/>
+            </w:pPr>
+            <w:r>
+              <w:t xml:space="preserve">Size</w:t>
+            </w:r>
+          </w:p>
+        </w:tc>
+        <w:tc>
+          <w:tcPr/>
+          <w:p>
+            <w:pPr>
+              <w:pStyle w:val="Compact"/>
+            </w:pPr>
+            <w:r>
+              <w:t xml:space="preserve">200 x 150 mm, at least 6 mm thick</w:t>
+            </w:r>
+          </w:p>
+        </w:tc>
+      </w:tr>
+      <w:tr>
+        <w:tc>
+          <w:tcPr/>
+          <w:p>
+            <w:pPr>
+              <w:pStyle w:val="Compact"/>
+            </w:pPr>
+            <w:r>
+              <w:t xml:space="preserve">Material</w:t>
+            </w:r>
+          </w:p>
+        </w:tc>
+        <w:tc>
+          <w:tcPr/>
+          <w:p>
+            <w:pPr>
+              <w:pStyle w:val="Compact"/>
+            </w:pPr>
+            <w:r>
+              <w:t xml:space="preserve">Ground aluminum tooling plate (for example MIC-6, finish-ground) or float glass</w:t>
+            </w:r>
+          </w:p>
+        </w:tc>
+      </w:tr>
+      <w:tr>
+        <w:tc>
+          <w:tcPr/>
+          <w:p>
+            <w:pPr>
+              <w:pStyle w:val="Compact"/>
+            </w:pPr>
+            <w:r>
+              <w:t xml:space="preserve">Flatness</w:t>
+            </w:r>
+          </w:p>
+        </w:tc>
+        <w:tc>
+          <w:tcPr/>
+          <w:p>
+            <w:pPr>
+              <w:pStyle w:val="Compact"/>
+            </w:pPr>
+            <w:r>
+              <w:t xml:space="preserve">0.05 mm over the front face, checked with the straightedge and a 0.05 mm feeler leaf after painting and after mounting on the board adapter</w:t>
+            </w:r>
+          </w:p>
+        </w:tc>
+      </w:tr>
+      <w:tr>
+        <w:tc>
+          <w:tcPr/>
+          <w:p>
+            <w:pPr>
+              <w:pStyle w:val="Compact"/>
+            </w:pPr>
+            <w:r>
+              <w:t xml:space="preserve">Front face</w:t>
+            </w:r>
+          </w:p>
+        </w:tc>
+        <w:tc>
+          <w:tcPr/>
+          <w:p>
+            <w:pPr>
+              <w:pStyle w:val="Compact"/>
+            </w:pPr>
+            <w:r>
+              <w:t xml:space="preserve">Matte light-gray paint, thin and even; do not bead-blast a plate thinner than about 10 mm, since peening one face bows it. Thickness is not a stiffness matter (a 6 mm plate sags about 0.002 mm under its own weight); it only has to survive the finish and the mounting flat</w:t>
+            </w:r>
+          </w:p>
+        </w:tc>
+      </w:tr>
+      <w:tr>
+        <w:tc>
+          <w:tcPr/>
+          <w:p>
+            <w:pPr>
+              <w:pStyle w:val="Compact"/>
+            </w:pPr>
+            <w:r>
+              <w:t xml:space="preserve">Edges</w:t>
+            </w:r>
+          </w:p>
+        </w:tc>
+        <w:tc>
+          <w:tcPr/>
+          <w:p>
+            <w:pPr>
+              <w:pStyle w:val="Compact"/>
+            </w:pPr>
+            <w:r>
+              <w:t xml:space="preserve">Square and clean on the bottom long edge and the left short edge, which rest against the board adapter’s edge pins</w:t>
+            </w:r>
+          </w:p>
+        </w:tc>
+      </w:tr>
+      <w:tr>
+        <w:tc>
+          <w:tcPr/>
+          <w:p>
+            <w:pPr>
+              <w:pStyle w:val="Compact"/>
+            </w:pPr>
+            <w:r>
+              <w:t xml:space="preserve">Documents</w:t>
+            </w:r>
+          </w:p>
+        </w:tc>
+        <w:tc>
+          <w:tcPr/>
+          <w:p>
+            <w:pPr>
+              <w:pStyle w:val="Compact"/>
+            </w:pPr>
+            <w:r>
+              <w:t xml:space="preserve">Supplier’s flatness report, kept with the session notes</w:t>
+            </w:r>
+          </w:p>
+        </w:tc>
+      </w:tr>
+    </w:tbl>
+    <w:bookmarkEnd w:id="12"/>
+    <w:bookmarkStart w:id="13" w:name="X26fbebb3a0176b944eeefc2cd1106ade37b86a0"/>
+    <w:p>
+      <w:pPr>
+        <w:pStyle w:val="Heading3"/>
+      </w:pPr>
+      <w:r>
+        <w:t xml:space="preserve">1e. Run-out fixture: dial indicator and its mounting</w:t>
       </w:r>
     </w:p>
     <w:p>
@@ -666,237 +1516,73 @@
         <w:pStyle w:val="FirstParagraph"/>
       </w:pPr>
       <w:r>
-        <w:rPr>
-          <w:b/>
-          <w:bCs/>
-        </w:rPr>
-        <w:t xml:space="preserve">Words used throughout.</w:t>
-      </w:r>
-      <w:r>
-        <w:t xml:space="preserve"> </w:t>
-      </w:r>
-      <w:r>
-        <w:t xml:space="preserve">A</w:t>
-      </w:r>
-      <w:r>
-        <w:t xml:space="preserve"> </w:t>
-      </w:r>
-      <w:r>
-        <w:rPr>
-          <w:i/>
-          <w:iCs/>
-        </w:rPr>
-        <w:t xml:space="preserve">capture</w:t>
-      </w:r>
-      <w:r>
-        <w:t xml:space="preserve"> </w:t>
-      </w:r>
-      <w:r>
-        <w:t xml:space="preserve">is one shot of the sensor; it produces one</w:t>
-      </w:r>
-      <w:r>
-        <w:t xml:space="preserve"> </w:t>
-      </w:r>
-      <w:r>
-        <w:rPr>
-          <w:i/>
-          <w:iCs/>
-        </w:rPr>
-        <w:t xml:space="preserve">frame</w:t>
-      </w:r>
-      <w:r>
-        <w:t xml:space="preserve"> </w:t>
-      </w:r>
-      <w:r>
-        <w:t xml:space="preserve">of 3D points, stored as one</w:t>
-      </w:r>
-      <w:r>
-        <w:t xml:space="preserve"> </w:t>
-      </w:r>
-      <w:r>
-        <w:rPr>
-          <w:rStyle w:val="VerbatimChar"/>
-        </w:rPr>
-        <w:t xml:space="preserve">.mc</w:t>
-      </w:r>
-      <w:r>
-        <w:t xml:space="preserve"> </w:t>
-      </w:r>
-      <w:r>
-        <w:t xml:space="preserve">file. Several captures are taken at each</w:t>
-      </w:r>
-      <w:r>
-        <w:t xml:space="preserve"> </w:t>
-      </w:r>
-      <w:r>
-        <w:t xml:space="preserve">robot position without moving the robot (five per pose in the plan of section 5),</w:t>
-      </w:r>
-      <w:r>
-        <w:t xml:space="preserve"> </w:t>
-      </w:r>
-      <w:r>
-        <w:t xml:space="preserve">so one pose gives several files. A</w:t>
-      </w:r>
-      <w:r>
-        <w:t xml:space="preserve"> </w:t>
-      </w:r>
-      <w:r>
-        <w:rPr>
-          <w:i/>
-          <w:iCs/>
-        </w:rPr>
-        <w:t xml:space="preserve">pose</w:t>
-      </w:r>
-      <w:r>
-        <w:t xml:space="preserve"> </w:t>
-      </w:r>
-      <w:r>
-        <w:t xml:space="preserve">is one position and orientation of the</w:t>
-      </w:r>
-      <w:r>
-        <w:t xml:space="preserve"> </w:t>
-      </w:r>
-      <w:r>
-        <w:t xml:space="preserve">board; every pose has a short name, its</w:t>
-      </w:r>
-      <w:r>
-        <w:t xml:space="preserve"> </w:t>
-      </w:r>
-      <w:r>
-        <w:rPr>
-          <w:i/>
-          <w:iCs/>
-        </w:rPr>
-        <w:t xml:space="preserve">pose id</w:t>
-      </w:r>
-      <w:r>
-        <w:t xml:space="preserve"> </w:t>
-      </w:r>
-      <w:r>
-        <w:t xml:space="preserve">(for example</w:t>
-      </w:r>
-      <w:r>
-        <w:t xml:space="preserve"> </w:t>
-      </w:r>
-      <w:r>
-        <w:rPr>
-          <w:rStyle w:val="VerbatimChar"/>
-        </w:rPr>
-        <w:t xml:space="preserve">boot01</w:t>
-      </w:r>
-      <w:r>
-        <w:t xml:space="preserve"> </w:t>
-      </w:r>
-      <w:r>
-        <w:t xml:space="preserve">or</w:t>
-      </w:r>
-      <w:r>
-        <w:t xml:space="preserve"> </w:t>
-      </w:r>
-      <w:r>
-        <w:rPr>
-          <w:rStyle w:val="VerbatimChar"/>
-        </w:rPr>
-        <w:t xml:space="preserve">b_z0650_t24_a090_05</w:t>
-      </w:r>
-      <w:r>
-        <w:t xml:space="preserve">), which appears in the robot program, in the pose log and in</w:t>
-      </w:r>
-      <w:r>
-        <w:t xml:space="preserve"> </w:t>
-      </w:r>
-      <w:r>
-        <w:t xml:space="preserve">the file names. The board’s</w:t>
-      </w:r>
-      <w:r>
-        <w:t xml:space="preserve"> </w:t>
-      </w:r>
-      <w:r>
-        <w:rPr>
-          <w:i/>
-          <w:iCs/>
-        </w:rPr>
-        <w:t xml:space="preserve">normal</w:t>
-      </w:r>
-      <w:r>
-        <w:t xml:space="preserve"> </w:t>
-      </w:r>
-      <w:r>
-        <w:t xml:space="preserve">is the direction perpendicular to its front</w:t>
-      </w:r>
-      <w:r>
-        <w:t xml:space="preserve"> </w:t>
-      </w:r>
-      <w:r>
-        <w:t xml:space="preserve">face, pointing out of the face toward the sensor. The</w:t>
-      </w:r>
-      <w:r>
-        <w:t xml:space="preserve"> </w:t>
-      </w:r>
-      <w:r>
-        <w:rPr>
-          <w:i/>
-          <w:iCs/>
-        </w:rPr>
-        <w:t xml:space="preserve">pose log</w:t>
-      </w:r>
-      <w:r>
-        <w:t xml:space="preserve"> </w:t>
-      </w:r>
-      <w:r>
-        <w:t xml:space="preserve">is the text table in</w:t>
-      </w:r>
-      <w:r>
-        <w:t xml:space="preserve"> </w:t>
-      </w:r>
-      <w:r>
-        <w:t xml:space="preserve">which the robot program records the pose it reached (section 7), and the</w:t>
-      </w:r>
-      <w:r>
-        <w:t xml:space="preserve"> </w:t>
-      </w:r>
-      <w:r>
-        <w:rPr>
-          <w:i/>
-          <w:iCs/>
-        </w:rPr>
-        <w:t xml:space="preserve">manifest</w:t>
-      </w:r>
-      <w:r>
-        <w:t xml:space="preserve"> </w:t>
-      </w:r>
-      <w:r>
-        <w:t xml:space="preserve">is the table the software builds from the pose log and the capture files.</w:t>
-      </w:r>
-    </w:p>
-    <w:p>
-      <w:pPr>
-        <w:pStyle w:val="BodyText"/>
-      </w:pPr>
-      <w:r>
-        <w:rPr>
-          <w:b/>
-          <w:bCs/>
-        </w:rPr>
-        <w:t xml:space="preserve">The session folder.</w:t>
-      </w:r>
-      <w:r>
-        <w:t xml:space="preserve"> </w:t>
-      </w:r>
-      <w:r>
-        <w:t xml:space="preserve">Make one working folder for the session (for example</w:t>
-      </w:r>
-      <w:r>
-        <w:t xml:space="preserve"> </w:t>
-      </w:r>
-      <w:r>
-        <w:rPr>
-          <w:rStyle w:val="VerbatimChar"/>
-        </w:rPr>
-        <w:t xml:space="preserve">reg_2026-10-05/</w:t>
-      </w:r>
-      <w:r>
-        <w:t xml:space="preserve">) and keep everything in it:</w:t>
+        <w:t xml:space="preserve">The run-out check of section 3 needs the dial indicator held still while the robot</w:t>
+      </w:r>
+      <w:r>
+        <w:t xml:space="preserve"> </w:t>
+      </w:r>
+      <w:r>
+        <w:t xml:space="preserve">turns the board (figure 1). Use a dial indicator with 0.01 mm graduation and about</w:t>
+      </w:r>
+      <w:r>
+        <w:t xml:space="preserve"> </w:t>
+      </w:r>
+      <w:r>
+        <w:t xml:space="preserve">10 mm travel (for example Mitutoyo 2046 series, about $50 to $150) on an articulating</w:t>
+      </w:r>
+      <w:r>
+        <w:t xml:space="preserve"> </w:t>
+      </w:r>
+      <w:r>
+        <w:t xml:space="preserve">magnetic base with fine adjustment (for example Noga MG71003 or DG-61003, about $140</w:t>
+      </w:r>
+      <w:r>
+        <w:t xml:space="preserve"> </w:t>
+      </w:r>
+      <w:r>
+        <w:t xml:space="preserve">to $320). Stand the magnetic base on a steel base plate about 150 x 100 x 12 mm bolted</w:t>
+      </w:r>
+      <w:r>
+        <w:t xml:space="preserve"> </w:t>
+      </w:r>
+      <w:r>
+        <w:t xml:space="preserve">to the cell table with two M8 screws, so the base holds on a non-magnetic table and</w:t>
+      </w:r>
+      <w:r>
+        <w:t xml:space="preserve"> </w:t>
+      </w:r>
+      <w:r>
+        <w:t xml:space="preserve">does not creep. Place the plate where the indicator tip reaches the board’s front</w:t>
+      </w:r>
+      <w:r>
+        <w:t xml:space="preserve"> </w:t>
+      </w:r>
+      <w:r>
+        <w:t xml:space="preserve">face about 20 mm from an edge with the robot in its run-out pose. McMaster-Carr and</w:t>
+      </w:r>
+      <w:r>
+        <w:t xml:space="preserve"> </w:t>
+      </w:r>
+      <w:r>
+        <w:t xml:space="preserve">the usual tool suppliers stock all three items. The stage-1 fixture serves as it is.</w:t>
+      </w:r>
+    </w:p>
+    <w:bookmarkEnd w:id="13"/>
+    <w:bookmarkStart w:id="14" w:name="f.-preparation-before-the-first-session"/>
+    <w:p>
+      <w:pPr>
+        <w:pStyle w:val="Heading3"/>
+      </w:pPr>
+      <w:r>
+        <w:t xml:space="preserve">1f. Preparation before the first session</w:t>
+      </w:r>
+    </w:p>
+    <w:p>
+      <w:pPr>
+        <w:pStyle w:val="FirstParagraph"/>
+      </w:pPr>
+      <w:r>
+        <w:t xml:space="preserve">Robot:</w:t>
       </w:r>
     </w:p>
     <w:p>
@@ -908,16 +1594,13 @@
         </w:numPr>
       </w:pPr>
       <w:r>
-        <w:rPr>
-          <w:rStyle w:val="VerbatimChar"/>
-        </w:rPr>
-        <w:t xml:space="preserve">session_notes.txt</w:t>
-      </w:r>
-      <w:r>
-        <w:t xml:space="preserve"> </w:t>
-      </w:r>
-      <w:r>
-        <w:t xml:space="preserve">(below);</w:t>
+        <w:t xml:space="preserve">Check the robot’s documented absolute-accuracy specification: 0.1 mm or better</w:t>
+      </w:r>
+      <w:r>
+        <w:t xml:space="preserve"> </w:t>
+      </w:r>
+      <w:r>
+        <w:t xml:space="preserve">over the working volume.</w:t>
       </w:r>
     </w:p>
     <w:p>
@@ -929,46 +1612,13 @@
         </w:numPr>
       </w:pPr>
       <w:r>
-        <w:rPr>
-          <w:rStyle w:val="VerbatimChar"/>
-        </w:rPr>
-        <w:t xml:space="preserve">boot/</w:t>
-      </w:r>
-      <w:r>
-        <w:t xml:space="preserve"> </w:t>
-      </w:r>
-      <w:r>
-        <w:t xml:space="preserve">for the six captures of section 4, with</w:t>
-      </w:r>
-      <w:r>
-        <w:t xml:space="preserve"> </w:t>
-      </w:r>
-      <w:r>
-        <w:rPr>
-          <w:rStyle w:val="VerbatimChar"/>
-        </w:rPr>
-        <w:t xml:space="preserve">boot_pose_log.csv</w:t>
-      </w:r>
-      <w:r>
-        <w:t xml:space="preserve"> </w:t>
-      </w:r>
-      <w:r>
-        <w:t xml:space="preserve">and</w:t>
-      </w:r>
-      <w:r>
-        <w:t xml:space="preserve"> </w:t>
-      </w:r>
-      <w:r>
-        <w:rPr>
-          <w:rStyle w:val="VerbatimChar"/>
-        </w:rPr>
-        <w:t xml:space="preserve">boot.json</w:t>
-      </w:r>
-      <w:r>
-        <w:t xml:space="preserve"> </w:t>
-      </w:r>
-      <w:r>
-        <w:t xml:space="preserve">next to it;</w:t>
+        <w:t xml:space="preserve">Weigh the board with its adapter and enter its tool load data (mass and center of</w:t>
+      </w:r>
+      <w:r>
+        <w:t xml:space="preserve"> </w:t>
+      </w:r>
+      <w:r>
+        <w:t xml:space="preserve">gravity) in the controller; wrong load data shifts every pose.</w:t>
       </w:r>
     </w:p>
     <w:p>
@@ -980,16 +1630,70 @@
         </w:numPr>
       </w:pPr>
       <w:r>
-        <w:rPr>
-          <w:rStyle w:val="VerbatimChar"/>
-        </w:rPr>
-        <w:t xml:space="preserve">plan/</w:t>
-      </w:r>
-      <w:r>
-        <w:t xml:space="preserve"> </w:t>
-      </w:r>
-      <w:r>
-        <w:t xml:space="preserve">for the pose plan of section 5;</w:t>
+        <w:t xml:space="preserve">Write the robot program to the interface of sections 6 and 7: it reads</w:t>
+      </w:r>
+      <w:r>
+        <w:t xml:space="preserve"> </w:t>
+      </w:r>
+      <w:r>
+        <w:rPr>
+          <w:rStyle w:val="VerbatimChar"/>
+        </w:rPr>
+        <w:t xml:space="preserve">plan/poses.csv</w:t>
+      </w:r>
+      <w:r>
+        <w:t xml:space="preserve">, drives each pose in the way its sub-procedure requires, triggers</w:t>
+      </w:r>
+      <w:r>
+        <w:t xml:space="preserve"> </w:t>
+      </w:r>
+      <w:r>
+        <w:t xml:space="preserve">the captures through the capture computer’s communication software, and writes</w:t>
+      </w:r>
+      <w:r>
+        <w:t xml:space="preserve"> </w:t>
+      </w:r>
+      <w:r>
+        <w:rPr>
+          <w:rStyle w:val="VerbatimChar"/>
+        </w:rPr>
+        <w:t xml:space="preserve">pose_log_A.csv</w:t>
+      </w:r>
+      <w:r>
+        <w:t xml:space="preserve"> </w:t>
+      </w:r>
+      <w:r>
+        <w:t xml:space="preserve">and</w:t>
+      </w:r>
+      <w:r>
+        <w:t xml:space="preserve"> </w:t>
+      </w:r>
+      <w:r>
+        <w:rPr>
+          <w:rStyle w:val="VerbatimChar"/>
+        </w:rPr>
+        <w:t xml:space="preserve">pose_log_B.csv</w:t>
+      </w:r>
+      <w:r>
+        <w:t xml:space="preserve">. Note where the program writes the pose logs</w:t>
+      </w:r>
+      <w:r>
+        <w:t xml:space="preserve"> </w:t>
+      </w:r>
+      <w:r>
+        <w:t xml:space="preserve">(controller storage or a network location) so they can be collected after the</w:t>
+      </w:r>
+      <w:r>
+        <w:t xml:space="preserve"> </w:t>
+      </w:r>
+      <w:r>
+        <w:t xml:space="preserve">session. Once the robot model and controller are settled, the program can be</w:t>
+      </w:r>
+      <w:r>
+        <w:t xml:space="preserve"> </w:t>
+      </w:r>
+      <w:r>
+        <w:t xml:space="preserve">written with Claude Code.</w:t>
       </w:r>
     </w:p>
     <w:p>
@@ -1001,61 +1705,31 @@
         </w:numPr>
       </w:pPr>
       <w:r>
-        <w:rPr>
-          <w:rStyle w:val="VerbatimChar"/>
-        </w:rPr>
-        <w:t xml:space="preserve">captures_A/</w:t>
-      </w:r>
-      <w:r>
-        <w:t xml:space="preserve"> </w:t>
-      </w:r>
-      <w:r>
-        <w:t xml:space="preserve">and</w:t>
-      </w:r>
-      <w:r>
-        <w:t xml:space="preserve"> </w:t>
-      </w:r>
-      <w:r>
-        <w:rPr>
-          <w:rStyle w:val="VerbatimChar"/>
-        </w:rPr>
-        <w:t xml:space="preserve">captures_B/</w:t>
-      </w:r>
-      <w:r>
-        <w:t xml:space="preserve"> </w:t>
-      </w:r>
-      <w:r>
-        <w:t xml:space="preserve">for the two capture runs of section 6, with</w:t>
-      </w:r>
-      <w:r>
-        <w:t xml:space="preserve"> </w:t>
-      </w:r>
-      <w:r>
-        <w:rPr>
-          <w:rStyle w:val="VerbatimChar"/>
-        </w:rPr>
-        <w:t xml:space="preserve">pose_log_A.csv</w:t>
-      </w:r>
-      <w:r>
-        <w:t xml:space="preserve"> </w:t>
-      </w:r>
-      <w:r>
-        <w:t xml:space="preserve">and</w:t>
-      </w:r>
-      <w:r>
-        <w:t xml:space="preserve"> </w:t>
-      </w:r>
-      <w:r>
-        <w:rPr>
-          <w:rStyle w:val="VerbatimChar"/>
-        </w:rPr>
-        <w:t xml:space="preserve">pose_log_B.csv</w:t>
-      </w:r>
-      <w:r>
-        <w:t xml:space="preserve"> </w:t>
-      </w:r>
-      <w:r>
-        <w:t xml:space="preserve">next to them.</w:t>
+        <w:t xml:space="preserve">Dry-run every planned pose at reduced speed, without capturing, in both</w:t>
+      </w:r>
+      <w:r>
+        <w:t xml:space="preserve"> </w:t>
+      </w:r>
+      <w:r>
+        <w:t xml:space="preserve">sub-procedures: the straight moves of A and the approach-then-final moves of B. Each</w:t>
+      </w:r>
+      <w:r>
+        <w:t xml:space="preserve"> </w:t>
+      </w:r>
+      <w:r>
+        <w:t xml:space="preserve">pose must be reachable and must clear the sensor, its mount and its cables.</w:t>
+      </w:r>
+    </w:p>
+    <w:p>
+      <w:pPr>
+        <w:pStyle w:val="Compact"/>
+        <w:numPr>
+          <w:ilvl w:val="0"/>
+          <w:numId w:val="1001"/>
+        </w:numPr>
+      </w:pPr>
+      <w:r>
+        <w:t xml:space="preserve">Review the new program under the cell’s safety rules.</w:t>
       </w:r>
     </w:p>
     <w:p>
@@ -1063,133 +1737,401 @@
         <w:pStyle w:val="FirstParagraph"/>
       </w:pPr>
       <w:r>
-        <w:t xml:space="preserve">Every command in this document is typed in that folder and names files relative to</w:t>
-      </w:r>
-      <w:r>
-        <w:t xml:space="preserve"> </w:t>
-      </w:r>
-      <w:r>
-        <w:t xml:space="preserve">it.</w:t>
-      </w:r>
-    </w:p>
-    <w:p>
-      <w:pPr>
-        <w:pStyle w:val="BodyText"/>
+        <w:t xml:space="preserve">Sensor and computers:</w:t>
+      </w:r>
+    </w:p>
+    <w:p>
+      <w:pPr>
+        <w:pStyle w:val="Compact"/>
+        <w:numPr>
+          <w:ilvl w:val="0"/>
+          <w:numId w:val="1002"/>
+        </w:numPr>
+      </w:pPr>
+      <w:r>
+        <w:t xml:space="preserve">Set up the capture software for the robot’s trigger and the</w:t>
+      </w:r>
+      <w:r>
+        <w:t xml:space="preserve"> </w:t>
+      </w:r>
+      <w:r>
+        <w:rPr>
+          <w:rStyle w:val="VerbatimChar"/>
+        </w:rPr>
+        <w:t xml:space="preserve">&lt;pose_id&gt;_Index&lt;nn&gt;</w:t>
+      </w:r>
+      <w:r>
+        <w:t xml:space="preserve"> </w:t>
+      </w:r>
+      <w:r>
+        <w:t xml:space="preserve">file names (section 2); writing the robot pose into the file header is optional</w:t>
+      </w:r>
+      <w:r>
+        <w:t xml:space="preserve"> </w:t>
+      </w:r>
+      <w:r>
+        <w:t xml:space="preserve">(section 7).</w:t>
+      </w:r>
+    </w:p>
+    <w:p>
+      <w:pPr>
+        <w:pStyle w:val="Compact"/>
+        <w:numPr>
+          <w:ilvl w:val="0"/>
+          <w:numId w:val="1002"/>
+        </w:numPr>
+      </w:pPr>
+      <w:r>
+        <w:t xml:space="preserve">Choose and record the production exposure and gain, and the SGM (semi-global</w:t>
+      </w:r>
+      <w:r>
+        <w:t xml:space="preserve"> </w:t>
+      </w:r>
+      <w:r>
+        <w:t xml:space="preserve">matching) parameters: all smoothing filters off, and the patch size the same as in</w:t>
+      </w:r>
+      <w:r>
+        <w:t xml:space="preserve"> </w:t>
+      </w:r>
+      <w:r>
+        <w:t xml:space="preserve">installations. These are the stage-1 settings.</w:t>
+      </w:r>
+    </w:p>
+    <w:p>
+      <w:pPr>
+        <w:pStyle w:val="Compact"/>
+        <w:numPr>
+          <w:ilvl w:val="0"/>
+          <w:numId w:val="1002"/>
+        </w:numPr>
+      </w:pPr>
+      <w:r>
+        <w:t xml:space="preserve">Free at least 25 GB on the capture computer: the default plan is about 2,350</w:t>
+      </w:r>
+      <w:r>
+        <w:t xml:space="preserve"> </w:t>
+      </w:r>
+      <w:r>
+        <w:t xml:space="preserve">frames, at 10 GB per 1,000 frames.</w:t>
+      </w:r>
+    </w:p>
+    <w:p>
+      <w:pPr>
+        <w:pStyle w:val="Compact"/>
+        <w:numPr>
+          <w:ilvl w:val="0"/>
+          <w:numId w:val="1002"/>
+        </w:numPr>
+      </w:pPr>
+      <w:r>
+        <w:t xml:space="preserve">Install the two software packages on the analysis computer and pass the self-test</w:t>
+      </w:r>
+      <w:r>
+        <w:t xml:space="preserve"> </w:t>
+      </w:r>
+      <w:r>
+        <w:t xml:space="preserve">(appendix C).</w:t>
+      </w:r>
+    </w:p>
+    <w:p>
+      <w:pPr>
+        <w:pStyle w:val="FirstParagraph"/>
+      </w:pPr>
+      <w:r>
+        <w:t xml:space="preserve">Cell:</w:t>
+      </w:r>
+    </w:p>
+    <w:p>
+      <w:pPr>
+        <w:pStyle w:val="Compact"/>
+        <w:numPr>
+          <w:ilvl w:val="0"/>
+          <w:numId w:val="1003"/>
+        </w:numPr>
+      </w:pPr>
+      <w:r>
+        <w:t xml:space="preserve">Layout study: place the sensor so that board centers at 550 to 950 mm from it, over</w:t>
+      </w:r>
+      <w:r>
+        <w:t xml:space="preserve"> </w:t>
+      </w:r>
+      <w:r>
+        <w:t xml:space="preserve">half of its field of view and tilted up to 30 degrees in four directions (section</w:t>
+      </w:r>
+      <w:r>
+        <w:t xml:space="preserve"> </w:t>
+      </w:r>
+      <w:r>
+        <w:t xml:space="preserve">5), lie inside the robot’s reach, and so that the 40 mm approach retreat of</w:t>
+      </w:r>
+      <w:r>
+        <w:t xml:space="preserve"> </w:t>
+      </w:r>
+      <w:r>
+        <w:t xml:space="preserve">sub-procedure B stays clear of the sensor; do this before the sensor mount is</w:t>
+      </w:r>
+      <w:r>
+        <w:t xml:space="preserve"> </w:t>
+      </w:r>
+      <w:r>
+        <w:t xml:space="preserve">fixed.</w:t>
+      </w:r>
+    </w:p>
+    <w:p>
+      <w:pPr>
+        <w:pStyle w:val="Compact"/>
+        <w:numPr>
+          <w:ilvl w:val="0"/>
+          <w:numId w:val="1003"/>
+        </w:numPr>
+      </w:pPr>
+      <w:r>
+        <w:t xml:space="preserve">Bolt the run-out base plate to the cell table (two M8) where section 1e says.</w:t>
+      </w:r>
+    </w:p>
+    <w:p>
+      <w:pPr>
+        <w:pStyle w:val="Compact"/>
+        <w:numPr>
+          <w:ilvl w:val="0"/>
+          <w:numId w:val="1003"/>
+        </w:numPr>
+      </w:pPr>
+      <w:r>
+        <w:t xml:space="preserve">Identify and record the robot base frame used for the session.</w:t>
+      </w:r>
+    </w:p>
+    <w:p>
+      <w:pPr>
+        <w:pStyle w:val="FirstParagraph"/>
+      </w:pPr>
+      <w:r>
+        <w:t xml:space="preserve">Appendix B lists the software tools used in sections 4 to 8 and their options;</w:t>
+      </w:r>
+      <w:r>
+        <w:t xml:space="preserve"> </w:t>
+      </w:r>
+      <w:r>
+        <w:t xml:space="preserve">appendix C says how to install them.</w:t>
+      </w:r>
+    </w:p>
+    <w:bookmarkEnd w:id="14"/>
+    <w:bookmarkEnd w:id="15"/>
+    <w:bookmarkStart w:id="16" w:name="before-anything-else"/>
+    <w:p>
+      <w:pPr>
+        <w:pStyle w:val="Heading2"/>
+      </w:pPr>
+      <w:r>
+        <w:t xml:space="preserve">2. Before anything else</w:t>
+      </w:r>
+    </w:p>
+    <w:p>
+      <w:pPr>
+        <w:pStyle w:val="FirstParagraph"/>
       </w:pPr>
       <w:r>
         <w:rPr>
           <w:b/>
           <w:bCs/>
         </w:rPr>
-        <w:t xml:space="preserve">File names.</w:t>
-      </w:r>
-      <w:r>
-        <w:t xml:space="preserve"> </w:t>
-      </w:r>
-      <w:r>
-        <w:t xml:space="preserve">Each capture file must be named</w:t>
-      </w:r>
-      <w:r>
-        <w:t xml:space="preserve"> </w:t>
-      </w:r>
-      <w:r>
-        <w:rPr>
-          <w:rStyle w:val="VerbatimChar"/>
-        </w:rPr>
-        <w:t xml:space="preserve">&lt;pose_id&gt;_Index&lt;nn&gt;.mc</w:t>
-      </w:r>
-      <w:r>
-        <w:t xml:space="preserve">, where</w:t>
-      </w:r>
-      <w:r>
-        <w:t xml:space="preserve"> </w:t>
-      </w:r>
-      <w:r>
-        <w:rPr>
-          <w:rStyle w:val="VerbatimChar"/>
-        </w:rPr>
-        <w:t xml:space="preserve">pose_id</w:t>
-      </w:r>
-      <w:r>
-        <w:t xml:space="preserve"> </w:t>
-      </w:r>
-      <w:r>
-        <w:t xml:space="preserve">is the id of the pose it was taken at and</w:t>
-      </w:r>
-      <w:r>
-        <w:t xml:space="preserve"> </w:t>
-      </w:r>
-      <w:r>
-        <w:rPr>
-          <w:rStyle w:val="VerbatimChar"/>
-        </w:rPr>
-        <w:t xml:space="preserve">nn</w:t>
-      </w:r>
-      <w:r>
-        <w:t xml:space="preserve"> </w:t>
-      </w:r>
-      <w:r>
-        <w:t xml:space="preserve">counts the frames of that</w:t>
-      </w:r>
-      <w:r>
-        <w:t xml:space="preserve"> </w:t>
-      </w:r>
-      <w:r>
-        <w:t xml:space="preserve">pose from 00 (</w:t>
-      </w:r>
-      <w:r>
-        <w:rPr>
-          <w:rStyle w:val="VerbatimChar"/>
-        </w:rPr>
-        <w:t xml:space="preserve">boot01_Index00.mc</w:t>
-      </w:r>
-      <w:r>
-        <w:t xml:space="preserve">;</w:t>
-      </w:r>
-      <w:r>
-        <w:t xml:space="preserve"> </w:t>
-      </w:r>
-      <w:r>
-        <w:rPr>
-          <w:rStyle w:val="VerbatimChar"/>
-        </w:rPr>
-        <w:t xml:space="preserve">b_z0650_t24_a090_05_Index00.mc</w:t>
-      </w:r>
-      <w:r>
-        <w:t xml:space="preserve"> </w:t>
-      </w:r>
-      <w:r>
-        <w:t xml:space="preserve">to</w:t>
-      </w:r>
-      <w:r>
-        <w:t xml:space="preserve"> </w:t>
-      </w:r>
-      <w:r>
-        <w:rPr>
-          <w:rStyle w:val="VerbatimChar"/>
-        </w:rPr>
-        <w:t xml:space="preserve">..._Index04.mc</w:t>
-      </w:r>
-      <w:r>
-        <w:t xml:space="preserve">). Set the capture software’s file-name prefix to the pose id</w:t>
-      </w:r>
-      <w:r>
-        <w:t xml:space="preserve"> </w:t>
-      </w:r>
-      <w:r>
-        <w:t xml:space="preserve">before each pose, or, if the software insists on its own names, rename the files</w:t>
-      </w:r>
-      <w:r>
-        <w:t xml:space="preserve"> </w:t>
-      </w:r>
-      <w:r>
-        <w:t xml:space="preserve">afterwards, before building the manifest. A file that is not named this way cannot</w:t>
-      </w:r>
-      <w:r>
-        <w:t xml:space="preserve"> </w:t>
-      </w:r>
-      <w:r>
-        <w:t xml:space="preserve">be matched to a pose and is left out.</w:t>
+        <w:t xml:space="preserve">Words used throughout.</w:t>
+      </w:r>
+      <w:r>
+        <w:t xml:space="preserve"> </w:t>
+      </w:r>
+      <w:r>
+        <w:t xml:space="preserve">A</w:t>
+      </w:r>
+      <w:r>
+        <w:t xml:space="preserve"> </w:t>
+      </w:r>
+      <w:r>
+        <w:rPr>
+          <w:i/>
+          <w:iCs/>
+        </w:rPr>
+        <w:t xml:space="preserve">capture</w:t>
+      </w:r>
+      <w:r>
+        <w:t xml:space="preserve"> </w:t>
+      </w:r>
+      <w:r>
+        <w:t xml:space="preserve">is one shot of the sensor; it produces one</w:t>
+      </w:r>
+      <w:r>
+        <w:t xml:space="preserve"> </w:t>
+      </w:r>
+      <w:r>
+        <w:rPr>
+          <w:i/>
+          <w:iCs/>
+        </w:rPr>
+        <w:t xml:space="preserve">frame</w:t>
+      </w:r>
+      <w:r>
+        <w:t xml:space="preserve"> </w:t>
+      </w:r>
+      <w:r>
+        <w:t xml:space="preserve">of 3D points, stored as one</w:t>
+      </w:r>
+      <w:r>
+        <w:t xml:space="preserve"> </w:t>
+      </w:r>
+      <w:r>
+        <w:rPr>
+          <w:rStyle w:val="VerbatimChar"/>
+        </w:rPr>
+        <w:t xml:space="preserve">.mc</w:t>
+      </w:r>
+      <w:r>
+        <w:t xml:space="preserve"> </w:t>
+      </w:r>
+      <w:r>
+        <w:t xml:space="preserve">file. Several captures are taken at each</w:t>
+      </w:r>
+      <w:r>
+        <w:t xml:space="preserve"> </w:t>
+      </w:r>
+      <w:r>
+        <w:t xml:space="preserve">robot position without moving the robot (five per pose in the plan of section 5),</w:t>
+      </w:r>
+      <w:r>
+        <w:t xml:space="preserve"> </w:t>
+      </w:r>
+      <w:r>
+        <w:t xml:space="preserve">so one pose gives several files. A</w:t>
+      </w:r>
+      <w:r>
+        <w:t xml:space="preserve"> </w:t>
+      </w:r>
+      <w:r>
+        <w:rPr>
+          <w:i/>
+          <w:iCs/>
+        </w:rPr>
+        <w:t xml:space="preserve">pose</w:t>
+      </w:r>
+      <w:r>
+        <w:t xml:space="preserve"> </w:t>
+      </w:r>
+      <w:r>
+        <w:t xml:space="preserve">is one position and orientation of the</w:t>
+      </w:r>
+      <w:r>
+        <w:t xml:space="preserve"> </w:t>
+      </w:r>
+      <w:r>
+        <w:t xml:space="preserve">board; every pose has a short name, its</w:t>
+      </w:r>
+      <w:r>
+        <w:t xml:space="preserve"> </w:t>
+      </w:r>
+      <w:r>
+        <w:rPr>
+          <w:i/>
+          <w:iCs/>
+        </w:rPr>
+        <w:t xml:space="preserve">pose id</w:t>
+      </w:r>
+      <w:r>
+        <w:t xml:space="preserve"> </w:t>
+      </w:r>
+      <w:r>
+        <w:t xml:space="preserve">(for example</w:t>
+      </w:r>
+      <w:r>
+        <w:t xml:space="preserve"> </w:t>
+      </w:r>
+      <w:r>
+        <w:rPr>
+          <w:rStyle w:val="VerbatimChar"/>
+        </w:rPr>
+        <w:t xml:space="preserve">boot01</w:t>
+      </w:r>
+      <w:r>
+        <w:t xml:space="preserve"> </w:t>
+      </w:r>
+      <w:r>
+        <w:t xml:space="preserve">or</w:t>
+      </w:r>
+      <w:r>
+        <w:t xml:space="preserve"> </w:t>
+      </w:r>
+      <w:r>
+        <w:rPr>
+          <w:rStyle w:val="VerbatimChar"/>
+        </w:rPr>
+        <w:t xml:space="preserve">b_z0650_t24_a090_05</w:t>
+      </w:r>
+      <w:r>
+        <w:t xml:space="preserve">), which appears in the robot program, in the pose log and in</w:t>
+      </w:r>
+      <w:r>
+        <w:t xml:space="preserve"> </w:t>
+      </w:r>
+      <w:r>
+        <w:t xml:space="preserve">the file names. The board’s</w:t>
+      </w:r>
+      <w:r>
+        <w:t xml:space="preserve"> </w:t>
+      </w:r>
+      <w:r>
+        <w:rPr>
+          <w:i/>
+          <w:iCs/>
+        </w:rPr>
+        <w:t xml:space="preserve">normal</w:t>
+      </w:r>
+      <w:r>
+        <w:t xml:space="preserve"> </w:t>
+      </w:r>
+      <w:r>
+        <w:t xml:space="preserve">is the direction perpendicular to its front</w:t>
+      </w:r>
+      <w:r>
+        <w:t xml:space="preserve"> </w:t>
+      </w:r>
+      <w:r>
+        <w:t xml:space="preserve">face, pointing out of the face toward the sensor. The</w:t>
+      </w:r>
+      <w:r>
+        <w:t xml:space="preserve"> </w:t>
+      </w:r>
+      <w:r>
+        <w:rPr>
+          <w:i/>
+          <w:iCs/>
+        </w:rPr>
+        <w:t xml:space="preserve">pose log</w:t>
+      </w:r>
+      <w:r>
+        <w:t xml:space="preserve"> </w:t>
+      </w:r>
+      <w:r>
+        <w:t xml:space="preserve">is the text table in</w:t>
+      </w:r>
+      <w:r>
+        <w:t xml:space="preserve"> </w:t>
+      </w:r>
+      <w:r>
+        <w:t xml:space="preserve">which the robot program records the pose it reached (section 7), and the</w:t>
+      </w:r>
+      <w:r>
+        <w:t xml:space="preserve"> </w:t>
+      </w:r>
+      <w:r>
+        <w:rPr>
+          <w:i/>
+          <w:iCs/>
+        </w:rPr>
+        <w:t xml:space="preserve">manifest</w:t>
+      </w:r>
+      <w:r>
+        <w:t xml:space="preserve"> </w:t>
+      </w:r>
+      <w:r>
+        <w:t xml:space="preserve">is the table the software builds from the pose log and the capture files.</w:t>
       </w:r>
     </w:p>
     <w:p>
@@ -1201,53 +2143,198 @@
           <w:b/>
           <w:bCs/>
         </w:rPr>
-        <w:t xml:space="preserve">Sensor.</w:t>
-      </w:r>
-      <w:r>
-        <w:t xml:space="preserve"> </w:t>
-      </w:r>
-      <w:r>
-        <w:t xml:space="preserve">Switch the sensor on and leave it running for at least 30 minutes before</w:t>
-      </w:r>
-      <w:r>
-        <w:t xml:space="preserve"> </w:t>
-      </w:r>
-      <w:r>
-        <w:t xml:space="preserve">the first capture, and leave it running for the whole session. Note the time it was</w:t>
-      </w:r>
-      <w:r>
-        <w:t xml:space="preserve"> </w:t>
-      </w:r>
-      <w:r>
-        <w:t xml:space="preserve">switched on.</w:t>
-      </w:r>
-    </w:p>
-    <w:p>
-      <w:pPr>
-        <w:pStyle w:val="BodyText"/>
-      </w:pPr>
-      <w:r>
-        <w:t xml:space="preserve">Fix the sensor’s exposure and gain to the values that will be used in production.</w:t>
-      </w:r>
-      <w:r>
-        <w:t xml:space="preserve"> </w:t>
-      </w:r>
-      <w:r>
-        <w:t xml:space="preserve">Write them down. Do not use automatic exposure.</w:t>
-      </w:r>
-    </w:p>
-    <w:p>
-      <w:pPr>
-        <w:pStyle w:val="BodyText"/>
-      </w:pPr>
-      <w:r>
-        <w:t xml:space="preserve">Switch off or block any sunlight or lamps that fall on the board. Room light is fine</w:t>
-      </w:r>
-      <w:r>
-        <w:t xml:space="preserve"> </w:t>
-      </w:r>
-      <w:r>
-        <w:t xml:space="preserve">if it is constant.</w:t>
+        <w:t xml:space="preserve">The session folder.</w:t>
+      </w:r>
+      <w:r>
+        <w:t xml:space="preserve"> </w:t>
+      </w:r>
+      <w:r>
+        <w:t xml:space="preserve">Make one working folder for the session (for example</w:t>
+      </w:r>
+      <w:r>
+        <w:t xml:space="preserve"> </w:t>
+      </w:r>
+      <w:r>
+        <w:rPr>
+          <w:rStyle w:val="VerbatimChar"/>
+        </w:rPr>
+        <w:t xml:space="preserve">reg_2026-10-05/</w:t>
+      </w:r>
+      <w:r>
+        <w:t xml:space="preserve">) and keep everything in it:</w:t>
+      </w:r>
+    </w:p>
+    <w:p>
+      <w:pPr>
+        <w:pStyle w:val="Compact"/>
+        <w:numPr>
+          <w:ilvl w:val="0"/>
+          <w:numId w:val="1004"/>
+        </w:numPr>
+      </w:pPr>
+      <w:r>
+        <w:rPr>
+          <w:rStyle w:val="VerbatimChar"/>
+        </w:rPr>
+        <w:t xml:space="preserve">session_notes.txt</w:t>
+      </w:r>
+      <w:r>
+        <w:t xml:space="preserve"> </w:t>
+      </w:r>
+      <w:r>
+        <w:t xml:space="preserve">(below);</w:t>
+      </w:r>
+    </w:p>
+    <w:p>
+      <w:pPr>
+        <w:pStyle w:val="Compact"/>
+        <w:numPr>
+          <w:ilvl w:val="0"/>
+          <w:numId w:val="1004"/>
+        </w:numPr>
+      </w:pPr>
+      <w:r>
+        <w:rPr>
+          <w:rStyle w:val="VerbatimChar"/>
+        </w:rPr>
+        <w:t xml:space="preserve">boot/</w:t>
+      </w:r>
+      <w:r>
+        <w:t xml:space="preserve"> </w:t>
+      </w:r>
+      <w:r>
+        <w:t xml:space="preserve">for the six captures of section 4, with</w:t>
+      </w:r>
+      <w:r>
+        <w:t xml:space="preserve"> </w:t>
+      </w:r>
+      <w:r>
+        <w:rPr>
+          <w:rStyle w:val="VerbatimChar"/>
+        </w:rPr>
+        <w:t xml:space="preserve">boot_pose_log.csv</w:t>
+      </w:r>
+      <w:r>
+        <w:t xml:space="preserve"> </w:t>
+      </w:r>
+      <w:r>
+        <w:t xml:space="preserve">and</w:t>
+      </w:r>
+      <w:r>
+        <w:t xml:space="preserve"> </w:t>
+      </w:r>
+      <w:r>
+        <w:rPr>
+          <w:rStyle w:val="VerbatimChar"/>
+        </w:rPr>
+        <w:t xml:space="preserve">boot.json</w:t>
+      </w:r>
+      <w:r>
+        <w:t xml:space="preserve"> </w:t>
+      </w:r>
+      <w:r>
+        <w:t xml:space="preserve">next to it;</w:t>
+      </w:r>
+    </w:p>
+    <w:p>
+      <w:pPr>
+        <w:pStyle w:val="Compact"/>
+        <w:numPr>
+          <w:ilvl w:val="0"/>
+          <w:numId w:val="1004"/>
+        </w:numPr>
+      </w:pPr>
+      <w:r>
+        <w:rPr>
+          <w:rStyle w:val="VerbatimChar"/>
+        </w:rPr>
+        <w:t xml:space="preserve">plan/</w:t>
+      </w:r>
+      <w:r>
+        <w:t xml:space="preserve"> </w:t>
+      </w:r>
+      <w:r>
+        <w:t xml:space="preserve">for the pose plan of section 5;</w:t>
+      </w:r>
+    </w:p>
+    <w:p>
+      <w:pPr>
+        <w:pStyle w:val="Compact"/>
+        <w:numPr>
+          <w:ilvl w:val="0"/>
+          <w:numId w:val="1004"/>
+        </w:numPr>
+      </w:pPr>
+      <w:r>
+        <w:rPr>
+          <w:rStyle w:val="VerbatimChar"/>
+        </w:rPr>
+        <w:t xml:space="preserve">captures_A/</w:t>
+      </w:r>
+      <w:r>
+        <w:t xml:space="preserve"> </w:t>
+      </w:r>
+      <w:r>
+        <w:t xml:space="preserve">and</w:t>
+      </w:r>
+      <w:r>
+        <w:t xml:space="preserve"> </w:t>
+      </w:r>
+      <w:r>
+        <w:rPr>
+          <w:rStyle w:val="VerbatimChar"/>
+        </w:rPr>
+        <w:t xml:space="preserve">captures_B/</w:t>
+      </w:r>
+      <w:r>
+        <w:t xml:space="preserve"> </w:t>
+      </w:r>
+      <w:r>
+        <w:t xml:space="preserve">for the two capture runs of section 6, with</w:t>
+      </w:r>
+      <w:r>
+        <w:t xml:space="preserve"> </w:t>
+      </w:r>
+      <w:r>
+        <w:rPr>
+          <w:rStyle w:val="VerbatimChar"/>
+        </w:rPr>
+        <w:t xml:space="preserve">pose_log_A.csv</w:t>
+      </w:r>
+      <w:r>
+        <w:t xml:space="preserve"> </w:t>
+      </w:r>
+      <w:r>
+        <w:t xml:space="preserve">and</w:t>
+      </w:r>
+      <w:r>
+        <w:t xml:space="preserve"> </w:t>
+      </w:r>
+      <w:r>
+        <w:rPr>
+          <w:rStyle w:val="VerbatimChar"/>
+        </w:rPr>
+        <w:t xml:space="preserve">pose_log_B.csv</w:t>
+      </w:r>
+      <w:r>
+        <w:t xml:space="preserve"> </w:t>
+      </w:r>
+      <w:r>
+        <w:t xml:space="preserve">next to them.</w:t>
+      </w:r>
+    </w:p>
+    <w:p>
+      <w:pPr>
+        <w:pStyle w:val="FirstParagraph"/>
+      </w:pPr>
+      <w:r>
+        <w:t xml:space="preserve">Every command in this document is typed in that folder and names files relative to</w:t>
+      </w:r>
+      <w:r>
+        <w:t xml:space="preserve"> </w:t>
+      </w:r>
+      <w:r>
+        <w:t xml:space="preserve">it.</w:t>
       </w:r>
     </w:p>
     <w:p>
@@ -1259,45 +2346,115 @@
           <w:b/>
           <w:bCs/>
         </w:rPr>
-        <w:t xml:space="preserve">Robot.</w:t>
-      </w:r>
-      <w:r>
-        <w:t xml:space="preserve"> </w:t>
-      </w:r>
-      <w:r>
-        <w:t xml:space="preserve">Confirm with the engineer what the robot base frame is (which frame the</w:t>
-      </w:r>
-      <w:r>
-        <w:t xml:space="preserve"> </w:t>
-      </w:r>
-      <w:r>
-        <w:t xml:space="preserve">robot’s position readout is in). Every pose in this procedure is recorded in that</w:t>
-      </w:r>
-      <w:r>
-        <w:t xml:space="preserve"> </w:t>
-      </w:r>
-      <w:r>
-        <w:t xml:space="preserve">frame. Do not change the active base frame during the session.</w:t>
-      </w:r>
-    </w:p>
-    <w:p>
-      <w:pPr>
-        <w:pStyle w:val="BodyText"/>
-      </w:pPr>
-      <w:r>
-        <w:t xml:space="preserve">Leave the controller’s backlash compensation (if it has such a setting) exactly as it</w:t>
-      </w:r>
-      <w:r>
-        <w:t xml:space="preserve"> </w:t>
-      </w:r>
-      <w:r>
-        <w:t xml:space="preserve">is in production, and write down what it is set to. Do not change it between the two</w:t>
-      </w:r>
-      <w:r>
-        <w:t xml:space="preserve"> </w:t>
-      </w:r>
-      <w:r>
-        <w:t xml:space="preserve">sub-procedures of section 6.</w:t>
+        <w:t xml:space="preserve">File names.</w:t>
+      </w:r>
+      <w:r>
+        <w:t xml:space="preserve"> </w:t>
+      </w:r>
+      <w:r>
+        <w:t xml:space="preserve">Each capture file must be named</w:t>
+      </w:r>
+      <w:r>
+        <w:t xml:space="preserve"> </w:t>
+      </w:r>
+      <w:r>
+        <w:rPr>
+          <w:rStyle w:val="VerbatimChar"/>
+        </w:rPr>
+        <w:t xml:space="preserve">&lt;pose_id&gt;_Index&lt;nn&gt;.mc</w:t>
+      </w:r>
+      <w:r>
+        <w:t xml:space="preserve">, where</w:t>
+      </w:r>
+      <w:r>
+        <w:t xml:space="preserve"> </w:t>
+      </w:r>
+      <w:r>
+        <w:rPr>
+          <w:rStyle w:val="VerbatimChar"/>
+        </w:rPr>
+        <w:t xml:space="preserve">pose_id</w:t>
+      </w:r>
+      <w:r>
+        <w:t xml:space="preserve"> </w:t>
+      </w:r>
+      <w:r>
+        <w:t xml:space="preserve">is the id of the pose it was taken at and</w:t>
+      </w:r>
+      <w:r>
+        <w:t xml:space="preserve"> </w:t>
+      </w:r>
+      <w:r>
+        <w:rPr>
+          <w:rStyle w:val="VerbatimChar"/>
+        </w:rPr>
+        <w:t xml:space="preserve">nn</w:t>
+      </w:r>
+      <w:r>
+        <w:t xml:space="preserve"> </w:t>
+      </w:r>
+      <w:r>
+        <w:t xml:space="preserve">counts the frames of that</w:t>
+      </w:r>
+      <w:r>
+        <w:t xml:space="preserve"> </w:t>
+      </w:r>
+      <w:r>
+        <w:t xml:space="preserve">pose from 00 (</w:t>
+      </w:r>
+      <w:r>
+        <w:rPr>
+          <w:rStyle w:val="VerbatimChar"/>
+        </w:rPr>
+        <w:t xml:space="preserve">boot01_Index00.mc</w:t>
+      </w:r>
+      <w:r>
+        <w:t xml:space="preserve">;</w:t>
+      </w:r>
+      <w:r>
+        <w:t xml:space="preserve"> </w:t>
+      </w:r>
+      <w:r>
+        <w:rPr>
+          <w:rStyle w:val="VerbatimChar"/>
+        </w:rPr>
+        <w:t xml:space="preserve">b_z0650_t24_a090_05_Index00.mc</w:t>
+      </w:r>
+      <w:r>
+        <w:t xml:space="preserve"> </w:t>
+      </w:r>
+      <w:r>
+        <w:t xml:space="preserve">to</w:t>
+      </w:r>
+      <w:r>
+        <w:t xml:space="preserve"> </w:t>
+      </w:r>
+      <w:r>
+        <w:rPr>
+          <w:rStyle w:val="VerbatimChar"/>
+        </w:rPr>
+        <w:t xml:space="preserve">..._Index04.mc</w:t>
+      </w:r>
+      <w:r>
+        <w:t xml:space="preserve">). Set the capture software’s file-name prefix to the pose id</w:t>
+      </w:r>
+      <w:r>
+        <w:t xml:space="preserve"> </w:t>
+      </w:r>
+      <w:r>
+        <w:t xml:space="preserve">before each pose, or, if the software insists on its own names, rename the files</w:t>
+      </w:r>
+      <w:r>
+        <w:t xml:space="preserve"> </w:t>
+      </w:r>
+      <w:r>
+        <w:t xml:space="preserve">afterwards, before building the manifest. A file that is not named this way cannot</w:t>
+      </w:r>
+      <w:r>
+        <w:t xml:space="preserve"> </w:t>
+      </w:r>
+      <w:r>
+        <w:t xml:space="preserve">be matched to a pose and is left out.</w:t>
       </w:r>
     </w:p>
     <w:p>
@@ -1309,40 +2466,65 @@
           <w:b/>
           <w:bCs/>
         </w:rPr>
-        <w:t xml:space="preserve">Session notes.</w:t>
-      </w:r>
-      <w:r>
-        <w:t xml:space="preserve"> </w:t>
-      </w:r>
-      <w:r>
-        <w:t xml:space="preserve">Record in a text file (</w:t>
-      </w:r>
-      <w:r>
-        <w:rPr>
-          <w:rStyle w:val="VerbatimChar"/>
-        </w:rPr>
-        <w:t xml:space="preserve">session_notes.txt</w:t>
-      </w:r>
-      <w:r>
-        <w:t xml:space="preserve">): date, sensor serial</w:t>
-      </w:r>
-      <w:r>
-        <w:t xml:space="preserve"> </w:t>
-      </w:r>
-      <w:r>
-        <w:t xml:space="preserve">number, exposure and gain, robot model and controller software version, the active</w:t>
-      </w:r>
-      <w:r>
-        <w:t xml:space="preserve"> </w:t>
-      </w:r>
-      <w:r>
-        <w:t xml:space="preserve">base frame name, the backlash compensation setting, the board certificate (flatness),</w:t>
-      </w:r>
-      <w:r>
-        <w:t xml:space="preserve"> </w:t>
-      </w:r>
-      <w:r>
-        <w:t xml:space="preserve">room temperature, and anything unusual.</w:t>
+        <w:t xml:space="preserve">Sensor.</w:t>
+      </w:r>
+      <w:r>
+        <w:t xml:space="preserve"> </w:t>
+      </w:r>
+      <w:r>
+        <w:t xml:space="preserve">Switch the sensor on and leave it running for at least 30 minutes before</w:t>
+      </w:r>
+      <w:r>
+        <w:t xml:space="preserve"> </w:t>
+      </w:r>
+      <w:r>
+        <w:t xml:space="preserve">the first capture, and leave it running for the whole session. Note the time it was</w:t>
+      </w:r>
+      <w:r>
+        <w:t xml:space="preserve"> </w:t>
+      </w:r>
+      <w:r>
+        <w:t xml:space="preserve">switched on.</w:t>
+      </w:r>
+    </w:p>
+    <w:p>
+      <w:pPr>
+        <w:pStyle w:val="BodyText"/>
+      </w:pPr>
+      <w:r>
+        <w:t xml:space="preserve">Fix the sensor’s exposure and gain to the values that will be used in production,</w:t>
+      </w:r>
+      <w:r>
+        <w:t xml:space="preserve"> </w:t>
+      </w:r>
+      <w:r>
+        <w:t xml:space="preserve">and set the SGM (semi-global matching) parameters as in stage 1: all smoothing filters</w:t>
+      </w:r>
+      <w:r>
+        <w:t xml:space="preserve"> </w:t>
+      </w:r>
+      <w:r>
+        <w:t xml:space="preserve">off, and the patch size the same as in installations. Write them down. Do not use</w:t>
+      </w:r>
+      <w:r>
+        <w:t xml:space="preserve"> </w:t>
+      </w:r>
+      <w:r>
+        <w:t xml:space="preserve">automatic exposure.</w:t>
+      </w:r>
+    </w:p>
+    <w:p>
+      <w:pPr>
+        <w:pStyle w:val="BodyText"/>
+      </w:pPr>
+      <w:r>
+        <w:t xml:space="preserve">Switch off or block any sunlight or lamps that fall on the board. Room light is fine</w:t>
+      </w:r>
+      <w:r>
+        <w:t xml:space="preserve"> </w:t>
+      </w:r>
+      <w:r>
+        <w:t xml:space="preserve">if it is constant.</w:t>
       </w:r>
     </w:p>
     <w:p>
@@ -1354,13 +2536,114 @@
           <w:b/>
           <w:bCs/>
         </w:rPr>
+        <w:t xml:space="preserve">Robot.</w:t>
+      </w:r>
+      <w:r>
+        <w:t xml:space="preserve"> </w:t>
+      </w:r>
+      <w:r>
+        <w:t xml:space="preserve">Confirm with the engineer what the robot base frame is (which frame the</w:t>
+      </w:r>
+      <w:r>
+        <w:t xml:space="preserve"> </w:t>
+      </w:r>
+      <w:r>
+        <w:t xml:space="preserve">robot’s position readout is in). Every pose in this procedure is recorded in that</w:t>
+      </w:r>
+      <w:r>
+        <w:t xml:space="preserve"> </w:t>
+      </w:r>
+      <w:r>
+        <w:t xml:space="preserve">frame. Do not change the active base frame during the session.</w:t>
+      </w:r>
+    </w:p>
+    <w:p>
+      <w:pPr>
+        <w:pStyle w:val="BodyText"/>
+      </w:pPr>
+      <w:r>
+        <w:t xml:space="preserve">Leave the controller’s backlash compensation (if it has such a setting) exactly as it</w:t>
+      </w:r>
+      <w:r>
+        <w:t xml:space="preserve"> </w:t>
+      </w:r>
+      <w:r>
+        <w:t xml:space="preserve">is in production, and write down what it is set to. Do not change it between the two</w:t>
+      </w:r>
+      <w:r>
+        <w:t xml:space="preserve"> </w:t>
+      </w:r>
+      <w:r>
+        <w:t xml:space="preserve">sub-procedures of section 6.</w:t>
+      </w:r>
+    </w:p>
+    <w:p>
+      <w:pPr>
+        <w:pStyle w:val="BodyText"/>
+      </w:pPr>
+      <w:r>
+        <w:rPr>
+          <w:b/>
+          <w:bCs/>
+        </w:rPr>
+        <w:t xml:space="preserve">Session notes.</w:t>
+      </w:r>
+      <w:r>
+        <w:t xml:space="preserve"> </w:t>
+      </w:r>
+      <w:r>
+        <w:t xml:space="preserve">Record in a text file (</w:t>
+      </w:r>
+      <w:r>
+        <w:rPr>
+          <w:rStyle w:val="VerbatimChar"/>
+        </w:rPr>
+        <w:t xml:space="preserve">session_notes.txt</w:t>
+      </w:r>
+      <w:r>
+        <w:t xml:space="preserve">): date, sensor serial</w:t>
+      </w:r>
+      <w:r>
+        <w:t xml:space="preserve"> </w:t>
+      </w:r>
+      <w:r>
+        <w:t xml:space="preserve">number, exposure, gain and SGM parameters, robot model and controller software</w:t>
+      </w:r>
+      <w:r>
+        <w:t xml:space="preserve"> </w:t>
+      </w:r>
+      <w:r>
+        <w:t xml:space="preserve">version, the active base frame name, where the robot program writes the pose logs,</w:t>
+      </w:r>
+      <w:r>
+        <w:t xml:space="preserve"> </w:t>
+      </w:r>
+      <w:r>
+        <w:t xml:space="preserve">the backlash compensation setting, the board certificate (flatness), room</w:t>
+      </w:r>
+      <w:r>
+        <w:t xml:space="preserve"> </w:t>
+      </w:r>
+      <w:r>
+        <w:t xml:space="preserve">temperature, and anything unusual.</w:t>
+      </w:r>
+    </w:p>
+    <w:p>
+      <w:pPr>
+        <w:pStyle w:val="BodyText"/>
+      </w:pPr>
+      <w:r>
+        <w:rPr>
+          <w:b/>
+          <w:bCs/>
+        </w:rPr>
         <w:t xml:space="preserve">Software.</w:t>
       </w:r>
       <w:r>
         <w:t xml:space="preserve"> </w:t>
       </w:r>
       <w:r>
-        <w:t xml:space="preserve">Before the first command of section 4, do appendix B once on the</w:t>
+        <w:t xml:space="preserve">Before the first command of section 4, do appendix C once on the</w:t>
       </w:r>
       <w:r>
         <w:t xml:space="preserve"> </w:t>
@@ -1378,7 +2661,7 @@
         <w:t xml:space="preserve"> </w:t>
       </w:r>
       <w:r>
-        <w:t xml:space="preserve">folder, with the environment of appendix B.4 active (the prompt starts with</w:t>
+        <w:t xml:space="preserve">folder, with the environment of appendix C.4 active (the prompt starts with</w:t>
       </w:r>
       <w:r>
         <w:t xml:space="preserve"> </w:t>
@@ -1540,7 +2823,7 @@
               <w:pStyle w:val="Compact"/>
             </w:pPr>
             <w:r>
-              <w:t xml:space="preserve">appendix B</w:t>
+              <w:t xml:space="preserve">appendix C</w:t>
             </w:r>
           </w:p>
         </w:tc>
@@ -1980,8 +3263,8 @@
         <w:t xml:space="preserve">options.</w:t>
       </w:r>
     </w:p>
-    <w:bookmarkEnd w:id="10"/>
-    <w:bookmarkStart w:id="14" w:name="mounting-the-board-and-its-tool-frame"/>
+    <w:bookmarkEnd w:id="16"/>
+    <w:bookmarkStart w:id="20" w:name="mounting-the-board-and-its-tool-frame"/>
     <w:p>
       <w:pPr>
         <w:pStyle w:val="Heading2"/>
@@ -2055,18 +3338,18 @@
           <wp:inline>
             <wp:extent cx="5334000" cy="1555750"/>
             <wp:effectExtent b="0" l="0" r="0" t="0"/>
-            <wp:docPr descr="mounting" title="" id="12" name="Picture"/>
+            <wp:docPr descr="mounting" title="" id="18" name="Picture"/>
             <a:graphic>
               <a:graphicData uri="http://schemas.openxmlformats.org/drawingml/2006/picture">
                 <pic:pic>
                   <pic:nvPicPr>
-                    <pic:cNvPr descr="figures/fig_mounting.png" id="13" name="Picture"/>
+                    <pic:cNvPr descr="figures/fig_mounting.png" id="19" name="Picture"/>
                     <pic:cNvPicPr>
                       <a:picLocks noChangeArrowheads="1" noChangeAspect="1"/>
                     </pic:cNvPicPr>
                   </pic:nvPicPr>
                   <pic:blipFill>
-                    <a:blip r:embed="rId11"/>
+                    <a:blip r:embed="rId17"/>
                     <a:stretch>
                       <a:fillRect/>
                     </a:stretch>
@@ -2144,7 +3427,7 @@
         <w:pStyle w:val="Compact"/>
         <w:numPr>
           <w:ilvl w:val="0"/>
-          <w:numId w:val="1002"/>
+          <w:numId w:val="1005"/>
         </w:numPr>
       </w:pPr>
       <w:r>
@@ -2156,7 +3439,7 @@
         <w:pStyle w:val="Compact"/>
         <w:numPr>
           <w:ilvl w:val="0"/>
-          <w:numId w:val="1002"/>
+          <w:numId w:val="1005"/>
         </w:numPr>
       </w:pPr>
       <w:r>
@@ -2192,7 +3475,7 @@
         <w:pStyle w:val="Compact"/>
         <w:numPr>
           <w:ilvl w:val="0"/>
-          <w:numId w:val="1002"/>
+          <w:numId w:val="1005"/>
         </w:numPr>
       </w:pPr>
       <w:r>
@@ -2216,7 +3499,7 @@
         <w:pStyle w:val="Compact"/>
         <w:numPr>
           <w:ilvl w:val="0"/>
-          <w:numId w:val="1002"/>
+          <w:numId w:val="1005"/>
         </w:numPr>
       </w:pPr>
       <w:r>
@@ -2234,7 +3517,7 @@
         <w:pStyle w:val="Compact"/>
         <w:numPr>
           <w:ilvl w:val="0"/>
-          <w:numId w:val="1002"/>
+          <w:numId w:val="1005"/>
         </w:numPr>
       </w:pPr>
       <w:r>
@@ -2294,7 +3577,7 @@
         <w:pStyle w:val="Compact"/>
         <w:numPr>
           <w:ilvl w:val="0"/>
-          <w:numId w:val="1002"/>
+          <w:numId w:val="1005"/>
         </w:numPr>
       </w:pPr>
       <w:r>
@@ -2366,8 +3649,8 @@
         <w:t xml:space="preserve">mix the two kinds of pose in one session.</w:t>
       </w:r>
     </w:p>
-    <w:bookmarkEnd w:id="14"/>
-    <w:bookmarkStart w:id="18" w:name="finding-where-the-sensor-is-rough"/>
+    <w:bookmarkEnd w:id="20"/>
+    <w:bookmarkStart w:id="24" w:name="finding-where-the-sensor-is-rough"/>
     <w:p>
       <w:pPr>
         <w:pStyle w:val="Heading2"/>
@@ -2591,18 +3874,18 @@
           <wp:inline>
             <wp:extent cx="5334000" cy="3692769"/>
             <wp:effectExtent b="0" l="0" r="0" t="0"/>
-            <wp:docPr descr="residuals" title="" id="16" name="Picture"/>
+            <wp:docPr descr="residuals" title="" id="22" name="Picture"/>
             <a:graphic>
               <a:graphicData uri="http://schemas.openxmlformats.org/drawingml/2006/picture">
                 <pic:pic>
                   <pic:nvPicPr>
-                    <pic:cNvPr descr="figures/fig_residuals.png" id="17" name="Picture"/>
+                    <pic:cNvPr descr="figures/fig_residuals.png" id="23" name="Picture"/>
                     <pic:cNvPicPr>
                       <a:picLocks noChangeArrowheads="1" noChangeAspect="1"/>
                     </pic:cNvPicPr>
                   </pic:nvPicPr>
                   <pic:blipFill>
-                    <a:blip r:embed="rId15"/>
+                    <a:blip r:embed="rId21"/>
                     <a:stretch>
                       <a:fillRect/>
                     </a:stretch>
@@ -2712,7 +3995,7 @@
         <w:pStyle w:val="Compact"/>
         <w:numPr>
           <w:ilvl w:val="0"/>
-          <w:numId w:val="1003"/>
+          <w:numId w:val="1006"/>
         </w:numPr>
       </w:pPr>
       <w:r>
@@ -2766,7 +4049,7 @@
         <w:pStyle w:val="Compact"/>
         <w:numPr>
           <w:ilvl w:val="0"/>
-          <w:numId w:val="1003"/>
+          <w:numId w:val="1006"/>
         </w:numPr>
       </w:pPr>
       <w:r>
@@ -2865,7 +4148,7 @@
         <w:pStyle w:val="Compact"/>
         <w:numPr>
           <w:ilvl w:val="0"/>
-          <w:numId w:val="1003"/>
+          <w:numId w:val="1006"/>
         </w:numPr>
       </w:pPr>
       <w:r>
@@ -2964,7 +4247,7 @@
         <w:pStyle w:val="Compact"/>
         <w:numPr>
           <w:ilvl w:val="0"/>
-          <w:numId w:val="1003"/>
+          <w:numId w:val="1006"/>
         </w:numPr>
       </w:pPr>
       <w:r>
@@ -3092,8 +4375,8 @@
         <w:t xml:space="preserve">is the rough sensor position; the next steps read it.</w:t>
       </w:r>
     </w:p>
-    <w:bookmarkEnd w:id="18"/>
-    <w:bookmarkStart w:id="22" w:name="the-pose-plan"/>
+    <w:bookmarkEnd w:id="24"/>
+    <w:bookmarkStart w:id="28" w:name="the-pose-plan"/>
     <w:p>
       <w:pPr>
         <w:pStyle w:val="Heading2"/>
@@ -3133,7 +4416,7 @@
         <w:pStyle w:val="Compact"/>
         <w:numPr>
           <w:ilvl w:val="0"/>
-          <w:numId w:val="1004"/>
+          <w:numId w:val="1007"/>
         </w:numPr>
       </w:pPr>
       <w:r>
@@ -3164,7 +4447,7 @@
         <w:pStyle w:val="Compact"/>
         <w:numPr>
           <w:ilvl w:val="0"/>
-          <w:numId w:val="1004"/>
+          <w:numId w:val="1007"/>
         </w:numPr>
       </w:pPr>
       <w:r>
@@ -3195,7 +4478,7 @@
         <w:pStyle w:val="Compact"/>
         <w:numPr>
           <w:ilvl w:val="0"/>
-          <w:numId w:val="1004"/>
+          <w:numId w:val="1007"/>
         </w:numPr>
       </w:pPr>
       <w:r>
@@ -3489,7 +4772,7 @@
         <w:pStyle w:val="Compact"/>
         <w:numPr>
           <w:ilvl w:val="0"/>
-          <w:numId w:val="1005"/>
+          <w:numId w:val="1008"/>
         </w:numPr>
       </w:pPr>
       <w:r>
@@ -3525,7 +4808,7 @@
         <w:pStyle w:val="Compact"/>
         <w:numPr>
           <w:ilvl w:val="0"/>
-          <w:numId w:val="1005"/>
+          <w:numId w:val="1008"/>
         </w:numPr>
       </w:pPr>
       <w:r>
@@ -3567,7 +4850,7 @@
         <w:pStyle w:val="Compact"/>
         <w:numPr>
           <w:ilvl w:val="0"/>
-          <w:numId w:val="1005"/>
+          <w:numId w:val="1008"/>
         </w:numPr>
       </w:pPr>
       <w:r>
@@ -3612,7 +4895,7 @@
         <w:pStyle w:val="Compact"/>
         <w:numPr>
           <w:ilvl w:val="0"/>
-          <w:numId w:val="1005"/>
+          <w:numId w:val="1008"/>
         </w:numPr>
       </w:pPr>
       <w:r>
@@ -4081,18 +5364,18 @@
           <wp:inline>
             <wp:extent cx="5334000" cy="2667000"/>
             <wp:effectExtent b="0" l="0" r="0" t="0"/>
-            <wp:docPr descr="plan" title="" id="20" name="Picture"/>
+            <wp:docPr descr="plan" title="" id="26" name="Picture"/>
             <a:graphic>
               <a:graphicData uri="http://schemas.openxmlformats.org/drawingml/2006/picture">
                 <pic:pic>
                   <pic:nvPicPr>
-                    <pic:cNvPr descr="figures/fig_plan_example.png" id="21" name="Picture"/>
+                    <pic:cNvPr descr="figures/fig_plan_example.png" id="27" name="Picture"/>
                     <pic:cNvPicPr>
                       <a:picLocks noChangeArrowheads="1" noChangeAspect="1"/>
                     </pic:cNvPicPr>
                   </pic:nvPicPr>
                   <pic:blipFill>
-                    <a:blip r:embed="rId19"/>
+                    <a:blip r:embed="rId25"/>
                     <a:stretch>
                       <a:fillRect/>
                     </a:stretch>
@@ -4901,8 +6184,8 @@
         <w:t xml:space="preserve">program, or import it directly if the controller can read CSV.</w:t>
       </w:r>
     </w:p>
-    <w:bookmarkEnd w:id="22"/>
-    <w:bookmarkStart w:id="26" w:name="the-two-sub-procedures"/>
+    <w:bookmarkEnd w:id="28"/>
+    <w:bookmarkStart w:id="32" w:name="the-two-sub-procedures"/>
     <w:p>
       <w:pPr>
         <w:pStyle w:val="Heading2"/>
@@ -4967,43 +6250,64 @@
         <w:t xml:space="preserve">the capture of 5 frames”</w:t>
       </w:r>
       <w:r>
-        <w:t xml:space="preserve">. How this is done depends on the capture software: by a</w:t>
-      </w:r>
-      <w:r>
-        <w:t xml:space="preserve"> </w:t>
-      </w:r>
-      <w:r>
-        <w:t xml:space="preserve">digital output of the robot wired to the capture computer, by a network command, or</w:t>
-      </w:r>
-      <w:r>
-        <w:t xml:space="preserve"> </w:t>
-      </w:r>
-      <w:r>
-        <w:t xml:space="preserve">by the operator pressing a key when the robot program shows a prompt and waits.</w:t>
-      </w:r>
-      <w:r>
-        <w:t xml:space="preserve"> </w:t>
-      </w:r>
-      <w:r>
-        <w:t xml:space="preserve">Any of the three is fine; what matters is that the capture is taken after the</w:t>
-      </w:r>
-      <w:r>
-        <w:t xml:space="preserve"> </w:t>
-      </w:r>
-      <w:r>
-        <w:t xml:space="preserve">settling wait, before the robot moves on, and that the file-name prefix for the</w:t>
-      </w:r>
-      <w:r>
-        <w:t xml:space="preserve"> </w:t>
-      </w:r>
-      <w:r>
-        <w:t xml:space="preserve">captures of that pose is the pose id (section 2). If the operator triggers by hand,</w:t>
-      </w:r>
-      <w:r>
-        <w:t xml:space="preserve"> </w:t>
-      </w:r>
-      <w:r>
-        <w:t xml:space="preserve">the program should wait for a confirmation before moving on.</w:t>
+        <w:t xml:space="preserve">. The robot program sends that trigger through the capture</w:t>
+      </w:r>
+      <w:r>
+        <w:t xml:space="preserve"> </w:t>
+      </w:r>
+      <w:r>
+        <w:t xml:space="preserve">computer’s communication software, the same path as in stage 1 (section 1f). The</w:t>
+      </w:r>
+      <w:r>
+        <w:t xml:space="preserve"> </w:t>
+      </w:r>
+      <w:r>
+        <w:t xml:space="preserve">capture is taken after the settling wait and before the robot moves on, and the</w:t>
+      </w:r>
+      <w:r>
+        <w:t xml:space="preserve"> </w:t>
+      </w:r>
+      <w:r>
+        <w:t xml:space="preserve">file-name prefix for the captures of that pose is the pose id (section 2). The</w:t>
+      </w:r>
+      <w:r>
+        <w:t xml:space="preserve"> </w:t>
+      </w:r>
+      <w:r>
+        <w:t xml:space="preserve">program is written before the first session (section 1f), once the robot model and</w:t>
+      </w:r>
+      <w:r>
+        <w:t xml:space="preserve"> </w:t>
+      </w:r>
+      <w:r>
+        <w:t xml:space="preserve">controller are settled; it can be written with Claude Code, because both sides of</w:t>
+      </w:r>
+      <w:r>
+        <w:t xml:space="preserve"> </w:t>
+      </w:r>
+      <w:r>
+        <w:t xml:space="preserve">its interface are fixed:</w:t>
+      </w:r>
+      <w:r>
+        <w:t xml:space="preserve"> </w:t>
+      </w:r>
+      <w:r>
+        <w:rPr>
+          <w:rStyle w:val="VerbatimChar"/>
+        </w:rPr>
+        <w:t xml:space="preserve">poses.csv</w:t>
+      </w:r>
+      <w:r>
+        <w:t xml:space="preserve"> </w:t>
+      </w:r>
+      <w:r>
+        <w:t xml:space="preserve">coming in (section 5), the trigger, and the pose</w:t>
+      </w:r>
+      <w:r>
+        <w:t xml:space="preserve"> </w:t>
+      </w:r>
+      <w:r>
+        <w:t xml:space="preserve">log going out (section 7).</w:t>
       </w:r>
     </w:p>
     <w:p>
@@ -5015,18 +6319,18 @@
           <wp:inline>
             <wp:extent cx="5334000" cy="2370666"/>
             <wp:effectExtent b="0" l="0" r="0" t="0"/>
-            <wp:docPr descr="approach" title="" id="24" name="Picture"/>
+            <wp:docPr descr="approach" title="" id="30" name="Picture"/>
             <a:graphic>
               <a:graphicData uri="http://schemas.openxmlformats.org/drawingml/2006/picture">
                 <pic:pic>
                   <pic:nvPicPr>
-                    <pic:cNvPr descr="figures/fig_approach.png" id="25" name="Picture"/>
+                    <pic:cNvPr descr="figures/fig_approach.png" id="31" name="Picture"/>
                     <pic:cNvPicPr>
                       <a:picLocks noChangeArrowheads="1" noChangeAspect="1"/>
                     </pic:cNvPicPr>
                   </pic:nvPicPr>
                   <pic:blipFill>
-                    <a:blip r:embed="rId23"/>
+                    <a:blip r:embed="rId29"/>
                     <a:stretch>
                       <a:fillRect/>
                     </a:stretch>
@@ -5137,7 +6441,7 @@
         <w:pStyle w:val="Compact"/>
         <w:numPr>
           <w:ilvl w:val="0"/>
-          <w:numId w:val="1006"/>
+          <w:numId w:val="1009"/>
         </w:numPr>
       </w:pPr>
       <w:r>
@@ -5149,7 +6453,7 @@
         <w:pStyle w:val="Compact"/>
         <w:numPr>
           <w:ilvl w:val="0"/>
-          <w:numId w:val="1006"/>
+          <w:numId w:val="1009"/>
         </w:numPr>
       </w:pPr>
       <w:r>
@@ -5161,11 +6465,11 @@
         <w:pStyle w:val="Compact"/>
         <w:numPr>
           <w:ilvl w:val="0"/>
-          <w:numId w:val="1006"/>
+          <w:numId w:val="1009"/>
         </w:numPr>
       </w:pPr>
       <w:r>
-        <w:t xml:space="preserve">Trigger the capture of 5 frames; file names</w:t>
+        <w:t xml:space="preserve">Trigger the capture of 5 frames through the communication software; file names</w:t>
       </w:r>
       <w:r>
         <w:t xml:space="preserve"> </w:t>
@@ -5212,7 +6516,7 @@
         <w:pStyle w:val="Compact"/>
         <w:numPr>
           <w:ilvl w:val="0"/>
-          <w:numId w:val="1006"/>
+          <w:numId w:val="1009"/>
         </w:numPr>
       </w:pPr>
       <w:r>
@@ -5251,7 +6555,7 @@
         <w:pStyle w:val="Compact"/>
         <w:numPr>
           <w:ilvl w:val="0"/>
-          <w:numId w:val="1006"/>
+          <w:numId w:val="1009"/>
         </w:numPr>
       </w:pPr>
       <w:r>
@@ -5379,7 +6683,7 @@
         <w:pStyle w:val="Compact"/>
         <w:numPr>
           <w:ilvl w:val="0"/>
-          <w:numId w:val="1007"/>
+          <w:numId w:val="1010"/>
         </w:numPr>
       </w:pPr>
       <w:r>
@@ -5391,7 +6695,7 @@
         <w:pStyle w:val="Compact"/>
         <w:numPr>
           <w:ilvl w:val="0"/>
-          <w:numId w:val="1007"/>
+          <w:numId w:val="1010"/>
         </w:numPr>
       </w:pPr>
       <w:r>
@@ -5403,7 +6707,7 @@
         <w:pStyle w:val="Compact"/>
         <w:numPr>
           <w:ilvl w:val="0"/>
-          <w:numId w:val="1007"/>
+          <w:numId w:val="1010"/>
         </w:numPr>
       </w:pPr>
       <w:r>
@@ -5457,7 +6761,7 @@
         <w:pStyle w:val="Compact"/>
         <w:numPr>
           <w:ilvl w:val="0"/>
-          <w:numId w:val="1007"/>
+          <w:numId w:val="1010"/>
         </w:numPr>
       </w:pPr>
       <w:r>
@@ -5469,11 +6773,17 @@
         <w:pStyle w:val="Compact"/>
         <w:numPr>
           <w:ilvl w:val="0"/>
-          <w:numId w:val="1007"/>
+          <w:numId w:val="1010"/>
         </w:numPr>
       </w:pPr>
       <w:r>
-        <w:t xml:space="preserve">Trigger the capture of 5 frames; file names as above, in the folder</w:t>
+        <w:t xml:space="preserve">Trigger the capture of 5 frames through the communication software; file names</w:t>
+      </w:r>
+      <w:r>
+        <w:t xml:space="preserve"> </w:t>
+      </w:r>
+      <w:r>
+        <w:t xml:space="preserve">as above, in the folder</w:t>
       </w:r>
       <w:r>
         <w:t xml:space="preserve"> </w:t>
@@ -5493,7 +6803,7 @@
         <w:pStyle w:val="Compact"/>
         <w:numPr>
           <w:ilvl w:val="0"/>
-          <w:numId w:val="1007"/>
+          <w:numId w:val="1010"/>
         </w:numPr>
       </w:pPr>
       <w:r>
@@ -5556,7 +6866,7 @@
         <w:pStyle w:val="Compact"/>
         <w:numPr>
           <w:ilvl w:val="0"/>
-          <w:numId w:val="1007"/>
+          <w:numId w:val="1010"/>
         </w:numPr>
       </w:pPr>
       <w:r>
@@ -5630,8 +6940,8 @@
         <w:t xml:space="preserve">checks.</w:t>
       </w:r>
     </w:p>
-    <w:bookmarkEnd w:id="26"/>
-    <w:bookmarkStart w:id="27" w:name="recording-the-poses-the-pose-log"/>
+    <w:bookmarkEnd w:id="32"/>
+    <w:bookmarkStart w:id="33" w:name="recording-the-poses-the-pose-log"/>
     <w:p>
       <w:pPr>
         <w:pStyle w:val="Heading2"/>
@@ -5741,7 +7051,7 @@
         <w:pStyle w:val="Compact"/>
         <w:numPr>
           <w:ilvl w:val="0"/>
-          <w:numId w:val="1008"/>
+          <w:numId w:val="1011"/>
         </w:numPr>
       </w:pPr>
       <w:r>
@@ -5804,7 +7114,7 @@
         <w:pStyle w:val="Compact"/>
         <w:numPr>
           <w:ilvl w:val="0"/>
-          <w:numId w:val="1008"/>
+          <w:numId w:val="1011"/>
         </w:numPr>
       </w:pPr>
       <w:r>
@@ -5846,7 +7156,7 @@
         <w:pStyle w:val="Compact"/>
         <w:numPr>
           <w:ilvl w:val="0"/>
-          <w:numId w:val="1008"/>
+          <w:numId w:val="1011"/>
         </w:numPr>
       </w:pPr>
       <w:r>
@@ -5876,7 +7186,7 @@
         <w:pStyle w:val="Compact"/>
         <w:numPr>
           <w:ilvl w:val="0"/>
-          <w:numId w:val="1008"/>
+          <w:numId w:val="1011"/>
         </w:numPr>
       </w:pPr>
       <w:r>
@@ -5918,7 +7228,7 @@
         <w:pStyle w:val="Compact"/>
         <w:numPr>
           <w:ilvl w:val="0"/>
-          <w:numId w:val="1008"/>
+          <w:numId w:val="1011"/>
         </w:numPr>
       </w:pPr>
       <w:r>
@@ -6011,7 +7321,7 @@
         <w:pStyle w:val="Compact"/>
         <w:numPr>
           <w:ilvl w:val="0"/>
-          <w:numId w:val="1008"/>
+          <w:numId w:val="1011"/>
         </w:numPr>
       </w:pPr>
       <w:r>
@@ -6604,8 +7914,8 @@
         <w:t xml:space="preserve">replace the pose log: the tools above read the log.</w:t>
       </w:r>
     </w:p>
-    <w:bookmarkEnd w:id="27"/>
-    <w:bookmarkStart w:id="28" w:name="X5519462675585d0256a3c46cb1261738cf187b2"/>
+    <w:bookmarkEnd w:id="33"/>
+    <w:bookmarkStart w:id="34" w:name="X5519462675585d0256a3c46cb1261738cf187b2"/>
     <w:p>
       <w:pPr>
         <w:pStyle w:val="Heading2"/>
@@ -6685,7 +7995,7 @@
         <w:pStyle w:val="Compact"/>
         <w:numPr>
           <w:ilvl w:val="0"/>
-          <w:numId w:val="1009"/>
+          <w:numId w:val="1012"/>
         </w:numPr>
       </w:pPr>
       <w:r>
@@ -6703,7 +8013,7 @@
         <w:pStyle w:val="Compact"/>
         <w:numPr>
           <w:ilvl w:val="0"/>
-          <w:numId w:val="1009"/>
+          <w:numId w:val="1012"/>
         </w:numPr>
       </w:pPr>
       <w:r>
@@ -6721,7 +8031,7 @@
         <w:pStyle w:val="Compact"/>
         <w:numPr>
           <w:ilvl w:val="0"/>
-          <w:numId w:val="1009"/>
+          <w:numId w:val="1012"/>
         </w:numPr>
       </w:pPr>
       <w:r>
@@ -6751,7 +8061,7 @@
         <w:pStyle w:val="Compact"/>
         <w:numPr>
           <w:ilvl w:val="0"/>
-          <w:numId w:val="1009"/>
+          <w:numId w:val="1012"/>
         </w:numPr>
       </w:pPr>
       <w:r>
@@ -6769,7 +8079,7 @@
         <w:pStyle w:val="Compact"/>
         <w:numPr>
           <w:ilvl w:val="0"/>
-          <w:numId w:val="1009"/>
+          <w:numId w:val="1012"/>
         </w:numPr>
       </w:pPr>
       <w:r>
@@ -6811,7 +8121,7 @@
         <w:pStyle w:val="Compact"/>
         <w:numPr>
           <w:ilvl w:val="0"/>
-          <w:numId w:val="1009"/>
+          <w:numId w:val="1012"/>
         </w:numPr>
       </w:pPr>
       <w:r>
@@ -6829,7 +8139,7 @@
         <w:pStyle w:val="Compact"/>
         <w:numPr>
           <w:ilvl w:val="0"/>
-          <w:numId w:val="1009"/>
+          <w:numId w:val="1012"/>
         </w:numPr>
       </w:pPr>
       <w:r>
@@ -6898,8 +8208,8 @@
         <w:t xml:space="preserve">it cannot read the manifest.</w:t>
       </w:r>
     </w:p>
-    <w:bookmarkEnd w:id="28"/>
-    <w:bookmarkStart w:id="29" w:name="deliverables-checklist"/>
+    <w:bookmarkEnd w:id="34"/>
+    <w:bookmarkStart w:id="35" w:name="deliverables-checklist"/>
     <w:p>
       <w:pPr>
         <w:pStyle w:val="Heading2"/>
@@ -6913,7 +8223,7 @@
         <w:pStyle w:val="Compact"/>
         <w:numPr>
           <w:ilvl w:val="0"/>
-          <w:numId w:val="1010"/>
+          <w:numId w:val="1013"/>
         </w:numPr>
       </w:pPr>
       <w:r>
@@ -6973,7 +8283,7 @@
         <w:pStyle w:val="Compact"/>
         <w:numPr>
           <w:ilvl w:val="0"/>
-          <w:numId w:val="1010"/>
+          <w:numId w:val="1013"/>
         </w:numPr>
       </w:pPr>
       <w:r>
@@ -7012,7 +8322,7 @@
         <w:pStyle w:val="Compact"/>
         <w:numPr>
           <w:ilvl w:val="0"/>
-          <w:numId w:val="1010"/>
+          <w:numId w:val="1013"/>
         </w:numPr>
       </w:pPr>
       <w:r>
@@ -7063,7 +8373,7 @@
         <w:pStyle w:val="Compact"/>
         <w:numPr>
           <w:ilvl w:val="0"/>
-          <w:numId w:val="1010"/>
+          <w:numId w:val="1013"/>
         </w:numPr>
       </w:pPr>
       <w:r>
@@ -7105,7 +8415,7 @@
         <w:pStyle w:val="Compact"/>
         <w:numPr>
           <w:ilvl w:val="0"/>
-          <w:numId w:val="1010"/>
+          <w:numId w:val="1013"/>
         </w:numPr>
       </w:pPr>
       <w:r>
@@ -7150,7 +8460,7 @@
         <w:pStyle w:val="Compact"/>
         <w:numPr>
           <w:ilvl w:val="0"/>
-          <w:numId w:val="1010"/>
+          <w:numId w:val="1013"/>
         </w:numPr>
       </w:pPr>
       <w:r>
@@ -7192,7 +8502,7 @@
         <w:pStyle w:val="Compact"/>
         <w:numPr>
           <w:ilvl w:val="0"/>
-          <w:numId w:val="1010"/>
+          <w:numId w:val="1013"/>
         </w:numPr>
       </w:pPr>
       <w:r>
@@ -7205,13 +8515,19 @@
         <w:t xml:space="preserve"> </w:t>
       </w:r>
       <w:r>
-        <w:t xml:space="preserve">with: sensor serial, warm-up time, exposure and gain, base</w:t>
-      </w:r>
-      <w:r>
-        <w:t xml:space="preserve"> </w:t>
-      </w:r>
-      <w:r>
-        <w:t xml:space="preserve">frame name, backlash compensation setting, board D and runout reading, whether the</w:t>
+        <w:t xml:space="preserve">with: sensor serial, warm-up time, exposure, gain and SGM</w:t>
+      </w:r>
+      <w:r>
+        <w:t xml:space="preserve"> </w:t>
+      </w:r>
+      <w:r>
+        <w:t xml:space="preserve">parameters, where the pose logs were written, base frame name, backlash</w:t>
+      </w:r>
+      <w:r>
+        <w:t xml:space="preserve"> </w:t>
+      </w:r>
+      <w:r>
+        <w:t xml:space="preserve">compensation setting, board D and runout reading, whether the</w:t>
       </w:r>
       <w:r>
         <w:t xml:space="preserve"> </w:t>
@@ -7237,7 +8553,7 @@
         <w:pStyle w:val="Compact"/>
         <w:numPr>
           <w:ilvl w:val="0"/>
-          <w:numId w:val="1010"/>
+          <w:numId w:val="1013"/>
         </w:numPr>
       </w:pPr>
       <w:r>
@@ -7250,8 +8566,8 @@
         <w:t xml:space="preserve">the board as the sensor sees it</w:t>
       </w:r>
     </w:p>
-    <w:bookmarkEnd w:id="29"/>
-    <w:bookmarkStart w:id="30" w:name="things-that-spoil-a-session"/>
+    <w:bookmarkEnd w:id="35"/>
+    <w:bookmarkStart w:id="36" w:name="things-that-spoil-a-session"/>
     <w:p>
       <w:pPr>
         <w:pStyle w:val="Heading2"/>
@@ -7265,7 +8581,7 @@
         <w:pStyle w:val="Compact"/>
         <w:numPr>
           <w:ilvl w:val="0"/>
-          <w:numId w:val="1011"/>
+          <w:numId w:val="1014"/>
         </w:numPr>
       </w:pPr>
       <w:r>
@@ -7283,7 +8599,7 @@
         <w:pStyle w:val="Compact"/>
         <w:numPr>
           <w:ilvl w:val="0"/>
-          <w:numId w:val="1011"/>
+          <w:numId w:val="1014"/>
         </w:numPr>
       </w:pPr>
       <w:r>
@@ -7301,7 +8617,7 @@
         <w:pStyle w:val="Compact"/>
         <w:numPr>
           <w:ilvl w:val="0"/>
-          <w:numId w:val="1011"/>
+          <w:numId w:val="1014"/>
         </w:numPr>
       </w:pPr>
       <w:r>
@@ -7313,7 +8629,7 @@
         <w:pStyle w:val="Compact"/>
         <w:numPr>
           <w:ilvl w:val="0"/>
-          <w:numId w:val="1011"/>
+          <w:numId w:val="1014"/>
         </w:numPr>
       </w:pPr>
       <w:r>
@@ -7331,7 +8647,7 @@
         <w:pStyle w:val="Compact"/>
         <w:numPr>
           <w:ilvl w:val="0"/>
-          <w:numId w:val="1011"/>
+          <w:numId w:val="1014"/>
         </w:numPr>
       </w:pPr>
       <w:r>
@@ -7349,7 +8665,7 @@
         <w:pStyle w:val="Compact"/>
         <w:numPr>
           <w:ilvl w:val="0"/>
-          <w:numId w:val="1011"/>
+          <w:numId w:val="1014"/>
         </w:numPr>
       </w:pPr>
       <w:r>
@@ -7373,7 +8689,7 @@
         <w:pStyle w:val="Compact"/>
         <w:numPr>
           <w:ilvl w:val="0"/>
-          <w:numId w:val="1011"/>
+          <w:numId w:val="1014"/>
         </w:numPr>
       </w:pPr>
       <w:r>
@@ -7397,21 +8713,21 @@
         <w:pStyle w:val="Compact"/>
         <w:numPr>
           <w:ilvl w:val="0"/>
-          <w:numId w:val="1011"/>
+          <w:numId w:val="1014"/>
         </w:numPr>
       </w:pPr>
       <w:r>
         <w:t xml:space="preserve">Mixing up the two pose logs, or capturing B into the A folder.</w:t>
       </w:r>
     </w:p>
-    <w:bookmarkEnd w:id="30"/>
-    <w:bookmarkStart w:id="31" w:name="appendix-a.-software-reference"/>
+    <w:bookmarkEnd w:id="36"/>
+    <w:bookmarkStart w:id="37" w:name="appendix-a.-suppliers"/>
     <w:p>
       <w:pPr>
         <w:pStyle w:val="Heading2"/>
       </w:pPr>
       <w:r>
-        <w:t xml:space="preserve">Appendix A. Software reference</w:t>
+        <w:t xml:space="preserve">Appendix A. Suppliers</w:t>
       </w:r>
     </w:p>
     <w:p>
@@ -7419,6 +8735,240 @@
         <w:pStyle w:val="FirstParagraph"/>
       </w:pPr>
       <w:r>
+        <w:t xml:space="preserve">This list was assembled from the suppliers’ web pages in October 2026, for the</w:t>
+      </w:r>
+      <w:r>
+        <w:t xml:space="preserve"> </w:t>
+      </w:r>
+      <w:r>
+        <w:t xml:space="preserve">stage-1 procedure, and is repeated here for the items this procedure uses. It is a</w:t>
+      </w:r>
+      <w:r>
+        <w:t xml:space="preserve"> </w:t>
+      </w:r>
+      <w:r>
+        <w:t xml:space="preserve">starting point, not an endorsement: confirm the flatness, the finish and the price</w:t>
+      </w:r>
+      <w:r>
+        <w:t xml:space="preserve"> </w:t>
+      </w:r>
+      <w:r>
+        <w:t xml:space="preserve">with the supplier before ordering, because catalogs change.</w:t>
+      </w:r>
+    </w:p>
+    <w:p>
+      <w:pPr>
+        <w:pStyle w:val="BodyText"/>
+      </w:pPr>
+      <w:r>
+        <w:t xml:space="preserve">Board:</w:t>
+      </w:r>
+    </w:p>
+    <w:p>
+      <w:pPr>
+        <w:pStyle w:val="Compact"/>
+        <w:numPr>
+          <w:ilvl w:val="0"/>
+          <w:numId w:val="1015"/>
+        </w:numPr>
+      </w:pPr>
+      <w:r>
+        <w:t xml:space="preserve">McMaster-Carr: MIC-6 cast aluminum tooling plate, sold with mill certificates and</w:t>
+      </w:r>
+      <w:r>
+        <w:t xml:space="preserve"> </w:t>
+      </w:r>
+      <w:r>
+        <w:t xml:space="preserve">a stated flatness (about 0.13 mm over the sheet for the thicknesses of interest).</w:t>
+      </w:r>
+      <w:r>
+        <w:t xml:space="preserve"> </w:t>
+      </w:r>
+      <w:r>
+        <w:t xml:space="preserve">That is coarser than the 0.05 mm asked for here, so order the plate oversize and</w:t>
+      </w:r>
+      <w:r>
+        <w:t xml:space="preserve"> </w:t>
+      </w:r>
+      <w:r>
+        <w:t xml:space="preserve">have a local grinding shop finish-grind the front face flat to 0.05 mm, then</w:t>
+      </w:r>
+      <w:r>
+        <w:t xml:space="preserve"> </w:t>
+      </w:r>
+      <w:r>
+        <w:t xml:space="preserve">matte-paint it (bead-blast only a plate 10 mm or thicker; peening one face of a</w:t>
+      </w:r>
+      <w:r>
+        <w:t xml:space="preserve"> </w:t>
+      </w:r>
+      <w:r>
+        <w:t xml:space="preserve">thinner plate bows it). Alternatively, ask the grinding shop for a flatness report</w:t>
+      </w:r>
+      <w:r>
+        <w:t xml:space="preserve"> </w:t>
+      </w:r>
+      <w:r>
+        <w:t xml:space="preserve">directly.</w:t>
+      </w:r>
+    </w:p>
+    <w:p>
+      <w:pPr>
+        <w:pStyle w:val="Compact"/>
+        <w:numPr>
+          <w:ilvl w:val="0"/>
+          <w:numId w:val="1015"/>
+        </w:numPr>
+      </w:pPr>
+      <w:r>
+        <w:t xml:space="preserve">Any float-glass or optical-flat supplier (Edmund Optics sells ground and polished</w:t>
+      </w:r>
+      <w:r>
+        <w:t xml:space="preserve"> </w:t>
+      </w:r>
+      <w:r>
+        <w:t xml:space="preserve">flats): a 6 to 10 mm float glass plate is flat to better than 0.05 mm over 200 mm</w:t>
+      </w:r>
+      <w:r>
+        <w:t xml:space="preserve"> </w:t>
+      </w:r>
+      <w:r>
+        <w:t xml:space="preserve">as delivered; it must be matte-painted on the front face and bonded or clamped to</w:t>
+      </w:r>
+      <w:r>
+        <w:t xml:space="preserve"> </w:t>
+      </w:r>
+      <w:r>
+        <w:t xml:space="preserve">the board adapter. Glass is the better choice when no grinding shop is at hand.</w:t>
+      </w:r>
+    </w:p>
+    <w:p>
+      <w:pPr>
+        <w:pStyle w:val="Compact"/>
+        <w:numPr>
+          <w:ilvl w:val="0"/>
+          <w:numId w:val="1015"/>
+        </w:numPr>
+      </w:pPr>
+      <w:r>
+        <w:t xml:space="preserve">A small granite surface plate (Starrett or Mitutoyo, grade A or AA) is flat to a</w:t>
+      </w:r>
+      <w:r>
+        <w:t xml:space="preserve"> </w:t>
+      </w:r>
+      <w:r>
+        <w:t xml:space="preserve">few micrometers but black and heavy; it works if the front is painted matte light</w:t>
+      </w:r>
+      <w:r>
+        <w:t xml:space="preserve"> </w:t>
+      </w:r>
+      <w:r>
+        <w:t xml:space="preserve">gray and the robot carries the weight (a 200 x 150 x 50 mm plate is about 4 kg).</w:t>
+      </w:r>
+    </w:p>
+    <w:p>
+      <w:pPr>
+        <w:pStyle w:val="FirstParagraph"/>
+      </w:pPr>
+      <w:r>
+        <w:t xml:space="preserve">Measuring instruments (section 1c), all stocked by McMaster-Carr, Transcat,</w:t>
+      </w:r>
+      <w:r>
+        <w:t xml:space="preserve"> </w:t>
+      </w:r>
+      <w:r>
+        <w:t xml:space="preserve">MSI-Viking and the usual tool suppliers:</w:t>
+      </w:r>
+    </w:p>
+    <w:p>
+      <w:pPr>
+        <w:pStyle w:val="Compact"/>
+        <w:numPr>
+          <w:ilvl w:val="0"/>
+          <w:numId w:val="1016"/>
+        </w:numPr>
+      </w:pPr>
+      <w:r>
+        <w:t xml:space="preserve">Dial indicator: Mitutoyo 2046 series, 0.01 mm graduation, 10 mm travel, about $50</w:t>
+      </w:r>
+      <w:r>
+        <w:t xml:space="preserve"> </w:t>
+      </w:r>
+      <w:r>
+        <w:t xml:space="preserve">to $150.</w:t>
+      </w:r>
+    </w:p>
+    <w:p>
+      <w:pPr>
+        <w:pStyle w:val="Compact"/>
+        <w:numPr>
+          <w:ilvl w:val="0"/>
+          <w:numId w:val="1016"/>
+        </w:numPr>
+      </w:pPr>
+      <w:r>
+        <w:t xml:space="preserve">Magnetic base: Noga MG71003 or DG-61003 with fine adjustment, about $140 to $320.</w:t>
+      </w:r>
+    </w:p>
+    <w:p>
+      <w:pPr>
+        <w:pStyle w:val="Compact"/>
+        <w:numPr>
+          <w:ilvl w:val="0"/>
+          <w:numId w:val="1016"/>
+        </w:numPr>
+      </w:pPr>
+      <w:r>
+        <w:t xml:space="preserve">Calipers with depth rod, 150 mm: Mitutoyo or Starrett, about $30 to $150.</w:t>
+      </w:r>
+    </w:p>
+    <w:p>
+      <w:pPr>
+        <w:pStyle w:val="Compact"/>
+        <w:numPr>
+          <w:ilvl w:val="0"/>
+          <w:numId w:val="1016"/>
+        </w:numPr>
+      </w:pPr>
+      <w:r>
+        <w:t xml:space="preserve">Straightedge: 300 mm, DIN 874 grade 0 or better, about $60 to $200; feeler gauge</w:t>
+      </w:r>
+      <w:r>
+        <w:t xml:space="preserve"> </w:t>
+      </w:r>
+      <w:r>
+        <w:t xml:space="preserve">set with a 0.05 mm leaf.</w:t>
+      </w:r>
+    </w:p>
+    <w:p>
+      <w:pPr>
+        <w:pStyle w:val="FirstParagraph"/>
+      </w:pPr>
+      <w:r>
+        <w:t xml:space="preserve">Machine shop: the board adapter and the run-out base plate (drawing SC1-05 in</w:t>
+      </w:r>
+      <w:r>
+        <w:t xml:space="preserve"> </w:t>
+      </w:r>
+      <w:r>
+        <w:t xml:space="preserve">appendix D for the adapter; the base plate is a plain drilled plate, section 1e).</w:t>
+      </w:r>
+    </w:p>
+    <w:bookmarkEnd w:id="37"/>
+    <w:bookmarkStart w:id="38" w:name="appendix-b.-software-reference"/>
+    <w:p>
+      <w:pPr>
+        <w:pStyle w:val="Heading2"/>
+      </w:pPr>
+      <w:r>
+        <w:t xml:space="preserve">Appendix B. Software reference</w:t>
+      </w:r>
+    </w:p>
+    <w:p>
+      <w:pPr>
+        <w:pStyle w:val="FirstParagraph"/>
+      </w:pPr>
+      <w:r>
         <w:t xml:space="preserve">The tools live in this repository under</w:t>
       </w:r>
       <w:r>
@@ -9364,14 +10914,14 @@
         <w:t xml:space="preserve">                       unit quaternions) as errors</w:t>
       </w:r>
     </w:p>
-    <w:bookmarkEnd w:id="31"/>
-    <w:bookmarkStart w:id="32" w:name="X3b77f225bf0e3dd8541e4ee02fd4c1c557d291a"/>
+    <w:bookmarkEnd w:id="38"/>
+    <w:bookmarkStart w:id="39" w:name="X55fa07073be7fe8e5902a88f1870747c627c989"/>
     <w:p>
       <w:pPr>
         <w:pStyle w:val="Heading2"/>
       </w:pPr>
       <w:r>
-        <w:t xml:space="preserve">Appendix B. Installing and running the software, step by step</w:t>
+        <w:t xml:space="preserve">Appendix C. Installing and running the software, step by step</w:t>
       </w:r>
     </w:p>
     <w:p>
@@ -9429,7 +10979,7 @@
         <w:pStyle w:val="BodyText"/>
       </w:pPr>
       <w:r>
-        <w:t xml:space="preserve">B.1 Install Python 3.10 or newer (stage-1 procedure, appendix C.1).</w:t>
+        <w:t xml:space="preserve">C.1 Install Python 3.10 or newer (stage-1 procedure, appendix C.1).</w:t>
       </w:r>
     </w:p>
     <w:p>
@@ -9437,7 +10987,7 @@
         <w:pStyle w:val="BodyText"/>
       </w:pPr>
       <w:r>
-        <w:t xml:space="preserve">B.2 Get the code: unzip the two archives the engineer sent, or clone the two</w:t>
+        <w:t xml:space="preserve">C.2 Get the code: unzip the two archives the engineer sent, or clone the two</w:t>
       </w:r>
       <w:r>
         <w:t xml:space="preserve"> </w:t>
@@ -9511,7 +11061,7 @@
         <w:pStyle w:val="BodyText"/>
       </w:pPr>
       <w:r>
-        <w:t xml:space="preserve">B.3 Open a terminal in</w:t>
+        <w:t xml:space="preserve">C.3 Open a terminal in</w:t>
       </w:r>
       <w:r>
         <w:t xml:space="preserve"> </w:t>
@@ -9591,7 +11141,7 @@
         <w:pStyle w:val="BodyText"/>
       </w:pPr>
       <w:r>
-        <w:t xml:space="preserve">B.4 Make a private Python environment and install both packages into it:</w:t>
+        <w:t xml:space="preserve">C.4 Make a private Python environment and install both packages into it:</w:t>
       </w:r>
     </w:p>
     <w:p>
@@ -9666,7 +11216,7 @@
         <w:pStyle w:val="BodyText"/>
       </w:pPr>
       <w:r>
-        <w:t xml:space="preserve">B.5 Run the self-test, still in</w:t>
+        <w:t xml:space="preserve">C.5 Run the self-test, still in</w:t>
       </w:r>
       <w:r>
         <w:t xml:space="preserve"> </w:t>
@@ -9753,7 +11303,7 @@
         <w:pStyle w:val="BodyText"/>
       </w:pPr>
       <w:r>
-        <w:t xml:space="preserve">B.6 Run the tools as</w:t>
+        <w:t xml:space="preserve">C.6 Run the tools as</w:t>
       </w:r>
       <w:r>
         <w:t xml:space="preserve"> </w:t>
@@ -9854,7 +11404,7 @@
         <w:pStyle w:val="BodyText"/>
       </w:pPr>
       <w:r>
-        <w:t xml:space="preserve">B.7 If something goes wrong: the stage-1 procedure’s appendix C.7 applies unchanged</w:t>
+        <w:t xml:space="preserve">C.7 If something goes wrong: the stage-1 procedure’s appendix C.7 applies unchanged</w:t>
       </w:r>
       <w:r>
         <w:t xml:space="preserve"> </w:t>
@@ -9896,8 +11446,361 @@
         <w:t xml:space="preserve">active or the install step was skipped).</w:t>
       </w:r>
     </w:p>
-    <w:bookmarkEnd w:id="32"/>
-    <w:bookmarkEnd w:id="33"/>
+    <w:bookmarkEnd w:id="39"/>
+    <w:bookmarkStart w:id="43" w:name="appendix-d.-shop-drawing"/>
+    <w:p>
+      <w:pPr>
+        <w:pStyle w:val="Heading2"/>
+      </w:pPr>
+      <w:r>
+        <w:t xml:space="preserve">Appendix D. Shop drawing</w:t>
+      </w:r>
+    </w:p>
+    <w:p>
+      <w:pPr>
+        <w:pStyle w:val="FirstParagraph"/>
+      </w:pPr>
+      <w:r>
+        <w:t xml:space="preserve">One drawing applies to this procedure: SC1-05, the board adapter, from the stage-1</w:t>
+      </w:r>
+      <w:r>
+        <w:t xml:space="preserve"> </w:t>
+      </w:r>
+      <w:r>
+        <w:t xml:space="preserve">procedure. It shows a plan view and an elevation in section, with every feature</w:t>
+      </w:r>
+      <w:r>
+        <w:t xml:space="preserve"> </w:t>
+      </w:r>
+      <w:r>
+        <w:t xml:space="preserve">dimensioned and toleranced, the material, the finish and the quantity. Its flange</w:t>
+      </w:r>
+      <w:r>
+        <w:t xml:space="preserve"> </w:t>
+      </w:r>
+      <w:r>
+        <w:t xml:space="preserve">interface follows ISO 9409-1-50-4-M6 (ISO 9409-1:1996, table 1: 50 mm pitch circle,</w:t>
+      </w:r>
+      <w:r>
+        <w:t xml:space="preserve"> </w:t>
+      </w:r>
+      <w:r>
+        <w:t xml:space="preserve">31.5 mm H7 centering recess, four M6, one 6 mm H7 pin hole on the pitch circle at</w:t>
+      </w:r>
+      <w:r>
+        <w:t xml:space="preserve"> </w:t>
+      </w:r>
+      <w:r>
+        <w:t xml:space="preserve">+Xm); confirm it against the chosen robot’s flange drawing before machining. The</w:t>
+      </w:r>
+      <w:r>
+        <w:t xml:space="preserve"> </w:t>
+      </w:r>
+      <w:r>
+        <w:t xml:space="preserve">rigid sensor mount is built from the existing drawing from previous work and is not</w:t>
+      </w:r>
+      <w:r>
+        <w:t xml:space="preserve"> </w:t>
+      </w:r>
+      <w:r>
+        <w:t xml:space="preserve">repeated here. The run-out fixture needs no drawing (section 1e).</w:t>
+      </w:r>
+    </w:p>
+    <w:p>
+      <w:pPr>
+        <w:pStyle w:val="BodyText"/>
+      </w:pPr>
+      <w:r>
+        <w:t xml:space="preserve">The drawing is generated by a script in the stage-1 repository</w:t>
+      </w:r>
+      <w:r>
+        <w:t xml:space="preserve"> </w:t>
+      </w:r>
+      <w:r>
+        <w:t xml:space="preserve">(</w:t>
+      </w:r>
+      <w:r>
+        <w:rPr>
+          <w:rStyle w:val="VerbatimChar"/>
+        </w:rPr>
+        <w:t xml:space="preserve">depth_calibration_from_spherical_target</w:t>
+      </w:r>
+      <w:r>
+        <w:t xml:space="preserve">, folder</w:t>
+      </w:r>
+      <w:r>
+        <w:t xml:space="preserve"> </w:t>
+      </w:r>
+      <w:r>
+        <w:rPr>
+          <w:rStyle w:val="VerbatimChar"/>
+        </w:rPr>
+        <w:t xml:space="preserve">docs/procedures/drawings/</w:t>
+      </w:r>
+      <w:r>
+        <w:t xml:space="preserve">;</w:t>
+      </w:r>
+      <w:r>
+        <w:t xml:space="preserve"> </w:t>
+      </w:r>
+      <w:r>
+        <w:t xml:space="preserve">regenerate with</w:t>
+      </w:r>
+      <w:r>
+        <w:t xml:space="preserve"> </w:t>
+      </w:r>
+      <w:r>
+        <w:rPr>
+          <w:rStyle w:val="VerbatimChar"/>
+        </w:rPr>
+        <w:t xml:space="preserve">python3 docs/procedures/drawings/make_all.py</w:t>
+      </w:r>
+      <w:r>
+        <w:t xml:space="preserve"> </w:t>
+      </w:r>
+      <w:r>
+        <w:t xml:space="preserve">there). The copy in</w:t>
+      </w:r>
+      <w:r>
+        <w:t xml:space="preserve"> </w:t>
+      </w:r>
+      <w:r>
+        <w:t xml:space="preserve">this repository,</w:t>
+      </w:r>
+      <w:r>
+        <w:t xml:space="preserve"> </w:t>
+      </w:r>
+      <w:r>
+        <w:rPr>
+          <w:rStyle w:val="VerbatimChar"/>
+        </w:rPr>
+        <w:t xml:space="preserve">docs/procedures/drawings/SC1-05_board_adapter.png</w:t>
+      </w:r>
+      <w:r>
+        <w:t xml:space="preserve">, is that output</w:t>
+      </w:r>
+      <w:r>
+        <w:t xml:space="preserve"> </w:t>
+      </w:r>
+      <w:r>
+        <w:t xml:space="preserve">and prints at full size; it is the copy to send to the shop. When the stage-1</w:t>
+      </w:r>
+      <w:r>
+        <w:t xml:space="preserve"> </w:t>
+      </w:r>
+      <w:r>
+        <w:t xml:space="preserve">drawing changes, copy the regenerated file here.</w:t>
+      </w:r>
+    </w:p>
+    <w:tbl>
+      <w:tblPr>
+        <w:tblStyle w:val="Table"/>
+        <w:tblW w:type="pct" w:w="5000"/>
+        <w:tblLayout w:type="fixed"/>
+        <w:tblLook w:firstRow="1" w:lastRow="0" w:firstColumn="0" w:lastColumn="0" w:noHBand="0" w:noVBand="0" w:val="0020"/>
+      </w:tblPr>
+      <w:tblGrid>
+        <w:gridCol w:w="1980"/>
+        <w:gridCol w:w="1980"/>
+        <w:gridCol w:w="1980"/>
+        <w:gridCol w:w="1980"/>
+      </w:tblGrid>
+      <w:tr>
+        <w:trPr>
+          <w:tblHeader w:val="on"/>
+        </w:trPr>
+        <w:tc>
+          <w:tcPr/>
+          <w:p>
+            <w:pPr>
+              <w:pStyle w:val="Compact"/>
+            </w:pPr>
+            <w:r>
+              <w:t xml:space="preserve">Drawing</w:t>
+            </w:r>
+          </w:p>
+        </w:tc>
+        <w:tc>
+          <w:tcPr/>
+          <w:p>
+            <w:pPr>
+              <w:pStyle w:val="Compact"/>
+            </w:pPr>
+            <w:r>
+              <w:t xml:space="preserve">Part</w:t>
+            </w:r>
+          </w:p>
+        </w:tc>
+        <w:tc>
+          <w:tcPr/>
+          <w:p>
+            <w:pPr>
+              <w:pStyle w:val="Compact"/>
+            </w:pPr>
+            <w:r>
+              <w:t xml:space="preserve">Quantity</w:t>
+            </w:r>
+          </w:p>
+        </w:tc>
+        <w:tc>
+          <w:tcPr/>
+          <w:p>
+            <w:pPr>
+              <w:pStyle w:val="Compact"/>
+            </w:pPr>
+            <w:r>
+              <w:t xml:space="preserve">File</w:t>
+            </w:r>
+          </w:p>
+        </w:tc>
+      </w:tr>
+      <w:tr>
+        <w:tc>
+          <w:tcPr/>
+          <w:p>
+            <w:pPr>
+              <w:pStyle w:val="Compact"/>
+            </w:pPr>
+            <w:r>
+              <w:t xml:space="preserve">SC1-05</w:t>
+            </w:r>
+          </w:p>
+        </w:tc>
+        <w:tc>
+          <w:tcPr/>
+          <w:p>
+            <w:pPr>
+              <w:pStyle w:val="Compact"/>
+            </w:pPr>
+            <w:r>
+              <w:t xml:space="preserve">Board adapter, with the board outline</w:t>
+            </w:r>
+          </w:p>
+        </w:tc>
+        <w:tc>
+          <w:tcPr/>
+          <w:p>
+            <w:pPr>
+              <w:pStyle w:val="Compact"/>
+            </w:pPr>
+            <w:r>
+              <w:t xml:space="preserve">1</w:t>
+            </w:r>
+          </w:p>
+        </w:tc>
+        <w:tc>
+          <w:tcPr/>
+          <w:p>
+            <w:pPr>
+              <w:pStyle w:val="Compact"/>
+            </w:pPr>
+            <w:r>
+              <w:rPr>
+                <w:rStyle w:val="VerbatimChar"/>
+              </w:rPr>
+              <w:t xml:space="preserve">drawings/SC1-05_board_adapter.png</w:t>
+            </w:r>
+          </w:p>
+        </w:tc>
+      </w:tr>
+    </w:tbl>
+    <w:p>
+      <w:pPr>
+        <w:pStyle w:val="BodyText"/>
+      </w:pPr>
+      <w:r>
+        <w:t xml:space="preserve">Points for the machine shop to confirm: the pin and pad positions carry the general</w:t>
+      </w:r>
+      <w:r>
+        <w:t xml:space="preserve"> </w:t>
+      </w:r>
+      <w:r>
+        <w:t xml:space="preserve">tolerance ISO 2768-mK, which is enough because the board’s position within its own</w:t>
+      </w:r>
+      <w:r>
+        <w:t xml:space="preserve"> </w:t>
+      </w:r>
+      <w:r>
+        <w:t xml:space="preserve">plane does not affect the registration; the flange-face-to-board-face distance D is</w:t>
+      </w:r>
+      <w:r>
+        <w:t xml:space="preserve"> </w:t>
+      </w:r>
+      <w:r>
+        <w:t xml:space="preserve">a formula of the board thickness, so the measured D of section 3 is what the robot</w:t>
+      </w:r>
+      <w:r>
+        <w:t xml:space="preserve"> </w:t>
+      </w:r>
+      <w:r>
+        <w:t xml:space="preserve">uses, not the drawing’s nominal.</w:t>
+      </w:r>
+    </w:p>
+    <w:p>
+      <w:pPr>
+        <w:pStyle w:val="CaptionedFigure"/>
+      </w:pPr>
+      <w:r>
+        <w:drawing>
+          <wp:inline>
+            <wp:extent cx="5334000" cy="3394363"/>
+            <wp:effectExtent b="0" l="0" r="0" t="0"/>
+            <wp:docPr descr="SC1-05" title="" id="41" name="Picture"/>
+            <a:graphic>
+              <a:graphicData uri="http://schemas.openxmlformats.org/drawingml/2006/picture">
+                <pic:pic>
+                  <pic:nvPicPr>
+                    <pic:cNvPr descr="drawings/SC1-05_board_adapter.png" id="42" name="Picture"/>
+                    <pic:cNvPicPr>
+                      <a:picLocks noChangeArrowheads="1" noChangeAspect="1"/>
+                    </pic:cNvPicPr>
+                  </pic:nvPicPr>
+                  <pic:blipFill>
+                    <a:blip r:embed="rId40"/>
+                    <a:stretch>
+                      <a:fillRect/>
+                    </a:stretch>
+                  </pic:blipFill>
+                  <pic:spPr bwMode="auto">
+                    <a:xfrm>
+                      <a:off x="0" y="0"/>
+                      <a:ext cx="5334000" cy="3394363"/>
+                    </a:xfrm>
+                    <a:prstGeom prst="rect">
+                      <a:avLst/>
+                    </a:prstGeom>
+                    <a:noFill/>
+                    <a:ln w="9525">
+                      <a:noFill/>
+                      <a:headEnd/>
+                      <a:tailEnd/>
+                    </a:ln>
+                  </pic:spPr>
+                </pic:pic>
+              </a:graphicData>
+            </a:graphic>
+          </wp:inline>
+        </w:drawing>
+      </w:r>
+    </w:p>
+    <w:p>
+      <w:pPr>
+        <w:pStyle w:val="ImageCaption"/>
+      </w:pPr>
+      <w:r>
+        <w:t xml:space="preserve">SC1-05</w:t>
+      </w:r>
+    </w:p>
+    <w:p>
+      <w:pPr>
+        <w:pStyle w:val="BodyText"/>
+      </w:pPr>
+      <w:r>
+        <w:t xml:space="preserve">Drawing SC1-05. Board adapter.</w:t>
+      </w:r>
+    </w:p>
+    <w:bookmarkEnd w:id="43"/>
+    <w:bookmarkEnd w:id="44"/>
     <w:sectPr>
       <w:footnotePr>
         <w:numRestart w:val="eachSect"/>
@@ -10203,6 +12106,15 @@
     <w:abstractNumId w:val="991"/>
   </w:num>
   <w:num w:numId="1002">
+    <w:abstractNumId w:val="991"/>
+  </w:num>
+  <w:num w:numId="1003">
+    <w:abstractNumId w:val="991"/>
+  </w:num>
+  <w:num w:numId="1004">
+    <w:abstractNumId w:val="991"/>
+  </w:num>
+  <w:num w:numId="1005">
     <w:abstractNumId w:val="99411"/>
     <w:lvlOverride w:ilvl="0">
       <w:startOverride w:val="1"/>
@@ -10231,42 +12143,6 @@
     <w:lvlOverride w:ilvl="8">
       <w:startOverride w:val="1"/>
     </w:lvlOverride>
-  </w:num>
-  <w:num w:numId="1003">
-    <w:abstractNumId w:val="99411"/>
-    <w:lvlOverride w:ilvl="0">
-      <w:startOverride w:val="1"/>
-    </w:lvlOverride>
-    <w:lvlOverride w:ilvl="1">
-      <w:startOverride w:val="1"/>
-    </w:lvlOverride>
-    <w:lvlOverride w:ilvl="2">
-      <w:startOverride w:val="1"/>
-    </w:lvlOverride>
-    <w:lvlOverride w:ilvl="3">
-      <w:startOverride w:val="1"/>
-    </w:lvlOverride>
-    <w:lvlOverride w:ilvl="4">
-      <w:startOverride w:val="1"/>
-    </w:lvlOverride>
-    <w:lvlOverride w:ilvl="5">
-      <w:startOverride w:val="1"/>
-    </w:lvlOverride>
-    <w:lvlOverride w:ilvl="6">
-      <w:startOverride w:val="1"/>
-    </w:lvlOverride>
-    <w:lvlOverride w:ilvl="7">
-      <w:startOverride w:val="1"/>
-    </w:lvlOverride>
-    <w:lvlOverride w:ilvl="8">
-      <w:startOverride w:val="1"/>
-    </w:lvlOverride>
-  </w:num>
-  <w:num w:numId="1004">
-    <w:abstractNumId w:val="991"/>
-  </w:num>
-  <w:num w:numId="1005">
-    <w:abstractNumId w:val="991"/>
   </w:num>
   <w:num w:numId="1006">
     <w:abstractNumId w:val="99411"/>
@@ -10299,6 +12175,12 @@
     </w:lvlOverride>
   </w:num>
   <w:num w:numId="1007">
+    <w:abstractNumId w:val="991"/>
+  </w:num>
+  <w:num w:numId="1008">
+    <w:abstractNumId w:val="991"/>
+  </w:num>
+  <w:num w:numId="1009">
     <w:abstractNumId w:val="99411"/>
     <w:lvlOverride w:ilvl="0">
       <w:startOverride w:val="1"/>
@@ -10328,16 +12210,52 @@
       <w:startOverride w:val="1"/>
     </w:lvlOverride>
   </w:num>
-  <w:num w:numId="1008">
+  <w:num w:numId="1010">
+    <w:abstractNumId w:val="99411"/>
+    <w:lvlOverride w:ilvl="0">
+      <w:startOverride w:val="1"/>
+    </w:lvlOverride>
+    <w:lvlOverride w:ilvl="1">
+      <w:startOverride w:val="1"/>
+    </w:lvlOverride>
+    <w:lvlOverride w:ilvl="2">
+      <w:startOverride w:val="1"/>
+    </w:lvlOverride>
+    <w:lvlOverride w:ilvl="3">
+      <w:startOverride w:val="1"/>
+    </w:lvlOverride>
+    <w:lvlOverride w:ilvl="4">
+      <w:startOverride w:val="1"/>
+    </w:lvlOverride>
+    <w:lvlOverride w:ilvl="5">
+      <w:startOverride w:val="1"/>
+    </w:lvlOverride>
+    <w:lvlOverride w:ilvl="6">
+      <w:startOverride w:val="1"/>
+    </w:lvlOverride>
+    <w:lvlOverride w:ilvl="7">
+      <w:startOverride w:val="1"/>
+    </w:lvlOverride>
+    <w:lvlOverride w:ilvl="8">
+      <w:startOverride w:val="1"/>
+    </w:lvlOverride>
+  </w:num>
+  <w:num w:numId="1011">
     <w:abstractNumId w:val="991"/>
   </w:num>
-  <w:num w:numId="1009">
+  <w:num w:numId="1012">
     <w:abstractNumId w:val="991"/>
   </w:num>
-  <w:num w:numId="1010">
+  <w:num w:numId="1013">
     <w:abstractNumId w:val="991"/>
   </w:num>
-  <w:num w:numId="1011">
+  <w:num w:numId="1014">
+    <w:abstractNumId w:val="991"/>
+  </w:num>
+  <w:num w:numId="1015">
+    <w:abstractNumId w:val="991"/>
+  </w:num>
+  <w:num w:numId="1016">
     <w:abstractNumId w:val="991"/>
   </w:num>
 </w:numbering>

</xml_diff>

<commit_message>
Decks: procurement and build, test procedure and robot program
Two decks built from content files by make_registration_deck.js, adapted from the
stage-1 generator: all text and notes in the JSON files, figures cropped from the
procedure's figures by make_assets.py, cost figures checked against costs.py. The
content check and the layout check report no problems; both decks validate; every
slide was rendered and looked at (renders under archive/qa_renders). The build table
of the procedure drops its description column, which section 1a already carries. The
chat record is refreshed to include this work.

Co-Authored-By: Claude Fable 5.1 <noreply@anthropic.com>
Claude-Session: https://claude.ai/code/session_016X9U4SzM2dXD3fEs3wV3Mm
</commit_message>
<xml_diff>
--- a/docs/procedures/registration_capture_procedure.docx
+++ b/docs/procedures/registration_capture_procedure.docx
@@ -649,17 +649,15 @@
     <w:tbl>
       <w:tblPr>
         <w:tblStyle w:val="Table"/>
-        <w:tblW w:type="pct" w:w="5000"/>
-        <w:tblLayout w:type="fixed"/>
+        <w:tblW w:type="auto" w:w="0"/>
         <w:tblLook w:firstRow="1" w:lastRow="0" w:firstColumn="0" w:lastColumn="0" w:noHBand="0" w:noVBand="0" w:val="0020"/>
       </w:tblPr>
       <w:tblGrid>
-        <w:gridCol w:w="1320"/>
-        <w:gridCol w:w="1320"/>
-        <w:gridCol w:w="1320"/>
-        <w:gridCol w:w="1320"/>
-        <w:gridCol w:w="1320"/>
-        <w:gridCol w:w="1320"/>
+        <w:gridCol w:w="1584"/>
+        <w:gridCol w:w="1584"/>
+        <w:gridCol w:w="1584"/>
+        <w:gridCol w:w="1584"/>
+        <w:gridCol w:w="1584"/>
       </w:tblGrid>
       <w:tr>
         <w:trPr>
@@ -694,17 +692,6 @@
               <w:pStyle w:val="Compact"/>
             </w:pPr>
             <w:r>
-              <w:t xml:space="preserve">Description</w:t>
-            </w:r>
-          </w:p>
-        </w:tc>
-        <w:tc>
-          <w:tcPr/>
-          <w:p>
-            <w:pPr>
-              <w:pStyle w:val="Compact"/>
-            </w:pPr>
-            <w:r>
               <w:t xml:space="preserve">Drawing</w:t>
             </w:r>
           </w:p>
@@ -762,17 +749,6 @@
               <w:pStyle w:val="Compact"/>
             </w:pPr>
             <w:r>
-              <w:t xml:space="preserve">200 x 150 mm plate, specification in 1d</w:t>
-            </w:r>
-          </w:p>
-        </w:tc>
-        <w:tc>
-          <w:tcPr/>
-          <w:p>
-            <w:pPr>
-              <w:pStyle w:val="Compact"/>
-            </w:pPr>
-            <w:r>
               <w:t xml:space="preserve">SC1-05 (outline)</w:t>
             </w:r>
           </w:p>
@@ -830,17 +806,6 @@
               <w:pStyle w:val="Compact"/>
             </w:pPr>
             <w:r>
-              <w:t xml:space="preserve">Flange plate with pads, edge pins and clamp fingers, drawing SC1-05</w:t>
-            </w:r>
-          </w:p>
-        </w:tc>
-        <w:tc>
-          <w:tcPr/>
-          <w:p>
-            <w:pPr>
-              <w:pStyle w:val="Compact"/>
-            </w:pPr>
-            <w:r>
               <w:t xml:space="preserve">SC1-05</w:t>
             </w:r>
           </w:p>
@@ -888,17 +853,6 @@
             </w:pPr>
             <w:r>
               <w:t xml:space="preserve">1</w:t>
-            </w:r>
-          </w:p>
-        </w:tc>
-        <w:tc>
-          <w:tcPr/>
-          <w:p>
-            <w:pPr>
-              <w:pStyle w:val="Compact"/>
-            </w:pPr>
-            <w:r>
-              <w:t xml:space="preserve">Dial indicator on a magnetic base on a bolted steel plate, section 1e</w:t>
             </w:r>
           </w:p>
         </w:tc>

</xml_diff>

<commit_message>
Plate suppliers aligned with the plate specification
Appendix A and the suppliers slide now offer only the two materials of section 1d
(finish-ground aluminum tooling plate or float glass); the granite option is dropped.
Both say that the supplier's flatness report is the starting document and that the
0.05 mm is confirmed in-house after painting and mounting.

Co-Authored-By: Claude Fable 5.1 <noreply@anthropic.com>
Claude-Session: https://claude.ai/code/session_016X9U4SzM2dXD3fEs3wV3Mm
</commit_message>
<xml_diff>
--- a/docs/procedures/registration_capture_procedure.docx
+++ b/docs/procedures/registration_capture_procedure.docx
@@ -8798,31 +8798,33 @@
     </w:p>
     <w:p>
       <w:pPr>
-        <w:pStyle w:val="Compact"/>
-        <w:numPr>
-          <w:ilvl w:val="0"/>
-          <w:numId w:val="1015"/>
-        </w:numPr>
-      </w:pPr>
-      <w:r>
-        <w:t xml:space="preserve">A small granite surface plate (Starrett or Mitutoyo, grade A or AA) is flat to a</w:t>
-      </w:r>
-      <w:r>
-        <w:t xml:space="preserve"> </w:t>
-      </w:r>
-      <w:r>
-        <w:t xml:space="preserve">few micrometers but black and heavy; it works if the front is painted matte light</w:t>
-      </w:r>
-      <w:r>
-        <w:t xml:space="preserve"> </w:t>
-      </w:r>
-      <w:r>
-        <w:t xml:space="preserve">gray and the robot carries the weight (a 200 x 150 x 50 mm plate is about 4 kg).</w:t>
-      </w:r>
-    </w:p>
-    <w:p>
-      <w:pPr>
         <w:pStyle w:val="FirstParagraph"/>
+      </w:pPr>
+      <w:r>
+        <w:t xml:space="preserve">Either way the supplier’s or the grinding shop’s flatness report is the starting</w:t>
+      </w:r>
+      <w:r>
+        <w:t xml:space="preserve"> </w:t>
+      </w:r>
+      <w:r>
+        <w:t xml:space="preserve">document (1d), and the 0.05 mm is confirmed in-house with the straightedge and</w:t>
+      </w:r>
+      <w:r>
+        <w:t xml:space="preserve"> </w:t>
+      </w:r>
+      <w:r>
+        <w:t xml:space="preserve">feeler leaf after painting and after mounting, because that is the state the sensor</w:t>
+      </w:r>
+      <w:r>
+        <w:t xml:space="preserve"> </w:t>
+      </w:r>
+      <w:r>
+        <w:t xml:space="preserve">sees; only the two materials of 1d are specified.</w:t>
+      </w:r>
+    </w:p>
+    <w:p>
+      <w:pPr>
+        <w:pStyle w:val="BodyText"/>
       </w:pPr>
       <w:r>
         <w:t xml:space="preserve">Measuring instruments (section 1c), all stocked by McMaster-Carr, Transcat,</w:t>

</xml_diff>

<commit_message>
Interim snapshot: dress rehearsal script and results; procedure and deck updated for its findings
docs/procedures/build/dress_rehearsal.py runs the procedure's whole chain on a synthetic
sensor and robot at full scale; docs/procedures/rehearsal/ holds the last run's summary,
registrations, comparison and report. The procedure now says the analysis reads the
plan to keep held-out poses out of the fit, and adds the small-board-image flag to
section 8; the test deck's checks slide carries it. Decision 18 logged. The analysis
and check tools are being changed to match in the next commit.

Co-Authored-By: Claude Fable 5.1 <noreply@anthropic.com>
Claude-Session: https://claude.ai/code/session_016X9U4SzM2dXD3fEs3wV3Mm
</commit_message>
<xml_diff>
--- a/docs/procedures/registration_capture_procedure.docx
+++ b/docs/procedures/registration_capture_procedure.docx
@@ -4950,13 +4950,55 @@
         <w:t xml:space="preserve">holdout</w:t>
       </w:r>
       <w:r>
-        <w:t xml:space="preserve">, value 1): capture them like all the others; the</w:t>
-      </w:r>
-      <w:r>
-        <w:t xml:space="preserve"> </w:t>
-      </w:r>
-      <w:r>
-        <w:t xml:space="preserve">software keeps them aside for checking the result instead of fitting with them.</w:t>
+        <w:t xml:space="preserve">, value 1): capture them like all the others. The</w:t>
+      </w:r>
+      <w:r>
+        <w:t xml:space="preserve"> </w:t>
+      </w:r>
+      <w:r>
+        <w:t xml:space="preserve">analysis reads</w:t>
+      </w:r>
+      <w:r>
+        <w:t xml:space="preserve"> </w:t>
+      </w:r>
+      <w:r>
+        <w:rPr>
+          <w:rStyle w:val="VerbatimChar"/>
+        </w:rPr>
+        <w:t xml:space="preserve">poses.csv</w:t>
+      </w:r>
+      <w:r>
+        <w:t xml:space="preserve"> </w:t>
+      </w:r>
+      <w:r>
+        <w:t xml:space="preserve">to know which they are, fits the registration without</w:t>
+      </w:r>
+      <w:r>
+        <w:t xml:space="preserve"> </w:t>
+      </w:r>
+      <w:r>
+        <w:t xml:space="preserve">them, and reports their residuals as an independent check of the result; that is</w:t>
+      </w:r>
+      <w:r>
+        <w:t xml:space="preserve"> </w:t>
+      </w:r>
+      <w:r>
+        <w:t xml:space="preserve">why</w:t>
+      </w:r>
+      <w:r>
+        <w:t xml:space="preserve"> </w:t>
+      </w:r>
+      <w:r>
+        <w:rPr>
+          <w:rStyle w:val="VerbatimChar"/>
+        </w:rPr>
+        <w:t xml:space="preserve">plan/poses.csv</w:t>
+      </w:r>
+      <w:r>
+        <w:t xml:space="preserve"> </w:t>
+      </w:r>
+      <w:r>
+        <w:t xml:space="preserve">is a deliverable (section 9).</w:t>
       </w:r>
     </w:p>
     <w:p>
@@ -8272,6 +8314,36 @@
       </w:r>
       <w:r>
         <w:t xml:space="preserve">unusable, re-plan it slightly inward.</w:t>
+      </w:r>
+    </w:p>
+    <w:p>
+      <w:pPr>
+        <w:pStyle w:val="Compact"/>
+        <w:numPr>
+          <w:ilvl w:val="0"/>
+          <w:numId w:val="1013"/>
+        </w:numPr>
+      </w:pPr>
+      <w:r>
+        <w:t xml:space="preserve">Board image too small (fewer than 1,000 pixels found): the pose is at the limit</w:t>
+      </w:r>
+      <w:r>
+        <w:t xml:space="preserve"> </w:t>
+      </w:r>
+      <w:r>
+        <w:t xml:space="preserve">of what the sensor can read, usually the far standoff at the largest tilt. Its</w:t>
+      </w:r>
+      <w:r>
+        <w:t xml:space="preserve"> </w:t>
+      </w:r>
+      <w:r>
+        <w:t xml:space="preserve">plane is noisy, so the residual flags are not raised for it. Do not re-capture it;</w:t>
+      </w:r>
+      <w:r>
+        <w:t xml:space="preserve"> </w:t>
+      </w:r>
+      <w:r>
+        <w:t xml:space="preserve">drop it from the plan. The 1,000 is a placeholder until real sessions set it.</w:t>
       </w:r>
     </w:p>
     <w:p>

</xml_diff>

<commit_message>
Analysis keeps held-out poses out of the fit; check flags a too-small board image
register --plan poses.csv: poses tagged held out are excluded from every solve and
evaluated against it, with their RMS and maximum residuals judged against the fit's
limits in registration.json, the report and the comparison; residual maps label them
"held out". check_captures --min-mask-pixels (default 1000, placeholder): a board
image with fewer segmented pixels is flagged as too small to give a reliable plane,
its residual flags are suppressed, and the advice is to drop the pose from the plan.
The core solver's residual computation is shared with the held-out evaluation. 74
tests. Found by the dress rehearsal (decision 18).

Co-Authored-By: Claude Fable 5.1 <noreply@anthropic.com>
Claude-Session: https://claude.ai/code/session_016X9U4SzM2dXD3fEs3wV3Mm
</commit_message>
<xml_diff>
--- a/docs/procedures/registration_capture_procedure.docx
+++ b/docs/procedures/registration_capture_procedure.docx
@@ -10653,6 +10653,15 @@
         <w:rPr>
           <w:rStyle w:val="VerbatimChar"/>
         </w:rPr>
+        <w:t xml:space="preserve">                         [--min-mask-pixels MIN_MASK_PIXELS]</w:t>
+      </w:r>
+      <w:r>
+        <w:br/>
+      </w:r>
+      <w:r>
+        <w:rPr>
+          <w:rStyle w:val="VerbatimChar"/>
+        </w:rPr>
         <w:t xml:space="preserve">                         [--normal-residual-warn-deg NORMAL_RESIDUAL_WARN_DEG]</w:t>
       </w:r>
       <w:r>
@@ -10939,6 +10948,42 @@
           <w:rStyle w:val="VerbatimChar"/>
         </w:rPr>
         <w:t xml:space="preserve">                        when the flange pose was logged (default 0.0)</w:t>
+      </w:r>
+      <w:r>
+        <w:br/>
+      </w:r>
+      <w:r>
+        <w:rPr>
+          <w:rStyle w:val="VerbatimChar"/>
+        </w:rPr>
+        <w:t xml:space="preserve">  --min-mask-pixels MIN_MASK_PIXELS</w:t>
+      </w:r>
+      <w:r>
+        <w:br/>
+      </w:r>
+      <w:r>
+        <w:rPr>
+          <w:rStyle w:val="VerbatimChar"/>
+        </w:rPr>
+        <w:t xml:space="preserve">                        flag a board image with fewer segmented pixels</w:t>
+      </w:r>
+      <w:r>
+        <w:br/>
+      </w:r>
+      <w:r>
+        <w:rPr>
+          <w:rStyle w:val="VerbatimChar"/>
+        </w:rPr>
+        <w:t xml:space="preserve">                        than this as too small for a reliable plane; its</w:t>
+      </w:r>
+      <w:r>
+        <w:br/>
+      </w:r>
+      <w:r>
+        <w:rPr>
+          <w:rStyle w:val="VerbatimChar"/>
+        </w:rPr>
+        <w:t xml:space="preserve">                        residual flags are then suppressed (default 1000)</w:t>
       </w:r>
       <w:r>
         <w:br/>

</xml_diff>

<commit_message>
Analysis leaves too-small board images out of the fit, as the check flags them
register --min-mask-pixels shares the check tool's default (1000, in core.pipeline):
such poses take no part in any solve or in the held-out evaluation, are listed per
pass with their count, keep their statistics in the per-pose entries, and are labeled
"too small" in the report and the figures. 77 tests.

Co-Authored-By: Claude Fable 5.1 <noreply@anthropic.com>
Claude-Session: https://claude.ai/code/session_016X9U4SzM2dXD3fEs3wV3Mm
</commit_message>
<xml_diff>
--- a/docs/procedures/registration_capture_procedure.docx
+++ b/docs/procedures/registration_capture_procedure.docx
@@ -8337,13 +8337,37 @@
         <w:t xml:space="preserve"> </w:t>
       </w:r>
       <w:r>
-        <w:t xml:space="preserve">plane is noisy, so the residual flags are not raised for it. Do not re-capture it;</w:t>
-      </w:r>
-      <w:r>
-        <w:t xml:space="preserve"> </w:t>
-      </w:r>
-      <w:r>
-        <w:t xml:space="preserve">drop it from the plan. The 1,000 is a placeholder until real sessions set it.</w:t>
+        <w:t xml:space="preserve">plane is noisy, so the residual flags are not raised for it, and the analysis</w:t>
+      </w:r>
+      <w:r>
+        <w:t xml:space="preserve"> </w:t>
+      </w:r>
+      <w:r>
+        <w:t xml:space="preserve">leaves it out of the fit. Do not re-capture it; drop it from the plan. The 1,000</w:t>
+      </w:r>
+      <w:r>
+        <w:t xml:space="preserve"> </w:t>
+      </w:r>
+      <w:r>
+        <w:t xml:space="preserve">is a placeholder until real sessions set it. In a full-scale synthetic rehearsal</w:t>
+      </w:r>
+      <w:r>
+        <w:t xml:space="preserve"> </w:t>
+      </w:r>
+      <w:r>
+        <w:t xml:space="preserve">of this procedure, 11 of 235 poses were flagged this way, all but one at the</w:t>
+      </w:r>
+      <w:r>
+        <w:t xml:space="preserve"> </w:t>
+      </w:r>
+      <w:r>
+        <w:t xml:space="preserve">950 mm standoff with 30 degrees of tilt; whether the real sensor reads those</w:t>
+      </w:r>
+      <w:r>
+        <w:t xml:space="preserve"> </w:t>
+      </w:r>
+      <w:r>
+        <w:t xml:space="preserve">poses is one of the things the first session will show.</w:t>
       </w:r>
     </w:p>
     <w:p>

</xml_diff>